<commit_message>
Se agrego parte del desarrollo de la actividad en el archivo, analisis del problema, actores del sistema, requerimientos del sistema, regla de negocio y la creacion y primer modelo del diagrama de caso de usos
</commit_message>
<xml_diff>
--- a/Actividad_1_Pilay_Tyrone.docx
+++ b/Actividad_1_Pilay_Tyrone.docx
@@ -1182,18 +1182,9 @@
           <w:szCs w:val="20"/>
           <w:lang w:eastAsia="es-EC"/>
         </w:rPr>
-        <w:t>Utilice el flujo de trabajo Gitflow para el registro de avances del diseño en un repositorio de GitHub.</w:t>
-      </w:r>
-    </w:p>
-    <w:p>
-      <w:pPr>
-        <w:rPr>
-          <w:rFonts w:ascii="Arial" w:hAnsi="Arial" w:cs="Arial"/>
-          <w:b/>
-          <w:bCs/>
-          <w:lang w:eastAsia="es-EC"/>
-        </w:rPr>
-      </w:pPr>
+        <w:t xml:space="preserve">Utilice el flujo de trabajo </w:t>
+      </w:r>
+      <w:proofErr w:type="spellStart"/>
       <w:r>
         <w:rPr>
           <w:rFonts w:ascii="Arial" w:hAnsi="Arial" w:cs="Arial"/>
@@ -1201,24 +1192,817 @@
           <w:szCs w:val="20"/>
           <w:lang w:eastAsia="es-EC"/>
         </w:rPr>
-        <w:t>IMPORTANTE: Revise el detalle del caso de Control de Rescate y la rúbrica en la guía técnica ubicada en el apartado de Recursos de la Unidad 1.</w:t>
-      </w:r>
-      <w:r>
-        <w:rPr>
-          <w:rFonts w:ascii="Arial" w:hAnsi="Arial" w:cs="Arial"/>
-          <w:b/>
-          <w:bCs/>
+        <w:t>Gitflow</w:t>
+      </w:r>
+      <w:proofErr w:type="spellEnd"/>
+      <w:r>
+        <w:rPr>
+          <w:rFonts w:ascii="Arial" w:hAnsi="Arial" w:cs="Arial"/>
           <w:sz w:val="20"/>
           <w:szCs w:val="20"/>
           <w:lang w:eastAsia="es-EC"/>
         </w:rPr>
+        <w:t xml:space="preserve"> para el registro de avances del diseño en un repositorio de GitHub.</w:t>
+      </w:r>
+    </w:p>
+    <w:p>
+      <w:pPr>
+        <w:rPr>
+          <w:rFonts w:ascii="Arial" w:hAnsi="Arial" w:cs="Arial"/>
+          <w:sz w:val="20"/>
+          <w:szCs w:val="20"/>
+          <w:lang w:eastAsia="es-EC"/>
+        </w:rPr>
+      </w:pPr>
+      <w:r>
+        <w:rPr>
+          <w:rFonts w:ascii="Arial" w:hAnsi="Arial" w:cs="Arial"/>
+          <w:sz w:val="20"/>
+          <w:szCs w:val="20"/>
+          <w:lang w:eastAsia="es-EC"/>
+        </w:rPr>
+        <w:t>IMPORTANTE: Revise el detalle del caso de Control de Rescate y la rúbrica en la guía técnica ubicada en el apartado de Recursos de la Unidad 1.</w:t>
+      </w:r>
+    </w:p>
+    <w:p>
+      <w:pPr>
+        <w:rPr>
+          <w:rFonts w:ascii="Arial" w:hAnsi="Arial" w:cs="Arial"/>
+          <w:b/>
+          <w:bCs/>
+          <w:lang w:eastAsia="es-EC"/>
+        </w:rPr>
+      </w:pPr>
+      <w:r>
+        <w:rPr>
+          <w:rFonts w:ascii="Arial" w:hAnsi="Arial" w:cs="Arial"/>
+          <w:b/>
+          <w:bCs/>
+          <w:lang w:eastAsia="es-EC"/>
+        </w:rPr>
         <w:t xml:space="preserve"> </w:t>
       </w:r>
-      <w:r>
+    </w:p>
+    <w:p>
+      <w:pPr>
         <w:rPr>
           <w:rFonts w:ascii="Arial" w:hAnsi="Arial" w:cs="Arial"/>
           <w:b/>
           <w:bCs/>
+          <w:sz w:val="24"/>
+          <w:szCs w:val="24"/>
+          <w:lang w:eastAsia="es-EC"/>
+        </w:rPr>
+      </w:pPr>
+      <w:r>
+        <w:rPr>
+          <w:rFonts w:ascii="Arial" w:hAnsi="Arial" w:cs="Arial"/>
+          <w:b/>
+          <w:bCs/>
+          <w:sz w:val="24"/>
+          <w:szCs w:val="24"/>
+          <w:lang w:eastAsia="es-EC"/>
+        </w:rPr>
+        <w:t>Desarrollo de la actividad propuesta</w:t>
+      </w:r>
+    </w:p>
+    <w:p>
+      <w:pPr>
+        <w:pStyle w:val="Prrafodelista"/>
+        <w:numPr>
+          <w:ilvl w:val="0"/>
+          <w:numId w:val="22"/>
+        </w:numPr>
+        <w:rPr>
+          <w:rFonts w:ascii="Arial" w:hAnsi="Arial" w:cs="Arial"/>
+          <w:b/>
+          <w:bCs/>
+          <w:lang w:eastAsia="es-EC"/>
+        </w:rPr>
+      </w:pPr>
+      <w:r>
+        <w:rPr>
+          <w:rFonts w:ascii="Arial" w:hAnsi="Arial" w:cs="Arial"/>
+          <w:b/>
+          <w:bCs/>
+          <w:lang w:eastAsia="es-EC"/>
+        </w:rPr>
+        <w:t>Análisis del problema</w:t>
+      </w:r>
+    </w:p>
+    <w:p>
+      <w:pPr>
+        <w:rPr>
+          <w:rFonts w:ascii="Arial" w:hAnsi="Arial" w:cs="Arial"/>
+          <w:lang w:eastAsia="es-EC"/>
+        </w:rPr>
+      </w:pPr>
+      <w:r>
+        <w:rPr>
+          <w:rFonts w:ascii="Arial" w:hAnsi="Arial" w:cs="Arial"/>
+          <w:lang w:eastAsia="es-EC"/>
+        </w:rPr>
+        <w:t>C</w:t>
+      </w:r>
+      <w:r>
+        <w:rPr>
+          <w:rFonts w:ascii="Arial" w:hAnsi="Arial" w:cs="Arial"/>
+          <w:lang w:eastAsia="es-EC"/>
+        </w:rPr>
+        <w:t>rear</w:t>
+      </w:r>
+      <w:r>
+        <w:rPr>
+          <w:rFonts w:ascii="Arial" w:hAnsi="Arial" w:cs="Arial"/>
+          <w:lang w:eastAsia="es-EC"/>
+        </w:rPr>
+        <w:t>é</w:t>
+      </w:r>
+      <w:r>
+        <w:rPr>
+          <w:rFonts w:ascii="Arial" w:hAnsi="Arial" w:cs="Arial"/>
+          <w:lang w:eastAsia="es-EC"/>
+        </w:rPr>
+        <w:t xml:space="preserve"> un sistema que ayude a gestionar los casos de rescate y adopción de animales. Esto implica registrar la información de cada animal, clasificarlo según su especie (perro, gato o fauna silvestre), asignarle un voluntario o veterinario responsable y hacer seguimiento del caso a través de estados como Rescatado, En tratamiento y En adopción.</w:t>
+      </w:r>
+    </w:p>
+    <w:p>
+      <w:pPr>
+        <w:rPr>
+          <w:rFonts w:ascii="Arial" w:hAnsi="Arial" w:cs="Arial"/>
+          <w:b/>
+          <w:bCs/>
+          <w:lang w:eastAsia="es-EC"/>
+        </w:rPr>
+      </w:pPr>
+    </w:p>
+    <w:p>
+      <w:pPr>
+        <w:pStyle w:val="Prrafodelista"/>
+        <w:numPr>
+          <w:ilvl w:val="0"/>
+          <w:numId w:val="22"/>
+        </w:numPr>
+        <w:rPr>
+          <w:rFonts w:ascii="Arial" w:hAnsi="Arial" w:cs="Arial"/>
+          <w:b/>
+          <w:bCs/>
+          <w:lang w:eastAsia="es-EC"/>
+        </w:rPr>
+      </w:pPr>
+      <w:r>
+        <w:rPr>
+          <w:rFonts w:ascii="Arial" w:hAnsi="Arial" w:cs="Arial"/>
+          <w:b/>
+          <w:bCs/>
+          <w:lang w:eastAsia="es-EC"/>
+        </w:rPr>
+        <w:t>Actores del sistema</w:t>
+      </w:r>
+    </w:p>
+    <w:p>
+      <w:pPr>
+        <w:rPr>
+          <w:rFonts w:ascii="Arial" w:hAnsi="Arial" w:cs="Arial"/>
+          <w:lang w:eastAsia="es-EC"/>
+        </w:rPr>
+      </w:pPr>
+      <w:r>
+        <w:rPr>
+          <w:rFonts w:ascii="Arial" w:hAnsi="Arial" w:cs="Arial"/>
+          <w:lang w:eastAsia="es-EC"/>
+        </w:rPr>
+        <w:t xml:space="preserve">Ciudadano o </w:t>
+      </w:r>
+      <w:proofErr w:type="spellStart"/>
+      <w:r>
+        <w:rPr>
+          <w:rFonts w:ascii="Arial" w:hAnsi="Arial" w:cs="Arial"/>
+          <w:lang w:eastAsia="es-EC"/>
+        </w:rPr>
+        <w:t>reportante</w:t>
+      </w:r>
+      <w:proofErr w:type="spellEnd"/>
+      <w:r>
+        <w:rPr>
+          <w:rFonts w:ascii="Arial" w:hAnsi="Arial" w:cs="Arial"/>
+          <w:lang w:eastAsia="es-EC"/>
+        </w:rPr>
+        <w:t>: se encarga de registrar los casos de rescate y de brindar la información inicial del animal.</w:t>
+      </w:r>
+    </w:p>
+    <w:p>
+      <w:pPr>
+        <w:rPr>
+          <w:rFonts w:ascii="Arial" w:hAnsi="Arial" w:cs="Arial"/>
+          <w:lang w:eastAsia="es-EC"/>
+        </w:rPr>
+      </w:pPr>
+      <w:r>
+        <w:rPr>
+          <w:rFonts w:ascii="Arial" w:hAnsi="Arial" w:cs="Arial"/>
+          <w:lang w:eastAsia="es-EC"/>
+        </w:rPr>
+        <w:t>Voluntario o veterinario: puede consultar los casos que le fueron asignados, atender a los animales y actualizar su estado.</w:t>
+      </w:r>
+    </w:p>
+    <w:p>
+      <w:pPr>
+        <w:rPr>
+          <w:rFonts w:ascii="Arial" w:hAnsi="Arial" w:cs="Arial"/>
+          <w:lang w:eastAsia="es-EC"/>
+        </w:rPr>
+      </w:pPr>
+      <w:r>
+        <w:rPr>
+          <w:rFonts w:ascii="Arial" w:hAnsi="Arial" w:cs="Arial"/>
+          <w:lang w:eastAsia="es-EC"/>
+        </w:rPr>
+        <w:t>Administrador del refugio: supervisa los casos, asigna responsables y hace seguimiento al proceso de cada animal.</w:t>
+      </w:r>
+    </w:p>
+    <w:p>
+      <w:pPr>
+        <w:rPr>
+          <w:rFonts w:ascii="Arial" w:hAnsi="Arial" w:cs="Arial"/>
+          <w:lang w:eastAsia="es-EC"/>
+        </w:rPr>
+      </w:pPr>
+    </w:p>
+    <w:p>
+      <w:pPr>
+        <w:pStyle w:val="Prrafodelista"/>
+        <w:numPr>
+          <w:ilvl w:val="0"/>
+          <w:numId w:val="22"/>
+        </w:numPr>
+        <w:rPr>
+          <w:rFonts w:ascii="Arial" w:hAnsi="Arial" w:cs="Arial"/>
+          <w:b/>
+          <w:bCs/>
+          <w:lang w:eastAsia="es-EC"/>
+        </w:rPr>
+      </w:pPr>
+      <w:r>
+        <w:rPr>
+          <w:rFonts w:ascii="Arial" w:hAnsi="Arial" w:cs="Arial"/>
+          <w:b/>
+          <w:bCs/>
+          <w:lang w:eastAsia="es-EC"/>
+        </w:rPr>
+        <w:t>Requerimientos del sistema</w:t>
+      </w:r>
+    </w:p>
+    <w:p>
+      <w:pPr>
+        <w:rPr>
+          <w:rFonts w:ascii="Arial" w:hAnsi="Arial" w:cs="Arial"/>
+          <w:b/>
+          <w:bCs/>
+          <w:lang w:eastAsia="es-EC"/>
+        </w:rPr>
+      </w:pPr>
+      <w:r>
+        <w:rPr>
+          <w:rFonts w:ascii="Arial" w:hAnsi="Arial" w:cs="Arial"/>
+          <w:b/>
+          <w:bCs/>
+          <w:lang w:eastAsia="es-EC"/>
+        </w:rPr>
+        <w:t>Requerimientos funcionales</w:t>
+      </w:r>
+    </w:p>
+    <w:p>
+      <w:pPr>
+        <w:pStyle w:val="Prrafodelista"/>
+        <w:numPr>
+          <w:ilvl w:val="0"/>
+          <w:numId w:val="23"/>
+        </w:numPr>
+        <w:rPr>
+          <w:rFonts w:ascii="Arial" w:hAnsi="Arial" w:cs="Arial"/>
+          <w:lang w:eastAsia="es-EC"/>
+        </w:rPr>
+      </w:pPr>
+      <w:r>
+        <w:rPr>
+          <w:rFonts w:ascii="Arial" w:hAnsi="Arial" w:cs="Arial"/>
+          <w:lang w:eastAsia="es-EC"/>
+        </w:rPr>
+        <w:t>Permitir el registro de nuevos casos de rescate.</w:t>
+      </w:r>
+    </w:p>
+    <w:p>
+      <w:pPr>
+        <w:pStyle w:val="Prrafodelista"/>
+        <w:numPr>
+          <w:ilvl w:val="0"/>
+          <w:numId w:val="23"/>
+        </w:numPr>
+        <w:rPr>
+          <w:rFonts w:ascii="Arial" w:hAnsi="Arial" w:cs="Arial"/>
+          <w:lang w:eastAsia="es-EC"/>
+        </w:rPr>
+      </w:pPr>
+      <w:r>
+        <w:rPr>
+          <w:rFonts w:ascii="Arial" w:hAnsi="Arial" w:cs="Arial"/>
+          <w:lang w:eastAsia="es-EC"/>
+        </w:rPr>
+        <w:t>Clasificar los animales según su especie.</w:t>
+      </w:r>
+    </w:p>
+    <w:p>
+      <w:pPr>
+        <w:pStyle w:val="Prrafodelista"/>
+        <w:numPr>
+          <w:ilvl w:val="0"/>
+          <w:numId w:val="23"/>
+        </w:numPr>
+        <w:rPr>
+          <w:rFonts w:ascii="Arial" w:hAnsi="Arial" w:cs="Arial"/>
+          <w:lang w:eastAsia="es-EC"/>
+        </w:rPr>
+      </w:pPr>
+      <w:r>
+        <w:rPr>
+          <w:rFonts w:ascii="Arial" w:hAnsi="Arial" w:cs="Arial"/>
+          <w:lang w:eastAsia="es-EC"/>
+        </w:rPr>
+        <w:t>Generar expedientes según el tipo de animal.</w:t>
+      </w:r>
+    </w:p>
+    <w:p>
+      <w:pPr>
+        <w:pStyle w:val="Prrafodelista"/>
+        <w:numPr>
+          <w:ilvl w:val="0"/>
+          <w:numId w:val="23"/>
+        </w:numPr>
+        <w:rPr>
+          <w:rFonts w:ascii="Arial" w:hAnsi="Arial" w:cs="Arial"/>
+          <w:lang w:eastAsia="es-EC"/>
+        </w:rPr>
+      </w:pPr>
+      <w:r>
+        <w:rPr>
+          <w:rFonts w:ascii="Arial" w:hAnsi="Arial" w:cs="Arial"/>
+          <w:lang w:eastAsia="es-EC"/>
+        </w:rPr>
+        <w:t>Permitir la asignación de voluntarios o veterinarios a los casos.</w:t>
+      </w:r>
+    </w:p>
+    <w:p>
+      <w:pPr>
+        <w:pStyle w:val="Prrafodelista"/>
+        <w:numPr>
+          <w:ilvl w:val="0"/>
+          <w:numId w:val="23"/>
+        </w:numPr>
+        <w:rPr>
+          <w:rFonts w:ascii="Arial" w:hAnsi="Arial" w:cs="Arial"/>
+          <w:lang w:eastAsia="es-EC"/>
+        </w:rPr>
+      </w:pPr>
+      <w:r>
+        <w:rPr>
+          <w:rFonts w:ascii="Arial" w:hAnsi="Arial" w:cs="Arial"/>
+          <w:lang w:eastAsia="es-EC"/>
+        </w:rPr>
+        <w:t>Consultar y actualizar el estado de los casos.</w:t>
+      </w:r>
+    </w:p>
+    <w:p>
+      <w:pPr>
+        <w:pStyle w:val="Prrafodelista"/>
+        <w:numPr>
+          <w:ilvl w:val="0"/>
+          <w:numId w:val="23"/>
+        </w:numPr>
+        <w:rPr>
+          <w:rFonts w:ascii="Arial" w:hAnsi="Arial" w:cs="Arial"/>
+          <w:lang w:eastAsia="es-EC"/>
+        </w:rPr>
+      </w:pPr>
+      <w:r>
+        <w:rPr>
+          <w:rFonts w:ascii="Arial" w:hAnsi="Arial" w:cs="Arial"/>
+          <w:lang w:eastAsia="es-EC"/>
+        </w:rPr>
+        <w:t>Notificar a los voluntarios sobre nuevos rescates.</w:t>
+      </w:r>
+    </w:p>
+    <w:p>
+      <w:pPr>
+        <w:pStyle w:val="Prrafodelista"/>
+        <w:numPr>
+          <w:ilvl w:val="0"/>
+          <w:numId w:val="23"/>
+        </w:numPr>
+        <w:rPr>
+          <w:rFonts w:ascii="Arial" w:hAnsi="Arial" w:cs="Arial"/>
+          <w:lang w:eastAsia="es-EC"/>
+        </w:rPr>
+      </w:pPr>
+      <w:r>
+        <w:rPr>
+          <w:rFonts w:ascii="Arial" w:hAnsi="Arial" w:cs="Arial"/>
+          <w:lang w:eastAsia="es-EC"/>
+        </w:rPr>
+        <w:t>Consultar la información y el historial de cada caso.</w:t>
+      </w:r>
+    </w:p>
+    <w:p>
+      <w:pPr>
+        <w:rPr>
+          <w:rFonts w:ascii="Arial" w:hAnsi="Arial" w:cs="Arial"/>
+          <w:b/>
+          <w:bCs/>
+          <w:lang w:eastAsia="es-EC"/>
+        </w:rPr>
+      </w:pPr>
+      <w:r>
+        <w:rPr>
+          <w:rFonts w:ascii="Arial" w:hAnsi="Arial" w:cs="Arial"/>
+          <w:b/>
+          <w:bCs/>
+          <w:lang w:eastAsia="es-EC"/>
+        </w:rPr>
+        <w:lastRenderedPageBreak/>
+        <w:t>Requerimientos no funcionales</w:t>
+      </w:r>
+    </w:p>
+    <w:p>
+      <w:pPr>
+        <w:pStyle w:val="Prrafodelista"/>
+        <w:numPr>
+          <w:ilvl w:val="0"/>
+          <w:numId w:val="24"/>
+        </w:numPr>
+        <w:rPr>
+          <w:rFonts w:ascii="Arial" w:hAnsi="Arial" w:cs="Arial"/>
+          <w:lang w:eastAsia="es-EC"/>
+        </w:rPr>
+      </w:pPr>
+      <w:r>
+        <w:rPr>
+          <w:rFonts w:ascii="Arial" w:hAnsi="Arial" w:cs="Arial"/>
+          <w:lang w:eastAsia="es-EC"/>
+        </w:rPr>
+        <w:t>Diseñar una arquitectura modular y escalable.</w:t>
+      </w:r>
+    </w:p>
+    <w:p>
+      <w:pPr>
+        <w:pStyle w:val="Prrafodelista"/>
+        <w:numPr>
+          <w:ilvl w:val="0"/>
+          <w:numId w:val="24"/>
+        </w:numPr>
+        <w:rPr>
+          <w:rFonts w:ascii="Arial" w:hAnsi="Arial" w:cs="Arial"/>
+          <w:lang w:eastAsia="es-EC"/>
+        </w:rPr>
+      </w:pPr>
+      <w:r>
+        <w:rPr>
+          <w:rFonts w:ascii="Arial" w:hAnsi="Arial" w:cs="Arial"/>
+          <w:lang w:eastAsia="es-EC"/>
+        </w:rPr>
+        <w:t>Facilitar el mantenimiento y la ampliación del sistema.</w:t>
+      </w:r>
+    </w:p>
+    <w:p>
+      <w:pPr>
+        <w:pStyle w:val="Prrafodelista"/>
+        <w:numPr>
+          <w:ilvl w:val="0"/>
+          <w:numId w:val="24"/>
+        </w:numPr>
+        <w:rPr>
+          <w:rFonts w:ascii="Arial" w:hAnsi="Arial" w:cs="Arial"/>
+          <w:lang w:eastAsia="es-EC"/>
+        </w:rPr>
+      </w:pPr>
+      <w:r>
+        <w:rPr>
+          <w:rFonts w:ascii="Arial" w:hAnsi="Arial" w:cs="Arial"/>
+          <w:lang w:eastAsia="es-EC"/>
+        </w:rPr>
+        <w:t>Aplicar principios SOLID para separar responsabilidades.</w:t>
+      </w:r>
+    </w:p>
+    <w:p>
+      <w:pPr>
+        <w:pStyle w:val="Prrafodelista"/>
+        <w:numPr>
+          <w:ilvl w:val="0"/>
+          <w:numId w:val="24"/>
+        </w:numPr>
+        <w:rPr>
+          <w:rFonts w:ascii="Arial" w:hAnsi="Arial" w:cs="Arial"/>
+          <w:lang w:eastAsia="es-EC"/>
+        </w:rPr>
+      </w:pPr>
+      <w:r>
+        <w:rPr>
+          <w:rFonts w:ascii="Arial" w:hAnsi="Arial" w:cs="Arial"/>
+          <w:lang w:eastAsia="es-EC"/>
+        </w:rPr>
+        <w:t>Mantener la trazabilidad de los cambios mediante Git y GitHub.</w:t>
+      </w:r>
+    </w:p>
+    <w:p>
+      <w:pPr>
+        <w:pStyle w:val="Prrafodelista"/>
+        <w:numPr>
+          <w:ilvl w:val="0"/>
+          <w:numId w:val="24"/>
+        </w:numPr>
+        <w:rPr>
+          <w:rFonts w:ascii="Arial" w:hAnsi="Arial" w:cs="Arial"/>
+          <w:lang w:eastAsia="es-EC"/>
+        </w:rPr>
+      </w:pPr>
+      <w:r>
+        <w:rPr>
+          <w:rFonts w:ascii="Arial" w:hAnsi="Arial" w:cs="Arial"/>
+          <w:lang w:eastAsia="es-EC"/>
+        </w:rPr>
+        <w:t>Restringir las operaciones según el rol de cada usuario.</w:t>
+      </w:r>
+    </w:p>
+    <w:p>
+      <w:pPr>
+        <w:rPr>
+          <w:rFonts w:ascii="Arial" w:hAnsi="Arial" w:cs="Arial"/>
+          <w:b/>
+          <w:bCs/>
+          <w:lang w:eastAsia="es-EC"/>
+        </w:rPr>
+      </w:pPr>
+    </w:p>
+    <w:p>
+      <w:pPr>
+        <w:pStyle w:val="Prrafodelista"/>
+        <w:numPr>
+          <w:ilvl w:val="0"/>
+          <w:numId w:val="22"/>
+        </w:numPr>
+        <w:rPr>
+          <w:rFonts w:ascii="Arial" w:hAnsi="Arial" w:cs="Arial"/>
+          <w:b/>
+          <w:bCs/>
+          <w:lang w:eastAsia="es-EC"/>
+        </w:rPr>
+      </w:pPr>
+      <w:r>
+        <w:rPr>
+          <w:rFonts w:ascii="Arial" w:hAnsi="Arial" w:cs="Arial"/>
+          <w:b/>
+          <w:bCs/>
+          <w:lang w:eastAsia="es-EC"/>
+        </w:rPr>
+        <w:t>Reglas de negocio</w:t>
+      </w:r>
+    </w:p>
+    <w:p>
+      <w:pPr>
+        <w:pStyle w:val="Prrafodelista"/>
+        <w:numPr>
+          <w:ilvl w:val="0"/>
+          <w:numId w:val="25"/>
+        </w:numPr>
+        <w:rPr>
+          <w:rFonts w:ascii="Arial" w:hAnsi="Arial" w:cs="Arial"/>
+          <w:lang w:eastAsia="es-EC"/>
+        </w:rPr>
+      </w:pPr>
+      <w:r>
+        <w:rPr>
+          <w:rFonts w:ascii="Arial" w:hAnsi="Arial" w:cs="Arial"/>
+          <w:lang w:eastAsia="es-EC"/>
+        </w:rPr>
+        <w:t>Cada caso de rescate tendrá un identificador único.</w:t>
+      </w:r>
+    </w:p>
+    <w:p>
+      <w:pPr>
+        <w:pStyle w:val="Prrafodelista"/>
+        <w:numPr>
+          <w:ilvl w:val="0"/>
+          <w:numId w:val="25"/>
+        </w:numPr>
+        <w:rPr>
+          <w:rFonts w:ascii="Arial" w:hAnsi="Arial" w:cs="Arial"/>
+          <w:lang w:eastAsia="es-EC"/>
+        </w:rPr>
+      </w:pPr>
+      <w:r>
+        <w:rPr>
+          <w:rFonts w:ascii="Arial" w:hAnsi="Arial" w:cs="Arial"/>
+          <w:lang w:eastAsia="es-EC"/>
+        </w:rPr>
+        <w:t>Cada caso estará asociado a una especie y un estado.</w:t>
+      </w:r>
+    </w:p>
+    <w:p>
+      <w:pPr>
+        <w:pStyle w:val="Prrafodelista"/>
+        <w:numPr>
+          <w:ilvl w:val="0"/>
+          <w:numId w:val="25"/>
+        </w:numPr>
+        <w:rPr>
+          <w:rFonts w:ascii="Arial" w:hAnsi="Arial" w:cs="Arial"/>
+          <w:lang w:eastAsia="es-EC"/>
+        </w:rPr>
+      </w:pPr>
+      <w:r>
+        <w:rPr>
+          <w:rFonts w:ascii="Arial" w:hAnsi="Arial" w:cs="Arial"/>
+          <w:lang w:eastAsia="es-EC"/>
+        </w:rPr>
+        <w:t>El administrador será responsable de gestionar las asignaciones de personal.</w:t>
+      </w:r>
+    </w:p>
+    <w:p>
+      <w:pPr>
+        <w:pStyle w:val="Prrafodelista"/>
+        <w:numPr>
+          <w:ilvl w:val="0"/>
+          <w:numId w:val="25"/>
+        </w:numPr>
+        <w:rPr>
+          <w:rFonts w:ascii="Arial" w:hAnsi="Arial" w:cs="Arial"/>
+          <w:lang w:eastAsia="es-EC"/>
+        </w:rPr>
+      </w:pPr>
+      <w:r>
+        <w:rPr>
+          <w:rFonts w:ascii="Arial" w:hAnsi="Arial" w:cs="Arial"/>
+          <w:lang w:eastAsia="es-EC"/>
+        </w:rPr>
+        <w:t>Los cambios de estado deberán reflejar el avance del caso.</w:t>
+      </w:r>
+    </w:p>
+    <w:p>
+      <w:pPr>
+        <w:pStyle w:val="Prrafodelista"/>
+        <w:numPr>
+          <w:ilvl w:val="0"/>
+          <w:numId w:val="25"/>
+        </w:numPr>
+        <w:rPr>
+          <w:rFonts w:ascii="Arial" w:hAnsi="Arial" w:cs="Arial"/>
+          <w:sz w:val="24"/>
+          <w:szCs w:val="24"/>
+          <w:lang w:eastAsia="es-EC"/>
+        </w:rPr>
+      </w:pPr>
+      <w:r>
+        <w:rPr>
+          <w:rFonts w:ascii="Arial" w:hAnsi="Arial" w:cs="Arial"/>
+          <w:lang w:eastAsia="es-EC"/>
+        </w:rPr>
+        <w:t>La adopción se gestionará como una etapa del proceso de atención del animal.</w:t>
+      </w:r>
+    </w:p>
+    <w:p>
+      <w:pPr>
+        <w:pStyle w:val="Prrafodelista"/>
+        <w:rPr>
+          <w:rFonts w:ascii="Arial" w:hAnsi="Arial" w:cs="Arial"/>
+          <w:sz w:val="24"/>
+          <w:szCs w:val="24"/>
+          <w:lang w:eastAsia="es-EC"/>
+        </w:rPr>
+      </w:pPr>
+    </w:p>
+    <w:p>
+      <w:pPr>
+        <w:pStyle w:val="Prrafodelista"/>
+        <w:numPr>
+          <w:ilvl w:val="0"/>
+          <w:numId w:val="22"/>
+        </w:numPr>
+        <w:rPr>
+          <w:rFonts w:ascii="Arial" w:hAnsi="Arial" w:cs="Arial"/>
+          <w:b/>
+          <w:bCs/>
+          <w:lang w:eastAsia="es-EC"/>
+        </w:rPr>
+      </w:pPr>
+      <w:r>
+        <w:rPr>
+          <w:rFonts w:ascii="Arial" w:hAnsi="Arial" w:cs="Arial"/>
+          <w:b/>
+          <w:bCs/>
+          <w:lang w:eastAsia="es-EC"/>
+        </w:rPr>
+        <w:t>Diagrama de caso de usos</w:t>
+      </w:r>
+    </w:p>
+    <w:p>
+      <w:pPr>
+        <w:rPr>
+          <w:rFonts w:ascii="Arial" w:hAnsi="Arial" w:cs="Arial"/>
+          <w:sz w:val="24"/>
+          <w:szCs w:val="24"/>
+          <w:lang w:eastAsia="es-EC"/>
+        </w:rPr>
+      </w:pPr>
+      <w:r>
+        <w:rPr>
+          <w:rFonts w:ascii="Arial" w:hAnsi="Arial" w:cs="Arial"/>
+          <w:lang w:eastAsia="es-EC"/>
+        </w:rPr>
+        <w:drawing>
+          <wp:anchor distT="0" distB="0" distL="114300" distR="114300" simplePos="0" relativeHeight="251667456" behindDoc="0" locked="0" layoutInCell="1" allowOverlap="1" wp14:anchorId="2C2605DE" wp14:editId="4207BA59">
+            <wp:simplePos x="0" y="0"/>
+            <wp:positionH relativeFrom="column">
+              <wp:posOffset>0</wp:posOffset>
+            </wp:positionH>
+            <wp:positionV relativeFrom="paragraph">
+              <wp:posOffset>973777</wp:posOffset>
+            </wp:positionV>
+            <wp:extent cx="5400040" cy="3106420"/>
+            <wp:effectExtent l="0" t="0" r="0" b="0"/>
+            <wp:wrapTopAndBottom/>
+            <wp:docPr id="2" name="Imagen 2"/>
+            <wp:cNvGraphicFramePr>
+              <a:graphicFrameLocks xmlns:a="http://schemas.openxmlformats.org/drawingml/2006/main" noChangeAspect="1"/>
+            </wp:cNvGraphicFramePr>
+            <a:graphic xmlns:a="http://schemas.openxmlformats.org/drawingml/2006/main">
+              <a:graphicData uri="http://schemas.openxmlformats.org/drawingml/2006/picture">
+                <pic:pic xmlns:pic="http://schemas.openxmlformats.org/drawingml/2006/picture">
+                  <pic:nvPicPr>
+                    <pic:cNvPr id="1" name=""/>
+                    <pic:cNvPicPr/>
+                  </pic:nvPicPr>
+                  <pic:blipFill>
+                    <a:blip r:embed="rId14"/>
+                    <a:stretch>
+                      <a:fillRect/>
+                    </a:stretch>
+                  </pic:blipFill>
+                  <pic:spPr>
+                    <a:xfrm>
+                      <a:off x="0" y="0"/>
+                      <a:ext cx="5400040" cy="3106420"/>
+                    </a:xfrm>
+                    <a:prstGeom prst="rect">
+                      <a:avLst/>
+                    </a:prstGeom>
+                  </pic:spPr>
+                </pic:pic>
+              </a:graphicData>
+            </a:graphic>
+          </wp:anchor>
+        </w:drawing>
+      </w:r>
+      <w:r>
+        <w:rPr>
+          <w:rFonts w:ascii="Arial" w:hAnsi="Arial" w:cs="Arial"/>
+          <w:lang w:eastAsia="es-EC"/>
+        </w:rPr>
+        <w:t xml:space="preserve">El diagrama de casos de uso muestra las funciones principales del Sistema de Control de Rescate y Adopción Animal, así como la forma en que los distintos actores interactúan con él. En total, se identifican tres actores clave: el Ciudadano o </w:t>
+      </w:r>
+      <w:proofErr w:type="spellStart"/>
+      <w:r>
+        <w:rPr>
+          <w:rFonts w:ascii="Arial" w:hAnsi="Arial" w:cs="Arial"/>
+          <w:lang w:eastAsia="es-EC"/>
+        </w:rPr>
+        <w:t>Reportante</w:t>
+      </w:r>
+      <w:proofErr w:type="spellEnd"/>
+      <w:r>
+        <w:rPr>
+          <w:rFonts w:ascii="Arial" w:hAnsi="Arial" w:cs="Arial"/>
+          <w:lang w:eastAsia="es-EC"/>
+        </w:rPr>
+        <w:t>, el Voluntario o Veterinario y el Administrador del Refugio. Cada uno cumple un rol distinto dentro del proceso de rescate y seguimiento de los animales.</w:t>
+      </w:r>
+      <w:r>
+        <w:rPr>
+          <w:rFonts w:ascii="Arial" w:hAnsi="Arial" w:cs="Arial"/>
+          <w:lang w:eastAsia="es-EC"/>
+        </w:rPr>
+        <w:t xml:space="preserve"> </w:t>
+      </w:r>
+      <w:r>
+        <w:rPr>
+          <w:rFonts w:ascii="Arial" w:hAnsi="Arial" w:cs="Arial"/>
+          <w:lang w:eastAsia="es-EC"/>
+        </w:rPr>
+        <w:t xml:space="preserve"> </w:t>
+      </w:r>
+      <w:r>
+        <w:rPr>
+          <w:rFonts w:ascii="Arial" w:hAnsi="Arial" w:cs="Arial"/>
+          <w:sz w:val="24"/>
+          <w:szCs w:val="24"/>
           <w:lang w:eastAsia="es-EC"/>
         </w:rPr>
         <w:br w:type="page"/>
@@ -1384,7 +2168,7 @@
       </w:r>
     </w:p>
     <w:sectPr>
-      <w:headerReference w:type="first" r:id="rId14"/>
+      <w:headerReference w:type="first" r:id="rId15"/>
       <w:pgSz w:w="11906" w:h="16838"/>
       <w:pgMar w:top="1417" w:right="1701" w:bottom="1417" w:left="1701" w:header="708" w:footer="708" w:gutter="0"/>
       <w:pgNumType w:start="1"/>
@@ -2260,7 +3044,7 @@
         <v:path o:extrusionok="f" gradientshapeok="t" o:connecttype="rect"/>
         <o:lock v:ext="edit" aspectratio="t"/>
       </v:shapetype>
-      <v:shape id="_x0000_i1029" type="#_x0000_t75" style="width:10.5pt;height:10.5pt" o:bullet="t">
+      <v:shape id="_x0000_i1075" type="#_x0000_t75" style="width:10.3pt;height:10.3pt" o:bullet="t">
         <v:imagedata r:id="rId1" o:title="mso3E28"/>
       </v:shape>
     </w:pict>
@@ -2607,6 +3391,119 @@
     </w:lvl>
   </w:abstractNum>
   <w:abstractNum w:abstractNumId="3" w15:restartNumberingAfterBreak="0">
+    <w:nsid w:val="206D3069"/>
+    <w:multiLevelType w:val="hybridMultilevel"/>
+    <w:tmpl w:val="D5826E02"/>
+    <w:lvl w:ilvl="0" w:tplc="300A0005">
+      <w:start w:val="1"/>
+      <w:numFmt w:val="bullet"/>
+      <w:lvlText w:val=""/>
+      <w:lvlJc w:val="left"/>
+      <w:pPr>
+        <w:ind w:left="720" w:hanging="360"/>
+      </w:pPr>
+      <w:rPr>
+        <w:rFonts w:ascii="Wingdings" w:hAnsi="Wingdings" w:hint="default"/>
+      </w:rPr>
+    </w:lvl>
+    <w:lvl w:ilvl="1" w:tplc="300A0003" w:tentative="1">
+      <w:start w:val="1"/>
+      <w:numFmt w:val="bullet"/>
+      <w:lvlText w:val="o"/>
+      <w:lvlJc w:val="left"/>
+      <w:pPr>
+        <w:ind w:left="1440" w:hanging="360"/>
+      </w:pPr>
+      <w:rPr>
+        <w:rFonts w:ascii="Courier New" w:hAnsi="Courier New" w:cs="Courier New" w:hint="default"/>
+      </w:rPr>
+    </w:lvl>
+    <w:lvl w:ilvl="2" w:tplc="300A0005" w:tentative="1">
+      <w:start w:val="1"/>
+      <w:numFmt w:val="bullet"/>
+      <w:lvlText w:val=""/>
+      <w:lvlJc w:val="left"/>
+      <w:pPr>
+        <w:ind w:left="2160" w:hanging="360"/>
+      </w:pPr>
+      <w:rPr>
+        <w:rFonts w:ascii="Wingdings" w:hAnsi="Wingdings" w:hint="default"/>
+      </w:rPr>
+    </w:lvl>
+    <w:lvl w:ilvl="3" w:tplc="300A0001" w:tentative="1">
+      <w:start w:val="1"/>
+      <w:numFmt w:val="bullet"/>
+      <w:lvlText w:val=""/>
+      <w:lvlJc w:val="left"/>
+      <w:pPr>
+        <w:ind w:left="2880" w:hanging="360"/>
+      </w:pPr>
+      <w:rPr>
+        <w:rFonts w:ascii="Symbol" w:hAnsi="Symbol" w:hint="default"/>
+      </w:rPr>
+    </w:lvl>
+    <w:lvl w:ilvl="4" w:tplc="300A0003" w:tentative="1">
+      <w:start w:val="1"/>
+      <w:numFmt w:val="bullet"/>
+      <w:lvlText w:val="o"/>
+      <w:lvlJc w:val="left"/>
+      <w:pPr>
+        <w:ind w:left="3600" w:hanging="360"/>
+      </w:pPr>
+      <w:rPr>
+        <w:rFonts w:ascii="Courier New" w:hAnsi="Courier New" w:cs="Courier New" w:hint="default"/>
+      </w:rPr>
+    </w:lvl>
+    <w:lvl w:ilvl="5" w:tplc="300A0005" w:tentative="1">
+      <w:start w:val="1"/>
+      <w:numFmt w:val="bullet"/>
+      <w:lvlText w:val=""/>
+      <w:lvlJc w:val="left"/>
+      <w:pPr>
+        <w:ind w:left="4320" w:hanging="360"/>
+      </w:pPr>
+      <w:rPr>
+        <w:rFonts w:ascii="Wingdings" w:hAnsi="Wingdings" w:hint="default"/>
+      </w:rPr>
+    </w:lvl>
+    <w:lvl w:ilvl="6" w:tplc="300A0001" w:tentative="1">
+      <w:start w:val="1"/>
+      <w:numFmt w:val="bullet"/>
+      <w:lvlText w:val=""/>
+      <w:lvlJc w:val="left"/>
+      <w:pPr>
+        <w:ind w:left="5040" w:hanging="360"/>
+      </w:pPr>
+      <w:rPr>
+        <w:rFonts w:ascii="Symbol" w:hAnsi="Symbol" w:hint="default"/>
+      </w:rPr>
+    </w:lvl>
+    <w:lvl w:ilvl="7" w:tplc="300A0003" w:tentative="1">
+      <w:start w:val="1"/>
+      <w:numFmt w:val="bullet"/>
+      <w:lvlText w:val="o"/>
+      <w:lvlJc w:val="left"/>
+      <w:pPr>
+        <w:ind w:left="5760" w:hanging="360"/>
+      </w:pPr>
+      <w:rPr>
+        <w:rFonts w:ascii="Courier New" w:hAnsi="Courier New" w:cs="Courier New" w:hint="default"/>
+      </w:rPr>
+    </w:lvl>
+    <w:lvl w:ilvl="8" w:tplc="300A0005" w:tentative="1">
+      <w:start w:val="1"/>
+      <w:numFmt w:val="bullet"/>
+      <w:lvlText w:val=""/>
+      <w:lvlJc w:val="left"/>
+      <w:pPr>
+        <w:ind w:left="6480" w:hanging="360"/>
+      </w:pPr>
+      <w:rPr>
+        <w:rFonts w:ascii="Wingdings" w:hAnsi="Wingdings" w:hint="default"/>
+      </w:rPr>
+    </w:lvl>
+  </w:abstractNum>
+  <w:abstractNum w:abstractNumId="4" w15:restartNumberingAfterBreak="0">
     <w:nsid w:val="25D101E3"/>
     <w:multiLevelType w:val="hybridMultilevel"/>
     <w:tmpl w:val="1E9CC514"/>
@@ -2719,7 +3616,7 @@
       </w:rPr>
     </w:lvl>
   </w:abstractNum>
-  <w:abstractNum w:abstractNumId="4" w15:restartNumberingAfterBreak="0">
+  <w:abstractNum w:abstractNumId="5" w15:restartNumberingAfterBreak="0">
     <w:nsid w:val="26DE4B16"/>
     <w:multiLevelType w:val="multilevel"/>
     <w:tmpl w:val="9470283E"/>
@@ -2868,7 +3765,7 @@
       </w:rPr>
     </w:lvl>
   </w:abstractNum>
-  <w:abstractNum w:abstractNumId="5" w15:restartNumberingAfterBreak="0">
+  <w:abstractNum w:abstractNumId="6" w15:restartNumberingAfterBreak="0">
     <w:nsid w:val="2E8C7B01"/>
     <w:multiLevelType w:val="multilevel"/>
     <w:tmpl w:val="C17EACDC"/>
@@ -2989,7 +3886,209 @@
       </w:rPr>
     </w:lvl>
   </w:abstractNum>
-  <w:abstractNum w:abstractNumId="6" w15:restartNumberingAfterBreak="0">
+  <w:abstractNum w:abstractNumId="7" w15:restartNumberingAfterBreak="0">
+    <w:nsid w:val="32510C06"/>
+    <w:multiLevelType w:val="hybridMultilevel"/>
+    <w:tmpl w:val="08646192"/>
+    <w:lvl w:ilvl="0" w:tplc="300A0003">
+      <w:start w:val="1"/>
+      <w:numFmt w:val="bullet"/>
+      <w:lvlText w:val="o"/>
+      <w:lvlJc w:val="left"/>
+      <w:pPr>
+        <w:ind w:left="720" w:hanging="360"/>
+      </w:pPr>
+      <w:rPr>
+        <w:rFonts w:ascii="Courier New" w:hAnsi="Courier New" w:cs="Courier New" w:hint="default"/>
+      </w:rPr>
+    </w:lvl>
+    <w:lvl w:ilvl="1" w:tplc="300A0003" w:tentative="1">
+      <w:start w:val="1"/>
+      <w:numFmt w:val="bullet"/>
+      <w:lvlText w:val="o"/>
+      <w:lvlJc w:val="left"/>
+      <w:pPr>
+        <w:ind w:left="1440" w:hanging="360"/>
+      </w:pPr>
+      <w:rPr>
+        <w:rFonts w:ascii="Courier New" w:hAnsi="Courier New" w:cs="Courier New" w:hint="default"/>
+      </w:rPr>
+    </w:lvl>
+    <w:lvl w:ilvl="2" w:tplc="300A0005" w:tentative="1">
+      <w:start w:val="1"/>
+      <w:numFmt w:val="bullet"/>
+      <w:lvlText w:val=""/>
+      <w:lvlJc w:val="left"/>
+      <w:pPr>
+        <w:ind w:left="2160" w:hanging="360"/>
+      </w:pPr>
+      <w:rPr>
+        <w:rFonts w:ascii="Wingdings" w:hAnsi="Wingdings" w:hint="default"/>
+      </w:rPr>
+    </w:lvl>
+    <w:lvl w:ilvl="3" w:tplc="300A0001" w:tentative="1">
+      <w:start w:val="1"/>
+      <w:numFmt w:val="bullet"/>
+      <w:lvlText w:val=""/>
+      <w:lvlJc w:val="left"/>
+      <w:pPr>
+        <w:ind w:left="2880" w:hanging="360"/>
+      </w:pPr>
+      <w:rPr>
+        <w:rFonts w:ascii="Symbol" w:hAnsi="Symbol" w:hint="default"/>
+      </w:rPr>
+    </w:lvl>
+    <w:lvl w:ilvl="4" w:tplc="300A0003" w:tentative="1">
+      <w:start w:val="1"/>
+      <w:numFmt w:val="bullet"/>
+      <w:lvlText w:val="o"/>
+      <w:lvlJc w:val="left"/>
+      <w:pPr>
+        <w:ind w:left="3600" w:hanging="360"/>
+      </w:pPr>
+      <w:rPr>
+        <w:rFonts w:ascii="Courier New" w:hAnsi="Courier New" w:cs="Courier New" w:hint="default"/>
+      </w:rPr>
+    </w:lvl>
+    <w:lvl w:ilvl="5" w:tplc="300A0005" w:tentative="1">
+      <w:start w:val="1"/>
+      <w:numFmt w:val="bullet"/>
+      <w:lvlText w:val=""/>
+      <w:lvlJc w:val="left"/>
+      <w:pPr>
+        <w:ind w:left="4320" w:hanging="360"/>
+      </w:pPr>
+      <w:rPr>
+        <w:rFonts w:ascii="Wingdings" w:hAnsi="Wingdings" w:hint="default"/>
+      </w:rPr>
+    </w:lvl>
+    <w:lvl w:ilvl="6" w:tplc="300A0001" w:tentative="1">
+      <w:start w:val="1"/>
+      <w:numFmt w:val="bullet"/>
+      <w:lvlText w:val=""/>
+      <w:lvlJc w:val="left"/>
+      <w:pPr>
+        <w:ind w:left="5040" w:hanging="360"/>
+      </w:pPr>
+      <w:rPr>
+        <w:rFonts w:ascii="Symbol" w:hAnsi="Symbol" w:hint="default"/>
+      </w:rPr>
+    </w:lvl>
+    <w:lvl w:ilvl="7" w:tplc="300A0003" w:tentative="1">
+      <w:start w:val="1"/>
+      <w:numFmt w:val="bullet"/>
+      <w:lvlText w:val="o"/>
+      <w:lvlJc w:val="left"/>
+      <w:pPr>
+        <w:ind w:left="5760" w:hanging="360"/>
+      </w:pPr>
+      <w:rPr>
+        <w:rFonts w:ascii="Courier New" w:hAnsi="Courier New" w:cs="Courier New" w:hint="default"/>
+      </w:rPr>
+    </w:lvl>
+    <w:lvl w:ilvl="8" w:tplc="300A0005" w:tentative="1">
+      <w:start w:val="1"/>
+      <w:numFmt w:val="bullet"/>
+      <w:lvlText w:val=""/>
+      <w:lvlJc w:val="left"/>
+      <w:pPr>
+        <w:ind w:left="6480" w:hanging="360"/>
+      </w:pPr>
+      <w:rPr>
+        <w:rFonts w:ascii="Wingdings" w:hAnsi="Wingdings" w:hint="default"/>
+      </w:rPr>
+    </w:lvl>
+  </w:abstractNum>
+  <w:abstractNum w:abstractNumId="8" w15:restartNumberingAfterBreak="0">
+    <w:nsid w:val="37AB4FF0"/>
+    <w:multiLevelType w:val="hybridMultilevel"/>
+    <w:tmpl w:val="8C06579A"/>
+    <w:lvl w:ilvl="0" w:tplc="300A000F">
+      <w:start w:val="1"/>
+      <w:numFmt w:val="decimal"/>
+      <w:lvlText w:val="%1."/>
+      <w:lvlJc w:val="left"/>
+      <w:pPr>
+        <w:ind w:left="360" w:hanging="360"/>
+      </w:pPr>
+      <w:rPr>
+        <w:rFonts w:hint="default"/>
+      </w:rPr>
+    </w:lvl>
+    <w:lvl w:ilvl="1" w:tplc="300A0019" w:tentative="1">
+      <w:start w:val="1"/>
+      <w:numFmt w:val="lowerLetter"/>
+      <w:lvlText w:val="%2."/>
+      <w:lvlJc w:val="left"/>
+      <w:pPr>
+        <w:ind w:left="1080" w:hanging="360"/>
+      </w:pPr>
+    </w:lvl>
+    <w:lvl w:ilvl="2" w:tplc="300A001B" w:tentative="1">
+      <w:start w:val="1"/>
+      <w:numFmt w:val="lowerRoman"/>
+      <w:lvlText w:val="%3."/>
+      <w:lvlJc w:val="right"/>
+      <w:pPr>
+        <w:ind w:left="1800" w:hanging="180"/>
+      </w:pPr>
+    </w:lvl>
+    <w:lvl w:ilvl="3" w:tplc="300A000F" w:tentative="1">
+      <w:start w:val="1"/>
+      <w:numFmt w:val="decimal"/>
+      <w:lvlText w:val="%4."/>
+      <w:lvlJc w:val="left"/>
+      <w:pPr>
+        <w:ind w:left="2520" w:hanging="360"/>
+      </w:pPr>
+    </w:lvl>
+    <w:lvl w:ilvl="4" w:tplc="300A0019" w:tentative="1">
+      <w:start w:val="1"/>
+      <w:numFmt w:val="lowerLetter"/>
+      <w:lvlText w:val="%5."/>
+      <w:lvlJc w:val="left"/>
+      <w:pPr>
+        <w:ind w:left="3240" w:hanging="360"/>
+      </w:pPr>
+    </w:lvl>
+    <w:lvl w:ilvl="5" w:tplc="300A001B" w:tentative="1">
+      <w:start w:val="1"/>
+      <w:numFmt w:val="lowerRoman"/>
+      <w:lvlText w:val="%6."/>
+      <w:lvlJc w:val="right"/>
+      <w:pPr>
+        <w:ind w:left="3960" w:hanging="180"/>
+      </w:pPr>
+    </w:lvl>
+    <w:lvl w:ilvl="6" w:tplc="300A000F" w:tentative="1">
+      <w:start w:val="1"/>
+      <w:numFmt w:val="decimal"/>
+      <w:lvlText w:val="%7."/>
+      <w:lvlJc w:val="left"/>
+      <w:pPr>
+        <w:ind w:left="4680" w:hanging="360"/>
+      </w:pPr>
+    </w:lvl>
+    <w:lvl w:ilvl="7" w:tplc="300A0019" w:tentative="1">
+      <w:start w:val="1"/>
+      <w:numFmt w:val="lowerLetter"/>
+      <w:lvlText w:val="%8."/>
+      <w:lvlJc w:val="left"/>
+      <w:pPr>
+        <w:ind w:left="5400" w:hanging="360"/>
+      </w:pPr>
+    </w:lvl>
+    <w:lvl w:ilvl="8" w:tplc="300A001B" w:tentative="1">
+      <w:start w:val="1"/>
+      <w:numFmt w:val="lowerRoman"/>
+      <w:lvlText w:val="%9."/>
+      <w:lvlJc w:val="right"/>
+      <w:pPr>
+        <w:ind w:left="6120" w:hanging="180"/>
+      </w:pPr>
+    </w:lvl>
+  </w:abstractNum>
+  <w:abstractNum w:abstractNumId="9" w15:restartNumberingAfterBreak="0">
     <w:nsid w:val="40DD1A90"/>
     <w:multiLevelType w:val="multilevel"/>
     <w:tmpl w:val="6E5C174A"/>
@@ -3102,7 +4201,7 @@
       </w:rPr>
     </w:lvl>
   </w:abstractNum>
-  <w:abstractNum w:abstractNumId="7" w15:restartNumberingAfterBreak="0">
+  <w:abstractNum w:abstractNumId="10" w15:restartNumberingAfterBreak="0">
     <w:nsid w:val="43722CF5"/>
     <w:multiLevelType w:val="hybridMultilevel"/>
     <w:tmpl w:val="7CCAC0E6"/>
@@ -3188,7 +4287,7 @@
       </w:pPr>
     </w:lvl>
   </w:abstractNum>
-  <w:abstractNum w:abstractNumId="8" w15:restartNumberingAfterBreak="0">
+  <w:abstractNum w:abstractNumId="11" w15:restartNumberingAfterBreak="0">
     <w:nsid w:val="4D4940A8"/>
     <w:multiLevelType w:val="hybridMultilevel"/>
     <w:tmpl w:val="4FEC69F0"/>
@@ -3302,7 +4401,7 @@
       </w:rPr>
     </w:lvl>
   </w:abstractNum>
-  <w:abstractNum w:abstractNumId="9" w15:restartNumberingAfterBreak="0">
+  <w:abstractNum w:abstractNumId="12" w15:restartNumberingAfterBreak="0">
     <w:nsid w:val="4F397A1C"/>
     <w:multiLevelType w:val="multilevel"/>
     <w:tmpl w:val="CCDA827E"/>
@@ -3451,7 +4550,7 @@
       </w:rPr>
     </w:lvl>
   </w:abstractNum>
-  <w:abstractNum w:abstractNumId="10" w15:restartNumberingAfterBreak="0">
+  <w:abstractNum w:abstractNumId="13" w15:restartNumberingAfterBreak="0">
     <w:nsid w:val="54174C12"/>
     <w:multiLevelType w:val="multilevel"/>
     <w:tmpl w:val="15B62650"/>
@@ -3582,7 +4681,7 @@
       </w:rPr>
     </w:lvl>
   </w:abstractNum>
-  <w:abstractNum w:abstractNumId="11" w15:restartNumberingAfterBreak="0">
+  <w:abstractNum w:abstractNumId="14" w15:restartNumberingAfterBreak="0">
     <w:nsid w:val="54517D06"/>
     <w:multiLevelType w:val="hybridMultilevel"/>
     <w:tmpl w:val="3DB0EB80"/>
@@ -3694,7 +4793,7 @@
       </w:rPr>
     </w:lvl>
   </w:abstractNum>
-  <w:abstractNum w:abstractNumId="12" w15:restartNumberingAfterBreak="0">
+  <w:abstractNum w:abstractNumId="15" w15:restartNumberingAfterBreak="0">
     <w:nsid w:val="68E15795"/>
     <w:multiLevelType w:val="hybridMultilevel"/>
     <w:tmpl w:val="8FE616A0"/>
@@ -3807,7 +4906,7 @@
       </w:rPr>
     </w:lvl>
   </w:abstractNum>
-  <w:abstractNum w:abstractNumId="13" w15:restartNumberingAfterBreak="0">
+  <w:abstractNum w:abstractNumId="16" w15:restartNumberingAfterBreak="0">
     <w:nsid w:val="6AFC07D3"/>
     <w:multiLevelType w:val="multilevel"/>
     <w:tmpl w:val="B3426C00"/>
@@ -3920,7 +5019,7 @@
       </w:rPr>
     </w:lvl>
   </w:abstractNum>
-  <w:abstractNum w:abstractNumId="14" w15:restartNumberingAfterBreak="0">
+  <w:abstractNum w:abstractNumId="17" w15:restartNumberingAfterBreak="0">
     <w:nsid w:val="6B7B1E92"/>
     <w:multiLevelType w:val="multilevel"/>
     <w:tmpl w:val="21BA233E"/>
@@ -4051,7 +5150,7 @@
       </w:rPr>
     </w:lvl>
   </w:abstractNum>
-  <w:abstractNum w:abstractNumId="15" w15:restartNumberingAfterBreak="0">
+  <w:abstractNum w:abstractNumId="18" w15:restartNumberingAfterBreak="0">
     <w:nsid w:val="6FA144D3"/>
     <w:multiLevelType w:val="multilevel"/>
     <w:tmpl w:val="98CEB7D6"/>
@@ -4172,7 +5271,7 @@
       </w:rPr>
     </w:lvl>
   </w:abstractNum>
-  <w:abstractNum w:abstractNumId="16" w15:restartNumberingAfterBreak="0">
+  <w:abstractNum w:abstractNumId="19" w15:restartNumberingAfterBreak="0">
     <w:nsid w:val="738344F2"/>
     <w:multiLevelType w:val="hybridMultilevel"/>
     <w:tmpl w:val="C4E037F2"/>
@@ -4287,7 +5386,7 @@
       </w:rPr>
     </w:lvl>
   </w:abstractNum>
-  <w:abstractNum w:abstractNumId="17" w15:restartNumberingAfterBreak="0">
+  <w:abstractNum w:abstractNumId="20" w15:restartNumberingAfterBreak="0">
     <w:nsid w:val="74B1685F"/>
     <w:multiLevelType w:val="hybridMultilevel"/>
     <w:tmpl w:val="943E89B2"/>
@@ -4400,7 +5499,7 @@
       </w:rPr>
     </w:lvl>
   </w:abstractNum>
-  <w:abstractNum w:abstractNumId="18" w15:restartNumberingAfterBreak="0">
+  <w:abstractNum w:abstractNumId="21" w15:restartNumberingAfterBreak="0">
     <w:nsid w:val="75DB1EAD"/>
     <w:multiLevelType w:val="multilevel"/>
     <w:tmpl w:val="F2B0D608"/>
@@ -4513,7 +5612,7 @@
       </w:rPr>
     </w:lvl>
   </w:abstractNum>
-  <w:abstractNum w:abstractNumId="19" w15:restartNumberingAfterBreak="0">
+  <w:abstractNum w:abstractNumId="22" w15:restartNumberingAfterBreak="0">
     <w:nsid w:val="77694BC3"/>
     <w:multiLevelType w:val="hybridMultilevel"/>
     <w:tmpl w:val="8D0A3582"/>
@@ -4626,7 +5725,120 @@
       </w:rPr>
     </w:lvl>
   </w:abstractNum>
-  <w:abstractNum w:abstractNumId="20" w15:restartNumberingAfterBreak="0">
+  <w:abstractNum w:abstractNumId="23" w15:restartNumberingAfterBreak="0">
+    <w:nsid w:val="79FE5F93"/>
+    <w:multiLevelType w:val="hybridMultilevel"/>
+    <w:tmpl w:val="A2A2B2DE"/>
+    <w:lvl w:ilvl="0" w:tplc="300A0003">
+      <w:start w:val="1"/>
+      <w:numFmt w:val="bullet"/>
+      <w:lvlText w:val="o"/>
+      <w:lvlJc w:val="left"/>
+      <w:pPr>
+        <w:ind w:left="720" w:hanging="360"/>
+      </w:pPr>
+      <w:rPr>
+        <w:rFonts w:ascii="Courier New" w:hAnsi="Courier New" w:cs="Courier New" w:hint="default"/>
+      </w:rPr>
+    </w:lvl>
+    <w:lvl w:ilvl="1" w:tplc="300A0003" w:tentative="1">
+      <w:start w:val="1"/>
+      <w:numFmt w:val="bullet"/>
+      <w:lvlText w:val="o"/>
+      <w:lvlJc w:val="left"/>
+      <w:pPr>
+        <w:ind w:left="1440" w:hanging="360"/>
+      </w:pPr>
+      <w:rPr>
+        <w:rFonts w:ascii="Courier New" w:hAnsi="Courier New" w:cs="Courier New" w:hint="default"/>
+      </w:rPr>
+    </w:lvl>
+    <w:lvl w:ilvl="2" w:tplc="300A0005" w:tentative="1">
+      <w:start w:val="1"/>
+      <w:numFmt w:val="bullet"/>
+      <w:lvlText w:val=""/>
+      <w:lvlJc w:val="left"/>
+      <w:pPr>
+        <w:ind w:left="2160" w:hanging="360"/>
+      </w:pPr>
+      <w:rPr>
+        <w:rFonts w:ascii="Wingdings" w:hAnsi="Wingdings" w:hint="default"/>
+      </w:rPr>
+    </w:lvl>
+    <w:lvl w:ilvl="3" w:tplc="300A0001" w:tentative="1">
+      <w:start w:val="1"/>
+      <w:numFmt w:val="bullet"/>
+      <w:lvlText w:val=""/>
+      <w:lvlJc w:val="left"/>
+      <w:pPr>
+        <w:ind w:left="2880" w:hanging="360"/>
+      </w:pPr>
+      <w:rPr>
+        <w:rFonts w:ascii="Symbol" w:hAnsi="Symbol" w:hint="default"/>
+      </w:rPr>
+    </w:lvl>
+    <w:lvl w:ilvl="4" w:tplc="300A0003" w:tentative="1">
+      <w:start w:val="1"/>
+      <w:numFmt w:val="bullet"/>
+      <w:lvlText w:val="o"/>
+      <w:lvlJc w:val="left"/>
+      <w:pPr>
+        <w:ind w:left="3600" w:hanging="360"/>
+      </w:pPr>
+      <w:rPr>
+        <w:rFonts w:ascii="Courier New" w:hAnsi="Courier New" w:cs="Courier New" w:hint="default"/>
+      </w:rPr>
+    </w:lvl>
+    <w:lvl w:ilvl="5" w:tplc="300A0005" w:tentative="1">
+      <w:start w:val="1"/>
+      <w:numFmt w:val="bullet"/>
+      <w:lvlText w:val=""/>
+      <w:lvlJc w:val="left"/>
+      <w:pPr>
+        <w:ind w:left="4320" w:hanging="360"/>
+      </w:pPr>
+      <w:rPr>
+        <w:rFonts w:ascii="Wingdings" w:hAnsi="Wingdings" w:hint="default"/>
+      </w:rPr>
+    </w:lvl>
+    <w:lvl w:ilvl="6" w:tplc="300A0001" w:tentative="1">
+      <w:start w:val="1"/>
+      <w:numFmt w:val="bullet"/>
+      <w:lvlText w:val=""/>
+      <w:lvlJc w:val="left"/>
+      <w:pPr>
+        <w:ind w:left="5040" w:hanging="360"/>
+      </w:pPr>
+      <w:rPr>
+        <w:rFonts w:ascii="Symbol" w:hAnsi="Symbol" w:hint="default"/>
+      </w:rPr>
+    </w:lvl>
+    <w:lvl w:ilvl="7" w:tplc="300A0003" w:tentative="1">
+      <w:start w:val="1"/>
+      <w:numFmt w:val="bullet"/>
+      <w:lvlText w:val="o"/>
+      <w:lvlJc w:val="left"/>
+      <w:pPr>
+        <w:ind w:left="5760" w:hanging="360"/>
+      </w:pPr>
+      <w:rPr>
+        <w:rFonts w:ascii="Courier New" w:hAnsi="Courier New" w:cs="Courier New" w:hint="default"/>
+      </w:rPr>
+    </w:lvl>
+    <w:lvl w:ilvl="8" w:tplc="300A0005" w:tentative="1">
+      <w:start w:val="1"/>
+      <w:numFmt w:val="bullet"/>
+      <w:lvlText w:val=""/>
+      <w:lvlJc w:val="left"/>
+      <w:pPr>
+        <w:ind w:left="6480" w:hanging="360"/>
+      </w:pPr>
+      <w:rPr>
+        <w:rFonts w:ascii="Wingdings" w:hAnsi="Wingdings" w:hint="default"/>
+      </w:rPr>
+    </w:lvl>
+  </w:abstractNum>
+  <w:abstractNum w:abstractNumId="24" w15:restartNumberingAfterBreak="0">
     <w:nsid w:val="7CE94054"/>
     <w:multiLevelType w:val="multilevel"/>
     <w:tmpl w:val="A4D4C1F2"/>
@@ -4741,67 +5953,79 @@
     </w:lvl>
   </w:abstractNum>
   <w:num w:numId="1" w16cid:durableId="1583446607">
-    <w:abstractNumId w:val="6"/>
+    <w:abstractNumId w:val="9"/>
   </w:num>
   <w:num w:numId="2" w16cid:durableId="1161702535">
+    <w:abstractNumId w:val="19"/>
+  </w:num>
+  <w:num w:numId="3" w16cid:durableId="278462607">
+    <w:abstractNumId w:val="18"/>
+  </w:num>
+  <w:num w:numId="4" w16cid:durableId="613749754">
     <w:abstractNumId w:val="16"/>
   </w:num>
-  <w:num w:numId="3" w16cid:durableId="278462607">
-    <w:abstractNumId w:val="15"/>
+  <w:num w:numId="5" w16cid:durableId="1105156356">
+    <w:abstractNumId w:val="24"/>
   </w:num>
-  <w:num w:numId="4" w16cid:durableId="613749754">
+  <w:num w:numId="6" w16cid:durableId="634412190">
     <w:abstractNumId w:val="13"/>
   </w:num>
-  <w:num w:numId="5" w16cid:durableId="1105156356">
-    <w:abstractNumId w:val="20"/>
-  </w:num>
-  <w:num w:numId="6" w16cid:durableId="634412190">
-    <w:abstractNumId w:val="10"/>
-  </w:num>
   <w:num w:numId="7" w16cid:durableId="1977828569">
-    <w:abstractNumId w:val="14"/>
+    <w:abstractNumId w:val="17"/>
   </w:num>
   <w:num w:numId="8" w16cid:durableId="368337943">
-    <w:abstractNumId w:val="18"/>
+    <w:abstractNumId w:val="21"/>
   </w:num>
   <w:num w:numId="9" w16cid:durableId="962729499">
-    <w:abstractNumId w:val="19"/>
+    <w:abstractNumId w:val="22"/>
   </w:num>
   <w:num w:numId="10" w16cid:durableId="1927571658">
     <w:abstractNumId w:val="1"/>
   </w:num>
   <w:num w:numId="11" w16cid:durableId="1692994704">
-    <w:abstractNumId w:val="3"/>
+    <w:abstractNumId w:val="4"/>
   </w:num>
   <w:num w:numId="12" w16cid:durableId="633755636">
-    <w:abstractNumId w:val="11"/>
+    <w:abstractNumId w:val="14"/>
   </w:num>
   <w:num w:numId="13" w16cid:durableId="978875567">
-    <w:abstractNumId w:val="5"/>
+    <w:abstractNumId w:val="6"/>
   </w:num>
   <w:num w:numId="14" w16cid:durableId="1002707692">
-    <w:abstractNumId w:val="8"/>
+    <w:abstractNumId w:val="11"/>
   </w:num>
   <w:num w:numId="15" w16cid:durableId="1257324613">
     <w:abstractNumId w:val="0"/>
   </w:num>
   <w:num w:numId="16" w16cid:durableId="1878276933">
-    <w:abstractNumId w:val="17"/>
+    <w:abstractNumId w:val="20"/>
   </w:num>
   <w:num w:numId="17" w16cid:durableId="1925651546">
-    <w:abstractNumId w:val="12"/>
+    <w:abstractNumId w:val="15"/>
   </w:num>
   <w:num w:numId="18" w16cid:durableId="1629318432">
     <w:abstractNumId w:val="2"/>
   </w:num>
   <w:num w:numId="19" w16cid:durableId="100034139">
-    <w:abstractNumId w:val="9"/>
+    <w:abstractNumId w:val="12"/>
   </w:num>
   <w:num w:numId="20" w16cid:durableId="1510371509">
-    <w:abstractNumId w:val="4"/>
+    <w:abstractNumId w:val="5"/>
   </w:num>
   <w:num w:numId="21" w16cid:durableId="1518696278">
+    <w:abstractNumId w:val="10"/>
+  </w:num>
+  <w:num w:numId="22" w16cid:durableId="1150554554">
+    <w:abstractNumId w:val="8"/>
+  </w:num>
+  <w:num w:numId="23" w16cid:durableId="260190137">
+    <w:abstractNumId w:val="23"/>
+  </w:num>
+  <w:num w:numId="24" w16cid:durableId="174996968">
     <w:abstractNumId w:val="7"/>
+  </w:num>
+  <w:num w:numId="25" w16cid:durableId="490607554">
+    <w:abstractNumId w:val="3"/>
   </w:num>
 </w:numbering>
 </file>

</xml_diff>

<commit_message>
Creacion del diagrama de clases UML y su implementacion en el archivo
</commit_message>
<xml_diff>
--- a/Actividad_1_Pilay_Tyrone.docx
+++ b/Actividad_1_Pilay_Tyrone.docx
@@ -621,6 +621,14 @@
           <w:noProof/>
           <w:lang w:val="es-ES_tradnl" w:eastAsia="es-EC"/>
         </w:rPr>
+        <w:t xml:space="preserve">Repositorio: </w:t>
+      </w:r>
+      <w:r>
+        <w:rPr>
+          <w:rFonts w:ascii="Arial" w:hAnsi="Arial" w:cs="Arial"/>
+          <w:noProof/>
+          <w:lang w:val="es-ES_tradnl" w:eastAsia="es-EC"/>
+        </w:rPr>
         <w:tab/>
       </w:r>
       <w:r>
@@ -2010,6 +2018,867 @@
     </w:p>
     <w:p>
       <w:pPr>
+        <w:rPr>
+          <w:rFonts w:ascii="Arial" w:hAnsi="Arial" w:cs="Arial"/>
+          <w:b/>
+          <w:bCs/>
+          <w:lang w:eastAsia="es-EC"/>
+        </w:rPr>
+      </w:pPr>
+      <w:r>
+        <w:rPr>
+          <w:rFonts w:ascii="Arial" w:hAnsi="Arial" w:cs="Arial"/>
+          <w:b/>
+          <w:bCs/>
+          <w:lang w:eastAsia="es-EC"/>
+        </w:rPr>
+        <w:lastRenderedPageBreak/>
+        <w:t>5. Diagrama de clases UML</w:t>
+      </w:r>
+    </w:p>
+    <w:p>
+      <w:pPr>
+        <w:rPr>
+          <w:rFonts w:ascii="Arial" w:hAnsi="Arial" w:cs="Arial"/>
+          <w:lang w:eastAsia="es-EC"/>
+        </w:rPr>
+      </w:pPr>
+      <w:r>
+        <w:rPr>
+          <w:rFonts w:ascii="Arial" w:hAnsi="Arial" w:cs="Arial"/>
+          <w:lang w:eastAsia="es-EC"/>
+        </w:rPr>
+        <w:t>Propongo estas clases principales:</w:t>
+      </w:r>
+      <w:r>
+        <w:rPr>
+          <w:rFonts w:ascii="Arial" w:hAnsi="Arial" w:cs="Arial"/>
+          <w:lang w:eastAsia="es-EC"/>
+        </w:rPr>
+        <w:t xml:space="preserve"> </w:t>
+      </w:r>
+    </w:p>
+    <w:tbl>
+      <w:tblPr>
+        <w:tblStyle w:val="Tablaconcuadrcula5oscura-nfasis5"/>
+        <w:tblW w:w="0" w:type="auto"/>
+        <w:tblLook w:val="04A0" w:firstRow="1" w:lastRow="0" w:firstColumn="1" w:lastColumn="0" w:noHBand="0" w:noVBand="1"/>
+      </w:tblPr>
+      <w:tblGrid>
+        <w:gridCol w:w="4247"/>
+        <w:gridCol w:w="4247"/>
+      </w:tblGrid>
+      <w:tr>
+        <w:trPr>
+          <w:cnfStyle w:val="100000000000" w:firstRow="1" w:lastRow="0" w:firstColumn="0" w:lastColumn="0" w:oddVBand="0" w:evenVBand="0" w:oddHBand="0" w:evenHBand="0" w:firstRowFirstColumn="0" w:firstRowLastColumn="0" w:lastRowFirstColumn="0" w:lastRowLastColumn="0"/>
+        </w:trPr>
+        <w:tc>
+          <w:tcPr>
+            <w:cnfStyle w:val="001000000000" w:firstRow="0" w:lastRow="0" w:firstColumn="1" w:lastColumn="0" w:oddVBand="0" w:evenVBand="0" w:oddHBand="0" w:evenHBand="0" w:firstRowFirstColumn="0" w:firstRowLastColumn="0" w:lastRowFirstColumn="0" w:lastRowLastColumn="0"/>
+            <w:tcW w:w="4247" w:type="dxa"/>
+          </w:tcPr>
+          <w:p>
+            <w:pPr>
+              <w:rPr>
+                <w:rFonts w:ascii="Arial" w:hAnsi="Arial" w:cs="Arial"/>
+                <w:lang w:eastAsia="es-EC"/>
+              </w:rPr>
+            </w:pPr>
+            <w:r>
+              <w:t>Clase</w:t>
+            </w:r>
+          </w:p>
+        </w:tc>
+        <w:tc>
+          <w:tcPr>
+            <w:tcW w:w="4247" w:type="dxa"/>
+          </w:tcPr>
+          <w:p>
+            <w:pPr>
+              <w:cnfStyle w:val="100000000000" w:firstRow="1" w:lastRow="0" w:firstColumn="0" w:lastColumn="0" w:oddVBand="0" w:evenVBand="0" w:oddHBand="0" w:evenHBand="0" w:firstRowFirstColumn="0" w:firstRowLastColumn="0" w:lastRowFirstColumn="0" w:lastRowLastColumn="0"/>
+              <w:rPr>
+                <w:rFonts w:ascii="Arial" w:hAnsi="Arial" w:cs="Arial"/>
+                <w:lang w:eastAsia="es-EC"/>
+              </w:rPr>
+            </w:pPr>
+            <w:r>
+              <w:t>Responsabilidad</w:t>
+            </w:r>
+          </w:p>
+        </w:tc>
+      </w:tr>
+      <w:tr>
+        <w:trPr>
+          <w:cnfStyle w:val="000000100000" w:firstRow="0" w:lastRow="0" w:firstColumn="0" w:lastColumn="0" w:oddVBand="0" w:evenVBand="0" w:oddHBand="1" w:evenHBand="0" w:firstRowFirstColumn="0" w:firstRowLastColumn="0" w:lastRowFirstColumn="0" w:lastRowLastColumn="0"/>
+        </w:trPr>
+        <w:tc>
+          <w:tcPr>
+            <w:cnfStyle w:val="001000000000" w:firstRow="0" w:lastRow="0" w:firstColumn="1" w:lastColumn="0" w:oddVBand="0" w:evenVBand="0" w:oddHBand="0" w:evenHBand="0" w:firstRowFirstColumn="0" w:firstRowLastColumn="0" w:lastRowFirstColumn="0" w:lastRowLastColumn="0"/>
+            <w:tcW w:w="4247" w:type="dxa"/>
+          </w:tcPr>
+          <w:p>
+            <w:pPr>
+              <w:rPr>
+                <w:rFonts w:ascii="Arial" w:hAnsi="Arial" w:cs="Arial"/>
+                <w:lang w:eastAsia="es-EC"/>
+              </w:rPr>
+            </w:pPr>
+            <w:proofErr w:type="spellStart"/>
+            <w:r>
+              <w:t>CasoRescate</w:t>
+            </w:r>
+            <w:proofErr w:type="spellEnd"/>
+          </w:p>
+        </w:tc>
+        <w:tc>
+          <w:tcPr>
+            <w:tcW w:w="4247" w:type="dxa"/>
+          </w:tcPr>
+          <w:p>
+            <w:pPr>
+              <w:cnfStyle w:val="000000100000" w:firstRow="0" w:lastRow="0" w:firstColumn="0" w:lastColumn="0" w:oddVBand="0" w:evenVBand="0" w:oddHBand="1" w:evenHBand="0" w:firstRowFirstColumn="0" w:firstRowLastColumn="0" w:lastRowFirstColumn="0" w:lastRowLastColumn="0"/>
+              <w:rPr>
+                <w:rFonts w:ascii="Arial" w:hAnsi="Arial" w:cs="Arial"/>
+                <w:lang w:eastAsia="es-EC"/>
+              </w:rPr>
+            </w:pPr>
+            <w:r>
+              <w:t>Registrar el caso, su fecha, ubicación y estado actual.</w:t>
+            </w:r>
+          </w:p>
+        </w:tc>
+      </w:tr>
+      <w:tr>
+        <w:tc>
+          <w:tcPr>
+            <w:cnfStyle w:val="001000000000" w:firstRow="0" w:lastRow="0" w:firstColumn="1" w:lastColumn="0" w:oddVBand="0" w:evenVBand="0" w:oddHBand="0" w:evenHBand="0" w:firstRowFirstColumn="0" w:firstRowLastColumn="0" w:lastRowFirstColumn="0" w:lastRowLastColumn="0"/>
+            <w:tcW w:w="4247" w:type="dxa"/>
+          </w:tcPr>
+          <w:p>
+            <w:pPr>
+              <w:rPr>
+                <w:rFonts w:ascii="Arial" w:hAnsi="Arial" w:cs="Arial"/>
+                <w:lang w:eastAsia="es-EC"/>
+              </w:rPr>
+            </w:pPr>
+            <w:r>
+              <w:t>Animal</w:t>
+            </w:r>
+          </w:p>
+        </w:tc>
+        <w:tc>
+          <w:tcPr>
+            <w:tcW w:w="4247" w:type="dxa"/>
+          </w:tcPr>
+          <w:p>
+            <w:pPr>
+              <w:cnfStyle w:val="000000000000" w:firstRow="0" w:lastRow="0" w:firstColumn="0" w:lastColumn="0" w:oddVBand="0" w:evenVBand="0" w:oddHBand="0" w:evenHBand="0" w:firstRowFirstColumn="0" w:firstRowLastColumn="0" w:lastRowFirstColumn="0" w:lastRowLastColumn="0"/>
+              <w:rPr>
+                <w:rFonts w:ascii="Arial" w:hAnsi="Arial" w:cs="Arial"/>
+                <w:lang w:eastAsia="es-EC"/>
+              </w:rPr>
+            </w:pPr>
+            <w:r>
+              <w:t>Mantener los datos generales del animal rescatado.</w:t>
+            </w:r>
+          </w:p>
+        </w:tc>
+      </w:tr>
+      <w:tr>
+        <w:trPr>
+          <w:cnfStyle w:val="000000100000" w:firstRow="0" w:lastRow="0" w:firstColumn="0" w:lastColumn="0" w:oddVBand="0" w:evenVBand="0" w:oddHBand="1" w:evenHBand="0" w:firstRowFirstColumn="0" w:firstRowLastColumn="0" w:lastRowFirstColumn="0" w:lastRowLastColumn="0"/>
+        </w:trPr>
+        <w:tc>
+          <w:tcPr>
+            <w:cnfStyle w:val="001000000000" w:firstRow="0" w:lastRow="0" w:firstColumn="1" w:lastColumn="0" w:oddVBand="0" w:evenVBand="0" w:oddHBand="0" w:evenHBand="0" w:firstRowFirstColumn="0" w:firstRowLastColumn="0" w:lastRowFirstColumn="0" w:lastRowLastColumn="0"/>
+            <w:tcW w:w="4247" w:type="dxa"/>
+          </w:tcPr>
+          <w:p>
+            <w:pPr>
+              <w:rPr>
+                <w:rFonts w:ascii="Arial" w:hAnsi="Arial" w:cs="Arial"/>
+                <w:lang w:eastAsia="es-EC"/>
+              </w:rPr>
+            </w:pPr>
+            <w:r>
+              <w:t xml:space="preserve">Perro, Gato, </w:t>
+            </w:r>
+            <w:proofErr w:type="spellStart"/>
+            <w:r>
+              <w:t>FaunaSilvestre</w:t>
+            </w:r>
+            <w:proofErr w:type="spellEnd"/>
+          </w:p>
+        </w:tc>
+        <w:tc>
+          <w:tcPr>
+            <w:tcW w:w="4247" w:type="dxa"/>
+          </w:tcPr>
+          <w:p>
+            <w:pPr>
+              <w:cnfStyle w:val="000000100000" w:firstRow="0" w:lastRow="0" w:firstColumn="0" w:lastColumn="0" w:oddVBand="0" w:evenVBand="0" w:oddHBand="1" w:evenHBand="0" w:firstRowFirstColumn="0" w:firstRowLastColumn="0" w:lastRowFirstColumn="0" w:lastRowLastColumn="0"/>
+              <w:rPr>
+                <w:rFonts w:ascii="Arial" w:hAnsi="Arial" w:cs="Arial"/>
+                <w:lang w:eastAsia="es-EC"/>
+              </w:rPr>
+            </w:pPr>
+            <w:r>
+              <w:t>Representar los distintos tipos de animales mediante herencia.</w:t>
+            </w:r>
+          </w:p>
+        </w:tc>
+      </w:tr>
+      <w:tr>
+        <w:tc>
+          <w:tcPr>
+            <w:cnfStyle w:val="001000000000" w:firstRow="0" w:lastRow="0" w:firstColumn="1" w:lastColumn="0" w:oddVBand="0" w:evenVBand="0" w:oddHBand="0" w:evenHBand="0" w:firstRowFirstColumn="0" w:firstRowLastColumn="0" w:lastRowFirstColumn="0" w:lastRowLastColumn="0"/>
+            <w:tcW w:w="4247" w:type="dxa"/>
+          </w:tcPr>
+          <w:p>
+            <w:pPr>
+              <w:rPr>
+                <w:rFonts w:ascii="Arial" w:hAnsi="Arial" w:cs="Arial"/>
+                <w:lang w:eastAsia="es-EC"/>
+              </w:rPr>
+            </w:pPr>
+            <w:r>
+              <w:t>Expediente</w:t>
+            </w:r>
+          </w:p>
+        </w:tc>
+        <w:tc>
+          <w:tcPr>
+            <w:tcW w:w="4247" w:type="dxa"/>
+          </w:tcPr>
+          <w:p>
+            <w:pPr>
+              <w:cnfStyle w:val="000000000000" w:firstRow="0" w:lastRow="0" w:firstColumn="0" w:lastColumn="0" w:oddVBand="0" w:evenVBand="0" w:oddHBand="0" w:evenHBand="0" w:firstRowFirstColumn="0" w:firstRowLastColumn="0" w:lastRowFirstColumn="0" w:lastRowLastColumn="0"/>
+              <w:rPr>
+                <w:rFonts w:ascii="Arial" w:hAnsi="Arial" w:cs="Arial"/>
+                <w:lang w:eastAsia="es-EC"/>
+              </w:rPr>
+            </w:pPr>
+            <w:r>
+              <w:t>Guardar el historial y la información de atención del animal.</w:t>
+            </w:r>
+          </w:p>
+        </w:tc>
+      </w:tr>
+      <w:tr>
+        <w:trPr>
+          <w:cnfStyle w:val="000000100000" w:firstRow="0" w:lastRow="0" w:firstColumn="0" w:lastColumn="0" w:oddVBand="0" w:evenVBand="0" w:oddHBand="1" w:evenHBand="0" w:firstRowFirstColumn="0" w:firstRowLastColumn="0" w:lastRowFirstColumn="0" w:lastRowLastColumn="0"/>
+        </w:trPr>
+        <w:tc>
+          <w:tcPr>
+            <w:cnfStyle w:val="001000000000" w:firstRow="0" w:lastRow="0" w:firstColumn="1" w:lastColumn="0" w:oddVBand="0" w:evenVBand="0" w:oddHBand="0" w:evenHBand="0" w:firstRowFirstColumn="0" w:firstRowLastColumn="0" w:lastRowFirstColumn="0" w:lastRowLastColumn="0"/>
+            <w:tcW w:w="4247" w:type="dxa"/>
+          </w:tcPr>
+          <w:p>
+            <w:pPr>
+              <w:rPr>
+                <w:rFonts w:ascii="Arial" w:hAnsi="Arial" w:cs="Arial"/>
+                <w:lang w:eastAsia="es-EC"/>
+              </w:rPr>
+            </w:pPr>
+            <w:r>
+              <w:t>Usuario</w:t>
+            </w:r>
+          </w:p>
+        </w:tc>
+        <w:tc>
+          <w:tcPr>
+            <w:tcW w:w="4247" w:type="dxa"/>
+          </w:tcPr>
+          <w:p>
+            <w:pPr>
+              <w:cnfStyle w:val="000000100000" w:firstRow="0" w:lastRow="0" w:firstColumn="0" w:lastColumn="0" w:oddVBand="0" w:evenVBand="0" w:oddHBand="1" w:evenHBand="0" w:firstRowFirstColumn="0" w:firstRowLastColumn="0" w:lastRowFirstColumn="0" w:lastRowLastColumn="0"/>
+              <w:rPr>
+                <w:rFonts w:ascii="Arial" w:hAnsi="Arial" w:cs="Arial"/>
+                <w:lang w:eastAsia="es-EC"/>
+              </w:rPr>
+            </w:pPr>
+            <w:r>
+              <w:t>Mantener los datos comunes de los usuarios.</w:t>
+            </w:r>
+          </w:p>
+        </w:tc>
+      </w:tr>
+      <w:tr>
+        <w:tc>
+          <w:tcPr>
+            <w:cnfStyle w:val="001000000000" w:firstRow="0" w:lastRow="0" w:firstColumn="1" w:lastColumn="0" w:oddVBand="0" w:evenVBand="0" w:oddHBand="0" w:evenHBand="0" w:firstRowFirstColumn="0" w:firstRowLastColumn="0" w:lastRowFirstColumn="0" w:lastRowLastColumn="0"/>
+            <w:tcW w:w="4247" w:type="dxa"/>
+          </w:tcPr>
+          <w:p>
+            <w:pPr>
+              <w:rPr>
+                <w:rFonts w:ascii="Arial" w:hAnsi="Arial" w:cs="Arial"/>
+                <w:lang w:eastAsia="es-EC"/>
+              </w:rPr>
+            </w:pPr>
+            <w:r>
+              <w:t>Voluntario</w:t>
+            </w:r>
+          </w:p>
+        </w:tc>
+        <w:tc>
+          <w:tcPr>
+            <w:tcW w:w="4247" w:type="dxa"/>
+          </w:tcPr>
+          <w:p>
+            <w:pPr>
+              <w:cnfStyle w:val="000000000000" w:firstRow="0" w:lastRow="0" w:firstColumn="0" w:lastColumn="0" w:oddVBand="0" w:evenVBand="0" w:oddHBand="0" w:evenHBand="0" w:firstRowFirstColumn="0" w:firstRowLastColumn="0" w:lastRowFirstColumn="0" w:lastRowLastColumn="0"/>
+              <w:rPr>
+                <w:rFonts w:ascii="Arial" w:hAnsi="Arial" w:cs="Arial"/>
+                <w:lang w:eastAsia="es-EC"/>
+              </w:rPr>
+            </w:pPr>
+            <w:r>
+              <w:t>Representar al personal que atiende los casos.</w:t>
+            </w:r>
+          </w:p>
+        </w:tc>
+      </w:tr>
+      <w:tr>
+        <w:trPr>
+          <w:cnfStyle w:val="000000100000" w:firstRow="0" w:lastRow="0" w:firstColumn="0" w:lastColumn="0" w:oddVBand="0" w:evenVBand="0" w:oddHBand="1" w:evenHBand="0" w:firstRowFirstColumn="0" w:firstRowLastColumn="0" w:lastRowFirstColumn="0" w:lastRowLastColumn="0"/>
+        </w:trPr>
+        <w:tc>
+          <w:tcPr>
+            <w:cnfStyle w:val="001000000000" w:firstRow="0" w:lastRow="0" w:firstColumn="1" w:lastColumn="0" w:oddVBand="0" w:evenVBand="0" w:oddHBand="0" w:evenHBand="0" w:firstRowFirstColumn="0" w:firstRowLastColumn="0" w:lastRowFirstColumn="0" w:lastRowLastColumn="0"/>
+            <w:tcW w:w="4247" w:type="dxa"/>
+          </w:tcPr>
+          <w:p>
+            <w:pPr>
+              <w:rPr>
+                <w:rFonts w:ascii="Arial" w:hAnsi="Arial" w:cs="Arial"/>
+                <w:lang w:eastAsia="es-EC"/>
+              </w:rPr>
+            </w:pPr>
+            <w:r>
+              <w:t>Administrador</w:t>
+            </w:r>
+          </w:p>
+        </w:tc>
+        <w:tc>
+          <w:tcPr>
+            <w:tcW w:w="4247" w:type="dxa"/>
+          </w:tcPr>
+          <w:p>
+            <w:pPr>
+              <w:cnfStyle w:val="000000100000" w:firstRow="0" w:lastRow="0" w:firstColumn="0" w:lastColumn="0" w:oddVBand="0" w:evenVBand="0" w:oddHBand="1" w:evenHBand="0" w:firstRowFirstColumn="0" w:firstRowLastColumn="0" w:lastRowFirstColumn="0" w:lastRowLastColumn="0"/>
+              <w:rPr>
+                <w:rFonts w:ascii="Arial" w:hAnsi="Arial" w:cs="Arial"/>
+                <w:lang w:eastAsia="es-EC"/>
+              </w:rPr>
+            </w:pPr>
+            <w:r>
+              <w:t>Gestionar los casos y asignar responsables.</w:t>
+            </w:r>
+          </w:p>
+        </w:tc>
+      </w:tr>
+      <w:tr>
+        <w:tc>
+          <w:tcPr>
+            <w:cnfStyle w:val="001000000000" w:firstRow="0" w:lastRow="0" w:firstColumn="1" w:lastColumn="0" w:oddVBand="0" w:evenVBand="0" w:oddHBand="0" w:evenHBand="0" w:firstRowFirstColumn="0" w:firstRowLastColumn="0" w:lastRowFirstColumn="0" w:lastRowLastColumn="0"/>
+            <w:tcW w:w="4247" w:type="dxa"/>
+          </w:tcPr>
+          <w:p>
+            <w:pPr>
+              <w:rPr>
+                <w:rFonts w:ascii="Arial" w:hAnsi="Arial" w:cs="Arial"/>
+                <w:lang w:eastAsia="es-EC"/>
+              </w:rPr>
+            </w:pPr>
+            <w:proofErr w:type="spellStart"/>
+            <w:r>
+              <w:t>GestorCasos</w:t>
+            </w:r>
+            <w:proofErr w:type="spellEnd"/>
+          </w:p>
+        </w:tc>
+        <w:tc>
+          <w:tcPr>
+            <w:tcW w:w="4247" w:type="dxa"/>
+          </w:tcPr>
+          <w:p>
+            <w:pPr>
+              <w:cnfStyle w:val="000000000000" w:firstRow="0" w:lastRow="0" w:firstColumn="0" w:lastColumn="0" w:oddVBand="0" w:evenVBand="0" w:oddHBand="0" w:evenHBand="0" w:firstRowFirstColumn="0" w:firstRowLastColumn="0" w:lastRowFirstColumn="0" w:lastRowLastColumn="0"/>
+              <w:rPr>
+                <w:rFonts w:ascii="Arial" w:hAnsi="Arial" w:cs="Arial"/>
+                <w:lang w:eastAsia="es-EC"/>
+              </w:rPr>
+            </w:pPr>
+            <w:r>
+              <w:t>Centralizar las operaciones relacionadas con los casos.</w:t>
+            </w:r>
+          </w:p>
+        </w:tc>
+      </w:tr>
+      <w:tr>
+        <w:trPr>
+          <w:cnfStyle w:val="000000100000" w:firstRow="0" w:lastRow="0" w:firstColumn="0" w:lastColumn="0" w:oddVBand="0" w:evenVBand="0" w:oddHBand="1" w:evenHBand="0" w:firstRowFirstColumn="0" w:firstRowLastColumn="0" w:lastRowFirstColumn="0" w:lastRowLastColumn="0"/>
+        </w:trPr>
+        <w:tc>
+          <w:tcPr>
+            <w:cnfStyle w:val="001000000000" w:firstRow="0" w:lastRow="0" w:firstColumn="1" w:lastColumn="0" w:oddVBand="0" w:evenVBand="0" w:oddHBand="0" w:evenHBand="0" w:firstRowFirstColumn="0" w:firstRowLastColumn="0" w:lastRowFirstColumn="0" w:lastRowLastColumn="0"/>
+            <w:tcW w:w="4247" w:type="dxa"/>
+          </w:tcPr>
+          <w:p>
+            <w:pPr>
+              <w:rPr>
+                <w:rFonts w:ascii="Arial" w:hAnsi="Arial" w:cs="Arial"/>
+                <w:lang w:eastAsia="es-EC"/>
+              </w:rPr>
+            </w:pPr>
+            <w:r>
+              <w:t>Notificador</w:t>
+            </w:r>
+          </w:p>
+        </w:tc>
+        <w:tc>
+          <w:tcPr>
+            <w:tcW w:w="4247" w:type="dxa"/>
+          </w:tcPr>
+          <w:p>
+            <w:pPr>
+              <w:cnfStyle w:val="000000100000" w:firstRow="0" w:lastRow="0" w:firstColumn="0" w:lastColumn="0" w:oddVBand="0" w:evenVBand="0" w:oddHBand="1" w:evenHBand="0" w:firstRowFirstColumn="0" w:firstRowLastColumn="0" w:lastRowFirstColumn="0" w:lastRowLastColumn="0"/>
+              <w:rPr>
+                <w:rFonts w:ascii="Arial" w:hAnsi="Arial" w:cs="Arial"/>
+                <w:lang w:eastAsia="es-EC"/>
+              </w:rPr>
+            </w:pPr>
+            <w:r>
+              <w:t>Avisar a los voluntarios cuando se registra un nuevo rescate.</w:t>
+            </w:r>
+          </w:p>
+        </w:tc>
+      </w:tr>
+      <w:tr>
+        <w:tc>
+          <w:tcPr>
+            <w:cnfStyle w:val="001000000000" w:firstRow="0" w:lastRow="0" w:firstColumn="1" w:lastColumn="0" w:oddVBand="0" w:evenVBand="0" w:oddHBand="0" w:evenHBand="0" w:firstRowFirstColumn="0" w:firstRowLastColumn="0" w:lastRowFirstColumn="0" w:lastRowLastColumn="0"/>
+            <w:tcW w:w="4247" w:type="dxa"/>
+          </w:tcPr>
+          <w:p>
+            <w:pPr>
+              <w:rPr>
+                <w:rFonts w:ascii="Arial" w:hAnsi="Arial" w:cs="Arial"/>
+                <w:lang w:eastAsia="es-EC"/>
+              </w:rPr>
+            </w:pPr>
+            <w:proofErr w:type="spellStart"/>
+            <w:r>
+              <w:t>AnimalFactory</w:t>
+            </w:r>
+            <w:proofErr w:type="spellEnd"/>
+          </w:p>
+        </w:tc>
+        <w:tc>
+          <w:tcPr>
+            <w:tcW w:w="4247" w:type="dxa"/>
+          </w:tcPr>
+          <w:p>
+            <w:pPr>
+              <w:cnfStyle w:val="000000000000" w:firstRow="0" w:lastRow="0" w:firstColumn="0" w:lastColumn="0" w:oddVBand="0" w:evenVBand="0" w:oddHBand="0" w:evenHBand="0" w:firstRowFirstColumn="0" w:firstRowLastColumn="0" w:lastRowFirstColumn="0" w:lastRowLastColumn="0"/>
+              <w:rPr>
+                <w:rFonts w:ascii="Arial" w:hAnsi="Arial" w:cs="Arial"/>
+                <w:lang w:eastAsia="es-EC"/>
+              </w:rPr>
+            </w:pPr>
+            <w:r>
+              <w:t>Crear el tipo de animal correspondiente según la especie.</w:t>
+            </w:r>
+          </w:p>
+        </w:tc>
+      </w:tr>
+    </w:tbl>
+    <w:p>
+      <w:pPr>
+        <w:rPr>
+          <w:rFonts w:ascii="Arial" w:hAnsi="Arial" w:cs="Arial"/>
+          <w:lang w:eastAsia="es-EC"/>
+        </w:rPr>
+      </w:pPr>
+      <w:r>
+        <w:rPr>
+          <w:rFonts w:ascii="Arial" w:hAnsi="Arial" w:cs="Arial"/>
+          <w:lang w:eastAsia="es-EC"/>
+        </w:rPr>
+        <w:br w:type="page"/>
+      </w:r>
+      <w:r>
+        <w:rPr>
+          <w:rFonts w:ascii="Arial" w:hAnsi="Arial" w:cs="Arial"/>
+          <w:lang w:eastAsia="es-EC"/>
+        </w:rPr>
+        <w:drawing>
+          <wp:anchor distT="0" distB="0" distL="114300" distR="114300" simplePos="0" relativeHeight="251669504" behindDoc="0" locked="0" layoutInCell="1" allowOverlap="1" wp14:anchorId="4271FB07" wp14:editId="29B81D1A">
+            <wp:simplePos x="0" y="0"/>
+            <wp:positionH relativeFrom="column">
+              <wp:posOffset>0</wp:posOffset>
+            </wp:positionH>
+            <wp:positionV relativeFrom="paragraph">
+              <wp:posOffset>272415</wp:posOffset>
+            </wp:positionV>
+            <wp:extent cx="5400040" cy="4004310"/>
+            <wp:effectExtent l="0" t="0" r="0" b="0"/>
+            <wp:wrapTopAndBottom/>
+            <wp:docPr id="3" name="Imagen 3"/>
+            <wp:cNvGraphicFramePr>
+              <a:graphicFrameLocks xmlns:a="http://schemas.openxmlformats.org/drawingml/2006/main" noChangeAspect="1"/>
+            </wp:cNvGraphicFramePr>
+            <a:graphic xmlns:a="http://schemas.openxmlformats.org/drawingml/2006/main">
+              <a:graphicData uri="http://schemas.openxmlformats.org/drawingml/2006/picture">
+                <pic:pic xmlns:pic="http://schemas.openxmlformats.org/drawingml/2006/picture">
+                  <pic:nvPicPr>
+                    <pic:cNvPr id="1" name=""/>
+                    <pic:cNvPicPr/>
+                  </pic:nvPicPr>
+                  <pic:blipFill>
+                    <a:blip r:embed="rId15"/>
+                    <a:stretch>
+                      <a:fillRect/>
+                    </a:stretch>
+                  </pic:blipFill>
+                  <pic:spPr>
+                    <a:xfrm>
+                      <a:off x="0" y="0"/>
+                      <a:ext cx="5400040" cy="4004310"/>
+                    </a:xfrm>
+                    <a:prstGeom prst="rect">
+                      <a:avLst/>
+                    </a:prstGeom>
+                  </pic:spPr>
+                </pic:pic>
+              </a:graphicData>
+            </a:graphic>
+          </wp:anchor>
+        </w:drawing>
+      </w:r>
+    </w:p>
+    <w:p>
+      <w:pPr>
+        <w:pStyle w:val="Prrafodelista"/>
+        <w:numPr>
+          <w:ilvl w:val="1"/>
+          <w:numId w:val="22"/>
+        </w:numPr>
+        <w:rPr>
+          <w:rFonts w:ascii="Arial" w:hAnsi="Arial" w:cs="Arial"/>
+          <w:b/>
+          <w:bCs/>
+          <w:lang w:eastAsia="es-EC"/>
+        </w:rPr>
+      </w:pPr>
+      <w:r>
+        <w:rPr>
+          <w:rFonts w:ascii="Arial" w:hAnsi="Arial" w:cs="Arial"/>
+          <w:b/>
+          <w:bCs/>
+          <w:lang w:eastAsia="es-EC"/>
+        </w:rPr>
+        <w:lastRenderedPageBreak/>
+        <w:t>Aplicación de patrones de diseño</w:t>
+      </w:r>
+    </w:p>
+    <w:p>
+      <w:pPr>
+        <w:ind w:left="360"/>
+        <w:rPr>
+          <w:rFonts w:ascii="Arial" w:hAnsi="Arial" w:cs="Arial"/>
+          <w:lang w:eastAsia="es-EC"/>
+        </w:rPr>
+      </w:pPr>
+      <w:proofErr w:type="spellStart"/>
+      <w:r>
+        <w:rPr>
+          <w:rFonts w:ascii="Arial" w:hAnsi="Arial" w:cs="Arial"/>
+          <w:b/>
+          <w:bCs/>
+          <w:lang w:eastAsia="es-EC"/>
+        </w:rPr>
+        <w:t>Singleton</w:t>
+      </w:r>
+      <w:proofErr w:type="spellEnd"/>
+      <w:r>
+        <w:rPr>
+          <w:rFonts w:ascii="Arial" w:hAnsi="Arial" w:cs="Arial"/>
+          <w:b/>
+          <w:bCs/>
+          <w:lang w:eastAsia="es-EC"/>
+        </w:rPr>
+        <w:t>:</w:t>
+      </w:r>
+      <w:r>
+        <w:rPr>
+          <w:rFonts w:ascii="Arial" w:hAnsi="Arial" w:cs="Arial"/>
+          <w:lang w:eastAsia="es-EC"/>
+        </w:rPr>
+        <w:t xml:space="preserve"> se aplica en la clase </w:t>
+      </w:r>
+      <w:proofErr w:type="spellStart"/>
+      <w:r>
+        <w:rPr>
+          <w:rFonts w:ascii="Arial" w:hAnsi="Arial" w:cs="Arial"/>
+          <w:lang w:eastAsia="es-EC"/>
+        </w:rPr>
+        <w:t>GestorCasos</w:t>
+      </w:r>
+      <w:proofErr w:type="spellEnd"/>
+      <w:r>
+        <w:rPr>
+          <w:rFonts w:ascii="Arial" w:hAnsi="Arial" w:cs="Arial"/>
+          <w:lang w:eastAsia="es-EC"/>
+        </w:rPr>
+        <w:t>, que centraliza la gestión de los casos de rescate y asegura que solo exista una instancia del gestor.</w:t>
+      </w:r>
+    </w:p>
+    <w:p>
+      <w:pPr>
+        <w:ind w:left="360"/>
+        <w:rPr>
+          <w:rFonts w:ascii="Arial" w:hAnsi="Arial" w:cs="Arial"/>
+          <w:lang w:eastAsia="es-EC"/>
+        </w:rPr>
+      </w:pPr>
+      <w:proofErr w:type="spellStart"/>
+      <w:r>
+        <w:rPr>
+          <w:rFonts w:ascii="Arial" w:hAnsi="Arial" w:cs="Arial"/>
+          <w:b/>
+          <w:bCs/>
+          <w:lang w:eastAsia="es-EC"/>
+        </w:rPr>
+        <w:t>Observer</w:t>
+      </w:r>
+      <w:proofErr w:type="spellEnd"/>
+      <w:r>
+        <w:rPr>
+          <w:rFonts w:ascii="Arial" w:hAnsi="Arial" w:cs="Arial"/>
+          <w:b/>
+          <w:bCs/>
+          <w:lang w:eastAsia="es-EC"/>
+        </w:rPr>
+        <w:t>:</w:t>
+      </w:r>
+      <w:r>
+        <w:rPr>
+          <w:rFonts w:ascii="Arial" w:hAnsi="Arial" w:cs="Arial"/>
+          <w:lang w:eastAsia="es-EC"/>
+        </w:rPr>
+        <w:t xml:space="preserve"> se usa a través de las clases Notificador y Observador, lo que permite avisar a los voluntarios cuando se registra un nuevo caso de rescate.</w:t>
+      </w:r>
+    </w:p>
+    <w:p>
+      <w:pPr>
+        <w:ind w:left="360"/>
+        <w:rPr>
+          <w:rFonts w:ascii="Arial" w:hAnsi="Arial" w:cs="Arial"/>
+          <w:lang w:eastAsia="es-EC"/>
+        </w:rPr>
+      </w:pPr>
+      <w:r>
+        <w:rPr>
+          <w:rFonts w:ascii="Arial" w:hAnsi="Arial" w:cs="Arial"/>
+          <w:b/>
+          <w:bCs/>
+          <w:lang w:eastAsia="es-EC"/>
+        </w:rPr>
+        <w:t xml:space="preserve">Factory </w:t>
+      </w:r>
+      <w:proofErr w:type="spellStart"/>
+      <w:r>
+        <w:rPr>
+          <w:rFonts w:ascii="Arial" w:hAnsi="Arial" w:cs="Arial"/>
+          <w:b/>
+          <w:bCs/>
+          <w:lang w:eastAsia="es-EC"/>
+        </w:rPr>
+        <w:t>Method</w:t>
+      </w:r>
+      <w:proofErr w:type="spellEnd"/>
+      <w:r>
+        <w:rPr>
+          <w:rFonts w:ascii="Arial" w:hAnsi="Arial" w:cs="Arial"/>
+          <w:b/>
+          <w:bCs/>
+          <w:lang w:eastAsia="es-EC"/>
+        </w:rPr>
+        <w:t>:</w:t>
+      </w:r>
+      <w:r>
+        <w:rPr>
+          <w:rFonts w:ascii="Arial" w:hAnsi="Arial" w:cs="Arial"/>
+          <w:lang w:eastAsia="es-EC"/>
+        </w:rPr>
+        <w:t xml:space="preserve"> se implementa con </w:t>
+      </w:r>
+      <w:proofErr w:type="spellStart"/>
+      <w:r>
+        <w:rPr>
+          <w:rFonts w:ascii="Arial" w:hAnsi="Arial" w:cs="Arial"/>
+          <w:lang w:eastAsia="es-EC"/>
+        </w:rPr>
+        <w:t>AnimalFactory</w:t>
+      </w:r>
+      <w:proofErr w:type="spellEnd"/>
+      <w:r>
+        <w:rPr>
+          <w:rFonts w:ascii="Arial" w:hAnsi="Arial" w:cs="Arial"/>
+          <w:lang w:eastAsia="es-EC"/>
+        </w:rPr>
+        <w:t xml:space="preserve"> y sus fábricas específicas, que se encargan de crear objetos según la especie del animal, ya sea perro, gato o fauna silvestre.</w:t>
+      </w:r>
+    </w:p>
+    <w:p>
+      <w:pPr>
+        <w:ind w:left="360"/>
+        <w:rPr>
+          <w:rFonts w:ascii="Arial" w:hAnsi="Arial" w:cs="Arial"/>
+          <w:lang w:eastAsia="es-EC"/>
+        </w:rPr>
+      </w:pPr>
+      <w:r>
+        <w:rPr>
+          <w:rFonts w:ascii="Arial" w:hAnsi="Arial" w:cs="Arial"/>
+          <w:lang w:eastAsia="es-EC"/>
+        </w:rPr>
+        <w:t>Estos patrones ayudan a organizar mejor las responsabilidades del sistema, facilitan su mantenimiento y dejan la puerta abierta para futuras ampliaciones.</w:t>
+      </w:r>
+    </w:p>
+    <w:p>
+      <w:pPr>
+        <w:rPr>
+          <w:rFonts w:ascii="Arial" w:hAnsi="Arial" w:cs="Arial"/>
+          <w:b/>
+          <w:bCs/>
+          <w:lang w:eastAsia="es-EC"/>
+        </w:rPr>
+      </w:pPr>
+    </w:p>
+    <w:p>
+      <w:pPr>
+        <w:pStyle w:val="Prrafodelista"/>
+        <w:numPr>
+          <w:ilvl w:val="1"/>
+          <w:numId w:val="22"/>
+        </w:numPr>
+        <w:rPr>
+          <w:rFonts w:ascii="Arial" w:hAnsi="Arial" w:cs="Arial"/>
+          <w:b/>
+          <w:bCs/>
+          <w:lang w:eastAsia="es-EC"/>
+        </w:rPr>
+      </w:pPr>
+      <w:r>
+        <w:rPr>
+          <w:rFonts w:ascii="Arial" w:hAnsi="Arial" w:cs="Arial"/>
+          <w:b/>
+          <w:bCs/>
+          <w:lang w:eastAsia="es-EC"/>
+        </w:rPr>
+        <w:t>Principios SOLID considerados</w:t>
+      </w:r>
+    </w:p>
+    <w:p>
+      <w:pPr>
+        <w:ind w:left="360"/>
+        <w:rPr>
+          <w:rFonts w:ascii="Arial" w:hAnsi="Arial" w:cs="Arial"/>
+          <w:lang w:eastAsia="es-EC"/>
+        </w:rPr>
+      </w:pPr>
+      <w:r>
+        <w:rPr>
+          <w:rFonts w:ascii="Arial" w:hAnsi="Arial" w:cs="Arial"/>
+          <w:b/>
+          <w:bCs/>
+          <w:lang w:eastAsia="es-EC"/>
+        </w:rPr>
+        <w:t>Responsabilidad única (SRP):</w:t>
+      </w:r>
+      <w:r>
+        <w:rPr>
+          <w:rFonts w:ascii="Arial" w:hAnsi="Arial" w:cs="Arial"/>
+          <w:lang w:eastAsia="es-EC"/>
+        </w:rPr>
+        <w:t xml:space="preserve"> cada clase cumple una función concreta, como gestionar casos, representar animales o enviar notificaciones.</w:t>
+      </w:r>
+    </w:p>
+    <w:p>
+      <w:pPr>
+        <w:ind w:left="360"/>
+        <w:rPr>
+          <w:rFonts w:ascii="Arial" w:hAnsi="Arial" w:cs="Arial"/>
+          <w:lang w:eastAsia="es-EC"/>
+        </w:rPr>
+      </w:pPr>
+      <w:r>
+        <w:rPr>
+          <w:rFonts w:ascii="Arial" w:hAnsi="Arial" w:cs="Arial"/>
+          <w:b/>
+          <w:bCs/>
+          <w:lang w:eastAsia="es-EC"/>
+        </w:rPr>
+        <w:t>Abierto/cerrado (OCP</w:t>
+      </w:r>
+      <w:r>
+        <w:rPr>
+          <w:rFonts w:ascii="Arial" w:hAnsi="Arial" w:cs="Arial"/>
+          <w:lang w:eastAsia="es-EC"/>
+        </w:rPr>
+        <w:t>): se pueden agregar nuevas especies creando clases y fábricas específicas, sin tener que modificar las clases que ya existen.</w:t>
+      </w:r>
+    </w:p>
+    <w:p>
+      <w:pPr>
+        <w:ind w:left="360"/>
+        <w:rPr>
+          <w:rFonts w:ascii="Arial" w:hAnsi="Arial" w:cs="Arial"/>
+          <w:b/>
+          <w:bCs/>
+          <w:lang w:eastAsia="es-EC"/>
+        </w:rPr>
+      </w:pPr>
+      <w:r>
+        <w:rPr>
+          <w:rFonts w:ascii="Arial" w:hAnsi="Arial" w:cs="Arial"/>
+          <w:b/>
+          <w:bCs/>
+          <w:lang w:eastAsia="es-EC"/>
+        </w:rPr>
+        <w:t>Inversión de dependencias (DIP):</w:t>
+      </w:r>
+      <w:r>
+        <w:rPr>
+          <w:rFonts w:ascii="Arial" w:hAnsi="Arial" w:cs="Arial"/>
+          <w:lang w:eastAsia="es-EC"/>
+        </w:rPr>
+        <w:t xml:space="preserve"> el uso de abstracciones como Animal y Observador reduce la dependencia directa entre los componentes concretos.</w:t>
+      </w:r>
+      <w:r>
+        <w:rPr>
+          <w:rFonts w:ascii="Arial" w:hAnsi="Arial" w:cs="Arial"/>
+          <w:b/>
+          <w:bCs/>
+          <w:lang w:eastAsia="es-EC"/>
+        </w:rPr>
+        <w:t xml:space="preserve"> </w:t>
+      </w:r>
+      <w:r>
+        <w:rPr>
+          <w:rFonts w:ascii="Arial" w:hAnsi="Arial" w:cs="Arial"/>
+          <w:b/>
+          <w:bCs/>
+          <w:lang w:eastAsia="es-EC"/>
+        </w:rPr>
+        <w:br w:type="page"/>
+      </w:r>
+    </w:p>
+    <w:p>
+      <w:pPr>
         <w:pStyle w:val="Sinespaciado"/>
         <w:spacing w:line="360" w:lineRule="auto"/>
         <w:jc w:val="both"/>
@@ -2055,19 +2924,6 @@
       </w:pPr>
       <w:r>
         <w:rPr>
-          <w:rFonts w:ascii="Arial" w:hAnsi="Arial" w:cs="Arial"/>
-          <w:b/>
-          <w:bCs/>
-          <w:i/>
-          <w:iCs/>
-          <w:sz w:val="20"/>
-          <w:szCs w:val="20"/>
-          <w:lang w:eastAsia="es-EC"/>
-        </w:rPr>
-        <w:t>(</w:t>
-      </w:r>
-      <w:r>
-        <w:rPr>
           <w:rFonts w:ascii="Arial" w:eastAsia="Arial" w:hAnsi="Arial" w:cs="Arial"/>
           <w:i/>
           <w:iCs/>
@@ -2075,7 +2931,155 @@
           <w:sz w:val="20"/>
           <w:szCs w:val="20"/>
         </w:rPr>
+        <w:drawing>
+          <wp:anchor distT="0" distB="0" distL="114300" distR="114300" simplePos="0" relativeHeight="251673600" behindDoc="0" locked="0" layoutInCell="1" allowOverlap="1" wp14:anchorId="1EA60D13" wp14:editId="06378E02">
+            <wp:simplePos x="0" y="0"/>
+            <wp:positionH relativeFrom="column">
+              <wp:posOffset>-18415</wp:posOffset>
+            </wp:positionH>
+            <wp:positionV relativeFrom="paragraph">
+              <wp:posOffset>3042285</wp:posOffset>
+            </wp:positionV>
+            <wp:extent cx="4145280" cy="2886075"/>
+            <wp:effectExtent l="0" t="0" r="7620" b="9525"/>
+            <wp:wrapTopAndBottom/>
+            <wp:docPr id="5" name="Imagen 5"/>
+            <wp:cNvGraphicFramePr>
+              <a:graphicFrameLocks xmlns:a="http://schemas.openxmlformats.org/drawingml/2006/main" noChangeAspect="1"/>
+            </wp:cNvGraphicFramePr>
+            <a:graphic xmlns:a="http://schemas.openxmlformats.org/drawingml/2006/main">
+              <a:graphicData uri="http://schemas.openxmlformats.org/drawingml/2006/picture">
+                <pic:pic xmlns:pic="http://schemas.openxmlformats.org/drawingml/2006/picture">
+                  <pic:nvPicPr>
+                    <pic:cNvPr id="1" name=""/>
+                    <pic:cNvPicPr/>
+                  </pic:nvPicPr>
+                  <pic:blipFill>
+                    <a:blip r:embed="rId16"/>
+                    <a:stretch>
+                      <a:fillRect/>
+                    </a:stretch>
+                  </pic:blipFill>
+                  <pic:spPr>
+                    <a:xfrm>
+                      <a:off x="0" y="0"/>
+                      <a:ext cx="4145280" cy="2886075"/>
+                    </a:xfrm>
+                    <a:prstGeom prst="rect">
+                      <a:avLst/>
+                    </a:prstGeom>
+                  </pic:spPr>
+                </pic:pic>
+              </a:graphicData>
+            </a:graphic>
+            <wp14:sizeRelH relativeFrom="margin">
+              <wp14:pctWidth>0</wp14:pctWidth>
+            </wp14:sizeRelH>
+            <wp14:sizeRelV relativeFrom="margin">
+              <wp14:pctHeight>0</wp14:pctHeight>
+            </wp14:sizeRelV>
+          </wp:anchor>
+        </w:drawing>
+      </w:r>
+      <w:r>
+        <w:rPr>
+          <w:rFonts w:ascii="Arial" w:eastAsia="Arial" w:hAnsi="Arial" w:cs="Arial"/>
+          <w:i/>
+          <w:iCs/>
+          <w:color w:val="000000"/>
+          <w:sz w:val="20"/>
+          <w:szCs w:val="20"/>
+        </w:rPr>
+        <w:drawing>
+          <wp:anchor distT="0" distB="0" distL="114300" distR="114300" simplePos="0" relativeHeight="251671552" behindDoc="0" locked="0" layoutInCell="1" allowOverlap="1" wp14:anchorId="6F80C3BC" wp14:editId="6FB70B7A">
+            <wp:simplePos x="0" y="0"/>
+            <wp:positionH relativeFrom="column">
+              <wp:posOffset>-3810</wp:posOffset>
+            </wp:positionH>
+            <wp:positionV relativeFrom="paragraph">
+              <wp:posOffset>480060</wp:posOffset>
+            </wp:positionV>
+            <wp:extent cx="4133850" cy="2287905"/>
+            <wp:effectExtent l="0" t="0" r="0" b="0"/>
+            <wp:wrapTopAndBottom/>
+            <wp:docPr id="4" name="Imagen 4"/>
+            <wp:cNvGraphicFramePr>
+              <a:graphicFrameLocks xmlns:a="http://schemas.openxmlformats.org/drawingml/2006/main" noChangeAspect="1"/>
+            </wp:cNvGraphicFramePr>
+            <a:graphic xmlns:a="http://schemas.openxmlformats.org/drawingml/2006/main">
+              <a:graphicData uri="http://schemas.openxmlformats.org/drawingml/2006/picture">
+                <pic:pic xmlns:pic="http://schemas.openxmlformats.org/drawingml/2006/picture">
+                  <pic:nvPicPr>
+                    <pic:cNvPr id="1" name=""/>
+                    <pic:cNvPicPr/>
+                  </pic:nvPicPr>
+                  <pic:blipFill>
+                    <a:blip r:embed="rId17"/>
+                    <a:stretch>
+                      <a:fillRect/>
+                    </a:stretch>
+                  </pic:blipFill>
+                  <pic:spPr>
+                    <a:xfrm>
+                      <a:off x="0" y="0"/>
+                      <a:ext cx="4133850" cy="2287905"/>
+                    </a:xfrm>
+                    <a:prstGeom prst="rect">
+                      <a:avLst/>
+                    </a:prstGeom>
+                  </pic:spPr>
+                </pic:pic>
+              </a:graphicData>
+            </a:graphic>
+            <wp14:sizeRelH relativeFrom="margin">
+              <wp14:pctWidth>0</wp14:pctWidth>
+            </wp14:sizeRelH>
+            <wp14:sizeRelV relativeFrom="margin">
+              <wp14:pctHeight>0</wp14:pctHeight>
+            </wp14:sizeRelV>
+          </wp:anchor>
+        </w:drawing>
+      </w:r>
+      <w:r>
+        <w:rPr>
+          <w:rFonts w:ascii="Arial" w:hAnsi="Arial" w:cs="Arial"/>
+          <w:b/>
+          <w:bCs/>
+          <w:i/>
+          <w:iCs/>
+          <w:sz w:val="20"/>
+          <w:szCs w:val="20"/>
+          <w:lang w:eastAsia="es-EC"/>
+        </w:rPr>
+        <w:t>(</w:t>
+      </w:r>
+      <w:r>
+        <w:rPr>
+          <w:rFonts w:ascii="Arial" w:eastAsia="Arial" w:hAnsi="Arial" w:cs="Arial"/>
+          <w:i/>
+          <w:iCs/>
+          <w:color w:val="000000"/>
+          <w:sz w:val="20"/>
+          <w:szCs w:val="20"/>
+        </w:rPr>
         <w:t>Código de la ejecución de los ejercicios, enlace drive donde se encuentren los mismos y Capturas de pantalla claras y relevantes, donde evidencie el proceso realizado).</w:t>
+      </w:r>
+      <w:r>
+        <w:rPr>
+          <w:noProof/>
+        </w:rPr>
+        <w:t xml:space="preserve"> </w:t>
+      </w:r>
+      <w:r>
+        <w:rPr>
+          <w:rFonts w:ascii="Arial" w:eastAsia="Arial" w:hAnsi="Arial" w:cs="Arial"/>
+          <w:i/>
+          <w:iCs/>
+          <w:color w:val="000000"/>
+          <w:sz w:val="20"/>
+          <w:szCs w:val="20"/>
+        </w:rPr>
+        <w:t xml:space="preserve">  </w:t>
       </w:r>
       <w:r>
         <w:rPr>
@@ -2168,7 +3172,7 @@
       </w:r>
     </w:p>
     <w:sectPr>
-      <w:headerReference w:type="first" r:id="rId15"/>
+      <w:headerReference w:type="first" r:id="rId18"/>
       <w:pgSz w:w="11906" w:h="16838"/>
       <w:pgMar w:top="1417" w:right="1701" w:bottom="1417" w:left="1701" w:header="708" w:footer="708" w:gutter="0"/>
       <w:pgNumType w:start="1"/>
@@ -3044,7 +4048,7 @@
         <v:path o:extrusionok="f" gradientshapeok="t" o:connecttype="rect"/>
         <o:lock v:ext="edit" aspectratio="t"/>
       </v:shapetype>
-      <v:shape id="_x0000_i1075" type="#_x0000_t75" style="width:10.3pt;height:10.3pt" o:bullet="t">
+      <v:shape id="_x0000_i1111" type="#_x0000_t75" style="width:10.5pt;height:10.5pt" o:bullet="t">
         <v:imagedata r:id="rId1" o:title="mso3E28"/>
       </v:shape>
     </w:pict>
@@ -4001,9 +5005,9 @@
   </w:abstractNum>
   <w:abstractNum w:abstractNumId="8" w15:restartNumberingAfterBreak="0">
     <w:nsid w:val="37AB4FF0"/>
-    <w:multiLevelType w:val="hybridMultilevel"/>
-    <w:tmpl w:val="8C06579A"/>
-    <w:lvl w:ilvl="0" w:tplc="300A000F">
+    <w:multiLevelType w:val="multilevel"/>
+    <w:tmpl w:val="300A001F"/>
+    <w:lvl w:ilvl="0">
       <w:start w:val="1"/>
       <w:numFmt w:val="decimal"/>
       <w:lvlText w:val="%1."/>
@@ -4015,76 +5019,76 @@
         <w:rFonts w:hint="default"/>
       </w:rPr>
     </w:lvl>
-    <w:lvl w:ilvl="1" w:tplc="300A0019" w:tentative="1">
-      <w:start w:val="1"/>
-      <w:numFmt w:val="lowerLetter"/>
-      <w:lvlText w:val="%2."/>
-      <w:lvlJc w:val="left"/>
-      <w:pPr>
-        <w:ind w:left="1080" w:hanging="360"/>
-      </w:pPr>
-    </w:lvl>
-    <w:lvl w:ilvl="2" w:tplc="300A001B" w:tentative="1">
-      <w:start w:val="1"/>
-      <w:numFmt w:val="lowerRoman"/>
-      <w:lvlText w:val="%3."/>
-      <w:lvlJc w:val="right"/>
-      <w:pPr>
-        <w:ind w:left="1800" w:hanging="180"/>
-      </w:pPr>
-    </w:lvl>
-    <w:lvl w:ilvl="3" w:tplc="300A000F" w:tentative="1">
+    <w:lvl w:ilvl="1">
       <w:start w:val="1"/>
       <w:numFmt w:val="decimal"/>
-      <w:lvlText w:val="%4."/>
-      <w:lvlJc w:val="left"/>
-      <w:pPr>
-        <w:ind w:left="2520" w:hanging="360"/>
-      </w:pPr>
-    </w:lvl>
-    <w:lvl w:ilvl="4" w:tplc="300A0019" w:tentative="1">
-      <w:start w:val="1"/>
-      <w:numFmt w:val="lowerLetter"/>
-      <w:lvlText w:val="%5."/>
-      <w:lvlJc w:val="left"/>
-      <w:pPr>
-        <w:ind w:left="3240" w:hanging="360"/>
-      </w:pPr>
-    </w:lvl>
-    <w:lvl w:ilvl="5" w:tplc="300A001B" w:tentative="1">
-      <w:start w:val="1"/>
-      <w:numFmt w:val="lowerRoman"/>
-      <w:lvlText w:val="%6."/>
-      <w:lvlJc w:val="right"/>
-      <w:pPr>
-        <w:ind w:left="3960" w:hanging="180"/>
-      </w:pPr>
-    </w:lvl>
-    <w:lvl w:ilvl="6" w:tplc="300A000F" w:tentative="1">
+      <w:lvlText w:val="%1.%2."/>
+      <w:lvlJc w:val="left"/>
+      <w:pPr>
+        <w:ind w:left="792" w:hanging="432"/>
+      </w:pPr>
+    </w:lvl>
+    <w:lvl w:ilvl="2">
       <w:start w:val="1"/>
       <w:numFmt w:val="decimal"/>
-      <w:lvlText w:val="%7."/>
-      <w:lvlJc w:val="left"/>
-      <w:pPr>
-        <w:ind w:left="4680" w:hanging="360"/>
-      </w:pPr>
-    </w:lvl>
-    <w:lvl w:ilvl="7" w:tplc="300A0019" w:tentative="1">
-      <w:start w:val="1"/>
-      <w:numFmt w:val="lowerLetter"/>
-      <w:lvlText w:val="%8."/>
-      <w:lvlJc w:val="left"/>
-      <w:pPr>
-        <w:ind w:left="5400" w:hanging="360"/>
-      </w:pPr>
-    </w:lvl>
-    <w:lvl w:ilvl="8" w:tplc="300A001B" w:tentative="1">
-      <w:start w:val="1"/>
-      <w:numFmt w:val="lowerRoman"/>
-      <w:lvlText w:val="%9."/>
-      <w:lvlJc w:val="right"/>
-      <w:pPr>
-        <w:ind w:left="6120" w:hanging="180"/>
+      <w:lvlText w:val="%1.%2.%3."/>
+      <w:lvlJc w:val="left"/>
+      <w:pPr>
+        <w:ind w:left="1224" w:hanging="504"/>
+      </w:pPr>
+    </w:lvl>
+    <w:lvl w:ilvl="3">
+      <w:start w:val="1"/>
+      <w:numFmt w:val="decimal"/>
+      <w:lvlText w:val="%1.%2.%3.%4."/>
+      <w:lvlJc w:val="left"/>
+      <w:pPr>
+        <w:ind w:left="1728" w:hanging="648"/>
+      </w:pPr>
+    </w:lvl>
+    <w:lvl w:ilvl="4">
+      <w:start w:val="1"/>
+      <w:numFmt w:val="decimal"/>
+      <w:lvlText w:val="%1.%2.%3.%4.%5."/>
+      <w:lvlJc w:val="left"/>
+      <w:pPr>
+        <w:ind w:left="2232" w:hanging="792"/>
+      </w:pPr>
+    </w:lvl>
+    <w:lvl w:ilvl="5">
+      <w:start w:val="1"/>
+      <w:numFmt w:val="decimal"/>
+      <w:lvlText w:val="%1.%2.%3.%4.%5.%6."/>
+      <w:lvlJc w:val="left"/>
+      <w:pPr>
+        <w:ind w:left="2736" w:hanging="936"/>
+      </w:pPr>
+    </w:lvl>
+    <w:lvl w:ilvl="6">
+      <w:start w:val="1"/>
+      <w:numFmt w:val="decimal"/>
+      <w:lvlText w:val="%1.%2.%3.%4.%5.%6.%7."/>
+      <w:lvlJc w:val="left"/>
+      <w:pPr>
+        <w:ind w:left="3240" w:hanging="1080"/>
+      </w:pPr>
+    </w:lvl>
+    <w:lvl w:ilvl="7">
+      <w:start w:val="1"/>
+      <w:numFmt w:val="decimal"/>
+      <w:lvlText w:val="%1.%2.%3.%4.%5.%6.%7.%8."/>
+      <w:lvlJc w:val="left"/>
+      <w:pPr>
+        <w:ind w:left="3744" w:hanging="1224"/>
+      </w:pPr>
+    </w:lvl>
+    <w:lvl w:ilvl="8">
+      <w:start w:val="1"/>
+      <w:numFmt w:val="decimal"/>
+      <w:lvlText w:val="%1.%2.%3.%4.%5.%6.%7.%8.%9."/>
+      <w:lvlJc w:val="left"/>
+      <w:pPr>
+        <w:ind w:left="4320" w:hanging="1440"/>
       </w:pPr>
     </w:lvl>
   </w:abstractNum>
@@ -6998,6 +8002,112 @@
       </w:tcPr>
     </w:tblStylePr>
   </w:style>
+  <w:style w:type="table" w:styleId="Tablaconcuadrcula5oscura-nfasis5">
+    <w:name w:val="Grid Table 5 Dark Accent 5"/>
+    <w:basedOn w:val="Tablanormal"/>
+    <w:uiPriority w:val="50"/>
+    <w:rsid w:val="001F07CF"/>
+    <w:pPr>
+      <w:spacing w:after="0" w:line="240" w:lineRule="auto"/>
+    </w:pPr>
+    <w:tblPr>
+      <w:tblStyleRowBandSize w:val="1"/>
+      <w:tblStyleColBandSize w:val="1"/>
+      <w:tblBorders>
+        <w:top w:val="single" w:sz="4" w:space="0" w:color="FFFFFF" w:themeColor="background1"/>
+        <w:left w:val="single" w:sz="4" w:space="0" w:color="FFFFFF" w:themeColor="background1"/>
+        <w:bottom w:val="single" w:sz="4" w:space="0" w:color="FFFFFF" w:themeColor="background1"/>
+        <w:right w:val="single" w:sz="4" w:space="0" w:color="FFFFFF" w:themeColor="background1"/>
+        <w:insideH w:val="single" w:sz="4" w:space="0" w:color="FFFFFF" w:themeColor="background1"/>
+        <w:insideV w:val="single" w:sz="4" w:space="0" w:color="FFFFFF" w:themeColor="background1"/>
+      </w:tblBorders>
+    </w:tblPr>
+    <w:tcPr>
+      <w:shd w:val="clear" w:color="auto" w:fill="DEEAF6" w:themeFill="accent5" w:themeFillTint="33"/>
+    </w:tcPr>
+    <w:tblStylePr w:type="firstRow">
+      <w:rPr>
+        <w:b/>
+        <w:bCs/>
+        <w:color w:val="FFFFFF" w:themeColor="background1"/>
+      </w:rPr>
+      <w:tblPr/>
+      <w:tcPr>
+        <w:tcBorders>
+          <w:top w:val="single" w:sz="4" w:space="0" w:color="FFFFFF" w:themeColor="background1"/>
+          <w:left w:val="single" w:sz="4" w:space="0" w:color="FFFFFF" w:themeColor="background1"/>
+          <w:right w:val="single" w:sz="4" w:space="0" w:color="FFFFFF" w:themeColor="background1"/>
+          <w:insideH w:val="nil"/>
+          <w:insideV w:val="nil"/>
+        </w:tcBorders>
+        <w:shd w:val="clear" w:color="auto" w:fill="5B9BD5" w:themeFill="accent5"/>
+      </w:tcPr>
+    </w:tblStylePr>
+    <w:tblStylePr w:type="lastRow">
+      <w:rPr>
+        <w:b/>
+        <w:bCs/>
+        <w:color w:val="FFFFFF" w:themeColor="background1"/>
+      </w:rPr>
+      <w:tblPr/>
+      <w:tcPr>
+        <w:tcBorders>
+          <w:left w:val="single" w:sz="4" w:space="0" w:color="FFFFFF" w:themeColor="background1"/>
+          <w:bottom w:val="single" w:sz="4" w:space="0" w:color="FFFFFF" w:themeColor="background1"/>
+          <w:right w:val="single" w:sz="4" w:space="0" w:color="FFFFFF" w:themeColor="background1"/>
+          <w:insideH w:val="nil"/>
+          <w:insideV w:val="nil"/>
+        </w:tcBorders>
+        <w:shd w:val="clear" w:color="auto" w:fill="5B9BD5" w:themeFill="accent5"/>
+      </w:tcPr>
+    </w:tblStylePr>
+    <w:tblStylePr w:type="firstCol">
+      <w:rPr>
+        <w:b/>
+        <w:bCs/>
+        <w:color w:val="FFFFFF" w:themeColor="background1"/>
+      </w:rPr>
+      <w:tblPr/>
+      <w:tcPr>
+        <w:tcBorders>
+          <w:top w:val="single" w:sz="4" w:space="0" w:color="FFFFFF" w:themeColor="background1"/>
+          <w:left w:val="single" w:sz="4" w:space="0" w:color="FFFFFF" w:themeColor="background1"/>
+          <w:bottom w:val="single" w:sz="4" w:space="0" w:color="FFFFFF" w:themeColor="background1"/>
+          <w:insideV w:val="nil"/>
+        </w:tcBorders>
+        <w:shd w:val="clear" w:color="auto" w:fill="5B9BD5" w:themeFill="accent5"/>
+      </w:tcPr>
+    </w:tblStylePr>
+    <w:tblStylePr w:type="lastCol">
+      <w:rPr>
+        <w:b/>
+        <w:bCs/>
+        <w:color w:val="FFFFFF" w:themeColor="background1"/>
+      </w:rPr>
+      <w:tblPr/>
+      <w:tcPr>
+        <w:tcBorders>
+          <w:top w:val="single" w:sz="4" w:space="0" w:color="FFFFFF" w:themeColor="background1"/>
+          <w:bottom w:val="single" w:sz="4" w:space="0" w:color="FFFFFF" w:themeColor="background1"/>
+          <w:right w:val="single" w:sz="4" w:space="0" w:color="FFFFFF" w:themeColor="background1"/>
+          <w:insideV w:val="nil"/>
+        </w:tcBorders>
+        <w:shd w:val="clear" w:color="auto" w:fill="5B9BD5" w:themeFill="accent5"/>
+      </w:tcPr>
+    </w:tblStylePr>
+    <w:tblStylePr w:type="band1Vert">
+      <w:tblPr/>
+      <w:tcPr>
+        <w:shd w:val="clear" w:color="auto" w:fill="BDD6EE" w:themeFill="accent5" w:themeFillTint="66"/>
+      </w:tcPr>
+    </w:tblStylePr>
+    <w:tblStylePr w:type="band1Horz">
+      <w:tblPr/>
+      <w:tcPr>
+        <w:shd w:val="clear" w:color="auto" w:fill="BDD6EE" w:themeFill="accent5" w:themeFillTint="66"/>
+      </w:tcPr>
+    </w:tblStylePr>
+  </w:style>
 </w:styles>
 </file>
 

</xml_diff>

<commit_message>
Actualizacion, creacion de diagramas UML, creacion de ramas y documentacion del proyecto Se agrego el actor Veterinario y sus métodos al diagrama de clases UML Se actualizo la imagen del diagrama de casos de uso en el documento Se creó e incorporó el diagrama de secuencia UML Se agregaron los enlaces al repositorio y a los diagramas Se creó el diagrama de flujo de Gitflow y se incorporó al documento Se crearon las ramas develop y feature, todo esto se documento
</commit_message>
<xml_diff>
--- a/Actividad_1_Pilay_Tyrone.docx
+++ b/Actividad_1_Pilay_Tyrone.docx
@@ -623,32 +623,49 @@
         </w:rPr>
         <w:t xml:space="preserve">Repositorio: </w:t>
       </w:r>
-      <w:r>
+      <w:hyperlink r:id="rId9" w:history="1">
+        <w:r>
+          <w:rPr>
+            <w:rStyle w:val="Hipervnculo"/>
+            <w:rFonts w:ascii="Arial" w:hAnsi="Arial" w:cs="Arial"/>
+            <w:noProof/>
+            <w:lang w:val="es-ES_tradnl" w:eastAsia="es-EC"/>
+          </w:rPr>
+          <w:t>https://github.com/Tyrone073/sistemaRescateAdopcionAnimal</w:t>
+        </w:r>
+      </w:hyperlink>
+    </w:p>
+    <w:p>
+      <w:pPr>
+        <w:spacing w:line="360" w:lineRule="auto"/>
         <w:rPr>
           <w:rFonts w:ascii="Arial" w:hAnsi="Arial" w:cs="Arial"/>
           <w:noProof/>
           <w:lang w:val="es-ES_tradnl" w:eastAsia="es-EC"/>
         </w:rPr>
-        <w:tab/>
-      </w:r>
+      </w:pPr>
       <w:r>
         <w:rPr>
           <w:rFonts w:ascii="Arial" w:hAnsi="Arial" w:cs="Arial"/>
           <w:noProof/>
           <w:lang w:val="es-ES_tradnl" w:eastAsia="es-EC"/>
         </w:rPr>
-        <w:tab/>
-      </w:r>
-    </w:p>
-    <w:p>
-      <w:pPr>
-        <w:spacing w:line="360" w:lineRule="auto"/>
-        <w:rPr>
-          <w:rFonts w:ascii="Arial" w:hAnsi="Arial" w:cs="Arial"/>
-          <w:noProof/>
-          <w:lang w:val="es-ES_tradnl" w:eastAsia="es-EC"/>
-        </w:rPr>
-      </w:pPr>
+        <w:t>Diagramas:</w:t>
+      </w:r>
+      <w:r>
+        <w:t xml:space="preserve"> </w:t>
+      </w:r>
+      <w:hyperlink r:id="rId10" w:history="1">
+        <w:r>
+          <w:rPr>
+            <w:rStyle w:val="Hipervnculo"/>
+            <w:rFonts w:ascii="Arial" w:hAnsi="Arial" w:cs="Arial"/>
+            <w:noProof/>
+            <w:lang w:val="es-ES_tradnl" w:eastAsia="es-EC"/>
+          </w:rPr>
+          <w:t>https://drive.google.com/file/d/1e5I_FJ8YafKvK65TfSiShO_EMXvFAYyx/view?usp=sharing</w:t>
+        </w:r>
+      </w:hyperlink>
     </w:p>
     <w:p>
       <w:pPr>
@@ -768,26 +785,23 @@
     </w:p>
     <w:p>
       <w:pPr>
-        <w:spacing w:line="360" w:lineRule="auto"/>
-        <w:rPr>
-          <w:rFonts w:ascii="Arial" w:hAnsi="Arial" w:cs="Arial"/>
-          <w:b/>
-          <w:color w:val="000000" w:themeColor="text1"/>
+        <w:jc w:val="center"/>
+        <w:rPr>
+          <w:rFonts w:ascii="Arial" w:hAnsi="Arial" w:cs="Arial"/>
+          <w:b/>
           <w:kern w:val="24"/>
           <w:lang w:val="es-ES_tradnl"/>
         </w:rPr>
       </w:pPr>
-    </w:p>
-    <w:p>
-      <w:pPr>
-        <w:jc w:val="center"/>
+      <w:r>
         <w:rPr>
           <w:rFonts w:ascii="Arial" w:hAnsi="Arial" w:cs="Arial"/>
           <w:b/>
           <w:kern w:val="24"/>
           <w:lang w:val="es-ES_tradnl"/>
         </w:rPr>
-      </w:pPr>
+        <w:t>PER</w:t>
+      </w:r>
       <w:r>
         <w:rPr>
           <w:rFonts w:ascii="Arial" w:hAnsi="Arial" w:cs="Arial"/>
@@ -795,7 +809,7 @@
           <w:kern w:val="24"/>
           <w:lang w:val="es-ES_tradnl"/>
         </w:rPr>
-        <w:t>PER</w:t>
+        <w:t>I</w:t>
       </w:r>
       <w:r>
         <w:rPr>
@@ -804,7 +818,7 @@
           <w:kern w:val="24"/>
           <w:lang w:val="es-ES_tradnl"/>
         </w:rPr>
-        <w:t>I</w:t>
+        <w:t xml:space="preserve">ODO </w:t>
       </w:r>
       <w:r>
         <w:rPr>
@@ -813,7 +827,7 @@
           <w:kern w:val="24"/>
           <w:lang w:val="es-ES_tradnl"/>
         </w:rPr>
-        <w:t xml:space="preserve">ODO </w:t>
+        <w:t>SEPTIEMBRE</w:t>
       </w:r>
       <w:r>
         <w:rPr>
@@ -822,7 +836,7 @@
           <w:kern w:val="24"/>
           <w:lang w:val="es-ES_tradnl"/>
         </w:rPr>
-        <w:t>SEPTIEMBRE</w:t>
+        <w:t xml:space="preserve"> </w:t>
       </w:r>
       <w:r>
         <w:rPr>
@@ -831,7 +845,7 @@
           <w:kern w:val="24"/>
           <w:lang w:val="es-ES_tradnl"/>
         </w:rPr>
-        <w:t xml:space="preserve"> </w:t>
+        <w:t>202</w:t>
       </w:r>
       <w:r>
         <w:rPr>
@@ -840,7 +854,7 @@
           <w:kern w:val="24"/>
           <w:lang w:val="es-ES_tradnl"/>
         </w:rPr>
-        <w:t>202</w:t>
+        <w:t>6</w:t>
       </w:r>
       <w:r>
         <w:rPr>
@@ -849,7 +863,7 @@
           <w:kern w:val="24"/>
           <w:lang w:val="es-ES_tradnl"/>
         </w:rPr>
-        <w:t>6</w:t>
+        <w:t xml:space="preserve"> </w:t>
       </w:r>
       <w:r>
         <w:rPr>
@@ -858,7 +872,7 @@
           <w:kern w:val="24"/>
           <w:lang w:val="es-ES_tradnl"/>
         </w:rPr>
-        <w:t xml:space="preserve"> </w:t>
+        <w:t>-</w:t>
       </w:r>
       <w:r>
         <w:rPr>
@@ -867,7 +881,7 @@
           <w:kern w:val="24"/>
           <w:lang w:val="es-ES_tradnl"/>
         </w:rPr>
-        <w:t>-</w:t>
+        <w:t xml:space="preserve"> ENERO</w:t>
       </w:r>
       <w:r>
         <w:rPr>
@@ -876,7 +890,7 @@
           <w:kern w:val="24"/>
           <w:lang w:val="es-ES_tradnl"/>
         </w:rPr>
-        <w:t xml:space="preserve"> ENERO</w:t>
+        <w:t xml:space="preserve"> 202</w:t>
       </w:r>
       <w:r>
         <w:rPr>
@@ -885,15 +899,6 @@
           <w:kern w:val="24"/>
           <w:lang w:val="es-ES_tradnl"/>
         </w:rPr>
-        <w:t xml:space="preserve"> 202</w:t>
-      </w:r>
-      <w:r>
-        <w:rPr>
-          <w:rFonts w:ascii="Arial" w:hAnsi="Arial" w:cs="Arial"/>
-          <w:b/>
-          <w:kern w:val="24"/>
-          <w:lang w:val="es-ES_tradnl"/>
-        </w:rPr>
         <w:t>7</w:t>
       </w:r>
     </w:p>
@@ -916,10 +921,10 @@
           <w:rFonts w:ascii="Arial" w:hAnsi="Arial" w:cs="Arial"/>
         </w:rPr>
         <w:sectPr>
-          <w:headerReference w:type="default" r:id="rId9"/>
-          <w:footerReference w:type="default" r:id="rId10"/>
-          <w:headerReference w:type="first" r:id="rId11"/>
-          <w:footerReference w:type="first" r:id="rId12"/>
+          <w:headerReference w:type="default" r:id="rId11"/>
+          <w:footerReference w:type="default" r:id="rId12"/>
+          <w:headerReference w:type="first" r:id="rId13"/>
+          <w:footerReference w:type="first" r:id="rId14"/>
           <w:pgSz w:w="11906" w:h="16838"/>
           <w:pgMar w:top="1417" w:right="1701" w:bottom="1417" w:left="1701" w:header="708" w:footer="708" w:gutter="0"/>
           <w:cols w:space="708"/>
@@ -971,7 +976,7 @@
                     </pic:cNvPicPr>
                   </pic:nvPicPr>
                   <pic:blipFill>
-                    <a:blip r:embed="rId13">
+                    <a:blip r:embed="rId15">
                       <a:extLst>
                         <a:ext uri="{28A0092B-C50C-407E-A947-70E740481C1C}">
                           <a14:useLocalDpi xmlns:a14="http://schemas.microsoft.com/office/drawing/2010/main" val="0"/>
@@ -1923,19 +1928,20 @@
       <w:r>
         <w:rPr>
           <w:rFonts w:ascii="Arial" w:hAnsi="Arial" w:cs="Arial"/>
+          <w:noProof/>
           <w:lang w:eastAsia="es-EC"/>
         </w:rPr>
         <w:drawing>
-          <wp:anchor distT="0" distB="0" distL="114300" distR="114300" simplePos="0" relativeHeight="251667456" behindDoc="0" locked="0" layoutInCell="1" allowOverlap="1" wp14:anchorId="2C2605DE" wp14:editId="4207BA59">
+          <wp:anchor distT="0" distB="0" distL="114300" distR="114300" simplePos="0" relativeHeight="251667456" behindDoc="0" locked="0" layoutInCell="1" allowOverlap="1" wp14:anchorId="2C2605DE" wp14:editId="4202B238">
             <wp:simplePos x="0" y="0"/>
             <wp:positionH relativeFrom="column">
-              <wp:posOffset>0</wp:posOffset>
+              <wp:posOffset>-130546</wp:posOffset>
             </wp:positionH>
             <wp:positionV relativeFrom="paragraph">
-              <wp:posOffset>973777</wp:posOffset>
+              <wp:posOffset>969645</wp:posOffset>
             </wp:positionV>
-            <wp:extent cx="5400040" cy="3106420"/>
-            <wp:effectExtent l="0" t="0" r="0" b="0"/>
+            <wp:extent cx="5672455" cy="3518535"/>
+            <wp:effectExtent l="0" t="0" r="4445" b="5715"/>
             <wp:wrapTopAndBottom/>
             <wp:docPr id="2" name="Imagen 2"/>
             <wp:cNvGraphicFramePr>
@@ -1948,24 +1954,37 @@
                     <pic:cNvPr id="1" name=""/>
                     <pic:cNvPicPr/>
                   </pic:nvPicPr>
-                  <pic:blipFill>
-                    <a:blip r:embed="rId14"/>
-                    <a:stretch>
-                      <a:fillRect/>
-                    </a:stretch>
+                  <pic:blipFill rotWithShape="1">
+                    <a:blip r:embed="rId16"/>
+                    <a:srcRect l="7257"/>
+                    <a:stretch/>
                   </pic:blipFill>
-                  <pic:spPr>
+                  <pic:spPr bwMode="auto">
                     <a:xfrm>
                       <a:off x="0" y="0"/>
-                      <a:ext cx="5400040" cy="3106420"/>
+                      <a:ext cx="5672455" cy="3518535"/>
                     </a:xfrm>
                     <a:prstGeom prst="rect">
                       <a:avLst/>
                     </a:prstGeom>
+                    <a:ln>
+                      <a:noFill/>
+                    </a:ln>
+                    <a:extLst>
+                      <a:ext uri="{53640926-AAD7-44D8-BBD7-CCE9431645EC}">
+                        <a14:shadowObscured xmlns:a14="http://schemas.microsoft.com/office/drawing/2010/main"/>
+                      </a:ext>
+                    </a:extLst>
                   </pic:spPr>
                 </pic:pic>
               </a:graphicData>
             </a:graphic>
+            <wp14:sizeRelH relativeFrom="margin">
+              <wp14:pctWidth>0</wp14:pctWidth>
+            </wp14:sizeRelH>
+            <wp14:sizeRelV relativeFrom="margin">
+              <wp14:pctHeight>0</wp14:pctHeight>
+            </wp14:sizeRelV>
           </wp:anchor>
         </w:drawing>
       </w:r>
@@ -1990,14 +2009,7 @@
           <w:rFonts w:ascii="Arial" w:hAnsi="Arial" w:cs="Arial"/>
           <w:lang w:eastAsia="es-EC"/>
         </w:rPr>
-        <w:t>, el Voluntario o Veterinario y el Administrador del Refugio. Cada uno cumple un rol distinto dentro del proceso de rescate y seguimiento de los animales.</w:t>
-      </w:r>
-      <w:r>
-        <w:rPr>
-          <w:rFonts w:ascii="Arial" w:hAnsi="Arial" w:cs="Arial"/>
-          <w:lang w:eastAsia="es-EC"/>
-        </w:rPr>
-        <w:t xml:space="preserve"> </w:t>
+        <w:t xml:space="preserve">, el Voluntario o Veterinario y el Administrador del Refugio. Cada uno cumple un rol distinto dentro del proceso de rescate y seguimiento de los animales. </w:t>
       </w:r>
       <w:r>
         <w:rPr>
@@ -2048,14 +2060,7 @@
           <w:rFonts w:ascii="Arial" w:hAnsi="Arial" w:cs="Arial"/>
           <w:lang w:eastAsia="es-EC"/>
         </w:rPr>
-        <w:t>Propongo estas clases principales:</w:t>
-      </w:r>
-      <w:r>
-        <w:rPr>
-          <w:rFonts w:ascii="Arial" w:hAnsi="Arial" w:cs="Arial"/>
-          <w:lang w:eastAsia="es-EC"/>
-        </w:rPr>
-        <w:t xml:space="preserve"> </w:t>
+        <w:t xml:space="preserve">Propongo estas clases principales: </w:t>
       </w:r>
     </w:p>
     <w:tbl>
@@ -2385,6 +2390,35 @@
             <w:tcW w:w="4247" w:type="dxa"/>
           </w:tcPr>
           <w:p>
+            <w:r>
+              <w:t>Veterinario</w:t>
+            </w:r>
+          </w:p>
+        </w:tc>
+        <w:tc>
+          <w:tcPr>
+            <w:tcW w:w="4247" w:type="dxa"/>
+          </w:tcPr>
+          <w:p>
+            <w:pPr>
+              <w:cnfStyle w:val="000000000000" w:firstRow="0" w:lastRow="0" w:firstColumn="0" w:lastColumn="0" w:oddVBand="0" w:evenVBand="0" w:oddHBand="0" w:evenHBand="0" w:firstRowFirstColumn="0" w:firstRowLastColumn="0" w:lastRowFirstColumn="0" w:lastRowLastColumn="0"/>
+            </w:pPr>
+            <w:r>
+              <w:t>Evalúa y diagnostica</w:t>
+            </w:r>
+          </w:p>
+        </w:tc>
+      </w:tr>
+      <w:tr>
+        <w:trPr>
+          <w:cnfStyle w:val="000000100000" w:firstRow="0" w:lastRow="0" w:firstColumn="0" w:lastColumn="0" w:oddVBand="0" w:evenVBand="0" w:oddHBand="1" w:evenHBand="0" w:firstRowFirstColumn="0" w:firstRowLastColumn="0" w:lastRowFirstColumn="0" w:lastRowLastColumn="0"/>
+        </w:trPr>
+        <w:tc>
+          <w:tcPr>
+            <w:cnfStyle w:val="001000000000" w:firstRow="0" w:lastRow="0" w:firstColumn="1" w:lastColumn="0" w:oddVBand="0" w:evenVBand="0" w:oddHBand="0" w:evenHBand="0" w:firstRowFirstColumn="0" w:firstRowLastColumn="0" w:lastRowFirstColumn="0" w:lastRowLastColumn="0"/>
+            <w:tcW w:w="4247" w:type="dxa"/>
+          </w:tcPr>
+          <w:p>
             <w:pPr>
               <w:rPr>
                 <w:rFonts w:ascii="Arial" w:hAnsi="Arial" w:cs="Arial"/>
@@ -2404,7 +2438,7 @@
           </w:tcPr>
           <w:p>
             <w:pPr>
-              <w:cnfStyle w:val="000000000000" w:firstRow="0" w:lastRow="0" w:firstColumn="0" w:lastColumn="0" w:oddVBand="0" w:evenVBand="0" w:oddHBand="0" w:evenHBand="0" w:firstRowFirstColumn="0" w:firstRowLastColumn="0" w:lastRowFirstColumn="0" w:lastRowLastColumn="0"/>
+              <w:cnfStyle w:val="000000100000" w:firstRow="0" w:lastRow="0" w:firstColumn="0" w:lastColumn="0" w:oddVBand="0" w:evenVBand="0" w:oddHBand="1" w:evenHBand="0" w:firstRowFirstColumn="0" w:firstRowLastColumn="0" w:lastRowFirstColumn="0" w:lastRowLastColumn="0"/>
               <w:rPr>
                 <w:rFonts w:ascii="Arial" w:hAnsi="Arial" w:cs="Arial"/>
                 <w:lang w:eastAsia="es-EC"/>
@@ -2417,9 +2451,6 @@
         </w:tc>
       </w:tr>
       <w:tr>
-        <w:trPr>
-          <w:cnfStyle w:val="000000100000" w:firstRow="0" w:lastRow="0" w:firstColumn="0" w:lastColumn="0" w:oddVBand="0" w:evenVBand="0" w:oddHBand="1" w:evenHBand="0" w:firstRowFirstColumn="0" w:firstRowLastColumn="0" w:lastRowFirstColumn="0" w:lastRowLastColumn="0"/>
-        </w:trPr>
         <w:tc>
           <w:tcPr>
             <w:cnfStyle w:val="001000000000" w:firstRow="0" w:lastRow="0" w:firstColumn="1" w:lastColumn="0" w:oddVBand="0" w:evenVBand="0" w:oddHBand="0" w:evenHBand="0" w:firstRowFirstColumn="0" w:firstRowLastColumn="0" w:lastRowFirstColumn="0" w:lastRowLastColumn="0"/>
@@ -2443,7 +2474,7 @@
           </w:tcPr>
           <w:p>
             <w:pPr>
-              <w:cnfStyle w:val="000000100000" w:firstRow="0" w:lastRow="0" w:firstColumn="0" w:lastColumn="0" w:oddVBand="0" w:evenVBand="0" w:oddHBand="1" w:evenHBand="0" w:firstRowFirstColumn="0" w:firstRowLastColumn="0" w:lastRowFirstColumn="0" w:lastRowLastColumn="0"/>
+              <w:cnfStyle w:val="000000000000" w:firstRow="0" w:lastRow="0" w:firstColumn="0" w:lastColumn="0" w:oddVBand="0" w:evenVBand="0" w:oddHBand="0" w:evenHBand="0" w:firstRowFirstColumn="0" w:firstRowLastColumn="0" w:lastRowFirstColumn="0" w:lastRowLastColumn="0"/>
               <w:rPr>
                 <w:rFonts w:ascii="Arial" w:hAnsi="Arial" w:cs="Arial"/>
                 <w:lang w:eastAsia="es-EC"/>
@@ -2456,6 +2487,9 @@
         </w:tc>
       </w:tr>
       <w:tr>
+        <w:trPr>
+          <w:cnfStyle w:val="000000100000" w:firstRow="0" w:lastRow="0" w:firstColumn="0" w:lastColumn="0" w:oddVBand="0" w:evenVBand="0" w:oddHBand="1" w:evenHBand="0" w:firstRowFirstColumn="0" w:firstRowLastColumn="0" w:lastRowFirstColumn="0" w:lastRowLastColumn="0"/>
+        </w:trPr>
         <w:tc>
           <w:tcPr>
             <w:cnfStyle w:val="001000000000" w:firstRow="0" w:lastRow="0" w:firstColumn="1" w:lastColumn="0" w:oddVBand="0" w:evenVBand="0" w:oddHBand="0" w:evenHBand="0" w:firstRowFirstColumn="0" w:firstRowLastColumn="0" w:lastRowFirstColumn="0" w:lastRowLastColumn="0"/>
@@ -2481,7 +2515,7 @@
           </w:tcPr>
           <w:p>
             <w:pPr>
-              <w:cnfStyle w:val="000000000000" w:firstRow="0" w:lastRow="0" w:firstColumn="0" w:lastColumn="0" w:oddVBand="0" w:evenVBand="0" w:oddHBand="0" w:evenHBand="0" w:firstRowFirstColumn="0" w:firstRowLastColumn="0" w:lastRowFirstColumn="0" w:lastRowLastColumn="0"/>
+              <w:cnfStyle w:val="000000100000" w:firstRow="0" w:lastRow="0" w:firstColumn="0" w:lastColumn="0" w:oddVBand="0" w:evenVBand="0" w:oddHBand="1" w:evenHBand="0" w:firstRowFirstColumn="0" w:firstRowLastColumn="0" w:lastRowFirstColumn="0" w:lastRowLastColumn="0"/>
               <w:rPr>
                 <w:rFonts w:ascii="Arial" w:hAnsi="Arial" w:cs="Arial"/>
                 <w:lang w:eastAsia="es-EC"/>
@@ -2514,495 +2548,18 @@
           <w:lang w:eastAsia="es-EC"/>
         </w:rPr>
         <w:drawing>
-          <wp:anchor distT="0" distB="0" distL="114300" distR="114300" simplePos="0" relativeHeight="251669504" behindDoc="0" locked="0" layoutInCell="1" allowOverlap="1" wp14:anchorId="4271FB07" wp14:editId="29B81D1A">
+          <wp:anchor distT="0" distB="0" distL="114300" distR="114300" simplePos="0" relativeHeight="251677696" behindDoc="0" locked="0" layoutInCell="1" allowOverlap="1" wp14:anchorId="29E58806" wp14:editId="65A01549">
             <wp:simplePos x="0" y="0"/>
             <wp:positionH relativeFrom="column">
               <wp:posOffset>0</wp:posOffset>
             </wp:positionH>
             <wp:positionV relativeFrom="paragraph">
-              <wp:posOffset>272415</wp:posOffset>
+              <wp:posOffset>275590</wp:posOffset>
             </wp:positionV>
-            <wp:extent cx="5400040" cy="4004310"/>
-            <wp:effectExtent l="0" t="0" r="0" b="0"/>
+            <wp:extent cx="5400040" cy="4012565"/>
+            <wp:effectExtent l="0" t="0" r="0" b="6985"/>
             <wp:wrapTopAndBottom/>
-            <wp:docPr id="3" name="Imagen 3"/>
-            <wp:cNvGraphicFramePr>
-              <a:graphicFrameLocks xmlns:a="http://schemas.openxmlformats.org/drawingml/2006/main" noChangeAspect="1"/>
-            </wp:cNvGraphicFramePr>
-            <a:graphic xmlns:a="http://schemas.openxmlformats.org/drawingml/2006/main">
-              <a:graphicData uri="http://schemas.openxmlformats.org/drawingml/2006/picture">
-                <pic:pic xmlns:pic="http://schemas.openxmlformats.org/drawingml/2006/picture">
-                  <pic:nvPicPr>
-                    <pic:cNvPr id="1" name=""/>
-                    <pic:cNvPicPr/>
-                  </pic:nvPicPr>
-                  <pic:blipFill>
-                    <a:blip r:embed="rId15"/>
-                    <a:stretch>
-                      <a:fillRect/>
-                    </a:stretch>
-                  </pic:blipFill>
-                  <pic:spPr>
-                    <a:xfrm>
-                      <a:off x="0" y="0"/>
-                      <a:ext cx="5400040" cy="4004310"/>
-                    </a:xfrm>
-                    <a:prstGeom prst="rect">
-                      <a:avLst/>
-                    </a:prstGeom>
-                  </pic:spPr>
-                </pic:pic>
-              </a:graphicData>
-            </a:graphic>
-          </wp:anchor>
-        </w:drawing>
-      </w:r>
-    </w:p>
-    <w:p>
-      <w:pPr>
-        <w:pStyle w:val="Prrafodelista"/>
-        <w:numPr>
-          <w:ilvl w:val="1"/>
-          <w:numId w:val="22"/>
-        </w:numPr>
-        <w:rPr>
-          <w:rFonts w:ascii="Arial" w:hAnsi="Arial" w:cs="Arial"/>
-          <w:b/>
-          <w:bCs/>
-          <w:lang w:eastAsia="es-EC"/>
-        </w:rPr>
-      </w:pPr>
-      <w:r>
-        <w:rPr>
-          <w:rFonts w:ascii="Arial" w:hAnsi="Arial" w:cs="Arial"/>
-          <w:b/>
-          <w:bCs/>
-          <w:lang w:eastAsia="es-EC"/>
-        </w:rPr>
-        <w:lastRenderedPageBreak/>
-        <w:t>Aplicación de patrones de diseño</w:t>
-      </w:r>
-    </w:p>
-    <w:p>
-      <w:pPr>
-        <w:ind w:left="360"/>
-        <w:rPr>
-          <w:rFonts w:ascii="Arial" w:hAnsi="Arial" w:cs="Arial"/>
-          <w:lang w:eastAsia="es-EC"/>
-        </w:rPr>
-      </w:pPr>
-      <w:proofErr w:type="spellStart"/>
-      <w:r>
-        <w:rPr>
-          <w:rFonts w:ascii="Arial" w:hAnsi="Arial" w:cs="Arial"/>
-          <w:b/>
-          <w:bCs/>
-          <w:lang w:eastAsia="es-EC"/>
-        </w:rPr>
-        <w:t>Singleton</w:t>
-      </w:r>
-      <w:proofErr w:type="spellEnd"/>
-      <w:r>
-        <w:rPr>
-          <w:rFonts w:ascii="Arial" w:hAnsi="Arial" w:cs="Arial"/>
-          <w:b/>
-          <w:bCs/>
-          <w:lang w:eastAsia="es-EC"/>
-        </w:rPr>
-        <w:t>:</w:t>
-      </w:r>
-      <w:r>
-        <w:rPr>
-          <w:rFonts w:ascii="Arial" w:hAnsi="Arial" w:cs="Arial"/>
-          <w:lang w:eastAsia="es-EC"/>
-        </w:rPr>
-        <w:t xml:space="preserve"> se aplica en la clase </w:t>
-      </w:r>
-      <w:proofErr w:type="spellStart"/>
-      <w:r>
-        <w:rPr>
-          <w:rFonts w:ascii="Arial" w:hAnsi="Arial" w:cs="Arial"/>
-          <w:lang w:eastAsia="es-EC"/>
-        </w:rPr>
-        <w:t>GestorCasos</w:t>
-      </w:r>
-      <w:proofErr w:type="spellEnd"/>
-      <w:r>
-        <w:rPr>
-          <w:rFonts w:ascii="Arial" w:hAnsi="Arial" w:cs="Arial"/>
-          <w:lang w:eastAsia="es-EC"/>
-        </w:rPr>
-        <w:t>, que centraliza la gestión de los casos de rescate y asegura que solo exista una instancia del gestor.</w:t>
-      </w:r>
-    </w:p>
-    <w:p>
-      <w:pPr>
-        <w:ind w:left="360"/>
-        <w:rPr>
-          <w:rFonts w:ascii="Arial" w:hAnsi="Arial" w:cs="Arial"/>
-          <w:lang w:eastAsia="es-EC"/>
-        </w:rPr>
-      </w:pPr>
-      <w:proofErr w:type="spellStart"/>
-      <w:r>
-        <w:rPr>
-          <w:rFonts w:ascii="Arial" w:hAnsi="Arial" w:cs="Arial"/>
-          <w:b/>
-          <w:bCs/>
-          <w:lang w:eastAsia="es-EC"/>
-        </w:rPr>
-        <w:t>Observer</w:t>
-      </w:r>
-      <w:proofErr w:type="spellEnd"/>
-      <w:r>
-        <w:rPr>
-          <w:rFonts w:ascii="Arial" w:hAnsi="Arial" w:cs="Arial"/>
-          <w:b/>
-          <w:bCs/>
-          <w:lang w:eastAsia="es-EC"/>
-        </w:rPr>
-        <w:t>:</w:t>
-      </w:r>
-      <w:r>
-        <w:rPr>
-          <w:rFonts w:ascii="Arial" w:hAnsi="Arial" w:cs="Arial"/>
-          <w:lang w:eastAsia="es-EC"/>
-        </w:rPr>
-        <w:t xml:space="preserve"> se usa a través de las clases Notificador y Observador, lo que permite avisar a los voluntarios cuando se registra un nuevo caso de rescate.</w:t>
-      </w:r>
-    </w:p>
-    <w:p>
-      <w:pPr>
-        <w:ind w:left="360"/>
-        <w:rPr>
-          <w:rFonts w:ascii="Arial" w:hAnsi="Arial" w:cs="Arial"/>
-          <w:lang w:eastAsia="es-EC"/>
-        </w:rPr>
-      </w:pPr>
-      <w:r>
-        <w:rPr>
-          <w:rFonts w:ascii="Arial" w:hAnsi="Arial" w:cs="Arial"/>
-          <w:b/>
-          <w:bCs/>
-          <w:lang w:eastAsia="es-EC"/>
-        </w:rPr>
-        <w:t xml:space="preserve">Factory </w:t>
-      </w:r>
-      <w:proofErr w:type="spellStart"/>
-      <w:r>
-        <w:rPr>
-          <w:rFonts w:ascii="Arial" w:hAnsi="Arial" w:cs="Arial"/>
-          <w:b/>
-          <w:bCs/>
-          <w:lang w:eastAsia="es-EC"/>
-        </w:rPr>
-        <w:t>Method</w:t>
-      </w:r>
-      <w:proofErr w:type="spellEnd"/>
-      <w:r>
-        <w:rPr>
-          <w:rFonts w:ascii="Arial" w:hAnsi="Arial" w:cs="Arial"/>
-          <w:b/>
-          <w:bCs/>
-          <w:lang w:eastAsia="es-EC"/>
-        </w:rPr>
-        <w:t>:</w:t>
-      </w:r>
-      <w:r>
-        <w:rPr>
-          <w:rFonts w:ascii="Arial" w:hAnsi="Arial" w:cs="Arial"/>
-          <w:lang w:eastAsia="es-EC"/>
-        </w:rPr>
-        <w:t xml:space="preserve"> se implementa con </w:t>
-      </w:r>
-      <w:proofErr w:type="spellStart"/>
-      <w:r>
-        <w:rPr>
-          <w:rFonts w:ascii="Arial" w:hAnsi="Arial" w:cs="Arial"/>
-          <w:lang w:eastAsia="es-EC"/>
-        </w:rPr>
-        <w:t>AnimalFactory</w:t>
-      </w:r>
-      <w:proofErr w:type="spellEnd"/>
-      <w:r>
-        <w:rPr>
-          <w:rFonts w:ascii="Arial" w:hAnsi="Arial" w:cs="Arial"/>
-          <w:lang w:eastAsia="es-EC"/>
-        </w:rPr>
-        <w:t xml:space="preserve"> y sus fábricas específicas, que se encargan de crear objetos según la especie del animal, ya sea perro, gato o fauna silvestre.</w:t>
-      </w:r>
-    </w:p>
-    <w:p>
-      <w:pPr>
-        <w:ind w:left="360"/>
-        <w:rPr>
-          <w:rFonts w:ascii="Arial" w:hAnsi="Arial" w:cs="Arial"/>
-          <w:lang w:eastAsia="es-EC"/>
-        </w:rPr>
-      </w:pPr>
-      <w:r>
-        <w:rPr>
-          <w:rFonts w:ascii="Arial" w:hAnsi="Arial" w:cs="Arial"/>
-          <w:lang w:eastAsia="es-EC"/>
-        </w:rPr>
-        <w:t>Estos patrones ayudan a organizar mejor las responsabilidades del sistema, facilitan su mantenimiento y dejan la puerta abierta para futuras ampliaciones.</w:t>
-      </w:r>
-    </w:p>
-    <w:p>
-      <w:pPr>
-        <w:rPr>
-          <w:rFonts w:ascii="Arial" w:hAnsi="Arial" w:cs="Arial"/>
-          <w:b/>
-          <w:bCs/>
-          <w:lang w:eastAsia="es-EC"/>
-        </w:rPr>
-      </w:pPr>
-    </w:p>
-    <w:p>
-      <w:pPr>
-        <w:pStyle w:val="Prrafodelista"/>
-        <w:numPr>
-          <w:ilvl w:val="1"/>
-          <w:numId w:val="22"/>
-        </w:numPr>
-        <w:rPr>
-          <w:rFonts w:ascii="Arial" w:hAnsi="Arial" w:cs="Arial"/>
-          <w:b/>
-          <w:bCs/>
-          <w:lang w:eastAsia="es-EC"/>
-        </w:rPr>
-      </w:pPr>
-      <w:r>
-        <w:rPr>
-          <w:rFonts w:ascii="Arial" w:hAnsi="Arial" w:cs="Arial"/>
-          <w:b/>
-          <w:bCs/>
-          <w:lang w:eastAsia="es-EC"/>
-        </w:rPr>
-        <w:t>Principios SOLID considerados</w:t>
-      </w:r>
-    </w:p>
-    <w:p>
-      <w:pPr>
-        <w:ind w:left="360"/>
-        <w:rPr>
-          <w:rFonts w:ascii="Arial" w:hAnsi="Arial" w:cs="Arial"/>
-          <w:lang w:eastAsia="es-EC"/>
-        </w:rPr>
-      </w:pPr>
-      <w:r>
-        <w:rPr>
-          <w:rFonts w:ascii="Arial" w:hAnsi="Arial" w:cs="Arial"/>
-          <w:b/>
-          <w:bCs/>
-          <w:lang w:eastAsia="es-EC"/>
-        </w:rPr>
-        <w:t>Responsabilidad única (SRP):</w:t>
-      </w:r>
-      <w:r>
-        <w:rPr>
-          <w:rFonts w:ascii="Arial" w:hAnsi="Arial" w:cs="Arial"/>
-          <w:lang w:eastAsia="es-EC"/>
-        </w:rPr>
-        <w:t xml:space="preserve"> cada clase cumple una función concreta, como gestionar casos, representar animales o enviar notificaciones.</w:t>
-      </w:r>
-    </w:p>
-    <w:p>
-      <w:pPr>
-        <w:ind w:left="360"/>
-        <w:rPr>
-          <w:rFonts w:ascii="Arial" w:hAnsi="Arial" w:cs="Arial"/>
-          <w:lang w:eastAsia="es-EC"/>
-        </w:rPr>
-      </w:pPr>
-      <w:r>
-        <w:rPr>
-          <w:rFonts w:ascii="Arial" w:hAnsi="Arial" w:cs="Arial"/>
-          <w:b/>
-          <w:bCs/>
-          <w:lang w:eastAsia="es-EC"/>
-        </w:rPr>
-        <w:t>Abierto/cerrado (OCP</w:t>
-      </w:r>
-      <w:r>
-        <w:rPr>
-          <w:rFonts w:ascii="Arial" w:hAnsi="Arial" w:cs="Arial"/>
-          <w:lang w:eastAsia="es-EC"/>
-        </w:rPr>
-        <w:t>): se pueden agregar nuevas especies creando clases y fábricas específicas, sin tener que modificar las clases que ya existen.</w:t>
-      </w:r>
-    </w:p>
-    <w:p>
-      <w:pPr>
-        <w:ind w:left="360"/>
-        <w:rPr>
-          <w:rFonts w:ascii="Arial" w:hAnsi="Arial" w:cs="Arial"/>
-          <w:b/>
-          <w:bCs/>
-          <w:lang w:eastAsia="es-EC"/>
-        </w:rPr>
-      </w:pPr>
-      <w:r>
-        <w:rPr>
-          <w:rFonts w:ascii="Arial" w:hAnsi="Arial" w:cs="Arial"/>
-          <w:b/>
-          <w:bCs/>
-          <w:lang w:eastAsia="es-EC"/>
-        </w:rPr>
-        <w:t>Inversión de dependencias (DIP):</w:t>
-      </w:r>
-      <w:r>
-        <w:rPr>
-          <w:rFonts w:ascii="Arial" w:hAnsi="Arial" w:cs="Arial"/>
-          <w:lang w:eastAsia="es-EC"/>
-        </w:rPr>
-        <w:t xml:space="preserve"> el uso de abstracciones como Animal y Observador reduce la dependencia directa entre los componentes concretos.</w:t>
-      </w:r>
-      <w:r>
-        <w:rPr>
-          <w:rFonts w:ascii="Arial" w:hAnsi="Arial" w:cs="Arial"/>
-          <w:b/>
-          <w:bCs/>
-          <w:lang w:eastAsia="es-EC"/>
-        </w:rPr>
-        <w:t xml:space="preserve"> </w:t>
-      </w:r>
-      <w:r>
-        <w:rPr>
-          <w:rFonts w:ascii="Arial" w:hAnsi="Arial" w:cs="Arial"/>
-          <w:b/>
-          <w:bCs/>
-          <w:lang w:eastAsia="es-EC"/>
-        </w:rPr>
-        <w:br w:type="page"/>
-      </w:r>
-    </w:p>
-    <w:p>
-      <w:pPr>
-        <w:pStyle w:val="Sinespaciado"/>
-        <w:spacing w:line="360" w:lineRule="auto"/>
-        <w:jc w:val="both"/>
-        <w:rPr>
-          <w:rFonts w:ascii="Arial" w:hAnsi="Arial" w:cs="Arial"/>
-          <w:b/>
-          <w:bCs/>
-          <w:lang w:eastAsia="es-EC"/>
-        </w:rPr>
-      </w:pPr>
-      <w:r>
-        <w:rPr>
-          <w:rFonts w:ascii="Arial" w:hAnsi="Arial" w:cs="Arial"/>
-          <w:b/>
-          <w:bCs/>
-          <w:lang w:eastAsia="es-EC"/>
-        </w:rPr>
-        <w:lastRenderedPageBreak/>
-        <w:t>Evidencias</w:t>
-      </w:r>
-    </w:p>
-    <w:p>
-      <w:pPr>
-        <w:widowControl w:val="0"/>
-        <w:pBdr>
-          <w:top w:val="nil"/>
-          <w:left w:val="nil"/>
-          <w:bottom w:val="nil"/>
-          <w:right w:val="nil"/>
-          <w:between w:val="nil"/>
-        </w:pBdr>
-        <w:spacing w:after="0" w:line="240" w:lineRule="auto"/>
-        <w:jc w:val="both"/>
-        <w:rPr>
-          <w:rFonts w:ascii="Arial" w:eastAsiaTheme="majorEastAsia" w:hAnsi="Arial" w:cs="Arial"/>
-          <w:b/>
-          <w:bCs/>
-          <w:color w:val="2F5496" w:themeColor="accent1" w:themeShade="BF"/>
-          <w:sz w:val="24"/>
-          <w:szCs w:val="24"/>
-          <w:lang w:eastAsia="es-EC"/>
-        </w:rPr>
-      </w:pPr>
-      <w:r>
-        <w:rPr>
-          <w:rFonts w:ascii="Arial" w:eastAsia="Arial" w:hAnsi="Arial" w:cs="Arial"/>
-          <w:i/>
-          <w:iCs/>
-          <w:color w:val="000000"/>
-          <w:sz w:val="20"/>
-          <w:szCs w:val="20"/>
-        </w:rPr>
-        <w:drawing>
-          <wp:anchor distT="0" distB="0" distL="114300" distR="114300" simplePos="0" relativeHeight="251673600" behindDoc="0" locked="0" layoutInCell="1" allowOverlap="1" wp14:anchorId="1EA60D13" wp14:editId="06378E02">
-            <wp:simplePos x="0" y="0"/>
-            <wp:positionH relativeFrom="column">
-              <wp:posOffset>-18415</wp:posOffset>
-            </wp:positionH>
-            <wp:positionV relativeFrom="paragraph">
-              <wp:posOffset>3042285</wp:posOffset>
-            </wp:positionV>
-            <wp:extent cx="4145280" cy="2886075"/>
-            <wp:effectExtent l="0" t="0" r="7620" b="9525"/>
-            <wp:wrapTopAndBottom/>
-            <wp:docPr id="5" name="Imagen 5"/>
-            <wp:cNvGraphicFramePr>
-              <a:graphicFrameLocks xmlns:a="http://schemas.openxmlformats.org/drawingml/2006/main" noChangeAspect="1"/>
-            </wp:cNvGraphicFramePr>
-            <a:graphic xmlns:a="http://schemas.openxmlformats.org/drawingml/2006/main">
-              <a:graphicData uri="http://schemas.openxmlformats.org/drawingml/2006/picture">
-                <pic:pic xmlns:pic="http://schemas.openxmlformats.org/drawingml/2006/picture">
-                  <pic:nvPicPr>
-                    <pic:cNvPr id="1" name=""/>
-                    <pic:cNvPicPr/>
-                  </pic:nvPicPr>
-                  <pic:blipFill>
-                    <a:blip r:embed="rId16"/>
-                    <a:stretch>
-                      <a:fillRect/>
-                    </a:stretch>
-                  </pic:blipFill>
-                  <pic:spPr>
-                    <a:xfrm>
-                      <a:off x="0" y="0"/>
-                      <a:ext cx="4145280" cy="2886075"/>
-                    </a:xfrm>
-                    <a:prstGeom prst="rect">
-                      <a:avLst/>
-                    </a:prstGeom>
-                  </pic:spPr>
-                </pic:pic>
-              </a:graphicData>
-            </a:graphic>
-            <wp14:sizeRelH relativeFrom="margin">
-              <wp14:pctWidth>0</wp14:pctWidth>
-            </wp14:sizeRelH>
-            <wp14:sizeRelV relativeFrom="margin">
-              <wp14:pctHeight>0</wp14:pctHeight>
-            </wp14:sizeRelV>
-          </wp:anchor>
-        </w:drawing>
-      </w:r>
-      <w:r>
-        <w:rPr>
-          <w:rFonts w:ascii="Arial" w:eastAsia="Arial" w:hAnsi="Arial" w:cs="Arial"/>
-          <w:i/>
-          <w:iCs/>
-          <w:color w:val="000000"/>
-          <w:sz w:val="20"/>
-          <w:szCs w:val="20"/>
-        </w:rPr>
-        <w:drawing>
-          <wp:anchor distT="0" distB="0" distL="114300" distR="114300" simplePos="0" relativeHeight="251671552" behindDoc="0" locked="0" layoutInCell="1" allowOverlap="1" wp14:anchorId="6F80C3BC" wp14:editId="6FB70B7A">
-            <wp:simplePos x="0" y="0"/>
-            <wp:positionH relativeFrom="column">
-              <wp:posOffset>-3810</wp:posOffset>
-            </wp:positionH>
-            <wp:positionV relativeFrom="paragraph">
-              <wp:posOffset>480060</wp:posOffset>
-            </wp:positionV>
-            <wp:extent cx="4133850" cy="2287905"/>
-            <wp:effectExtent l="0" t="0" r="0" b="0"/>
-            <wp:wrapTopAndBottom/>
-            <wp:docPr id="4" name="Imagen 4"/>
+            <wp:docPr id="8" name="Imagen 8"/>
             <wp:cNvGraphicFramePr>
               <a:graphicFrameLocks xmlns:a="http://schemas.openxmlformats.org/drawingml/2006/main" noChangeAspect="1"/>
             </wp:cNvGraphicFramePr>
@@ -3022,7 +2579,143 @@
                   <pic:spPr>
                     <a:xfrm>
                       <a:off x="0" y="0"/>
-                      <a:ext cx="4133850" cy="2287905"/>
+                      <a:ext cx="5400040" cy="4012565"/>
+                    </a:xfrm>
+                    <a:prstGeom prst="rect">
+                      <a:avLst/>
+                    </a:prstGeom>
+                  </pic:spPr>
+                </pic:pic>
+              </a:graphicData>
+            </a:graphic>
+          </wp:anchor>
+        </w:drawing>
+      </w:r>
+    </w:p>
+    <w:p>
+      <w:pPr>
+        <w:pStyle w:val="Prrafodelista"/>
+        <w:numPr>
+          <w:ilvl w:val="1"/>
+          <w:numId w:val="22"/>
+        </w:numPr>
+        <w:rPr>
+          <w:rFonts w:ascii="Arial" w:hAnsi="Arial" w:cs="Arial"/>
+          <w:b/>
+          <w:bCs/>
+          <w:lang w:eastAsia="es-EC"/>
+        </w:rPr>
+      </w:pPr>
+      <w:r>
+        <w:rPr>
+          <w:rFonts w:ascii="Arial" w:hAnsi="Arial" w:cs="Arial"/>
+          <w:b/>
+          <w:bCs/>
+          <w:lang w:eastAsia="es-EC"/>
+        </w:rPr>
+        <w:lastRenderedPageBreak/>
+        <w:t>Aplicación de patrones de diseño</w:t>
+      </w:r>
+    </w:p>
+    <w:p>
+      <w:pPr>
+        <w:ind w:left="360"/>
+        <w:rPr>
+          <w:rFonts w:ascii="Arial" w:hAnsi="Arial" w:cs="Arial"/>
+          <w:lang w:eastAsia="es-EC"/>
+        </w:rPr>
+      </w:pPr>
+      <w:r>
+        <w:rPr>
+          <w:rFonts w:ascii="Arial" w:hAnsi="Arial" w:cs="Arial"/>
+          <w:noProof/>
+          <w:lang w:eastAsia="es-EC"/>
+        </w:rPr>
+        <mc:AlternateContent>
+          <mc:Choice Requires="wpi">
+            <w:drawing>
+              <wp:anchor distT="0" distB="0" distL="114300" distR="114300" simplePos="0" relativeHeight="251697152" behindDoc="0" locked="0" layoutInCell="1" allowOverlap="1" wp14:anchorId="3FB37AF6" wp14:editId="7F90E07F">
+                <wp:simplePos x="0" y="0"/>
+                <wp:positionH relativeFrom="column">
+                  <wp:posOffset>3110486</wp:posOffset>
+                </wp:positionH>
+                <wp:positionV relativeFrom="paragraph">
+                  <wp:posOffset>1889931</wp:posOffset>
+                </wp:positionV>
+                <wp:extent cx="487045" cy="320032"/>
+                <wp:effectExtent l="133350" t="133350" r="122555" b="137795"/>
+                <wp:wrapNone/>
+                <wp:docPr id="25" name="Entrada de lápiz 25"/>
+                <wp:cNvGraphicFramePr/>
+                <a:graphic xmlns:a="http://schemas.openxmlformats.org/drawingml/2006/main">
+                  <a:graphicData uri="http://schemas.microsoft.com/office/word/2010/wordprocessingInk">
+                    <w14:contentPart bwMode="auto" r:id="rId18">
+                      <w14:nvContentPartPr>
+                        <w14:cNvContentPartPr/>
+                      </w14:nvContentPartPr>
+                      <w14:xfrm>
+                        <a:off x="0" y="0"/>
+                        <a:ext cx="487045" cy="320032"/>
+                      </w14:xfrm>
+                    </w14:contentPart>
+                  </a:graphicData>
+                </a:graphic>
+                <wp14:sizeRelH relativeFrom="margin">
+                  <wp14:pctWidth>0</wp14:pctWidth>
+                </wp14:sizeRelH>
+                <wp14:sizeRelV relativeFrom="margin">
+                  <wp14:pctHeight>0</wp14:pctHeight>
+                </wp14:sizeRelV>
+              </wp:anchor>
+            </w:drawing>
+          </mc:Choice>
+          <mc:Fallback>
+            <w:pict>
+              <v:shape w14:anchorId="5E6D5B65" id="Entrada de lápiz 25" o:spid="_x0000_s1026" type="#_x0000_t75" style="position:absolute;margin-left:239.95pt;margin-top:143.85pt;width:48.25pt;height:35.1pt;z-index:251697152;visibility:visible;mso-wrap-style:square;mso-width-percent:0;mso-height-percent:0;mso-wrap-distance-left:9pt;mso-wrap-distance-top:0;mso-wrap-distance-right:9pt;mso-wrap-distance-bottom:0;mso-position-horizontal:absolute;mso-position-horizontal-relative:text;mso-position-vertical:absolute;mso-position-vertical-relative:text;mso-width-percent:0;mso-height-percent:0;mso-width-relative:margin;mso-height-relative:margin" o:gfxdata="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">
+                <v:imagedata r:id="rId19" o:title=""/>
+              </v:shape>
+            </w:pict>
+          </mc:Fallback>
+        </mc:AlternateContent>
+      </w:r>
+      <w:r>
+        <w:rPr>
+          <w:rFonts w:ascii="Arial" w:hAnsi="Arial" w:cs="Arial"/>
+          <w:lang w:eastAsia="es-EC"/>
+        </w:rPr>
+        <w:drawing>
+          <wp:anchor distT="0" distB="0" distL="114300" distR="114300" simplePos="0" relativeHeight="251694080" behindDoc="0" locked="0" layoutInCell="1" allowOverlap="1" wp14:anchorId="401EBAF9" wp14:editId="1DBF1CCA">
+            <wp:simplePos x="0" y="0"/>
+            <wp:positionH relativeFrom="column">
+              <wp:posOffset>1594485</wp:posOffset>
+            </wp:positionH>
+            <wp:positionV relativeFrom="paragraph">
+              <wp:posOffset>445135</wp:posOffset>
+            </wp:positionV>
+            <wp:extent cx="2326640" cy="2224405"/>
+            <wp:effectExtent l="0" t="0" r="0" b="4445"/>
+            <wp:wrapTopAndBottom/>
+            <wp:docPr id="18" name="Imagen 18"/>
+            <wp:cNvGraphicFramePr>
+              <a:graphicFrameLocks xmlns:a="http://schemas.openxmlformats.org/drawingml/2006/main" noChangeAspect="1"/>
+            </wp:cNvGraphicFramePr>
+            <a:graphic xmlns:a="http://schemas.openxmlformats.org/drawingml/2006/main">
+              <a:graphicData uri="http://schemas.openxmlformats.org/drawingml/2006/picture">
+                <pic:pic xmlns:pic="http://schemas.openxmlformats.org/drawingml/2006/picture">
+                  <pic:nvPicPr>
+                    <pic:cNvPr id="1" name=""/>
+                    <pic:cNvPicPr/>
+                  </pic:nvPicPr>
+                  <pic:blipFill>
+                    <a:blip r:embed="rId20"/>
+                    <a:stretch>
+                      <a:fillRect/>
+                    </a:stretch>
+                  </pic:blipFill>
+                  <pic:spPr>
+                    <a:xfrm>
+                      <a:off x="0" y="0"/>
+                      <a:ext cx="2326640" cy="2224405"/>
                     </a:xfrm>
                     <a:prstGeom prst="rect">
                       <a:avLst/>
@@ -3040,80 +2733,2401 @@
           </wp:anchor>
         </w:drawing>
       </w:r>
-      <w:r>
-        <w:rPr>
-          <w:rFonts w:ascii="Arial" w:hAnsi="Arial" w:cs="Arial"/>
-          <w:b/>
-          <w:bCs/>
-          <w:i/>
-          <w:iCs/>
-          <w:sz w:val="20"/>
-          <w:szCs w:val="20"/>
-          <w:lang w:eastAsia="es-EC"/>
-        </w:rPr>
-        <w:t>(</w:t>
+      <w:proofErr w:type="spellStart"/>
+      <w:r>
+        <w:rPr>
+          <w:rFonts w:ascii="Arial" w:hAnsi="Arial" w:cs="Arial"/>
+          <w:b/>
+          <w:bCs/>
+          <w:lang w:eastAsia="es-EC"/>
+        </w:rPr>
+        <w:t>Singleton</w:t>
+      </w:r>
+      <w:proofErr w:type="spellEnd"/>
+      <w:r>
+        <w:rPr>
+          <w:rFonts w:ascii="Arial" w:hAnsi="Arial" w:cs="Arial"/>
+          <w:b/>
+          <w:bCs/>
+          <w:lang w:eastAsia="es-EC"/>
+        </w:rPr>
+        <w:t>:</w:t>
+      </w:r>
+      <w:r>
+        <w:rPr>
+          <w:rFonts w:ascii="Arial" w:hAnsi="Arial" w:cs="Arial"/>
+          <w:lang w:eastAsia="es-EC"/>
+        </w:rPr>
+        <w:t xml:space="preserve"> se aplica en la clase </w:t>
+      </w:r>
+      <w:proofErr w:type="spellStart"/>
+      <w:r>
+        <w:rPr>
+          <w:rFonts w:ascii="Arial" w:hAnsi="Arial" w:cs="Arial"/>
+          <w:lang w:eastAsia="es-EC"/>
+        </w:rPr>
+        <w:t>GestorCasos</w:t>
+      </w:r>
+      <w:proofErr w:type="spellEnd"/>
+      <w:r>
+        <w:rPr>
+          <w:rFonts w:ascii="Arial" w:hAnsi="Arial" w:cs="Arial"/>
+          <w:lang w:eastAsia="es-EC"/>
+        </w:rPr>
+        <w:t>, que centraliza la gestión de los casos de rescate y asegura que solo exista una instancia del gestor.</w:t>
+      </w:r>
+      <w:r>
+        <w:rPr>
+          <w:noProof/>
+        </w:rPr>
+        <w:t xml:space="preserve"> </w:t>
+      </w:r>
+    </w:p>
+    <w:p>
+      <w:pPr>
+        <w:ind w:left="360"/>
+        <w:rPr>
+          <w:rFonts w:ascii="Arial" w:hAnsi="Arial" w:cs="Arial"/>
+          <w:lang w:eastAsia="es-EC"/>
+        </w:rPr>
+      </w:pPr>
+      <w:r>
+        <w:rPr>
+          <w:rFonts w:ascii="Arial" w:hAnsi="Arial" w:cs="Arial"/>
+          <w:noProof/>
+          <w:lang w:eastAsia="es-EC"/>
+        </w:rPr>
+        <mc:AlternateContent>
+          <mc:Choice Requires="wpi">
+            <w:drawing>
+              <wp:anchor distT="0" distB="0" distL="114300" distR="114300" simplePos="0" relativeHeight="251701248" behindDoc="0" locked="0" layoutInCell="1" allowOverlap="1" wp14:anchorId="3968D200" wp14:editId="52BF2F36">
+                <wp:simplePos x="0" y="0"/>
+                <wp:positionH relativeFrom="column">
+                  <wp:posOffset>1840230</wp:posOffset>
+                </wp:positionH>
+                <wp:positionV relativeFrom="paragraph">
+                  <wp:posOffset>4209453</wp:posOffset>
+                </wp:positionV>
+                <wp:extent cx="559814" cy="578087"/>
+                <wp:effectExtent l="133350" t="133350" r="107315" b="146050"/>
+                <wp:wrapNone/>
+                <wp:docPr id="27" name="Entrada de lápiz 27"/>
+                <wp:cNvGraphicFramePr/>
+                <a:graphic xmlns:a="http://schemas.openxmlformats.org/drawingml/2006/main">
+                  <a:graphicData uri="http://schemas.microsoft.com/office/word/2010/wordprocessingInk">
+                    <w14:contentPart bwMode="auto" r:id="rId21">
+                      <w14:nvContentPartPr>
+                        <w14:cNvContentPartPr/>
+                      </w14:nvContentPartPr>
+                      <w14:xfrm>
+                        <a:off x="0" y="0"/>
+                        <a:ext cx="559814" cy="578087"/>
+                      </w14:xfrm>
+                    </w14:contentPart>
+                  </a:graphicData>
+                </a:graphic>
+                <wp14:sizeRelH relativeFrom="margin">
+                  <wp14:pctWidth>0</wp14:pctWidth>
+                </wp14:sizeRelH>
+                <wp14:sizeRelV relativeFrom="margin">
+                  <wp14:pctHeight>0</wp14:pctHeight>
+                </wp14:sizeRelV>
+              </wp:anchor>
+            </w:drawing>
+          </mc:Choice>
+          <mc:Fallback>
+            <w:pict>
+              <v:shape w14:anchorId="3E18B226" id="Entrada de lápiz 27" o:spid="_x0000_s1026" type="#_x0000_t75" style="position:absolute;margin-left:139.95pt;margin-top:326.65pt;width:54pt;height:55.1pt;z-index:251701248;visibility:visible;mso-wrap-style:square;mso-width-percent:0;mso-height-percent:0;mso-wrap-distance-left:9pt;mso-wrap-distance-top:0;mso-wrap-distance-right:9pt;mso-wrap-distance-bottom:0;mso-position-horizontal:absolute;mso-position-horizontal-relative:text;mso-position-vertical:absolute;mso-position-vertical-relative:text;mso-width-percent:0;mso-height-percent:0;mso-width-relative:margin;mso-height-relative:margin" o:gfxdata="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">
+                <v:imagedata r:id="rId22" o:title=""/>
+              </v:shape>
+            </w:pict>
+          </mc:Fallback>
+        </mc:AlternateContent>
+      </w:r>
+      <w:r>
+        <w:rPr>
+          <w:rFonts w:ascii="Arial" w:hAnsi="Arial" w:cs="Arial"/>
+          <w:noProof/>
+          <w:lang w:eastAsia="es-EC"/>
+        </w:rPr>
+        <mc:AlternateContent>
+          <mc:Choice Requires="wpi">
+            <w:drawing>
+              <wp:anchor distT="0" distB="0" distL="114300" distR="114300" simplePos="0" relativeHeight="251703296" behindDoc="0" locked="0" layoutInCell="1" allowOverlap="1" wp14:anchorId="0E07B501" wp14:editId="38F76FD7">
+                <wp:simplePos x="0" y="0"/>
+                <wp:positionH relativeFrom="column">
+                  <wp:posOffset>1840230</wp:posOffset>
+                </wp:positionH>
+                <wp:positionV relativeFrom="paragraph">
+                  <wp:posOffset>5607211</wp:posOffset>
+                </wp:positionV>
+                <wp:extent cx="487045" cy="319405"/>
+                <wp:effectExtent l="133350" t="133350" r="122555" b="137795"/>
+                <wp:wrapNone/>
+                <wp:docPr id="28" name="Entrada de lápiz 28"/>
+                <wp:cNvGraphicFramePr/>
+                <a:graphic xmlns:a="http://schemas.openxmlformats.org/drawingml/2006/main">
+                  <a:graphicData uri="http://schemas.microsoft.com/office/word/2010/wordprocessingInk">
+                    <w14:contentPart bwMode="auto" r:id="rId23">
+                      <w14:nvContentPartPr>
+                        <w14:cNvContentPartPr/>
+                      </w14:nvContentPartPr>
+                      <w14:xfrm>
+                        <a:off x="0" y="0"/>
+                        <a:ext cx="487045" cy="319405"/>
+                      </w14:xfrm>
+                    </w14:contentPart>
+                  </a:graphicData>
+                </a:graphic>
+                <wp14:sizeRelH relativeFrom="margin">
+                  <wp14:pctWidth>0</wp14:pctWidth>
+                </wp14:sizeRelH>
+                <wp14:sizeRelV relativeFrom="margin">
+                  <wp14:pctHeight>0</wp14:pctHeight>
+                </wp14:sizeRelV>
+              </wp:anchor>
+            </w:drawing>
+          </mc:Choice>
+          <mc:Fallback>
+            <w:pict>
+              <v:shape w14:anchorId="0683163C" id="Entrada de lápiz 28" o:spid="_x0000_s1026" type="#_x0000_t75" style="position:absolute;margin-left:139.95pt;margin-top:436.55pt;width:48.25pt;height:35pt;z-index:251703296;visibility:visible;mso-wrap-style:square;mso-width-percent:0;mso-height-percent:0;mso-wrap-distance-left:9pt;mso-wrap-distance-top:0;mso-wrap-distance-right:9pt;mso-wrap-distance-bottom:0;mso-position-horizontal:absolute;mso-position-horizontal-relative:text;mso-position-vertical:absolute;mso-position-vertical-relative:text;mso-width-percent:0;mso-height-percent:0;mso-width-relative:margin;mso-height-relative:margin" o:gfxdata="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">
+                <v:imagedata r:id="rId24" o:title=""/>
+              </v:shape>
+            </w:pict>
+          </mc:Fallback>
+        </mc:AlternateContent>
+      </w:r>
+      <w:r>
+        <w:rPr>
+          <w:rFonts w:ascii="Arial" w:hAnsi="Arial" w:cs="Arial"/>
+          <w:noProof/>
+          <w:lang w:eastAsia="es-EC"/>
+        </w:rPr>
+        <mc:AlternateContent>
+          <mc:Choice Requires="wpi">
+            <w:drawing>
+              <wp:anchor distT="0" distB="0" distL="114300" distR="114300" simplePos="0" relativeHeight="251705344" behindDoc="0" locked="0" layoutInCell="1" allowOverlap="1" wp14:anchorId="28BB1A65" wp14:editId="20E6101C">
+                <wp:simplePos x="0" y="0"/>
+                <wp:positionH relativeFrom="column">
+                  <wp:posOffset>1840486</wp:posOffset>
+                </wp:positionH>
+                <wp:positionV relativeFrom="paragraph">
+                  <wp:posOffset>6943128</wp:posOffset>
+                </wp:positionV>
+                <wp:extent cx="487045" cy="320032"/>
+                <wp:effectExtent l="133350" t="133350" r="122555" b="137795"/>
+                <wp:wrapNone/>
+                <wp:docPr id="29" name="Entrada de lápiz 29"/>
+                <wp:cNvGraphicFramePr/>
+                <a:graphic xmlns:a="http://schemas.openxmlformats.org/drawingml/2006/main">
+                  <a:graphicData uri="http://schemas.microsoft.com/office/word/2010/wordprocessingInk">
+                    <w14:contentPart bwMode="auto" r:id="rId25">
+                      <w14:nvContentPartPr>
+                        <w14:cNvContentPartPr/>
+                      </w14:nvContentPartPr>
+                      <w14:xfrm>
+                        <a:off x="0" y="0"/>
+                        <a:ext cx="487045" cy="320032"/>
+                      </w14:xfrm>
+                    </w14:contentPart>
+                  </a:graphicData>
+                </a:graphic>
+                <wp14:sizeRelH relativeFrom="margin">
+                  <wp14:pctWidth>0</wp14:pctWidth>
+                </wp14:sizeRelH>
+                <wp14:sizeRelV relativeFrom="margin">
+                  <wp14:pctHeight>0</wp14:pctHeight>
+                </wp14:sizeRelV>
+              </wp:anchor>
+            </w:drawing>
+          </mc:Choice>
+          <mc:Fallback>
+            <w:pict>
+              <v:shape w14:anchorId="110BA67C" id="Entrada de lápiz 29" o:spid="_x0000_s1026" type="#_x0000_t75" style="position:absolute;margin-left:139.95pt;margin-top:541.85pt;width:48.25pt;height:34.9pt;z-index:251705344;visibility:visible;mso-wrap-style:square;mso-width-percent:0;mso-height-percent:0;mso-wrap-distance-left:9pt;mso-wrap-distance-top:0;mso-wrap-distance-right:9pt;mso-wrap-distance-bottom:0;mso-position-horizontal:absolute;mso-position-horizontal-relative:text;mso-position-vertical:absolute;mso-position-vertical-relative:text;mso-width-percent:0;mso-height-percent:0;mso-width-relative:margin;mso-height-relative:margin" o:gfxdata="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">
+                <v:imagedata r:id="rId26" o:title=""/>
+              </v:shape>
+            </w:pict>
+          </mc:Fallback>
+        </mc:AlternateContent>
+      </w:r>
+      <w:r>
+        <w:rPr>
+          <w:rFonts w:ascii="Arial" w:hAnsi="Arial" w:cs="Arial"/>
+          <w:lang w:eastAsia="es-EC"/>
+        </w:rPr>
+        <w:drawing>
+          <wp:anchor distT="0" distB="0" distL="114300" distR="114300" simplePos="0" relativeHeight="251699200" behindDoc="0" locked="0" layoutInCell="1" allowOverlap="1" wp14:anchorId="2F45CDEA" wp14:editId="00DF746C">
+            <wp:simplePos x="0" y="0"/>
+            <wp:positionH relativeFrom="column">
+              <wp:posOffset>1838666</wp:posOffset>
+            </wp:positionH>
+            <wp:positionV relativeFrom="paragraph">
+              <wp:posOffset>2728434</wp:posOffset>
+            </wp:positionV>
+            <wp:extent cx="1757045" cy="4735195"/>
+            <wp:effectExtent l="0" t="0" r="0" b="8255"/>
+            <wp:wrapTopAndBottom/>
+            <wp:docPr id="26" name="Imagen 26"/>
+            <wp:cNvGraphicFramePr>
+              <a:graphicFrameLocks xmlns:a="http://schemas.openxmlformats.org/drawingml/2006/main" noChangeAspect="1"/>
+            </wp:cNvGraphicFramePr>
+            <a:graphic xmlns:a="http://schemas.openxmlformats.org/drawingml/2006/main">
+              <a:graphicData uri="http://schemas.openxmlformats.org/drawingml/2006/picture">
+                <pic:pic xmlns:pic="http://schemas.openxmlformats.org/drawingml/2006/picture">
+                  <pic:nvPicPr>
+                    <pic:cNvPr id="1" name=""/>
+                    <pic:cNvPicPr/>
+                  </pic:nvPicPr>
+                  <pic:blipFill>
+                    <a:blip r:embed="rId27"/>
+                    <a:stretch>
+                      <a:fillRect/>
+                    </a:stretch>
+                  </pic:blipFill>
+                  <pic:spPr>
+                    <a:xfrm>
+                      <a:off x="0" y="0"/>
+                      <a:ext cx="1757045" cy="4735195"/>
+                    </a:xfrm>
+                    <a:prstGeom prst="rect">
+                      <a:avLst/>
+                    </a:prstGeom>
+                  </pic:spPr>
+                </pic:pic>
+              </a:graphicData>
+            </a:graphic>
+            <wp14:sizeRelH relativeFrom="margin">
+              <wp14:pctWidth>0</wp14:pctWidth>
+            </wp14:sizeRelH>
+            <wp14:sizeRelV relativeFrom="margin">
+              <wp14:pctHeight>0</wp14:pctHeight>
+            </wp14:sizeRelV>
+          </wp:anchor>
+        </w:drawing>
+      </w:r>
+      <w:proofErr w:type="spellStart"/>
+      <w:r>
+        <w:rPr>
+          <w:rFonts w:ascii="Arial" w:hAnsi="Arial" w:cs="Arial"/>
+          <w:b/>
+          <w:bCs/>
+          <w:lang w:eastAsia="es-EC"/>
+        </w:rPr>
+        <w:t>Observer</w:t>
+      </w:r>
+      <w:proofErr w:type="spellEnd"/>
+      <w:r>
+        <w:rPr>
+          <w:rFonts w:ascii="Arial" w:hAnsi="Arial" w:cs="Arial"/>
+          <w:b/>
+          <w:bCs/>
+          <w:lang w:eastAsia="es-EC"/>
+        </w:rPr>
+        <w:t>:</w:t>
+      </w:r>
+      <w:r>
+        <w:rPr>
+          <w:rFonts w:ascii="Arial" w:hAnsi="Arial" w:cs="Arial"/>
+          <w:lang w:eastAsia="es-EC"/>
+        </w:rPr>
+        <w:t xml:space="preserve"> se usa a través de las clases Notificador y Observador, lo que permite avisar a los voluntarios cuando se registra un nuevo caso de rescate.</w:t>
+      </w:r>
+      <w:r>
+        <w:rPr>
+          <w:noProof/>
+        </w:rPr>
+        <w:t xml:space="preserve"> </w:t>
+      </w:r>
+    </w:p>
+    <w:p>
+      <w:pPr>
+        <w:rPr>
+          <w:rFonts w:ascii="Arial" w:hAnsi="Arial" w:cs="Arial"/>
+          <w:b/>
+          <w:bCs/>
+          <w:lang w:eastAsia="es-EC"/>
+        </w:rPr>
+      </w:pPr>
+      <w:r>
+        <w:rPr>
+          <w:rFonts w:ascii="Arial" w:hAnsi="Arial" w:cs="Arial"/>
+          <w:b/>
+          <w:bCs/>
+          <w:lang w:eastAsia="es-EC"/>
+        </w:rPr>
+        <w:br w:type="page"/>
+      </w:r>
+    </w:p>
+    <w:p>
+      <w:pPr>
+        <w:ind w:left="360"/>
+        <w:rPr>
+          <w:rFonts w:ascii="Arial" w:hAnsi="Arial" w:cs="Arial"/>
+          <w:lang w:eastAsia="es-EC"/>
+        </w:rPr>
+      </w:pPr>
+      <w:r>
+        <w:rPr>
+          <w:rFonts w:ascii="Arial" w:hAnsi="Arial" w:cs="Arial"/>
+          <w:noProof/>
+          <w:lang w:eastAsia="es-EC"/>
+        </w:rPr>
+        <w:lastRenderedPageBreak/>
+        <mc:AlternateContent>
+          <mc:Choice Requires="wpi">
+            <w:drawing>
+              <wp:anchor distT="0" distB="0" distL="114300" distR="114300" simplePos="0" relativeHeight="251711488" behindDoc="0" locked="0" layoutInCell="1" allowOverlap="1" wp14:anchorId="791B4415" wp14:editId="3A69CE43">
+                <wp:simplePos x="0" y="0"/>
+                <wp:positionH relativeFrom="column">
+                  <wp:posOffset>3832225</wp:posOffset>
+                </wp:positionH>
+                <wp:positionV relativeFrom="paragraph">
+                  <wp:posOffset>3550001</wp:posOffset>
+                </wp:positionV>
+                <wp:extent cx="487045" cy="319405"/>
+                <wp:effectExtent l="133350" t="133350" r="122555" b="137795"/>
+                <wp:wrapNone/>
+                <wp:docPr id="32" name="Entrada de lápiz 32"/>
+                <wp:cNvGraphicFramePr/>
+                <a:graphic xmlns:a="http://schemas.openxmlformats.org/drawingml/2006/main">
+                  <a:graphicData uri="http://schemas.microsoft.com/office/word/2010/wordprocessingInk">
+                    <w14:contentPart bwMode="auto" r:id="rId28">
+                      <w14:nvContentPartPr>
+                        <w14:cNvContentPartPr/>
+                      </w14:nvContentPartPr>
+                      <w14:xfrm>
+                        <a:off x="0" y="0"/>
+                        <a:ext cx="487045" cy="319405"/>
+                      </w14:xfrm>
+                    </w14:contentPart>
+                  </a:graphicData>
+                </a:graphic>
+                <wp14:sizeRelH relativeFrom="margin">
+                  <wp14:pctWidth>0</wp14:pctWidth>
+                </wp14:sizeRelH>
+                <wp14:sizeRelV relativeFrom="margin">
+                  <wp14:pctHeight>0</wp14:pctHeight>
+                </wp14:sizeRelV>
+              </wp:anchor>
+            </w:drawing>
+          </mc:Choice>
+          <mc:Fallback>
+            <w:pict>
+              <v:shape w14:anchorId="2EAA04DB" id="Entrada de lápiz 32" o:spid="_x0000_s1026" type="#_x0000_t75" style="position:absolute;margin-left:296.8pt;margin-top:274.6pt;width:48.25pt;height:35pt;z-index:251711488;visibility:visible;mso-wrap-style:square;mso-width-percent:0;mso-height-percent:0;mso-wrap-distance-left:9pt;mso-wrap-distance-top:0;mso-wrap-distance-right:9pt;mso-wrap-distance-bottom:0;mso-position-horizontal:absolute;mso-position-horizontal-relative:text;mso-position-vertical:absolute;mso-position-vertical-relative:text;mso-width-percent:0;mso-height-percent:0;mso-width-relative:margin;mso-height-relative:margin" o:gfxdata="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">
+                <v:imagedata r:id="rId24" o:title=""/>
+              </v:shape>
+            </w:pict>
+          </mc:Fallback>
+        </mc:AlternateContent>
+      </w:r>
+      <w:r>
+        <w:rPr>
+          <w:rFonts w:ascii="Arial" w:hAnsi="Arial" w:cs="Arial"/>
+          <w:noProof/>
+          <w:lang w:eastAsia="es-EC"/>
+        </w:rPr>
+        <mc:AlternateContent>
+          <mc:Choice Requires="wpi">
+            <w:drawing>
+              <wp:anchor distT="0" distB="0" distL="114300" distR="114300" simplePos="0" relativeHeight="251709440" behindDoc="0" locked="0" layoutInCell="1" allowOverlap="1" wp14:anchorId="654B59DD" wp14:editId="706AAF87">
+                <wp:simplePos x="0" y="0"/>
+                <wp:positionH relativeFrom="column">
+                  <wp:posOffset>3832567</wp:posOffset>
+                </wp:positionH>
+                <wp:positionV relativeFrom="paragraph">
+                  <wp:posOffset>2862722</wp:posOffset>
+                </wp:positionV>
+                <wp:extent cx="487045" cy="319405"/>
+                <wp:effectExtent l="133350" t="133350" r="122555" b="137795"/>
+                <wp:wrapNone/>
+                <wp:docPr id="31" name="Entrada de lápiz 31"/>
+                <wp:cNvGraphicFramePr/>
+                <a:graphic xmlns:a="http://schemas.openxmlformats.org/drawingml/2006/main">
+                  <a:graphicData uri="http://schemas.microsoft.com/office/word/2010/wordprocessingInk">
+                    <w14:contentPart bwMode="auto" r:id="rId29">
+                      <w14:nvContentPartPr>
+                        <w14:cNvContentPartPr/>
+                      </w14:nvContentPartPr>
+                      <w14:xfrm>
+                        <a:off x="0" y="0"/>
+                        <a:ext cx="487045" cy="319405"/>
+                      </w14:xfrm>
+                    </w14:contentPart>
+                  </a:graphicData>
+                </a:graphic>
+                <wp14:sizeRelH relativeFrom="margin">
+                  <wp14:pctWidth>0</wp14:pctWidth>
+                </wp14:sizeRelH>
+                <wp14:sizeRelV relativeFrom="margin">
+                  <wp14:pctHeight>0</wp14:pctHeight>
+                </wp14:sizeRelV>
+              </wp:anchor>
+            </w:drawing>
+          </mc:Choice>
+          <mc:Fallback>
+            <w:pict>
+              <v:shape w14:anchorId="112022C8" id="Entrada de lápiz 31" o:spid="_x0000_s1026" type="#_x0000_t75" style="position:absolute;margin-left:296.85pt;margin-top:220.45pt;width:48.25pt;height:35pt;z-index:251709440;visibility:visible;mso-wrap-style:square;mso-width-percent:0;mso-height-percent:0;mso-wrap-distance-left:9pt;mso-wrap-distance-top:0;mso-wrap-distance-right:9pt;mso-wrap-distance-bottom:0;mso-position-horizontal:absolute;mso-position-horizontal-relative:text;mso-position-vertical:absolute;mso-position-vertical-relative:text;mso-width-percent:0;mso-height-percent:0;mso-width-relative:margin;mso-height-relative:margin" o:gfxdata="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">
+                <v:imagedata r:id="rId24" o:title=""/>
+              </v:shape>
+            </w:pict>
+          </mc:Fallback>
+        </mc:AlternateContent>
+      </w:r>
+      <w:r>
+        <w:rPr>
+          <w:rFonts w:ascii="Arial" w:hAnsi="Arial" w:cs="Arial"/>
+          <w:lang w:eastAsia="es-EC"/>
+        </w:rPr>
+        <w:drawing>
+          <wp:anchor distT="0" distB="0" distL="114300" distR="114300" simplePos="0" relativeHeight="251707392" behindDoc="0" locked="0" layoutInCell="1" allowOverlap="1" wp14:anchorId="52D0DF81" wp14:editId="126A1479">
+            <wp:simplePos x="0" y="0"/>
+            <wp:positionH relativeFrom="column">
+              <wp:posOffset>1157728</wp:posOffset>
+            </wp:positionH>
+            <wp:positionV relativeFrom="paragraph">
+              <wp:posOffset>528955</wp:posOffset>
+            </wp:positionV>
+            <wp:extent cx="3015615" cy="3435985"/>
+            <wp:effectExtent l="0" t="0" r="0" b="0"/>
+            <wp:wrapTopAndBottom/>
+            <wp:docPr id="30" name="Imagen 30"/>
+            <wp:cNvGraphicFramePr>
+              <a:graphicFrameLocks xmlns:a="http://schemas.openxmlformats.org/drawingml/2006/main" noChangeAspect="1"/>
+            </wp:cNvGraphicFramePr>
+            <a:graphic xmlns:a="http://schemas.openxmlformats.org/drawingml/2006/main">
+              <a:graphicData uri="http://schemas.openxmlformats.org/drawingml/2006/picture">
+                <pic:pic xmlns:pic="http://schemas.openxmlformats.org/drawingml/2006/picture">
+                  <pic:nvPicPr>
+                    <pic:cNvPr id="1" name=""/>
+                    <pic:cNvPicPr/>
+                  </pic:nvPicPr>
+                  <pic:blipFill>
+                    <a:blip r:embed="rId30"/>
+                    <a:stretch>
+                      <a:fillRect/>
+                    </a:stretch>
+                  </pic:blipFill>
+                  <pic:spPr>
+                    <a:xfrm>
+                      <a:off x="0" y="0"/>
+                      <a:ext cx="3015615" cy="3435985"/>
+                    </a:xfrm>
+                    <a:prstGeom prst="rect">
+                      <a:avLst/>
+                    </a:prstGeom>
+                  </pic:spPr>
+                </pic:pic>
+              </a:graphicData>
+            </a:graphic>
+            <wp14:sizeRelH relativeFrom="margin">
+              <wp14:pctWidth>0</wp14:pctWidth>
+            </wp14:sizeRelH>
+            <wp14:sizeRelV relativeFrom="margin">
+              <wp14:pctHeight>0</wp14:pctHeight>
+            </wp14:sizeRelV>
+          </wp:anchor>
+        </w:drawing>
+      </w:r>
+      <w:r>
+        <w:rPr>
+          <w:rFonts w:ascii="Arial" w:hAnsi="Arial" w:cs="Arial"/>
+          <w:b/>
+          <w:bCs/>
+          <w:lang w:eastAsia="es-EC"/>
+        </w:rPr>
+        <w:t xml:space="preserve">Factory </w:t>
+      </w:r>
+      <w:proofErr w:type="spellStart"/>
+      <w:r>
+        <w:rPr>
+          <w:rFonts w:ascii="Arial" w:hAnsi="Arial" w:cs="Arial"/>
+          <w:b/>
+          <w:bCs/>
+          <w:lang w:eastAsia="es-EC"/>
+        </w:rPr>
+        <w:t>Method</w:t>
+      </w:r>
+      <w:proofErr w:type="spellEnd"/>
+      <w:r>
+        <w:rPr>
+          <w:rFonts w:ascii="Arial" w:hAnsi="Arial" w:cs="Arial"/>
+          <w:b/>
+          <w:bCs/>
+          <w:lang w:eastAsia="es-EC"/>
+        </w:rPr>
+        <w:t>:</w:t>
+      </w:r>
+      <w:r>
+        <w:rPr>
+          <w:rFonts w:ascii="Arial" w:hAnsi="Arial" w:cs="Arial"/>
+          <w:lang w:eastAsia="es-EC"/>
+        </w:rPr>
+        <w:t xml:space="preserve"> se implementa con </w:t>
+      </w:r>
+      <w:proofErr w:type="spellStart"/>
+      <w:r>
+        <w:rPr>
+          <w:rFonts w:ascii="Arial" w:hAnsi="Arial" w:cs="Arial"/>
+          <w:lang w:eastAsia="es-EC"/>
+        </w:rPr>
+        <w:t>AnimalFactory</w:t>
+      </w:r>
+      <w:proofErr w:type="spellEnd"/>
+      <w:r>
+        <w:rPr>
+          <w:rFonts w:ascii="Arial" w:hAnsi="Arial" w:cs="Arial"/>
+          <w:lang w:eastAsia="es-EC"/>
+        </w:rPr>
+        <w:t xml:space="preserve"> y sus fábricas específicas, que se encargan de crear objetos según la especie del animal, ya sea perro, gato o fauna silvestre.</w:t>
+      </w:r>
+      <w:r>
+        <w:rPr>
+          <w:noProof/>
+        </w:rPr>
+        <w:t xml:space="preserve"> </w:t>
+      </w:r>
+    </w:p>
+    <w:p>
+      <w:pPr>
+        <w:ind w:left="360"/>
+        <w:rPr>
+          <w:rFonts w:ascii="Arial" w:hAnsi="Arial" w:cs="Arial"/>
+          <w:lang w:eastAsia="es-EC"/>
+        </w:rPr>
+      </w:pPr>
+    </w:p>
+    <w:p>
+      <w:pPr>
+        <w:ind w:left="360"/>
+        <w:rPr>
+          <w:rFonts w:ascii="Arial" w:hAnsi="Arial" w:cs="Arial"/>
+          <w:lang w:eastAsia="es-EC"/>
+        </w:rPr>
+      </w:pPr>
+      <w:r>
+        <w:rPr>
+          <w:rFonts w:ascii="Arial" w:hAnsi="Arial" w:cs="Arial"/>
+          <w:lang w:eastAsia="es-EC"/>
+        </w:rPr>
+        <w:t>Estos patrones ayudan a organizar mejor las responsabilidades del sistema, facilitan su mantenimiento y dejan la puerta abierta para futuras ampliaciones.</w:t>
+      </w:r>
+    </w:p>
+    <w:p>
+      <w:pPr>
+        <w:rPr>
+          <w:rFonts w:ascii="Arial" w:hAnsi="Arial" w:cs="Arial"/>
+          <w:b/>
+          <w:bCs/>
+          <w:lang w:eastAsia="es-EC"/>
+        </w:rPr>
+      </w:pPr>
+    </w:p>
+    <w:p>
+      <w:pPr>
+        <w:pStyle w:val="Prrafodelista"/>
+        <w:numPr>
+          <w:ilvl w:val="1"/>
+          <w:numId w:val="22"/>
+        </w:numPr>
+        <w:rPr>
+          <w:rFonts w:ascii="Arial" w:hAnsi="Arial" w:cs="Arial"/>
+          <w:b/>
+          <w:bCs/>
+          <w:lang w:eastAsia="es-EC"/>
+        </w:rPr>
+      </w:pPr>
+      <w:r>
+        <w:rPr>
+          <w:rFonts w:ascii="Arial" w:hAnsi="Arial" w:cs="Arial"/>
+          <w:b/>
+          <w:bCs/>
+          <w:lang w:eastAsia="es-EC"/>
+        </w:rPr>
+        <w:t>Principios SOLID considerados</w:t>
+      </w:r>
+    </w:p>
+    <w:p>
+      <w:pPr>
+        <w:ind w:left="360"/>
+        <w:rPr>
+          <w:rFonts w:ascii="Arial" w:hAnsi="Arial" w:cs="Arial"/>
+          <w:lang w:eastAsia="es-EC"/>
+        </w:rPr>
+      </w:pPr>
+      <w:r>
+        <w:rPr>
+          <w:rFonts w:ascii="Arial" w:hAnsi="Arial" w:cs="Arial"/>
+          <w:b/>
+          <w:bCs/>
+          <w:lang w:eastAsia="es-EC"/>
+        </w:rPr>
+        <w:t>Responsabilidad única (SRP):</w:t>
+      </w:r>
+      <w:r>
+        <w:rPr>
+          <w:rFonts w:ascii="Arial" w:hAnsi="Arial" w:cs="Arial"/>
+          <w:lang w:eastAsia="es-EC"/>
+        </w:rPr>
+        <w:t xml:space="preserve"> cada clase cumple una función concreta, como gestionar casos, representar animales o enviar notificaciones.</w:t>
+      </w:r>
+    </w:p>
+    <w:p>
+      <w:pPr>
+        <w:ind w:left="360"/>
+        <w:rPr>
+          <w:rFonts w:ascii="Arial" w:hAnsi="Arial" w:cs="Arial"/>
+          <w:lang w:eastAsia="es-EC"/>
+        </w:rPr>
+      </w:pPr>
+      <w:r>
+        <w:rPr>
+          <w:rFonts w:ascii="Arial" w:hAnsi="Arial" w:cs="Arial"/>
+          <w:b/>
+          <w:bCs/>
+          <w:lang w:eastAsia="es-EC"/>
+        </w:rPr>
+        <w:t>Abierto/cerrado (OCP</w:t>
+      </w:r>
+      <w:r>
+        <w:rPr>
+          <w:rFonts w:ascii="Arial" w:hAnsi="Arial" w:cs="Arial"/>
+          <w:lang w:eastAsia="es-EC"/>
+        </w:rPr>
+        <w:t>): se pueden agregar nuevas especies creando clases y fábricas específicas, sin tener que modificar las clases que ya existen.</w:t>
+      </w:r>
+    </w:p>
+    <w:p>
+      <w:pPr>
+        <w:ind w:left="360"/>
+        <w:rPr>
+          <w:rFonts w:ascii="Arial" w:hAnsi="Arial" w:cs="Arial"/>
+          <w:b/>
+          <w:bCs/>
+          <w:lang w:eastAsia="es-EC"/>
+        </w:rPr>
+      </w:pPr>
+      <w:r>
+        <w:rPr>
+          <w:rFonts w:ascii="Arial" w:hAnsi="Arial" w:cs="Arial"/>
+          <w:b/>
+          <w:bCs/>
+          <w:lang w:eastAsia="es-EC"/>
+        </w:rPr>
+        <w:t>Inversión de dependencias (DIP):</w:t>
+      </w:r>
+      <w:r>
+        <w:rPr>
+          <w:rFonts w:ascii="Arial" w:hAnsi="Arial" w:cs="Arial"/>
+          <w:lang w:eastAsia="es-EC"/>
+        </w:rPr>
+        <w:t xml:space="preserve"> el uso de abstracciones como Animal y Observador reduce la dependencia directa entre los componentes concretos.</w:t>
+      </w:r>
+      <w:r>
+        <w:rPr>
+          <w:rFonts w:ascii="Arial" w:hAnsi="Arial" w:cs="Arial"/>
+          <w:b/>
+          <w:bCs/>
+          <w:lang w:eastAsia="es-EC"/>
+        </w:rPr>
+        <w:t xml:space="preserve"> </w:t>
+      </w:r>
+    </w:p>
+    <w:p>
+      <w:pPr>
+        <w:rPr>
+          <w:rFonts w:ascii="Arial" w:hAnsi="Arial" w:cs="Arial"/>
+          <w:b/>
+          <w:bCs/>
+          <w:lang w:eastAsia="es-EC"/>
+        </w:rPr>
+      </w:pPr>
+    </w:p>
+    <w:p>
+      <w:pPr>
+        <w:rPr>
+          <w:rFonts w:ascii="Arial" w:hAnsi="Arial" w:cs="Arial"/>
+          <w:b/>
+          <w:bCs/>
+          <w:lang w:eastAsia="es-EC"/>
+        </w:rPr>
+      </w:pPr>
+      <w:r>
+        <w:rPr>
+          <w:rFonts w:ascii="Arial" w:hAnsi="Arial" w:cs="Arial"/>
+          <w:b/>
+          <w:bCs/>
+          <w:lang w:eastAsia="es-EC"/>
+        </w:rPr>
+        <w:br w:type="page"/>
+      </w:r>
+    </w:p>
+    <w:p>
+      <w:pPr>
+        <w:ind w:left="360"/>
+        <w:rPr>
+          <w:rFonts w:ascii="Arial" w:hAnsi="Arial" w:cs="Arial"/>
+          <w:b/>
+          <w:bCs/>
+          <w:lang w:eastAsia="es-EC"/>
+        </w:rPr>
+      </w:pPr>
+    </w:p>
+    <w:p>
+      <w:pPr>
+        <w:pStyle w:val="Prrafodelista"/>
+        <w:numPr>
+          <w:ilvl w:val="0"/>
+          <w:numId w:val="22"/>
+        </w:numPr>
+        <w:rPr>
+          <w:rFonts w:ascii="Arial" w:hAnsi="Arial" w:cs="Arial"/>
+          <w:b/>
+          <w:bCs/>
+          <w:lang w:eastAsia="es-EC"/>
+        </w:rPr>
+      </w:pPr>
+      <w:r>
+        <w:rPr>
+          <w:rFonts w:ascii="Arial" w:hAnsi="Arial" w:cs="Arial"/>
+          <w:b/>
+          <w:bCs/>
+          <w:lang w:eastAsia="es-EC"/>
+        </w:rPr>
+        <w:t>Diagrama de secuencia UML</w:t>
+      </w:r>
+    </w:p>
+    <w:p>
+      <w:pPr>
+        <w:rPr>
+          <w:rFonts w:ascii="Arial" w:hAnsi="Arial" w:cs="Arial"/>
+          <w:lang w:eastAsia="es-EC"/>
+        </w:rPr>
+      </w:pPr>
+      <w:r>
+        <w:rPr>
+          <w:rFonts w:ascii="Arial" w:hAnsi="Arial" w:cs="Arial"/>
+          <w:lang w:eastAsia="es-EC"/>
+        </w:rPr>
+        <w:t xml:space="preserve">El diagrama de secuencia muestra cómo se lleva a cabo el registro de un nuevo caso de rescate, desde que se recibe la solicitud hasta que se notifica a los voluntarios. Durante este proceso, </w:t>
+      </w:r>
+      <w:proofErr w:type="spellStart"/>
+      <w:r>
+        <w:rPr>
+          <w:rFonts w:ascii="Arial" w:hAnsi="Arial" w:cs="Arial"/>
+          <w:lang w:eastAsia="es-EC"/>
+        </w:rPr>
+        <w:t>GestorCasos</w:t>
+      </w:r>
+      <w:proofErr w:type="spellEnd"/>
+      <w:r>
+        <w:rPr>
+          <w:rFonts w:ascii="Arial" w:hAnsi="Arial" w:cs="Arial"/>
+          <w:lang w:eastAsia="es-EC"/>
+        </w:rPr>
+        <w:t xml:space="preserve"> se encarga de coordinar el registro, </w:t>
+      </w:r>
+      <w:proofErr w:type="spellStart"/>
+      <w:r>
+        <w:rPr>
+          <w:rFonts w:ascii="Arial" w:hAnsi="Arial" w:cs="Arial"/>
+          <w:lang w:eastAsia="es-EC"/>
+        </w:rPr>
+        <w:t>AnimalFactory</w:t>
+      </w:r>
+      <w:proofErr w:type="spellEnd"/>
+      <w:r>
+        <w:rPr>
+          <w:rFonts w:ascii="Arial" w:hAnsi="Arial" w:cs="Arial"/>
+          <w:lang w:eastAsia="es-EC"/>
+        </w:rPr>
+        <w:t xml:space="preserve"> crea el objeto según la especie del animal y Notificador se ocupa de avisar a los voluntarios suscritos que hay un nuevo caso disponible.</w:t>
+      </w:r>
+    </w:p>
+    <w:p>
+      <w:pPr>
+        <w:rPr>
+          <w:rFonts w:ascii="Arial" w:hAnsi="Arial" w:cs="Arial"/>
+          <w:b/>
+          <w:bCs/>
+          <w:lang w:eastAsia="es-EC"/>
+        </w:rPr>
+      </w:pPr>
+      <w:r>
+        <w:rPr>
+          <w:rFonts w:ascii="Arial" w:hAnsi="Arial" w:cs="Arial"/>
+          <w:b/>
+          <w:bCs/>
+          <w:lang w:eastAsia="es-EC"/>
+        </w:rPr>
+        <w:drawing>
+          <wp:anchor distT="0" distB="0" distL="114300" distR="114300" simplePos="0" relativeHeight="251679744" behindDoc="0" locked="0" layoutInCell="1" allowOverlap="1" wp14:anchorId="420250FC" wp14:editId="6DE9ABBC">
+            <wp:simplePos x="0" y="0"/>
+            <wp:positionH relativeFrom="column">
+              <wp:posOffset>0</wp:posOffset>
+            </wp:positionH>
+            <wp:positionV relativeFrom="paragraph">
+              <wp:posOffset>283210</wp:posOffset>
+            </wp:positionV>
+            <wp:extent cx="5400040" cy="4827270"/>
+            <wp:effectExtent l="0" t="0" r="0" b="0"/>
+            <wp:wrapTopAndBottom/>
+            <wp:docPr id="9" name="Imagen 9"/>
+            <wp:cNvGraphicFramePr>
+              <a:graphicFrameLocks xmlns:a="http://schemas.openxmlformats.org/drawingml/2006/main" noChangeAspect="1"/>
+            </wp:cNvGraphicFramePr>
+            <a:graphic xmlns:a="http://schemas.openxmlformats.org/drawingml/2006/main">
+              <a:graphicData uri="http://schemas.openxmlformats.org/drawingml/2006/picture">
+                <pic:pic xmlns:pic="http://schemas.openxmlformats.org/drawingml/2006/picture">
+                  <pic:nvPicPr>
+                    <pic:cNvPr id="1" name=""/>
+                    <pic:cNvPicPr/>
+                  </pic:nvPicPr>
+                  <pic:blipFill>
+                    <a:blip r:embed="rId31"/>
+                    <a:stretch>
+                      <a:fillRect/>
+                    </a:stretch>
+                  </pic:blipFill>
+                  <pic:spPr>
+                    <a:xfrm>
+                      <a:off x="0" y="0"/>
+                      <a:ext cx="5400040" cy="4827270"/>
+                    </a:xfrm>
+                    <a:prstGeom prst="rect">
+                      <a:avLst/>
+                    </a:prstGeom>
+                  </pic:spPr>
+                </pic:pic>
+              </a:graphicData>
+            </a:graphic>
+          </wp:anchor>
+        </w:drawing>
+      </w:r>
+      <w:r>
+        <w:rPr>
+          <w:rFonts w:ascii="Arial" w:hAnsi="Arial" w:cs="Arial"/>
+          <w:b/>
+          <w:bCs/>
+          <w:lang w:eastAsia="es-EC"/>
+        </w:rPr>
+        <w:br w:type="page"/>
+      </w:r>
+    </w:p>
+    <w:p>
+      <w:pPr>
+        <w:pStyle w:val="Prrafodelista"/>
+        <w:numPr>
+          <w:ilvl w:val="0"/>
+          <w:numId w:val="22"/>
+        </w:numPr>
+        <w:rPr>
+          <w:rFonts w:ascii="Arial" w:hAnsi="Arial" w:cs="Arial"/>
+          <w:b/>
+          <w:bCs/>
+          <w:lang w:eastAsia="es-EC"/>
+        </w:rPr>
+      </w:pPr>
+      <w:r>
+        <w:rPr>
+          <w:rFonts w:ascii="Arial" w:hAnsi="Arial" w:cs="Arial"/>
+          <w:b/>
+          <w:bCs/>
+          <w:lang w:eastAsia="es-EC"/>
+        </w:rPr>
+        <w:lastRenderedPageBreak/>
+        <w:t xml:space="preserve">Arquitectura general y flujo de trabajo </w:t>
+      </w:r>
+      <w:proofErr w:type="spellStart"/>
+      <w:r>
+        <w:rPr>
+          <w:rFonts w:ascii="Arial" w:hAnsi="Arial" w:cs="Arial"/>
+          <w:b/>
+          <w:bCs/>
+          <w:lang w:eastAsia="es-EC"/>
+        </w:rPr>
+        <w:t>Gitflow</w:t>
+      </w:r>
+      <w:proofErr w:type="spellEnd"/>
+    </w:p>
+    <w:p>
+      <w:pPr>
+        <w:rPr>
+          <w:rFonts w:ascii="Arial" w:hAnsi="Arial" w:cs="Arial"/>
+          <w:lang w:eastAsia="es-EC"/>
+        </w:rPr>
+      </w:pPr>
+      <w:r>
+        <w:rPr>
+          <w:rFonts w:ascii="Arial" w:hAnsi="Arial" w:cs="Arial"/>
+          <w:lang w:eastAsia="es-EC"/>
+        </w:rPr>
+        <w:t>La arquitectura que se propone organiza el sistema en componentes, cada uno con una responsabilidad clara. La interfaz de usuario permite interactuar con las funciones del sistema; la capa de control se encarga de coordinar las operaciones; la lógica de negocio gestiona los casos de rescate, los expedientes y las asignaciones; y la capa de datos permite almacenar y consultar la información.</w:t>
+      </w:r>
+    </w:p>
+    <w:p>
+      <w:pPr>
+        <w:rPr>
+          <w:rFonts w:ascii="Arial" w:hAnsi="Arial" w:cs="Arial"/>
+          <w:lang w:eastAsia="es-EC"/>
+        </w:rPr>
+      </w:pPr>
+      <w:r>
+        <w:rPr>
+          <w:rFonts w:ascii="Arial" w:hAnsi="Arial" w:cs="Arial"/>
+          <w:lang w:eastAsia="es-EC"/>
+        </w:rPr>
+        <w:t xml:space="preserve">Para organizar el desarrollo y llevar un control de los cambios, se plantea usar Git y GitHub con el flujo de trabajo </w:t>
+      </w:r>
+      <w:proofErr w:type="spellStart"/>
+      <w:r>
+        <w:rPr>
+          <w:rFonts w:ascii="Arial" w:hAnsi="Arial" w:cs="Arial"/>
+          <w:lang w:eastAsia="es-EC"/>
+        </w:rPr>
+        <w:t>Gitflow</w:t>
+      </w:r>
+      <w:proofErr w:type="spellEnd"/>
+      <w:r>
+        <w:rPr>
+          <w:rFonts w:ascii="Arial" w:hAnsi="Arial" w:cs="Arial"/>
+          <w:lang w:eastAsia="es-EC"/>
+        </w:rPr>
+        <w:t>, apoyándose en las siguientes ramas:</w:t>
+      </w:r>
+    </w:p>
+    <w:p>
+      <w:pPr>
+        <w:pStyle w:val="Prrafodelista"/>
+        <w:numPr>
+          <w:ilvl w:val="0"/>
+          <w:numId w:val="26"/>
+        </w:numPr>
+        <w:rPr>
+          <w:rFonts w:ascii="Arial" w:hAnsi="Arial" w:cs="Arial"/>
+          <w:lang w:eastAsia="es-EC"/>
+        </w:rPr>
+      </w:pPr>
+      <w:r>
+        <w:rPr>
+          <w:rFonts w:ascii="Arial" w:hAnsi="Arial" w:cs="Arial"/>
+          <w:b/>
+          <w:bCs/>
+          <w:lang w:eastAsia="es-EC"/>
+        </w:rPr>
+        <w:t>master</w:t>
+      </w:r>
+      <w:r>
+        <w:rPr>
+          <w:rFonts w:ascii="Arial" w:hAnsi="Arial" w:cs="Arial"/>
+          <w:lang w:eastAsia="es-EC"/>
+        </w:rPr>
+        <w:t>: guarda las versiones estables del proyecto.</w:t>
+      </w:r>
+    </w:p>
+    <w:p>
+      <w:pPr>
+        <w:pStyle w:val="Prrafodelista"/>
+        <w:numPr>
+          <w:ilvl w:val="0"/>
+          <w:numId w:val="26"/>
+        </w:numPr>
+        <w:rPr>
+          <w:rFonts w:ascii="Arial" w:hAnsi="Arial" w:cs="Arial"/>
+          <w:lang w:eastAsia="es-EC"/>
+        </w:rPr>
+      </w:pPr>
+      <w:proofErr w:type="spellStart"/>
+      <w:r>
+        <w:rPr>
+          <w:rFonts w:ascii="Arial" w:hAnsi="Arial" w:cs="Arial"/>
+          <w:b/>
+          <w:bCs/>
+          <w:lang w:eastAsia="es-EC"/>
+        </w:rPr>
+        <w:t>develop</w:t>
+      </w:r>
+      <w:proofErr w:type="spellEnd"/>
+      <w:r>
+        <w:rPr>
+          <w:rFonts w:ascii="Arial" w:hAnsi="Arial" w:cs="Arial"/>
+          <w:lang w:eastAsia="es-EC"/>
+        </w:rPr>
+        <w:t>: reúne los cambios que se preparan para la siguiente versión.</w:t>
+      </w:r>
+    </w:p>
+    <w:p>
+      <w:pPr>
+        <w:pStyle w:val="Prrafodelista"/>
+        <w:numPr>
+          <w:ilvl w:val="0"/>
+          <w:numId w:val="26"/>
+        </w:numPr>
+        <w:rPr>
+          <w:rFonts w:ascii="Arial" w:hAnsi="Arial" w:cs="Arial"/>
+          <w:lang w:eastAsia="es-EC"/>
+        </w:rPr>
+      </w:pPr>
+      <w:proofErr w:type="spellStart"/>
+      <w:r>
+        <w:rPr>
+          <w:rFonts w:ascii="Arial" w:hAnsi="Arial" w:cs="Arial"/>
+          <w:b/>
+          <w:bCs/>
+          <w:lang w:eastAsia="es-EC"/>
+        </w:rPr>
+        <w:t>feature</w:t>
+      </w:r>
+      <w:proofErr w:type="spellEnd"/>
+      <w:r>
+        <w:rPr>
+          <w:rFonts w:ascii="Arial" w:hAnsi="Arial" w:cs="Arial"/>
+          <w:b/>
+          <w:bCs/>
+          <w:lang w:eastAsia="es-EC"/>
+        </w:rPr>
+        <w:t>/nombre-funcionalidad</w:t>
+      </w:r>
+      <w:r>
+        <w:rPr>
+          <w:rFonts w:ascii="Arial" w:hAnsi="Arial" w:cs="Arial"/>
+          <w:lang w:eastAsia="es-EC"/>
+        </w:rPr>
+        <w:t>: permite desarrollar funcionalidades específicas sin tocar directamente las ramas principales.</w:t>
+      </w:r>
+    </w:p>
+    <w:p>
+      <w:pPr>
+        <w:rPr>
+          <w:rFonts w:ascii="Arial" w:hAnsi="Arial" w:cs="Arial"/>
+          <w:lang w:eastAsia="es-EC"/>
+        </w:rPr>
+      </w:pPr>
+      <w:r>
+        <w:rPr>
+          <w:rFonts w:ascii="Arial" w:hAnsi="Arial" w:cs="Arial"/>
+          <w:lang w:eastAsia="es-EC"/>
+        </w:rPr>
+        <w:t xml:space="preserve">Cuando una funcionalidad termina y se prueba, se integra en </w:t>
+      </w:r>
+      <w:proofErr w:type="spellStart"/>
+      <w:r>
+        <w:rPr>
+          <w:rFonts w:ascii="Arial" w:hAnsi="Arial" w:cs="Arial"/>
+          <w:lang w:eastAsia="es-EC"/>
+        </w:rPr>
+        <w:t>develop</w:t>
+      </w:r>
+      <w:proofErr w:type="spellEnd"/>
+      <w:r>
+        <w:rPr>
+          <w:rFonts w:ascii="Arial" w:hAnsi="Arial" w:cs="Arial"/>
+          <w:lang w:eastAsia="es-EC"/>
+        </w:rPr>
+        <w:t>. Y cuando el conjunto de cambios está listo para publicarse, se pasa a master mediante el proceso de integración correspondiente.</w:t>
+      </w:r>
+    </w:p>
+    <w:p>
+      <w:pPr>
+        <w:pStyle w:val="Prrafodelista"/>
+        <w:numPr>
+          <w:ilvl w:val="0"/>
+          <w:numId w:val="22"/>
+        </w:numPr>
+        <w:rPr>
+          <w:rFonts w:ascii="Arial" w:hAnsi="Arial" w:cs="Arial"/>
+          <w:b/>
+          <w:bCs/>
+          <w:lang w:eastAsia="es-EC"/>
+        </w:rPr>
+      </w:pPr>
+      <w:r>
+        <w:rPr>
+          <w:rFonts w:ascii="Arial" w:hAnsi="Arial" w:cs="Arial"/>
+          <w:b/>
+          <w:bCs/>
+          <w:lang w:eastAsia="es-EC"/>
+        </w:rPr>
+        <w:t xml:space="preserve">Diagrama del flujo </w:t>
+      </w:r>
+      <w:proofErr w:type="spellStart"/>
+      <w:r>
+        <w:rPr>
+          <w:rFonts w:ascii="Arial" w:hAnsi="Arial" w:cs="Arial"/>
+          <w:b/>
+          <w:bCs/>
+          <w:lang w:eastAsia="es-EC"/>
+        </w:rPr>
+        <w:t>Gitflow</w:t>
+      </w:r>
+      <w:proofErr w:type="spellEnd"/>
+    </w:p>
+    <w:p>
+      <w:pPr>
+        <w:rPr>
+          <w:rFonts w:ascii="Arial" w:hAnsi="Arial" w:cs="Arial"/>
+          <w:lang w:eastAsia="es-EC"/>
+        </w:rPr>
+      </w:pPr>
+      <w:r>
+        <w:rPr>
+          <w:rFonts w:ascii="Arial" w:hAnsi="Arial" w:cs="Arial"/>
+          <w:lang w:eastAsia="es-EC"/>
+        </w:rPr>
+        <w:t xml:space="preserve">El diagrama muestra el flujo de trabajo que se propone para el desarrollo del sistema. La rama master conserva las versiones estables, </w:t>
+      </w:r>
+      <w:proofErr w:type="spellStart"/>
+      <w:r>
+        <w:rPr>
+          <w:rFonts w:ascii="Arial" w:hAnsi="Arial" w:cs="Arial"/>
+          <w:lang w:eastAsia="es-EC"/>
+        </w:rPr>
+        <w:t>develop</w:t>
+      </w:r>
+      <w:proofErr w:type="spellEnd"/>
+      <w:r>
+        <w:rPr>
+          <w:rFonts w:ascii="Arial" w:hAnsi="Arial" w:cs="Arial"/>
+          <w:lang w:eastAsia="es-EC"/>
+        </w:rPr>
+        <w:t xml:space="preserve"> se encarga de integrar los cambios y las ramas </w:t>
+      </w:r>
+      <w:proofErr w:type="spellStart"/>
+      <w:r>
+        <w:rPr>
+          <w:rFonts w:ascii="Arial" w:hAnsi="Arial" w:cs="Arial"/>
+          <w:lang w:eastAsia="es-EC"/>
+        </w:rPr>
+        <w:t>feature</w:t>
+      </w:r>
+      <w:proofErr w:type="spellEnd"/>
+      <w:r>
+        <w:rPr>
+          <w:rFonts w:ascii="Arial" w:hAnsi="Arial" w:cs="Arial"/>
+          <w:lang w:eastAsia="es-EC"/>
+        </w:rPr>
+        <w:t>/ permiten trabajar en funcionalidades específicas antes de unirlas a la rama de desarrollo.</w:t>
+      </w:r>
+      <w:r>
+        <w:t xml:space="preserve"> </w:t>
+      </w:r>
+      <w:r>
+        <w:drawing>
+          <wp:anchor distT="0" distB="0" distL="114300" distR="114300" simplePos="0" relativeHeight="251681792" behindDoc="0" locked="0" layoutInCell="1" allowOverlap="1" wp14:anchorId="6F166512" wp14:editId="493051C2">
+            <wp:simplePos x="0" y="0"/>
+            <wp:positionH relativeFrom="column">
+              <wp:posOffset>0</wp:posOffset>
+            </wp:positionH>
+            <wp:positionV relativeFrom="paragraph">
+              <wp:posOffset>796290</wp:posOffset>
+            </wp:positionV>
+            <wp:extent cx="5400040" cy="3406775"/>
+            <wp:effectExtent l="0" t="0" r="0" b="3175"/>
+            <wp:wrapTopAndBottom/>
+            <wp:docPr id="11" name="Imagen 11"/>
+            <wp:cNvGraphicFramePr>
+              <a:graphicFrameLocks xmlns:a="http://schemas.openxmlformats.org/drawingml/2006/main" noChangeAspect="1"/>
+            </wp:cNvGraphicFramePr>
+            <a:graphic xmlns:a="http://schemas.openxmlformats.org/drawingml/2006/main">
+              <a:graphicData uri="http://schemas.openxmlformats.org/drawingml/2006/picture">
+                <pic:pic xmlns:pic="http://schemas.openxmlformats.org/drawingml/2006/picture">
+                  <pic:nvPicPr>
+                    <pic:cNvPr id="1" name=""/>
+                    <pic:cNvPicPr/>
+                  </pic:nvPicPr>
+                  <pic:blipFill>
+                    <a:blip r:embed="rId32"/>
+                    <a:stretch>
+                      <a:fillRect/>
+                    </a:stretch>
+                  </pic:blipFill>
+                  <pic:spPr>
+                    <a:xfrm>
+                      <a:off x="0" y="0"/>
+                      <a:ext cx="5400040" cy="3406775"/>
+                    </a:xfrm>
+                    <a:prstGeom prst="rect">
+                      <a:avLst/>
+                    </a:prstGeom>
+                  </pic:spPr>
+                </pic:pic>
+              </a:graphicData>
+            </a:graphic>
+          </wp:anchor>
+        </w:drawing>
+      </w:r>
+      <w:r>
+        <w:rPr>
+          <w:rFonts w:ascii="Arial" w:hAnsi="Arial" w:cs="Arial"/>
+          <w:lang w:eastAsia="es-EC"/>
+        </w:rPr>
+        <w:br w:type="page"/>
+      </w:r>
+    </w:p>
+    <w:p>
+      <w:pPr>
+        <w:pStyle w:val="Prrafodelista"/>
+        <w:numPr>
+          <w:ilvl w:val="0"/>
+          <w:numId w:val="22"/>
+        </w:numPr>
+        <w:rPr>
+          <w:rFonts w:ascii="Arial" w:hAnsi="Arial" w:cs="Arial"/>
+          <w:b/>
+          <w:bCs/>
+          <w:lang w:eastAsia="es-EC"/>
+        </w:rPr>
+      </w:pPr>
+      <w:r>
+        <w:rPr>
+          <w:rFonts w:ascii="Arial" w:hAnsi="Arial" w:cs="Arial"/>
+          <w:b/>
+          <w:bCs/>
+          <w:lang w:eastAsia="es-EC"/>
+        </w:rPr>
+        <w:lastRenderedPageBreak/>
+        <w:t xml:space="preserve">Implementación del flujo de trabajo </w:t>
+      </w:r>
+      <w:proofErr w:type="spellStart"/>
+      <w:r>
+        <w:rPr>
+          <w:rFonts w:ascii="Arial" w:hAnsi="Arial" w:cs="Arial"/>
+          <w:b/>
+          <w:bCs/>
+          <w:lang w:eastAsia="es-EC"/>
+        </w:rPr>
+        <w:t>Gitflow</w:t>
+      </w:r>
+      <w:proofErr w:type="spellEnd"/>
+    </w:p>
+    <w:p>
+      <w:pPr>
+        <w:pStyle w:val="Sinespaciado"/>
+        <w:spacing w:line="360" w:lineRule="auto"/>
+        <w:jc w:val="both"/>
+        <w:rPr>
+          <w:noProof/>
+        </w:rPr>
+      </w:pPr>
+      <w:r>
+        <w:rPr>
+          <w:rFonts w:ascii="Arial" w:hAnsi="Arial" w:cs="Arial"/>
+          <w:lang w:eastAsia="es-EC"/>
+        </w:rPr>
+        <w:t>Para organizar el desarrollo del Sistema de Control de Rescate y Adopción Animal, se plantea usar Git como herramienta de control de versiones y GitHub para alojar el repositorio remoto. La idea es trabajar con ramas independientes que permitan desarrollar funcionalidades por separado y, al mismo tiempo, mantener un historial claro de los cambios.</w:t>
+      </w:r>
+      <w:r>
+        <w:rPr>
+          <w:noProof/>
+        </w:rPr>
+        <w:t xml:space="preserve"> </w:t>
+      </w:r>
+    </w:p>
+    <w:p>
+      <w:pPr>
+        <w:rPr>
+          <w:rFonts w:ascii="Arial" w:hAnsi="Arial" w:cs="Arial"/>
+          <w:b/>
+          <w:bCs/>
+          <w:lang w:eastAsia="es-EC"/>
+        </w:rPr>
+      </w:pPr>
+      <w:r>
+        <w:rPr>
+          <w:rFonts w:ascii="Arial" w:hAnsi="Arial" w:cs="Arial"/>
+          <w:lang w:eastAsia="es-EC"/>
+        </w:rPr>
+        <w:drawing>
+          <wp:anchor distT="0" distB="0" distL="114300" distR="114300" simplePos="0" relativeHeight="251683840" behindDoc="0" locked="0" layoutInCell="1" allowOverlap="1" wp14:anchorId="62A763AA" wp14:editId="05CA2785">
+            <wp:simplePos x="0" y="0"/>
+            <wp:positionH relativeFrom="column">
+              <wp:posOffset>0</wp:posOffset>
+            </wp:positionH>
+            <wp:positionV relativeFrom="paragraph">
+              <wp:posOffset>167689</wp:posOffset>
+            </wp:positionV>
+            <wp:extent cx="5485765" cy="2815590"/>
+            <wp:effectExtent l="0" t="0" r="635" b="3810"/>
+            <wp:wrapTopAndBottom/>
+            <wp:docPr id="12" name="Imagen 12"/>
+            <wp:cNvGraphicFramePr>
+              <a:graphicFrameLocks xmlns:a="http://schemas.openxmlformats.org/drawingml/2006/main" noChangeAspect="1"/>
+            </wp:cNvGraphicFramePr>
+            <a:graphic xmlns:a="http://schemas.openxmlformats.org/drawingml/2006/main">
+              <a:graphicData uri="http://schemas.openxmlformats.org/drawingml/2006/picture">
+                <pic:pic xmlns:pic="http://schemas.openxmlformats.org/drawingml/2006/picture">
+                  <pic:nvPicPr>
+                    <pic:cNvPr id="1" name=""/>
+                    <pic:cNvPicPr/>
+                  </pic:nvPicPr>
+                  <pic:blipFill>
+                    <a:blip r:embed="rId33"/>
+                    <a:stretch>
+                      <a:fillRect/>
+                    </a:stretch>
+                  </pic:blipFill>
+                  <pic:spPr>
+                    <a:xfrm>
+                      <a:off x="0" y="0"/>
+                      <a:ext cx="5485765" cy="2815590"/>
+                    </a:xfrm>
+                    <a:prstGeom prst="rect">
+                      <a:avLst/>
+                    </a:prstGeom>
+                  </pic:spPr>
+                </pic:pic>
+              </a:graphicData>
+            </a:graphic>
+            <wp14:sizeRelH relativeFrom="margin">
+              <wp14:pctWidth>0</wp14:pctWidth>
+            </wp14:sizeRelH>
+            <wp14:sizeRelV relativeFrom="margin">
+              <wp14:pctHeight>0</wp14:pctHeight>
+            </wp14:sizeRelV>
+          </wp:anchor>
+        </w:drawing>
+      </w:r>
+      <w:r>
+        <w:rPr>
+          <w:rFonts w:ascii="Arial" w:hAnsi="Arial" w:cs="Arial"/>
+          <w:b/>
+          <w:bCs/>
+          <w:lang w:eastAsia="es-EC"/>
+        </w:rPr>
+        <w:br w:type="page"/>
+      </w:r>
+    </w:p>
+    <w:p>
+      <w:pPr>
+        <w:pStyle w:val="Sinespaciado"/>
+        <w:spacing w:line="360" w:lineRule="auto"/>
+        <w:jc w:val="both"/>
+        <w:rPr>
+          <w:rFonts w:ascii="Arial" w:hAnsi="Arial" w:cs="Arial"/>
+          <w:b/>
+          <w:bCs/>
+          <w:lang w:eastAsia="es-EC"/>
+        </w:rPr>
+      </w:pPr>
+      <w:r>
+        <w:rPr>
+          <w:rFonts w:ascii="Arial" w:hAnsi="Arial" w:cs="Arial"/>
+          <w:b/>
+          <w:bCs/>
+          <w:lang w:eastAsia="es-EC"/>
+        </w:rPr>
+        <w:lastRenderedPageBreak/>
+        <w:t>Evidencias</w:t>
+      </w:r>
+    </w:p>
+    <w:p>
+      <w:pPr>
+        <w:pStyle w:val="Prrafodelista"/>
+        <w:numPr>
+          <w:ilvl w:val="1"/>
+          <w:numId w:val="22"/>
+        </w:numPr>
+        <w:rPr>
+          <w:rFonts w:ascii="Arial" w:hAnsi="Arial" w:cs="Arial"/>
+          <w:b/>
+          <w:bCs/>
+          <w:lang w:eastAsia="es-EC"/>
+        </w:rPr>
+      </w:pPr>
+      <w:r>
+        <w:rPr>
+          <w:rFonts w:ascii="Arial" w:hAnsi="Arial" w:cs="Arial"/>
+          <w:b/>
+          <w:bCs/>
+          <w:lang w:eastAsia="es-EC"/>
+        </w:rPr>
+        <w:t>Creación del repositorio en GitHub</w:t>
+      </w:r>
+    </w:p>
+    <w:p>
+      <w:pPr>
+        <w:pStyle w:val="Prrafodelista"/>
+        <w:ind w:left="792"/>
+        <w:rPr>
+          <w:rFonts w:ascii="Arial" w:hAnsi="Arial" w:cs="Arial"/>
+          <w:lang w:eastAsia="es-EC"/>
+        </w:rPr>
+      </w:pPr>
+    </w:p>
+    <w:p>
+      <w:pPr>
+        <w:pStyle w:val="Prrafodelista"/>
+        <w:ind w:left="792"/>
+        <w:rPr>
+          <w:rFonts w:ascii="Arial" w:hAnsi="Arial" w:cs="Arial"/>
+          <w:lang w:eastAsia="es-EC"/>
+        </w:rPr>
+      </w:pPr>
+      <w:r>
+        <w:rPr>
+          <w:rFonts w:ascii="Arial" w:hAnsi="Arial" w:cs="Arial"/>
+          <w:lang w:eastAsia="es-EC"/>
+        </w:rPr>
+        <w:drawing>
+          <wp:anchor distT="0" distB="0" distL="114300" distR="114300" simplePos="0" relativeHeight="251687936" behindDoc="0" locked="0" layoutInCell="1" allowOverlap="1" wp14:anchorId="27E30E80" wp14:editId="2F237AEE">
+            <wp:simplePos x="0" y="0"/>
+            <wp:positionH relativeFrom="column">
+              <wp:posOffset>463542</wp:posOffset>
+            </wp:positionH>
+            <wp:positionV relativeFrom="paragraph">
+              <wp:posOffset>620395</wp:posOffset>
+            </wp:positionV>
+            <wp:extent cx="4555490" cy="2646680"/>
+            <wp:effectExtent l="0" t="0" r="0" b="1270"/>
+            <wp:wrapTopAndBottom/>
+            <wp:docPr id="14" name="Imagen 14"/>
+            <wp:cNvGraphicFramePr>
+              <a:graphicFrameLocks xmlns:a="http://schemas.openxmlformats.org/drawingml/2006/main" noChangeAspect="1"/>
+            </wp:cNvGraphicFramePr>
+            <a:graphic xmlns:a="http://schemas.openxmlformats.org/drawingml/2006/main">
+              <a:graphicData uri="http://schemas.openxmlformats.org/drawingml/2006/picture">
+                <pic:pic xmlns:pic="http://schemas.openxmlformats.org/drawingml/2006/picture">
+                  <pic:nvPicPr>
+                    <pic:cNvPr id="1" name=""/>
+                    <pic:cNvPicPr/>
+                  </pic:nvPicPr>
+                  <pic:blipFill>
+                    <a:blip r:embed="rId34"/>
+                    <a:stretch>
+                      <a:fillRect/>
+                    </a:stretch>
+                  </pic:blipFill>
+                  <pic:spPr>
+                    <a:xfrm>
+                      <a:off x="0" y="0"/>
+                      <a:ext cx="4555490" cy="2646680"/>
+                    </a:xfrm>
+                    <a:prstGeom prst="rect">
+                      <a:avLst/>
+                    </a:prstGeom>
+                  </pic:spPr>
+                </pic:pic>
+              </a:graphicData>
+            </a:graphic>
+            <wp14:sizeRelH relativeFrom="margin">
+              <wp14:pctWidth>0</wp14:pctWidth>
+            </wp14:sizeRelH>
+            <wp14:sizeRelV relativeFrom="margin">
+              <wp14:pctHeight>0</wp14:pctHeight>
+            </wp14:sizeRelV>
+          </wp:anchor>
+        </w:drawing>
+      </w:r>
+      <w:r>
+        <w:rPr>
+          <w:rFonts w:ascii="Arial" w:hAnsi="Arial" w:cs="Arial"/>
+          <w:lang w:eastAsia="es-EC"/>
+        </w:rPr>
+        <w:t>Se creó un repositorio público en GitHub para guardar los archivos del proyecto y llevar el historial de versiones. Este repositorio permite revisar los cambios realizados y facilita el seguimiento del desarrollo.</w:t>
+      </w:r>
+      <w:r>
+        <w:rPr>
+          <w:noProof/>
+        </w:rPr>
+        <w:t xml:space="preserve"> </w:t>
+      </w:r>
+    </w:p>
+    <w:p>
+      <w:pPr>
+        <w:pStyle w:val="Prrafodelista"/>
+        <w:ind w:left="792"/>
+        <w:rPr>
+          <w:noProof/>
+        </w:rPr>
+      </w:pPr>
+      <w:r>
+        <w:rPr>
+          <w:rFonts w:ascii="Arial" w:hAnsi="Arial" w:cs="Arial"/>
+          <w:lang w:eastAsia="es-EC"/>
+        </w:rPr>
+        <w:t xml:space="preserve">Luego creé una carpeta local para iniciar el proyecto y la conecté con el repositorio. Dentro de esa carpeta abrí Git </w:t>
+      </w:r>
+      <w:proofErr w:type="spellStart"/>
+      <w:r>
+        <w:rPr>
+          <w:rFonts w:ascii="Arial" w:hAnsi="Arial" w:cs="Arial"/>
+          <w:lang w:eastAsia="es-EC"/>
+        </w:rPr>
+        <w:t>Bash</w:t>
+      </w:r>
+      <w:proofErr w:type="spellEnd"/>
+      <w:r>
+        <w:rPr>
+          <w:rFonts w:ascii="Arial" w:hAnsi="Arial" w:cs="Arial"/>
+          <w:lang w:eastAsia="es-EC"/>
+        </w:rPr>
+        <w:t xml:space="preserve"> y usé los siguientes comandos para inicializar el proyecto, crear la rama principal (master) y enlazarlo con el repositorio remoto:</w:t>
+      </w:r>
+      <w:r>
+        <w:rPr>
+          <w:rFonts w:ascii="Arial" w:hAnsi="Arial" w:cs="Arial"/>
+          <w:lang w:eastAsia="es-EC"/>
+        </w:rPr>
+        <w:br/>
+      </w:r>
+      <w:proofErr w:type="spellStart"/>
+      <w:r>
+        <w:rPr>
+          <w:rFonts w:ascii="Arial" w:hAnsi="Arial" w:cs="Arial"/>
+          <w:b/>
+          <w:bCs/>
+          <w:lang w:eastAsia="es-EC"/>
+        </w:rPr>
+        <w:t>git</w:t>
+      </w:r>
+      <w:proofErr w:type="spellEnd"/>
+      <w:r>
+        <w:rPr>
+          <w:rFonts w:ascii="Arial" w:hAnsi="Arial" w:cs="Arial"/>
+          <w:b/>
+          <w:bCs/>
+          <w:lang w:eastAsia="es-EC"/>
+        </w:rPr>
+        <w:t xml:space="preserve"> </w:t>
+      </w:r>
+      <w:proofErr w:type="spellStart"/>
+      <w:r>
+        <w:rPr>
+          <w:rFonts w:ascii="Arial" w:hAnsi="Arial" w:cs="Arial"/>
+          <w:b/>
+          <w:bCs/>
+          <w:lang w:eastAsia="es-EC"/>
+        </w:rPr>
+        <w:t>init</w:t>
+      </w:r>
+      <w:proofErr w:type="spellEnd"/>
+      <w:r>
+        <w:rPr>
+          <w:rFonts w:ascii="Arial" w:hAnsi="Arial" w:cs="Arial"/>
+          <w:b/>
+          <w:bCs/>
+          <w:lang w:eastAsia="es-EC"/>
+        </w:rPr>
+        <w:br/>
+      </w:r>
+      <w:proofErr w:type="spellStart"/>
+      <w:r>
+        <w:rPr>
+          <w:rFonts w:ascii="Arial" w:hAnsi="Arial" w:cs="Arial"/>
+          <w:b/>
+          <w:bCs/>
+          <w:lang w:eastAsia="es-EC"/>
+        </w:rPr>
+        <w:t>git</w:t>
+      </w:r>
+      <w:proofErr w:type="spellEnd"/>
+      <w:r>
+        <w:rPr>
+          <w:rFonts w:ascii="Arial" w:hAnsi="Arial" w:cs="Arial"/>
+          <w:b/>
+          <w:bCs/>
+          <w:lang w:eastAsia="es-EC"/>
+        </w:rPr>
+        <w:t xml:space="preserve"> </w:t>
+      </w:r>
+      <w:proofErr w:type="spellStart"/>
+      <w:r>
+        <w:rPr>
+          <w:rFonts w:ascii="Arial" w:hAnsi="Arial" w:cs="Arial"/>
+          <w:b/>
+          <w:bCs/>
+          <w:lang w:eastAsia="es-EC"/>
+        </w:rPr>
+        <w:t>checkout</w:t>
+      </w:r>
+      <w:proofErr w:type="spellEnd"/>
+      <w:r>
+        <w:rPr>
+          <w:rFonts w:ascii="Arial" w:hAnsi="Arial" w:cs="Arial"/>
+          <w:b/>
+          <w:bCs/>
+          <w:lang w:eastAsia="es-EC"/>
+        </w:rPr>
+        <w:t xml:space="preserve"> -b</w:t>
+      </w:r>
+      <w:r>
+        <w:rPr>
+          <w:rFonts w:ascii="Arial" w:hAnsi="Arial" w:cs="Arial"/>
+          <w:b/>
+          <w:bCs/>
+          <w:lang w:eastAsia="es-EC"/>
+        </w:rPr>
+        <w:t xml:space="preserve"> master</w:t>
+      </w:r>
+      <w:r>
+        <w:rPr>
+          <w:noProof/>
+        </w:rPr>
+        <w:t xml:space="preserve"> </w:t>
+      </w:r>
+    </w:p>
+    <w:p>
+      <w:pPr>
+        <w:pStyle w:val="Prrafodelista"/>
+        <w:ind w:left="792"/>
+        <w:rPr>
+          <w:rFonts w:ascii="Arial" w:hAnsi="Arial" w:cs="Arial"/>
+          <w:b/>
+          <w:bCs/>
+          <w:lang w:val="en-US" w:eastAsia="es-EC"/>
+        </w:rPr>
+      </w:pPr>
+      <w:r>
+        <w:rPr>
+          <w:rFonts w:ascii="Arial" w:hAnsi="Arial" w:cs="Arial"/>
+          <w:lang w:eastAsia="es-EC"/>
+        </w:rPr>
+        <w:drawing>
+          <wp:anchor distT="0" distB="0" distL="114300" distR="114300" simplePos="0" relativeHeight="251689984" behindDoc="0" locked="0" layoutInCell="1" allowOverlap="1" wp14:anchorId="0D4525C3" wp14:editId="00735B8A">
+            <wp:simplePos x="0" y="0"/>
+            <wp:positionH relativeFrom="column">
+              <wp:posOffset>126917</wp:posOffset>
+            </wp:positionH>
+            <wp:positionV relativeFrom="paragraph">
+              <wp:posOffset>508610</wp:posOffset>
+            </wp:positionV>
+            <wp:extent cx="5400040" cy="1915795"/>
+            <wp:effectExtent l="0" t="0" r="0" b="8255"/>
+            <wp:wrapTopAndBottom/>
+            <wp:docPr id="15" name="Imagen 15"/>
+            <wp:cNvGraphicFramePr>
+              <a:graphicFrameLocks xmlns:a="http://schemas.openxmlformats.org/drawingml/2006/main" noChangeAspect="1"/>
+            </wp:cNvGraphicFramePr>
+            <a:graphic xmlns:a="http://schemas.openxmlformats.org/drawingml/2006/main">
+              <a:graphicData uri="http://schemas.openxmlformats.org/drawingml/2006/picture">
+                <pic:pic xmlns:pic="http://schemas.openxmlformats.org/drawingml/2006/picture">
+                  <pic:nvPicPr>
+                    <pic:cNvPr id="1" name=""/>
+                    <pic:cNvPicPr/>
+                  </pic:nvPicPr>
+                  <pic:blipFill>
+                    <a:blip r:embed="rId35"/>
+                    <a:stretch>
+                      <a:fillRect/>
+                    </a:stretch>
+                  </pic:blipFill>
+                  <pic:spPr>
+                    <a:xfrm>
+                      <a:off x="0" y="0"/>
+                      <a:ext cx="5400040" cy="1915795"/>
+                    </a:xfrm>
+                    <a:prstGeom prst="rect">
+                      <a:avLst/>
+                    </a:prstGeom>
+                  </pic:spPr>
+                </pic:pic>
+              </a:graphicData>
+            </a:graphic>
+          </wp:anchor>
+        </w:drawing>
+      </w:r>
+      <w:r>
+        <w:rPr>
+          <w:rFonts w:ascii="Arial" w:hAnsi="Arial" w:cs="Arial"/>
+          <w:b/>
+          <w:bCs/>
+          <w:lang w:val="en-US" w:eastAsia="es-EC"/>
+        </w:rPr>
+        <w:t>git remote add origin</w:t>
+      </w:r>
+      <w:r>
+        <w:rPr>
+          <w:rFonts w:ascii="Arial" w:hAnsi="Arial" w:cs="Arial"/>
+          <w:b/>
+          <w:bCs/>
+          <w:lang w:val="en-US" w:eastAsia="es-EC"/>
+        </w:rPr>
+        <w:t xml:space="preserve"> </w:t>
+      </w:r>
+      <w:hyperlink r:id="rId36" w:history="1">
+        <w:r>
+          <w:rPr>
+            <w:rStyle w:val="Hipervnculo"/>
+            <w:rFonts w:ascii="Arial" w:hAnsi="Arial" w:cs="Arial"/>
+            <w:b/>
+            <w:bCs/>
+            <w:lang w:val="en-US" w:eastAsia="es-EC"/>
+          </w:rPr>
+          <w:t>https://github.com/Tyrone073/sistemaRescateAdopcionAnima</w:t>
+        </w:r>
+        <w:r>
+          <w:rPr>
+            <w:rStyle w:val="Hipervnculo"/>
+            <w:rFonts w:ascii="Arial" w:hAnsi="Arial" w:cs="Arial"/>
+            <w:b/>
+            <w:bCs/>
+            <w:lang w:val="en-US" w:eastAsia="es-EC"/>
+          </w:rPr>
+          <w:t>l</w:t>
+        </w:r>
+        <w:r>
+          <w:rPr>
+            <w:rStyle w:val="Hipervnculo"/>
+            <w:rFonts w:ascii="Arial" w:hAnsi="Arial" w:cs="Arial"/>
+            <w:b/>
+            <w:bCs/>
+            <w:lang w:val="en-US" w:eastAsia="es-EC"/>
+          </w:rPr>
+          <w:t>.git</w:t>
+        </w:r>
+      </w:hyperlink>
+      <w:r>
+        <w:rPr>
+          <w:rFonts w:ascii="Arial" w:hAnsi="Arial" w:cs="Arial"/>
+          <w:b/>
+          <w:bCs/>
+          <w:lang w:val="en-US" w:eastAsia="es-EC"/>
+        </w:rPr>
+        <w:t xml:space="preserve"> </w:t>
+      </w:r>
+    </w:p>
+    <w:p>
+      <w:pPr>
+        <w:pStyle w:val="Prrafodelista"/>
+        <w:ind w:left="792"/>
+        <w:rPr>
+          <w:rFonts w:ascii="Arial" w:hAnsi="Arial" w:cs="Arial"/>
+          <w:b/>
+          <w:bCs/>
+          <w:lang w:val="en-US" w:eastAsia="es-EC"/>
+        </w:rPr>
+      </w:pPr>
+    </w:p>
+    <w:p>
+      <w:pPr>
+        <w:rPr>
+          <w:rFonts w:ascii="Arial" w:hAnsi="Arial" w:cs="Arial"/>
+          <w:b/>
+          <w:bCs/>
+          <w:lang w:val="en-US" w:eastAsia="es-EC"/>
+        </w:rPr>
+      </w:pPr>
+      <w:r>
+        <w:rPr>
+          <w:rFonts w:ascii="Arial" w:hAnsi="Arial" w:cs="Arial"/>
+          <w:b/>
+          <w:bCs/>
+          <w:lang w:val="en-US" w:eastAsia="es-EC"/>
+        </w:rPr>
+        <w:br w:type="page"/>
+      </w:r>
+    </w:p>
+    <w:p>
+      <w:pPr>
+        <w:pStyle w:val="Prrafodelista"/>
+        <w:ind w:left="792"/>
+        <w:rPr>
+          <w:rFonts w:ascii="Arial" w:hAnsi="Arial" w:cs="Arial"/>
+          <w:b/>
+          <w:bCs/>
+          <w:lang w:eastAsia="es-EC"/>
+        </w:rPr>
+      </w:pPr>
+      <w:proofErr w:type="spellStart"/>
+      <w:r>
+        <w:rPr>
+          <w:rFonts w:ascii="Arial" w:hAnsi="Arial" w:cs="Arial"/>
+          <w:b/>
+          <w:bCs/>
+          <w:lang w:eastAsia="es-EC"/>
+        </w:rPr>
+        <w:lastRenderedPageBreak/>
+        <w:t>Creacion</w:t>
+      </w:r>
+      <w:proofErr w:type="spellEnd"/>
+      <w:r>
+        <w:rPr>
+          <w:rFonts w:ascii="Arial" w:hAnsi="Arial" w:cs="Arial"/>
+          <w:b/>
+          <w:bCs/>
+          <w:lang w:eastAsia="es-EC"/>
+        </w:rPr>
+        <w:t xml:space="preserve"> de las ramas</w:t>
+      </w:r>
+      <w:r>
+        <w:rPr>
+          <w:rFonts w:ascii="Arial" w:hAnsi="Arial" w:cs="Arial"/>
+          <w:b/>
+          <w:bCs/>
+          <w:lang w:eastAsia="es-EC"/>
+        </w:rPr>
+        <w:t xml:space="preserve"> </w:t>
+      </w:r>
+      <w:proofErr w:type="spellStart"/>
+      <w:r>
+        <w:rPr>
+          <w:rFonts w:ascii="Arial" w:hAnsi="Arial" w:cs="Arial"/>
+          <w:b/>
+          <w:bCs/>
+          <w:lang w:eastAsia="es-EC"/>
+        </w:rPr>
+        <w:t>develop</w:t>
+      </w:r>
+      <w:proofErr w:type="spellEnd"/>
+      <w:r>
+        <w:rPr>
+          <w:rFonts w:ascii="Arial" w:hAnsi="Arial" w:cs="Arial"/>
+          <w:b/>
+          <w:bCs/>
+          <w:lang w:eastAsia="es-EC"/>
+        </w:rPr>
+        <w:t xml:space="preserve"> y </w:t>
+      </w:r>
+      <w:proofErr w:type="spellStart"/>
+      <w:r>
+        <w:rPr>
+          <w:rFonts w:ascii="Arial" w:hAnsi="Arial" w:cs="Arial"/>
+          <w:b/>
+          <w:bCs/>
+          <w:lang w:eastAsia="es-EC"/>
+        </w:rPr>
+        <w:t>feature</w:t>
+      </w:r>
+      <w:proofErr w:type="spellEnd"/>
+    </w:p>
+    <w:p>
+      <w:pPr>
+        <w:pStyle w:val="Prrafodelista"/>
+        <w:ind w:left="792"/>
+        <w:rPr>
+          <w:rFonts w:ascii="Arial" w:hAnsi="Arial" w:cs="Arial"/>
+          <w:b/>
+          <w:bCs/>
+          <w:lang w:eastAsia="es-EC"/>
+        </w:rPr>
+      </w:pPr>
+    </w:p>
+    <w:p>
+      <w:pPr>
+        <w:pStyle w:val="Prrafodelista"/>
+        <w:ind w:left="792"/>
+        <w:rPr>
+          <w:rFonts w:ascii="Arial" w:hAnsi="Arial" w:cs="Arial"/>
+          <w:lang w:eastAsia="es-EC"/>
+        </w:rPr>
+      </w:pPr>
+      <w:r>
+        <w:rPr>
+          <w:rFonts w:ascii="Arial" w:hAnsi="Arial" w:cs="Arial"/>
+          <w:lang w:eastAsia="es-EC"/>
+        </w:rPr>
+        <w:t>Use los comandos:</w:t>
+      </w:r>
+    </w:p>
+    <w:p>
+      <w:pPr>
+        <w:pStyle w:val="Prrafodelista"/>
+        <w:ind w:left="792"/>
+        <w:rPr>
+          <w:rFonts w:ascii="Arial" w:hAnsi="Arial" w:cs="Arial"/>
+          <w:b/>
+          <w:bCs/>
+          <w:lang w:eastAsia="es-EC"/>
+        </w:rPr>
+      </w:pPr>
+      <w:proofErr w:type="spellStart"/>
+      <w:r>
+        <w:rPr>
+          <w:rFonts w:ascii="Arial" w:hAnsi="Arial" w:cs="Arial"/>
+          <w:b/>
+          <w:bCs/>
+          <w:lang w:eastAsia="es-EC"/>
+        </w:rPr>
+        <w:t>git</w:t>
+      </w:r>
+      <w:proofErr w:type="spellEnd"/>
+      <w:r>
+        <w:rPr>
+          <w:rFonts w:ascii="Arial" w:hAnsi="Arial" w:cs="Arial"/>
+          <w:b/>
+          <w:bCs/>
+          <w:lang w:eastAsia="es-EC"/>
+        </w:rPr>
+        <w:t xml:space="preserve"> </w:t>
+      </w:r>
+      <w:proofErr w:type="spellStart"/>
+      <w:r>
+        <w:rPr>
+          <w:rFonts w:ascii="Arial" w:hAnsi="Arial" w:cs="Arial"/>
+          <w:b/>
+          <w:bCs/>
+          <w:lang w:eastAsia="es-EC"/>
+        </w:rPr>
+        <w:t>checkout</w:t>
+      </w:r>
+      <w:proofErr w:type="spellEnd"/>
+      <w:r>
+        <w:rPr>
+          <w:rFonts w:ascii="Arial" w:hAnsi="Arial" w:cs="Arial"/>
+          <w:b/>
+          <w:bCs/>
+          <w:lang w:eastAsia="es-EC"/>
+        </w:rPr>
+        <w:t xml:space="preserve"> -b </w:t>
+      </w:r>
+      <w:proofErr w:type="spellStart"/>
+      <w:r>
+        <w:rPr>
+          <w:rFonts w:ascii="Arial" w:hAnsi="Arial" w:cs="Arial"/>
+          <w:b/>
+          <w:bCs/>
+          <w:lang w:eastAsia="es-EC"/>
+        </w:rPr>
+        <w:t>develop</w:t>
+      </w:r>
+      <w:proofErr w:type="spellEnd"/>
+    </w:p>
+    <w:p>
+      <w:pPr>
+        <w:pStyle w:val="Prrafodelista"/>
+        <w:ind w:left="792"/>
+        <w:rPr>
+          <w:rFonts w:ascii="Arial" w:hAnsi="Arial" w:cs="Arial"/>
+          <w:b/>
+          <w:bCs/>
+          <w:lang w:eastAsia="es-EC"/>
+        </w:rPr>
+      </w:pPr>
+      <w:r>
+        <w:rPr>
+          <w:rFonts w:ascii="Arial" w:hAnsi="Arial" w:cs="Arial"/>
+          <w:b/>
+          <w:bCs/>
+          <w:lang w:eastAsia="es-EC"/>
+        </w:rPr>
+        <w:drawing>
+          <wp:anchor distT="0" distB="0" distL="114300" distR="114300" simplePos="0" relativeHeight="251692032" behindDoc="0" locked="0" layoutInCell="1" allowOverlap="1" wp14:anchorId="26B806B0" wp14:editId="63929268">
+            <wp:simplePos x="0" y="0"/>
+            <wp:positionH relativeFrom="column">
+              <wp:posOffset>127049</wp:posOffset>
+            </wp:positionH>
+            <wp:positionV relativeFrom="paragraph">
+              <wp:posOffset>225293</wp:posOffset>
+            </wp:positionV>
+            <wp:extent cx="5400040" cy="2875280"/>
+            <wp:effectExtent l="0" t="0" r="0" b="1270"/>
+            <wp:wrapTopAndBottom/>
+            <wp:docPr id="17" name="Imagen 17"/>
+            <wp:cNvGraphicFramePr>
+              <a:graphicFrameLocks xmlns:a="http://schemas.openxmlformats.org/drawingml/2006/main" noChangeAspect="1"/>
+            </wp:cNvGraphicFramePr>
+            <a:graphic xmlns:a="http://schemas.openxmlformats.org/drawingml/2006/main">
+              <a:graphicData uri="http://schemas.openxmlformats.org/drawingml/2006/picture">
+                <pic:pic xmlns:pic="http://schemas.openxmlformats.org/drawingml/2006/picture">
+                  <pic:nvPicPr>
+                    <pic:cNvPr id="1" name=""/>
+                    <pic:cNvPicPr/>
+                  </pic:nvPicPr>
+                  <pic:blipFill>
+                    <a:blip r:embed="rId37"/>
+                    <a:stretch>
+                      <a:fillRect/>
+                    </a:stretch>
+                  </pic:blipFill>
+                  <pic:spPr>
+                    <a:xfrm>
+                      <a:off x="0" y="0"/>
+                      <a:ext cx="5400040" cy="2875280"/>
+                    </a:xfrm>
+                    <a:prstGeom prst="rect">
+                      <a:avLst/>
+                    </a:prstGeom>
+                  </pic:spPr>
+                </pic:pic>
+              </a:graphicData>
+            </a:graphic>
+          </wp:anchor>
+        </w:drawing>
+      </w:r>
+      <w:proofErr w:type="spellStart"/>
+      <w:r>
+        <w:rPr>
+          <w:rFonts w:ascii="Arial" w:hAnsi="Arial" w:cs="Arial"/>
+          <w:b/>
+          <w:bCs/>
+          <w:lang w:eastAsia="es-EC"/>
+        </w:rPr>
+        <w:t>git</w:t>
+      </w:r>
+      <w:proofErr w:type="spellEnd"/>
+      <w:r>
+        <w:rPr>
+          <w:rFonts w:ascii="Arial" w:hAnsi="Arial" w:cs="Arial"/>
+          <w:b/>
+          <w:bCs/>
+          <w:lang w:eastAsia="es-EC"/>
+        </w:rPr>
+        <w:t xml:space="preserve"> </w:t>
+      </w:r>
+      <w:proofErr w:type="spellStart"/>
+      <w:r>
+        <w:rPr>
+          <w:rFonts w:ascii="Arial" w:hAnsi="Arial" w:cs="Arial"/>
+          <w:b/>
+          <w:bCs/>
+          <w:lang w:eastAsia="es-EC"/>
+        </w:rPr>
+        <w:t>checkout</w:t>
+      </w:r>
+      <w:proofErr w:type="spellEnd"/>
+      <w:r>
+        <w:rPr>
+          <w:rFonts w:ascii="Arial" w:hAnsi="Arial" w:cs="Arial"/>
+          <w:b/>
+          <w:bCs/>
+          <w:lang w:eastAsia="es-EC"/>
+        </w:rPr>
+        <w:t xml:space="preserve"> -b </w:t>
+      </w:r>
+      <w:proofErr w:type="spellStart"/>
+      <w:r>
+        <w:rPr>
+          <w:rFonts w:ascii="Arial" w:hAnsi="Arial" w:cs="Arial"/>
+          <w:b/>
+          <w:bCs/>
+          <w:lang w:eastAsia="es-EC"/>
+        </w:rPr>
+        <w:t>feature</w:t>
+      </w:r>
+      <w:proofErr w:type="spellEnd"/>
+      <w:r>
+        <w:rPr>
+          <w:rFonts w:ascii="Arial" w:hAnsi="Arial" w:cs="Arial"/>
+          <w:b/>
+          <w:bCs/>
+          <w:lang w:eastAsia="es-EC"/>
+        </w:rPr>
+        <w:t xml:space="preserve">  </w:t>
+      </w:r>
+    </w:p>
+    <w:p>
+      <w:pPr>
+        <w:pStyle w:val="Prrafodelista"/>
+        <w:ind w:left="792"/>
+        <w:rPr>
+          <w:rFonts w:ascii="Arial" w:hAnsi="Arial" w:cs="Arial"/>
+          <w:b/>
+          <w:bCs/>
+          <w:lang w:eastAsia="es-EC"/>
+        </w:rPr>
+      </w:pPr>
+    </w:p>
+    <w:p>
+      <w:pPr>
+        <w:pStyle w:val="Prrafodelista"/>
+        <w:ind w:left="792"/>
+        <w:rPr>
+          <w:rFonts w:ascii="Arial" w:hAnsi="Arial" w:cs="Arial"/>
+          <w:lang w:eastAsia="es-EC"/>
+        </w:rPr>
+      </w:pPr>
+      <w:r>
+        <w:rPr>
+          <w:rFonts w:ascii="Arial" w:hAnsi="Arial" w:cs="Arial"/>
+          <w:b/>
+          <w:bCs/>
+          <w:lang w:eastAsia="es-EC"/>
+        </w:rPr>
+        <w:drawing>
+          <wp:anchor distT="0" distB="0" distL="114300" distR="114300" simplePos="0" relativeHeight="251713536" behindDoc="0" locked="0" layoutInCell="1" allowOverlap="1" wp14:anchorId="52BD0D57" wp14:editId="1BC2AC4E">
+            <wp:simplePos x="0" y="0"/>
+            <wp:positionH relativeFrom="column">
+              <wp:posOffset>-135181</wp:posOffset>
+            </wp:positionH>
+            <wp:positionV relativeFrom="paragraph">
+              <wp:posOffset>2190661</wp:posOffset>
+            </wp:positionV>
+            <wp:extent cx="2444750" cy="2214880"/>
+            <wp:effectExtent l="0" t="0" r="0" b="0"/>
+            <wp:wrapTopAndBottom/>
+            <wp:docPr id="33" name="Imagen 33"/>
+            <wp:cNvGraphicFramePr>
+              <a:graphicFrameLocks xmlns:a="http://schemas.openxmlformats.org/drawingml/2006/main" noChangeAspect="1"/>
+            </wp:cNvGraphicFramePr>
+            <a:graphic xmlns:a="http://schemas.openxmlformats.org/drawingml/2006/main">
+              <a:graphicData uri="http://schemas.openxmlformats.org/drawingml/2006/picture">
+                <pic:pic xmlns:pic="http://schemas.openxmlformats.org/drawingml/2006/picture">
+                  <pic:nvPicPr>
+                    <pic:cNvPr id="1" name=""/>
+                    <pic:cNvPicPr/>
+                  </pic:nvPicPr>
+                  <pic:blipFill>
+                    <a:blip r:embed="rId38"/>
+                    <a:stretch>
+                      <a:fillRect/>
+                    </a:stretch>
+                  </pic:blipFill>
+                  <pic:spPr>
+                    <a:xfrm>
+                      <a:off x="0" y="0"/>
+                      <a:ext cx="2444750" cy="2214880"/>
+                    </a:xfrm>
+                    <a:prstGeom prst="rect">
+                      <a:avLst/>
+                    </a:prstGeom>
+                  </pic:spPr>
+                </pic:pic>
+              </a:graphicData>
+            </a:graphic>
+            <wp14:sizeRelH relativeFrom="margin">
+              <wp14:pctWidth>0</wp14:pctWidth>
+            </wp14:sizeRelH>
+            <wp14:sizeRelV relativeFrom="margin">
+              <wp14:pctHeight>0</wp14:pctHeight>
+            </wp14:sizeRelV>
+          </wp:anchor>
+        </w:drawing>
       </w:r>
       <w:r>
         <w:rPr>
           <w:rFonts w:ascii="Arial" w:eastAsia="Arial" w:hAnsi="Arial" w:cs="Arial"/>
           <w:i/>
           <w:iCs/>
+          <w:noProof/>
           <w:color w:val="000000"/>
           <w:sz w:val="20"/>
           <w:szCs w:val="20"/>
         </w:rPr>
-        <w:t>Código de la ejecución de los ejercicios, enlace drive donde se encuentren los mismos y Capturas de pantalla claras y relevantes, donde evidencie el proceso realizado).</w:t>
-      </w:r>
-      <w:r>
-        <w:rPr>
-          <w:noProof/>
-        </w:rPr>
-        <w:t xml:space="preserve"> </w:t>
+        <w:drawing>
+          <wp:anchor distT="0" distB="0" distL="114300" distR="114300" simplePos="0" relativeHeight="251675648" behindDoc="0" locked="0" layoutInCell="1" allowOverlap="1" wp14:anchorId="432DBE7B" wp14:editId="31F389BC">
+            <wp:simplePos x="0" y="0"/>
+            <wp:positionH relativeFrom="column">
+              <wp:posOffset>2752725</wp:posOffset>
+            </wp:positionH>
+            <wp:positionV relativeFrom="paragraph">
+              <wp:posOffset>2387083</wp:posOffset>
+            </wp:positionV>
+            <wp:extent cx="2686050" cy="2080895"/>
+            <wp:effectExtent l="0" t="0" r="0" b="0"/>
+            <wp:wrapTopAndBottom/>
+            <wp:docPr id="7" name="Imagen 7"/>
+            <wp:cNvGraphicFramePr>
+              <a:graphicFrameLocks xmlns:a="http://schemas.openxmlformats.org/drawingml/2006/main" noChangeAspect="1"/>
+            </wp:cNvGraphicFramePr>
+            <a:graphic xmlns:a="http://schemas.openxmlformats.org/drawingml/2006/main">
+              <a:graphicData uri="http://schemas.openxmlformats.org/drawingml/2006/picture">
+                <pic:pic xmlns:pic="http://schemas.openxmlformats.org/drawingml/2006/picture">
+                  <pic:nvPicPr>
+                    <pic:cNvPr id="1" name=""/>
+                    <pic:cNvPicPr/>
+                  </pic:nvPicPr>
+                  <pic:blipFill>
+                    <a:blip r:embed="rId39"/>
+                    <a:stretch>
+                      <a:fillRect/>
+                    </a:stretch>
+                  </pic:blipFill>
+                  <pic:spPr>
+                    <a:xfrm>
+                      <a:off x="0" y="0"/>
+                      <a:ext cx="2686050" cy="2080895"/>
+                    </a:xfrm>
+                    <a:prstGeom prst="rect">
+                      <a:avLst/>
+                    </a:prstGeom>
+                  </pic:spPr>
+                </pic:pic>
+              </a:graphicData>
+            </a:graphic>
+            <wp14:sizeRelH relativeFrom="margin">
+              <wp14:pctWidth>0</wp14:pctWidth>
+            </wp14:sizeRelH>
+            <wp14:sizeRelV relativeFrom="margin">
+              <wp14:pctHeight>0</wp14:pctHeight>
+            </wp14:sizeRelV>
+          </wp:anchor>
+        </w:drawing>
       </w:r>
       <w:r>
         <w:rPr>
           <w:rFonts w:ascii="Arial" w:eastAsia="Arial" w:hAnsi="Arial" w:cs="Arial"/>
           <w:i/>
           <w:iCs/>
+          <w:noProof/>
           <w:color w:val="000000"/>
           <w:sz w:val="20"/>
           <w:szCs w:val="20"/>
         </w:rPr>
-        <w:t xml:space="preserve">  </w:t>
-      </w:r>
-      <w:r>
-        <w:rPr>
-          <w:rFonts w:ascii="Arial" w:hAnsi="Arial" w:cs="Arial"/>
-          <w:b/>
-          <w:bCs/>
-          <w:sz w:val="24"/>
-          <w:szCs w:val="24"/>
+        <w:drawing>
+          <wp:anchor distT="0" distB="0" distL="114300" distR="114300" simplePos="0" relativeHeight="251671552" behindDoc="0" locked="0" layoutInCell="1" allowOverlap="1" wp14:anchorId="6F80C3BC" wp14:editId="2E9684A6">
+            <wp:simplePos x="0" y="0"/>
+            <wp:positionH relativeFrom="column">
+              <wp:posOffset>-131150</wp:posOffset>
+            </wp:positionH>
+            <wp:positionV relativeFrom="paragraph">
+              <wp:posOffset>405174</wp:posOffset>
+            </wp:positionV>
+            <wp:extent cx="2891155" cy="1600200"/>
+            <wp:effectExtent l="0" t="0" r="4445" b="0"/>
+            <wp:wrapTopAndBottom/>
+            <wp:docPr id="4" name="Imagen 4"/>
+            <wp:cNvGraphicFramePr>
+              <a:graphicFrameLocks xmlns:a="http://schemas.openxmlformats.org/drawingml/2006/main" noChangeAspect="1"/>
+            </wp:cNvGraphicFramePr>
+            <a:graphic xmlns:a="http://schemas.openxmlformats.org/drawingml/2006/main">
+              <a:graphicData uri="http://schemas.openxmlformats.org/drawingml/2006/picture">
+                <pic:pic xmlns:pic="http://schemas.openxmlformats.org/drawingml/2006/picture">
+                  <pic:nvPicPr>
+                    <pic:cNvPr id="1" name=""/>
+                    <pic:cNvPicPr/>
+                  </pic:nvPicPr>
+                  <pic:blipFill>
+                    <a:blip r:embed="rId40"/>
+                    <a:stretch>
+                      <a:fillRect/>
+                    </a:stretch>
+                  </pic:blipFill>
+                  <pic:spPr>
+                    <a:xfrm>
+                      <a:off x="0" y="0"/>
+                      <a:ext cx="2891155" cy="1600200"/>
+                    </a:xfrm>
+                    <a:prstGeom prst="rect">
+                      <a:avLst/>
+                    </a:prstGeom>
+                  </pic:spPr>
+                </pic:pic>
+              </a:graphicData>
+            </a:graphic>
+            <wp14:sizeRelH relativeFrom="margin">
+              <wp14:pctWidth>0</wp14:pctWidth>
+            </wp14:sizeRelH>
+            <wp14:sizeRelV relativeFrom="margin">
+              <wp14:pctHeight>0</wp14:pctHeight>
+            </wp14:sizeRelV>
+          </wp:anchor>
+        </w:drawing>
+      </w:r>
+      <w:r>
+        <w:rPr>
+          <w:rFonts w:ascii="Arial" w:eastAsia="Arial" w:hAnsi="Arial" w:cs="Arial"/>
+          <w:i/>
+          <w:iCs/>
+          <w:noProof/>
+          <w:color w:val="000000"/>
+          <w:sz w:val="20"/>
+          <w:szCs w:val="20"/>
+        </w:rPr>
+        <w:drawing>
+          <wp:anchor distT="0" distB="0" distL="114300" distR="114300" simplePos="0" relativeHeight="251673600" behindDoc="0" locked="0" layoutInCell="1" allowOverlap="1" wp14:anchorId="1EA60D13" wp14:editId="7EAFD8AE">
+            <wp:simplePos x="0" y="0"/>
+            <wp:positionH relativeFrom="column">
+              <wp:posOffset>2818130</wp:posOffset>
+            </wp:positionH>
+            <wp:positionV relativeFrom="paragraph">
+              <wp:posOffset>410210</wp:posOffset>
+            </wp:positionV>
+            <wp:extent cx="2676525" cy="1863090"/>
+            <wp:effectExtent l="0" t="0" r="9525" b="3810"/>
+            <wp:wrapTopAndBottom/>
+            <wp:docPr id="5" name="Imagen 5"/>
+            <wp:cNvGraphicFramePr>
+              <a:graphicFrameLocks xmlns:a="http://schemas.openxmlformats.org/drawingml/2006/main" noChangeAspect="1"/>
+            </wp:cNvGraphicFramePr>
+            <a:graphic xmlns:a="http://schemas.openxmlformats.org/drawingml/2006/main">
+              <a:graphicData uri="http://schemas.openxmlformats.org/drawingml/2006/picture">
+                <pic:pic xmlns:pic="http://schemas.openxmlformats.org/drawingml/2006/picture">
+                  <pic:nvPicPr>
+                    <pic:cNvPr id="1" name=""/>
+                    <pic:cNvPicPr/>
+                  </pic:nvPicPr>
+                  <pic:blipFill>
+                    <a:blip r:embed="rId41"/>
+                    <a:stretch>
+                      <a:fillRect/>
+                    </a:stretch>
+                  </pic:blipFill>
+                  <pic:spPr>
+                    <a:xfrm>
+                      <a:off x="0" y="0"/>
+                      <a:ext cx="2676525" cy="1863090"/>
+                    </a:xfrm>
+                    <a:prstGeom prst="rect">
+                      <a:avLst/>
+                    </a:prstGeom>
+                  </pic:spPr>
+                </pic:pic>
+              </a:graphicData>
+            </a:graphic>
+            <wp14:sizeRelH relativeFrom="margin">
+              <wp14:pctWidth>0</wp14:pctWidth>
+            </wp14:sizeRelH>
+            <wp14:sizeRelV relativeFrom="margin">
+              <wp14:pctHeight>0</wp14:pctHeight>
+            </wp14:sizeRelV>
+          </wp:anchor>
+        </w:drawing>
+      </w:r>
+      <w:r>
+        <w:rPr>
+          <w:rFonts w:ascii="Arial" w:hAnsi="Arial" w:cs="Arial"/>
+          <w:b/>
+          <w:bCs/>
+          <w:lang w:eastAsia="es-EC"/>
+        </w:rPr>
+        <w:t xml:space="preserve">Registro de cambios mediante </w:t>
+      </w:r>
+      <w:proofErr w:type="spellStart"/>
+      <w:r>
+        <w:rPr>
+          <w:rFonts w:ascii="Arial" w:hAnsi="Arial" w:cs="Arial"/>
+          <w:b/>
+          <w:bCs/>
+          <w:lang w:eastAsia="es-EC"/>
+        </w:rPr>
+        <w:t>commits</w:t>
+      </w:r>
+      <w:proofErr w:type="spellEnd"/>
+      <w:r>
+        <w:rPr>
+          <w:rFonts w:ascii="Arial" w:hAnsi="Arial" w:cs="Arial"/>
+          <w:b/>
+          <w:bCs/>
+          <w:lang w:eastAsia="es-EC"/>
+        </w:rPr>
+        <w:t xml:space="preserve"> y </w:t>
+      </w:r>
+      <w:proofErr w:type="spellStart"/>
+      <w:r>
+        <w:rPr>
+          <w:rFonts w:ascii="Arial" w:hAnsi="Arial" w:cs="Arial"/>
+          <w:b/>
+          <w:bCs/>
+          <w:lang w:eastAsia="es-EC"/>
+        </w:rPr>
+        <w:t>push</w:t>
+      </w:r>
+      <w:proofErr w:type="spellEnd"/>
+      <w:r>
+        <w:rPr>
+          <w:rFonts w:ascii="Arial" w:hAnsi="Arial" w:cs="Arial"/>
+          <w:b/>
+          <w:bCs/>
+          <w:lang w:eastAsia="es-EC"/>
+        </w:rPr>
+        <w:t xml:space="preserve"> al repositorio</w:t>
+      </w:r>
+      <w:r>
+        <w:rPr>
+          <w:rFonts w:ascii="Arial" w:hAnsi="Arial" w:cs="Arial"/>
+          <w:b/>
+          <w:bCs/>
+          <w:lang w:eastAsia="es-EC"/>
+        </w:rPr>
+        <w:t xml:space="preserve"> </w:t>
+      </w:r>
+      <w:r>
+        <w:rPr>
+          <w:rFonts w:ascii="Arial" w:hAnsi="Arial" w:cs="Arial"/>
+          <w:b/>
+          <w:bCs/>
           <w:lang w:eastAsia="es-EC"/>
         </w:rPr>
         <w:br w:type="page"/>
-      </w:r>
-    </w:p>
-    <w:p>
-      <w:pPr>
-        <w:pStyle w:val="Sinespaciado"/>
-        <w:spacing w:line="360" w:lineRule="auto"/>
-        <w:jc w:val="both"/>
-        <w:rPr>
-          <w:rFonts w:ascii="Arial" w:hAnsi="Arial" w:cs="Arial"/>
-          <w:b/>
-          <w:bCs/>
-          <w:lang w:eastAsia="es-EC"/>
-        </w:rPr>
-      </w:pPr>
-      <w:r>
-        <w:rPr>
-          <w:rFonts w:ascii="Arial" w:hAnsi="Arial" w:cs="Arial"/>
-          <w:b/>
-          <w:bCs/>
-          <w:lang w:eastAsia="es-EC"/>
-        </w:rPr>
-        <w:lastRenderedPageBreak/>
-        <w:t>Bibliografía</w:t>
       </w:r>
     </w:p>
     <w:p>
@@ -3129,6 +5143,507 @@
         <w:spacing w:after="0" w:line="240" w:lineRule="auto"/>
         <w:jc w:val="both"/>
         <w:rPr>
+          <w:rFonts w:ascii="Arial" w:eastAsiaTheme="majorEastAsia" w:hAnsi="Arial" w:cs="Arial"/>
+          <w:b/>
+          <w:bCs/>
+          <w:color w:val="2F5496" w:themeColor="accent1" w:themeShade="BF"/>
+          <w:sz w:val="24"/>
+          <w:szCs w:val="24"/>
+          <w:lang w:eastAsia="es-EC"/>
+        </w:rPr>
+      </w:pPr>
+    </w:p>
+    <w:p>
+      <w:pPr>
+        <w:pStyle w:val="Sinespaciado"/>
+        <w:spacing w:line="360" w:lineRule="auto"/>
+        <w:jc w:val="both"/>
+        <w:rPr>
+          <w:rFonts w:ascii="Arial" w:hAnsi="Arial" w:cs="Arial"/>
+          <w:b/>
+          <w:bCs/>
+          <w:lang w:eastAsia="es-EC"/>
+        </w:rPr>
+      </w:pPr>
+      <w:r>
+        <w:rPr>
+          <w:rFonts w:ascii="Arial" w:hAnsi="Arial" w:cs="Arial"/>
+          <w:b/>
+          <w:bCs/>
+          <w:lang w:eastAsia="es-EC"/>
+        </w:rPr>
+        <w:t>Bibliografía</w:t>
+      </w:r>
+    </w:p>
+    <w:p>
+      <w:pPr>
+        <w:widowControl w:val="0"/>
+        <w:pBdr>
+          <w:top w:val="nil"/>
+          <w:left w:val="nil"/>
+          <w:bottom w:val="nil"/>
+          <w:right w:val="nil"/>
+          <w:between w:val="nil"/>
+        </w:pBdr>
+        <w:spacing w:after="0" w:line="240" w:lineRule="auto"/>
+        <w:ind w:left="709" w:hanging="709"/>
+        <w:rPr>
+          <w:lang w:eastAsia="es-EC"/>
+        </w:rPr>
+      </w:pPr>
+      <w:proofErr w:type="spellStart"/>
+      <w:r>
+        <w:rPr>
+          <w:lang w:eastAsia="es-EC"/>
+        </w:rPr>
+        <w:t>Atlassian</w:t>
+      </w:r>
+      <w:proofErr w:type="spellEnd"/>
+      <w:r>
+        <w:rPr>
+          <w:lang w:eastAsia="es-EC"/>
+        </w:rPr>
+        <w:t xml:space="preserve">. (s. f.). Flujo de trabajo de </w:t>
+      </w:r>
+      <w:proofErr w:type="spellStart"/>
+      <w:r>
+        <w:rPr>
+          <w:lang w:eastAsia="es-EC"/>
+        </w:rPr>
+        <w:t>Gitflow</w:t>
+      </w:r>
+      <w:proofErr w:type="spellEnd"/>
+      <w:r>
+        <w:rPr>
+          <w:lang w:eastAsia="es-EC"/>
+        </w:rPr>
+        <w:t xml:space="preserve">. </w:t>
+      </w:r>
+      <w:hyperlink r:id="rId42" w:history="1">
+        <w:r>
+          <w:rPr>
+            <w:rStyle w:val="Hipervnculo"/>
+            <w:lang w:eastAsia="es-EC"/>
+          </w:rPr>
+          <w:t>https://www.atlassian.com/es/git/tutorials/comparing-workflows/gitflow-workflow</w:t>
+        </w:r>
+      </w:hyperlink>
+    </w:p>
+    <w:p>
+      <w:pPr>
+        <w:widowControl w:val="0"/>
+        <w:pBdr>
+          <w:top w:val="nil"/>
+          <w:left w:val="nil"/>
+          <w:bottom w:val="nil"/>
+          <w:right w:val="nil"/>
+          <w:between w:val="nil"/>
+        </w:pBdr>
+        <w:spacing w:after="0" w:line="240" w:lineRule="auto"/>
+        <w:ind w:left="709" w:hanging="709"/>
+        <w:rPr>
+          <w:lang w:eastAsia="es-EC"/>
+        </w:rPr>
+      </w:pPr>
+    </w:p>
+    <w:p>
+      <w:pPr>
+        <w:widowControl w:val="0"/>
+        <w:pBdr>
+          <w:top w:val="nil"/>
+          <w:left w:val="nil"/>
+          <w:bottom w:val="nil"/>
+          <w:right w:val="nil"/>
+          <w:between w:val="nil"/>
+        </w:pBdr>
+        <w:spacing w:after="0" w:line="240" w:lineRule="auto"/>
+        <w:ind w:left="709" w:hanging="709"/>
+        <w:rPr>
+          <w:lang w:eastAsia="es-EC"/>
+        </w:rPr>
+      </w:pPr>
+      <w:proofErr w:type="spellStart"/>
+      <w:r>
+        <w:rPr>
+          <w:lang w:eastAsia="es-EC"/>
+        </w:rPr>
+        <w:t>freeCodeCamp</w:t>
+      </w:r>
+      <w:proofErr w:type="spellEnd"/>
+      <w:r>
+        <w:rPr>
+          <w:lang w:eastAsia="es-EC"/>
+        </w:rPr>
+        <w:t xml:space="preserve"> </w:t>
+      </w:r>
+      <w:proofErr w:type="gramStart"/>
+      <w:r>
+        <w:rPr>
+          <w:lang w:eastAsia="es-EC"/>
+        </w:rPr>
+        <w:t>Español</w:t>
+      </w:r>
+      <w:proofErr w:type="gramEnd"/>
+      <w:r>
+        <w:rPr>
+          <w:lang w:eastAsia="es-EC"/>
+        </w:rPr>
+        <w:t xml:space="preserve">. (s. f.). Guía para principiantes de Git y GitHub. </w:t>
+      </w:r>
+      <w:hyperlink r:id="rId43" w:history="1">
+        <w:r>
+          <w:rPr>
+            <w:rStyle w:val="Hipervnculo"/>
+            <w:lang w:eastAsia="es-EC"/>
+          </w:rPr>
+          <w:t>https://www.freecodecamp.org/espanol/news/guia-para-principiantes-de-git-y-github/</w:t>
+        </w:r>
+      </w:hyperlink>
+    </w:p>
+    <w:p>
+      <w:pPr>
+        <w:widowControl w:val="0"/>
+        <w:pBdr>
+          <w:top w:val="nil"/>
+          <w:left w:val="nil"/>
+          <w:bottom w:val="nil"/>
+          <w:right w:val="nil"/>
+          <w:between w:val="nil"/>
+        </w:pBdr>
+        <w:spacing w:after="0" w:line="240" w:lineRule="auto"/>
+        <w:ind w:left="709" w:hanging="709"/>
+        <w:rPr>
+          <w:lang w:eastAsia="es-EC"/>
+        </w:rPr>
+      </w:pPr>
+    </w:p>
+    <w:p>
+      <w:pPr>
+        <w:widowControl w:val="0"/>
+        <w:pBdr>
+          <w:top w:val="nil"/>
+          <w:left w:val="nil"/>
+          <w:bottom w:val="nil"/>
+          <w:right w:val="nil"/>
+          <w:between w:val="nil"/>
+        </w:pBdr>
+        <w:spacing w:after="0" w:line="240" w:lineRule="auto"/>
+        <w:ind w:left="709" w:hanging="709"/>
+        <w:rPr>
+          <w:lang w:eastAsia="es-EC"/>
+        </w:rPr>
+      </w:pPr>
+      <w:r>
+        <w:rPr>
+          <w:lang w:eastAsia="es-EC"/>
+        </w:rPr>
+        <w:t xml:space="preserve">Miro. (s. f.). Diagrama de clases UML. </w:t>
+      </w:r>
+      <w:hyperlink r:id="rId44" w:history="1">
+        <w:r>
+          <w:rPr>
+            <w:rStyle w:val="Hipervnculo"/>
+            <w:lang w:eastAsia="es-EC"/>
+          </w:rPr>
+          <w:t>https://miro.com/es/diagrama/que-es-diagrama-clases-uml/</w:t>
+        </w:r>
+      </w:hyperlink>
+    </w:p>
+    <w:p>
+      <w:pPr>
+        <w:widowControl w:val="0"/>
+        <w:pBdr>
+          <w:top w:val="nil"/>
+          <w:left w:val="nil"/>
+          <w:bottom w:val="nil"/>
+          <w:right w:val="nil"/>
+          <w:between w:val="nil"/>
+        </w:pBdr>
+        <w:spacing w:after="0" w:line="240" w:lineRule="auto"/>
+        <w:ind w:left="709" w:hanging="709"/>
+        <w:rPr>
+          <w:lang w:eastAsia="es-EC"/>
+        </w:rPr>
+      </w:pPr>
+    </w:p>
+    <w:p>
+      <w:pPr>
+        <w:widowControl w:val="0"/>
+        <w:pBdr>
+          <w:top w:val="nil"/>
+          <w:left w:val="nil"/>
+          <w:bottom w:val="nil"/>
+          <w:right w:val="nil"/>
+          <w:between w:val="nil"/>
+        </w:pBdr>
+        <w:spacing w:after="0" w:line="240" w:lineRule="auto"/>
+        <w:ind w:left="709" w:hanging="709"/>
+        <w:rPr>
+          <w:lang w:eastAsia="es-EC"/>
+        </w:rPr>
+      </w:pPr>
+      <w:r>
+        <w:rPr>
+          <w:lang w:eastAsia="es-EC"/>
+        </w:rPr>
+        <w:t xml:space="preserve">Miro. (s. f.). Diagrama de secuencia UML. </w:t>
+      </w:r>
+      <w:hyperlink r:id="rId45" w:history="1">
+        <w:r>
+          <w:rPr>
+            <w:rStyle w:val="Hipervnculo"/>
+            <w:lang w:eastAsia="es-EC"/>
+          </w:rPr>
+          <w:t>https://miro.com/es/diagrama/que-es-diagrama-secuencia-uml/</w:t>
+        </w:r>
+      </w:hyperlink>
+    </w:p>
+    <w:p>
+      <w:pPr>
+        <w:widowControl w:val="0"/>
+        <w:pBdr>
+          <w:top w:val="nil"/>
+          <w:left w:val="nil"/>
+          <w:bottom w:val="nil"/>
+          <w:right w:val="nil"/>
+          <w:between w:val="nil"/>
+        </w:pBdr>
+        <w:spacing w:after="0" w:line="240" w:lineRule="auto"/>
+        <w:ind w:left="709" w:hanging="709"/>
+        <w:rPr>
+          <w:lang w:eastAsia="es-EC"/>
+        </w:rPr>
+      </w:pPr>
+    </w:p>
+    <w:p>
+      <w:pPr>
+        <w:widowControl w:val="0"/>
+        <w:pBdr>
+          <w:top w:val="nil"/>
+          <w:left w:val="nil"/>
+          <w:bottom w:val="nil"/>
+          <w:right w:val="nil"/>
+          <w:between w:val="nil"/>
+        </w:pBdr>
+        <w:spacing w:after="0" w:line="240" w:lineRule="auto"/>
+        <w:ind w:left="709" w:hanging="709"/>
+        <w:rPr>
+          <w:lang w:val="en-US" w:eastAsia="es-EC"/>
+        </w:rPr>
+      </w:pPr>
+      <w:r>
+        <w:rPr>
+          <w:lang w:val="en-US" w:eastAsia="es-EC"/>
+        </w:rPr>
+        <w:t xml:space="preserve">Visual Paradigm. (s. f.). What is use case diagram? </w:t>
+      </w:r>
+      <w:hyperlink r:id="rId46" w:history="1">
+        <w:r>
+          <w:rPr>
+            <w:rStyle w:val="Hipervnculo"/>
+            <w:lang w:val="en-US" w:eastAsia="es-EC"/>
+          </w:rPr>
+          <w:t>https://www.visual-paradigm.com/guide/uml-unified-modeling-language/what-is-use-case-diagram/</w:t>
+        </w:r>
+      </w:hyperlink>
+    </w:p>
+    <w:p>
+      <w:pPr>
+        <w:widowControl w:val="0"/>
+        <w:pBdr>
+          <w:top w:val="nil"/>
+          <w:left w:val="nil"/>
+          <w:bottom w:val="nil"/>
+          <w:right w:val="nil"/>
+          <w:between w:val="nil"/>
+        </w:pBdr>
+        <w:spacing w:after="0" w:line="240" w:lineRule="auto"/>
+        <w:ind w:left="709" w:hanging="709"/>
+        <w:rPr>
+          <w:lang w:val="en-US" w:eastAsia="es-EC"/>
+        </w:rPr>
+      </w:pPr>
+    </w:p>
+    <w:p>
+      <w:pPr>
+        <w:widowControl w:val="0"/>
+        <w:pBdr>
+          <w:top w:val="nil"/>
+          <w:left w:val="nil"/>
+          <w:bottom w:val="nil"/>
+          <w:right w:val="nil"/>
+          <w:between w:val="nil"/>
+        </w:pBdr>
+        <w:spacing w:after="0" w:line="240" w:lineRule="auto"/>
+        <w:ind w:left="709" w:hanging="709"/>
+        <w:rPr>
+          <w:lang w:eastAsia="es-EC"/>
+        </w:rPr>
+      </w:pPr>
+      <w:proofErr w:type="spellStart"/>
+      <w:r>
+        <w:rPr>
+          <w:lang w:eastAsia="es-EC"/>
+        </w:rPr>
+        <w:t>S</w:t>
+      </w:r>
+      <w:r>
+        <w:rPr>
+          <w:lang w:eastAsia="es-EC"/>
+        </w:rPr>
+        <w:t>oydalto</w:t>
+      </w:r>
+      <w:proofErr w:type="spellEnd"/>
+      <w:r>
+        <w:rPr>
+          <w:lang w:eastAsia="es-EC"/>
+        </w:rPr>
+        <w:t xml:space="preserve"> </w:t>
+      </w:r>
+      <w:r>
+        <w:rPr>
+          <w:lang w:eastAsia="es-EC"/>
+        </w:rPr>
+        <w:t xml:space="preserve">(s. f.). Curso de GIT desde CERO </w:t>
+      </w:r>
+      <w:r>
+        <w:rPr>
+          <w:lang w:eastAsia="es-EC"/>
+        </w:rPr>
+        <w:t>[Video]</w:t>
+      </w:r>
+      <w:r>
+        <w:rPr>
+          <w:lang w:eastAsia="es-EC"/>
+        </w:rPr>
+        <w:t xml:space="preserve">. YouTube. </w:t>
+      </w:r>
+      <w:hyperlink r:id="rId47" w:history="1">
+        <w:r>
+          <w:rPr>
+            <w:rStyle w:val="Hipervnculo"/>
+            <w:lang w:eastAsia="es-EC"/>
+          </w:rPr>
+          <w:t>https://youtu.be/9ZJ-K-zk_Go</w:t>
+        </w:r>
+      </w:hyperlink>
+    </w:p>
+    <w:p>
+      <w:pPr>
+        <w:widowControl w:val="0"/>
+        <w:pBdr>
+          <w:top w:val="nil"/>
+          <w:left w:val="nil"/>
+          <w:bottom w:val="nil"/>
+          <w:right w:val="nil"/>
+          <w:between w:val="nil"/>
+        </w:pBdr>
+        <w:spacing w:after="0" w:line="240" w:lineRule="auto"/>
+        <w:ind w:left="709" w:hanging="709"/>
+        <w:rPr>
+          <w:lang w:eastAsia="es-EC"/>
+        </w:rPr>
+      </w:pPr>
+    </w:p>
+    <w:p>
+      <w:pPr>
+        <w:widowControl w:val="0"/>
+        <w:pBdr>
+          <w:top w:val="nil"/>
+          <w:left w:val="nil"/>
+          <w:bottom w:val="nil"/>
+          <w:right w:val="nil"/>
+          <w:between w:val="nil"/>
+        </w:pBdr>
+        <w:spacing w:after="0" w:line="240" w:lineRule="auto"/>
+        <w:ind w:left="709" w:hanging="709"/>
+        <w:rPr>
+          <w:lang w:eastAsia="es-EC"/>
+        </w:rPr>
+      </w:pPr>
+      <w:proofErr w:type="spellStart"/>
+      <w:r>
+        <w:rPr>
+          <w:lang w:eastAsia="es-EC"/>
+        </w:rPr>
+        <w:t>E</w:t>
+      </w:r>
+      <w:r>
+        <w:rPr>
+          <w:lang w:eastAsia="es-EC"/>
+        </w:rPr>
+        <w:t>scuelaspring</w:t>
+      </w:r>
+      <w:proofErr w:type="spellEnd"/>
+      <w:r>
+        <w:rPr>
+          <w:lang w:eastAsia="es-EC"/>
+        </w:rPr>
+        <w:t xml:space="preserve"> </w:t>
+      </w:r>
+      <w:r>
+        <w:rPr>
+          <w:lang w:eastAsia="es-EC"/>
+        </w:rPr>
+        <w:t xml:space="preserve">(s. f.). </w:t>
+      </w:r>
+      <w:proofErr w:type="spellStart"/>
+      <w:r>
+        <w:rPr>
+          <w:lang w:eastAsia="es-EC"/>
+        </w:rPr>
+        <w:t>Gitflow</w:t>
+      </w:r>
+      <w:proofErr w:type="spellEnd"/>
+      <w:r>
+        <w:rPr>
+          <w:lang w:eastAsia="es-EC"/>
+        </w:rPr>
+        <w:t xml:space="preserve"> explicado paso a paso | Tutorial completo de </w:t>
+      </w:r>
+      <w:proofErr w:type="spellStart"/>
+      <w:r>
+        <w:rPr>
+          <w:lang w:eastAsia="es-EC"/>
+        </w:rPr>
+        <w:t>Gitflow</w:t>
+      </w:r>
+      <w:proofErr w:type="spellEnd"/>
+      <w:r>
+        <w:rPr>
+          <w:lang w:eastAsia="es-EC"/>
+        </w:rPr>
+        <w:t xml:space="preserve"> </w:t>
+      </w:r>
+      <w:r>
+        <w:rPr>
+          <w:lang w:eastAsia="es-EC"/>
+        </w:rPr>
+        <w:t xml:space="preserve">[Video]. YouTube. </w:t>
+      </w:r>
+      <w:hyperlink r:id="rId48" w:history="1">
+        <w:r>
+          <w:rPr>
+            <w:rStyle w:val="Hipervnculo"/>
+            <w:lang w:val="en-US" w:eastAsia="es-EC"/>
+          </w:rPr>
+          <w:t>https://youtu.be/TPBBgiuL27I</w:t>
+        </w:r>
+      </w:hyperlink>
+    </w:p>
+    <w:p>
+      <w:pPr>
+        <w:widowControl w:val="0"/>
+        <w:pBdr>
+          <w:top w:val="nil"/>
+          <w:left w:val="nil"/>
+          <w:bottom w:val="nil"/>
+          <w:right w:val="nil"/>
+          <w:between w:val="nil"/>
+        </w:pBdr>
+        <w:spacing w:after="0" w:line="240" w:lineRule="auto"/>
+        <w:jc w:val="both"/>
+        <w:rPr>
           <w:rFonts w:ascii="Arial" w:hAnsi="Arial" w:cs="Arial"/>
           <w:i/>
           <w:iCs/>
@@ -3137,42 +5652,9 @@
           <w:lang w:eastAsia="es-EC"/>
         </w:rPr>
       </w:pPr>
-      <w:r>
-        <w:rPr>
-          <w:rFonts w:ascii="Arial" w:hAnsi="Arial" w:cs="Arial"/>
-          <w:i/>
-          <w:iCs/>
-          <w:sz w:val="20"/>
-          <w:szCs w:val="20"/>
-          <w:lang w:eastAsia="es-EC"/>
-        </w:rPr>
-        <w:t>(</w:t>
-      </w:r>
-      <w:r>
-        <w:rPr>
-          <w:rFonts w:ascii="Arial" w:hAnsi="Arial" w:cs="Arial"/>
-          <w:i/>
-          <w:iCs/>
-          <w:sz w:val="20"/>
-          <w:szCs w:val="20"/>
-          <w:lang w:eastAsia="es-EC"/>
-        </w:rPr>
-        <w:t>Referencias bibliográficas y/o enlaces en Internet (normas APA) que se utilizaron para realizar la práctica.</w:t>
-      </w:r>
-      <w:r>
-        <w:rPr>
-          <w:rFonts w:ascii="Arial" w:hAnsi="Arial" w:cs="Arial"/>
-          <w:i/>
-          <w:iCs/>
-          <w:sz w:val="20"/>
-          <w:szCs w:val="20"/>
-          <w:lang w:eastAsia="es-EC"/>
-        </w:rPr>
-        <w:t>)</w:t>
-      </w:r>
     </w:p>
     <w:sectPr>
-      <w:headerReference w:type="first" r:id="rId18"/>
+      <w:headerReference w:type="first" r:id="rId49"/>
       <w:pgSz w:w="11906" w:h="16838"/>
       <w:pgMar w:top="1417" w:right="1701" w:bottom="1417" w:left="1701" w:header="708" w:footer="708" w:gutter="0"/>
       <w:pgNumType w:start="1"/>
@@ -4048,12 +6530,125 @@
         <v:path o:extrusionok="f" gradientshapeok="t" o:connecttype="rect"/>
         <o:lock v:ext="edit" aspectratio="t"/>
       </v:shapetype>
-      <v:shape id="_x0000_i1111" type="#_x0000_t75" style="width:10.5pt;height:10.5pt" o:bullet="t">
+      <v:shape id="_x0000_i1107" type="#_x0000_t75" style="width:10.9pt;height:10.9pt" o:bullet="t">
         <v:imagedata r:id="rId1" o:title="mso3E28"/>
       </v:shape>
     </w:pict>
   </w:numPicBullet>
   <w:abstractNum w:abstractNumId="0" w15:restartNumberingAfterBreak="0">
+    <w:nsid w:val="0B514E42"/>
+    <w:multiLevelType w:val="hybridMultilevel"/>
+    <w:tmpl w:val="FD1A7722"/>
+    <w:lvl w:ilvl="0" w:tplc="300A0001">
+      <w:start w:val="1"/>
+      <w:numFmt w:val="bullet"/>
+      <w:lvlText w:val=""/>
+      <w:lvlJc w:val="left"/>
+      <w:pPr>
+        <w:ind w:left="720" w:hanging="360"/>
+      </w:pPr>
+      <w:rPr>
+        <w:rFonts w:ascii="Symbol" w:hAnsi="Symbol" w:hint="default"/>
+      </w:rPr>
+    </w:lvl>
+    <w:lvl w:ilvl="1" w:tplc="300A0003" w:tentative="1">
+      <w:start w:val="1"/>
+      <w:numFmt w:val="bullet"/>
+      <w:lvlText w:val="o"/>
+      <w:lvlJc w:val="left"/>
+      <w:pPr>
+        <w:ind w:left="1440" w:hanging="360"/>
+      </w:pPr>
+      <w:rPr>
+        <w:rFonts w:ascii="Courier New" w:hAnsi="Courier New" w:cs="Courier New" w:hint="default"/>
+      </w:rPr>
+    </w:lvl>
+    <w:lvl w:ilvl="2" w:tplc="300A0005" w:tentative="1">
+      <w:start w:val="1"/>
+      <w:numFmt w:val="bullet"/>
+      <w:lvlText w:val=""/>
+      <w:lvlJc w:val="left"/>
+      <w:pPr>
+        <w:ind w:left="2160" w:hanging="360"/>
+      </w:pPr>
+      <w:rPr>
+        <w:rFonts w:ascii="Wingdings" w:hAnsi="Wingdings" w:hint="default"/>
+      </w:rPr>
+    </w:lvl>
+    <w:lvl w:ilvl="3" w:tplc="300A0001" w:tentative="1">
+      <w:start w:val="1"/>
+      <w:numFmt w:val="bullet"/>
+      <w:lvlText w:val=""/>
+      <w:lvlJc w:val="left"/>
+      <w:pPr>
+        <w:ind w:left="2880" w:hanging="360"/>
+      </w:pPr>
+      <w:rPr>
+        <w:rFonts w:ascii="Symbol" w:hAnsi="Symbol" w:hint="default"/>
+      </w:rPr>
+    </w:lvl>
+    <w:lvl w:ilvl="4" w:tplc="300A0003" w:tentative="1">
+      <w:start w:val="1"/>
+      <w:numFmt w:val="bullet"/>
+      <w:lvlText w:val="o"/>
+      <w:lvlJc w:val="left"/>
+      <w:pPr>
+        <w:ind w:left="3600" w:hanging="360"/>
+      </w:pPr>
+      <w:rPr>
+        <w:rFonts w:ascii="Courier New" w:hAnsi="Courier New" w:cs="Courier New" w:hint="default"/>
+      </w:rPr>
+    </w:lvl>
+    <w:lvl w:ilvl="5" w:tplc="300A0005" w:tentative="1">
+      <w:start w:val="1"/>
+      <w:numFmt w:val="bullet"/>
+      <w:lvlText w:val=""/>
+      <w:lvlJc w:val="left"/>
+      <w:pPr>
+        <w:ind w:left="4320" w:hanging="360"/>
+      </w:pPr>
+      <w:rPr>
+        <w:rFonts w:ascii="Wingdings" w:hAnsi="Wingdings" w:hint="default"/>
+      </w:rPr>
+    </w:lvl>
+    <w:lvl w:ilvl="6" w:tplc="300A0001" w:tentative="1">
+      <w:start w:val="1"/>
+      <w:numFmt w:val="bullet"/>
+      <w:lvlText w:val=""/>
+      <w:lvlJc w:val="left"/>
+      <w:pPr>
+        <w:ind w:left="5040" w:hanging="360"/>
+      </w:pPr>
+      <w:rPr>
+        <w:rFonts w:ascii="Symbol" w:hAnsi="Symbol" w:hint="default"/>
+      </w:rPr>
+    </w:lvl>
+    <w:lvl w:ilvl="7" w:tplc="300A0003" w:tentative="1">
+      <w:start w:val="1"/>
+      <w:numFmt w:val="bullet"/>
+      <w:lvlText w:val="o"/>
+      <w:lvlJc w:val="left"/>
+      <w:pPr>
+        <w:ind w:left="5760" w:hanging="360"/>
+      </w:pPr>
+      <w:rPr>
+        <w:rFonts w:ascii="Courier New" w:hAnsi="Courier New" w:cs="Courier New" w:hint="default"/>
+      </w:rPr>
+    </w:lvl>
+    <w:lvl w:ilvl="8" w:tplc="300A0005" w:tentative="1">
+      <w:start w:val="1"/>
+      <w:numFmt w:val="bullet"/>
+      <w:lvlText w:val=""/>
+      <w:lvlJc w:val="left"/>
+      <w:pPr>
+        <w:ind w:left="6480" w:hanging="360"/>
+      </w:pPr>
+      <w:rPr>
+        <w:rFonts w:ascii="Wingdings" w:hAnsi="Wingdings" w:hint="default"/>
+      </w:rPr>
+    </w:lvl>
+  </w:abstractNum>
+  <w:abstractNum w:abstractNumId="1" w15:restartNumberingAfterBreak="0">
     <w:nsid w:val="0DEB2E8C"/>
     <w:multiLevelType w:val="hybridMultilevel"/>
     <w:tmpl w:val="D478A1FA"/>
@@ -4167,7 +6762,7 @@
       </w:rPr>
     </w:lvl>
   </w:abstractNum>
-  <w:abstractNum w:abstractNumId="1" w15:restartNumberingAfterBreak="0">
+  <w:abstractNum w:abstractNumId="2" w15:restartNumberingAfterBreak="0">
     <w:nsid w:val="0F253528"/>
     <w:multiLevelType w:val="hybridMultilevel"/>
     <w:tmpl w:val="E022366C"/>
@@ -4280,7 +6875,7 @@
       </w:rPr>
     </w:lvl>
   </w:abstractNum>
-  <w:abstractNum w:abstractNumId="2" w15:restartNumberingAfterBreak="0">
+  <w:abstractNum w:abstractNumId="3" w15:restartNumberingAfterBreak="0">
     <w:nsid w:val="19254471"/>
     <w:multiLevelType w:val="hybridMultilevel"/>
     <w:tmpl w:val="EE48CFBA"/>
@@ -4394,7 +6989,7 @@
       </w:rPr>
     </w:lvl>
   </w:abstractNum>
-  <w:abstractNum w:abstractNumId="3" w15:restartNumberingAfterBreak="0">
+  <w:abstractNum w:abstractNumId="4" w15:restartNumberingAfterBreak="0">
     <w:nsid w:val="206D3069"/>
     <w:multiLevelType w:val="hybridMultilevel"/>
     <w:tmpl w:val="D5826E02"/>
@@ -4507,7 +7102,7 @@
       </w:rPr>
     </w:lvl>
   </w:abstractNum>
-  <w:abstractNum w:abstractNumId="4" w15:restartNumberingAfterBreak="0">
+  <w:abstractNum w:abstractNumId="5" w15:restartNumberingAfterBreak="0">
     <w:nsid w:val="25D101E3"/>
     <w:multiLevelType w:val="hybridMultilevel"/>
     <w:tmpl w:val="1E9CC514"/>
@@ -4620,7 +7215,7 @@
       </w:rPr>
     </w:lvl>
   </w:abstractNum>
-  <w:abstractNum w:abstractNumId="5" w15:restartNumberingAfterBreak="0">
+  <w:abstractNum w:abstractNumId="6" w15:restartNumberingAfterBreak="0">
     <w:nsid w:val="26DE4B16"/>
     <w:multiLevelType w:val="multilevel"/>
     <w:tmpl w:val="9470283E"/>
@@ -4769,7 +7364,7 @@
       </w:rPr>
     </w:lvl>
   </w:abstractNum>
-  <w:abstractNum w:abstractNumId="6" w15:restartNumberingAfterBreak="0">
+  <w:abstractNum w:abstractNumId="7" w15:restartNumberingAfterBreak="0">
     <w:nsid w:val="2E8C7B01"/>
     <w:multiLevelType w:val="multilevel"/>
     <w:tmpl w:val="C17EACDC"/>
@@ -4890,7 +7485,7 @@
       </w:rPr>
     </w:lvl>
   </w:abstractNum>
-  <w:abstractNum w:abstractNumId="7" w15:restartNumberingAfterBreak="0">
+  <w:abstractNum w:abstractNumId="8" w15:restartNumberingAfterBreak="0">
     <w:nsid w:val="32510C06"/>
     <w:multiLevelType w:val="hybridMultilevel"/>
     <w:tmpl w:val="08646192"/>
@@ -5003,7 +7598,7 @@
       </w:rPr>
     </w:lvl>
   </w:abstractNum>
-  <w:abstractNum w:abstractNumId="8" w15:restartNumberingAfterBreak="0">
+  <w:abstractNum w:abstractNumId="9" w15:restartNumberingAfterBreak="0">
     <w:nsid w:val="37AB4FF0"/>
     <w:multiLevelType w:val="multilevel"/>
     <w:tmpl w:val="300A001F"/>
@@ -5092,7 +7687,7 @@
       </w:pPr>
     </w:lvl>
   </w:abstractNum>
-  <w:abstractNum w:abstractNumId="9" w15:restartNumberingAfterBreak="0">
+  <w:abstractNum w:abstractNumId="10" w15:restartNumberingAfterBreak="0">
     <w:nsid w:val="40DD1A90"/>
     <w:multiLevelType w:val="multilevel"/>
     <w:tmpl w:val="6E5C174A"/>
@@ -5205,7 +7800,7 @@
       </w:rPr>
     </w:lvl>
   </w:abstractNum>
-  <w:abstractNum w:abstractNumId="10" w15:restartNumberingAfterBreak="0">
+  <w:abstractNum w:abstractNumId="11" w15:restartNumberingAfterBreak="0">
     <w:nsid w:val="43722CF5"/>
     <w:multiLevelType w:val="hybridMultilevel"/>
     <w:tmpl w:val="7CCAC0E6"/>
@@ -5291,7 +7886,7 @@
       </w:pPr>
     </w:lvl>
   </w:abstractNum>
-  <w:abstractNum w:abstractNumId="11" w15:restartNumberingAfterBreak="0">
+  <w:abstractNum w:abstractNumId="12" w15:restartNumberingAfterBreak="0">
     <w:nsid w:val="4D4940A8"/>
     <w:multiLevelType w:val="hybridMultilevel"/>
     <w:tmpl w:val="4FEC69F0"/>
@@ -5405,7 +8000,7 @@
       </w:rPr>
     </w:lvl>
   </w:abstractNum>
-  <w:abstractNum w:abstractNumId="12" w15:restartNumberingAfterBreak="0">
+  <w:abstractNum w:abstractNumId="13" w15:restartNumberingAfterBreak="0">
     <w:nsid w:val="4F397A1C"/>
     <w:multiLevelType w:val="multilevel"/>
     <w:tmpl w:val="CCDA827E"/>
@@ -5554,7 +8149,7 @@
       </w:rPr>
     </w:lvl>
   </w:abstractNum>
-  <w:abstractNum w:abstractNumId="13" w15:restartNumberingAfterBreak="0">
+  <w:abstractNum w:abstractNumId="14" w15:restartNumberingAfterBreak="0">
     <w:nsid w:val="54174C12"/>
     <w:multiLevelType w:val="multilevel"/>
     <w:tmpl w:val="15B62650"/>
@@ -5685,7 +8280,7 @@
       </w:rPr>
     </w:lvl>
   </w:abstractNum>
-  <w:abstractNum w:abstractNumId="14" w15:restartNumberingAfterBreak="0">
+  <w:abstractNum w:abstractNumId="15" w15:restartNumberingAfterBreak="0">
     <w:nsid w:val="54517D06"/>
     <w:multiLevelType w:val="hybridMultilevel"/>
     <w:tmpl w:val="3DB0EB80"/>
@@ -5797,7 +8392,7 @@
       </w:rPr>
     </w:lvl>
   </w:abstractNum>
-  <w:abstractNum w:abstractNumId="15" w15:restartNumberingAfterBreak="0">
+  <w:abstractNum w:abstractNumId="16" w15:restartNumberingAfterBreak="0">
     <w:nsid w:val="68E15795"/>
     <w:multiLevelType w:val="hybridMultilevel"/>
     <w:tmpl w:val="8FE616A0"/>
@@ -5910,7 +8505,7 @@
       </w:rPr>
     </w:lvl>
   </w:abstractNum>
-  <w:abstractNum w:abstractNumId="16" w15:restartNumberingAfterBreak="0">
+  <w:abstractNum w:abstractNumId="17" w15:restartNumberingAfterBreak="0">
     <w:nsid w:val="6AFC07D3"/>
     <w:multiLevelType w:val="multilevel"/>
     <w:tmpl w:val="B3426C00"/>
@@ -6023,7 +8618,7 @@
       </w:rPr>
     </w:lvl>
   </w:abstractNum>
-  <w:abstractNum w:abstractNumId="17" w15:restartNumberingAfterBreak="0">
+  <w:abstractNum w:abstractNumId="18" w15:restartNumberingAfterBreak="0">
     <w:nsid w:val="6B7B1E92"/>
     <w:multiLevelType w:val="multilevel"/>
     <w:tmpl w:val="21BA233E"/>
@@ -6154,7 +8749,7 @@
       </w:rPr>
     </w:lvl>
   </w:abstractNum>
-  <w:abstractNum w:abstractNumId="18" w15:restartNumberingAfterBreak="0">
+  <w:abstractNum w:abstractNumId="19" w15:restartNumberingAfterBreak="0">
     <w:nsid w:val="6FA144D3"/>
     <w:multiLevelType w:val="multilevel"/>
     <w:tmpl w:val="98CEB7D6"/>
@@ -6275,7 +8870,7 @@
       </w:rPr>
     </w:lvl>
   </w:abstractNum>
-  <w:abstractNum w:abstractNumId="19" w15:restartNumberingAfterBreak="0">
+  <w:abstractNum w:abstractNumId="20" w15:restartNumberingAfterBreak="0">
     <w:nsid w:val="738344F2"/>
     <w:multiLevelType w:val="hybridMultilevel"/>
     <w:tmpl w:val="C4E037F2"/>
@@ -6390,7 +8985,7 @@
       </w:rPr>
     </w:lvl>
   </w:abstractNum>
-  <w:abstractNum w:abstractNumId="20" w15:restartNumberingAfterBreak="0">
+  <w:abstractNum w:abstractNumId="21" w15:restartNumberingAfterBreak="0">
     <w:nsid w:val="74B1685F"/>
     <w:multiLevelType w:val="hybridMultilevel"/>
     <w:tmpl w:val="943E89B2"/>
@@ -6503,7 +9098,7 @@
       </w:rPr>
     </w:lvl>
   </w:abstractNum>
-  <w:abstractNum w:abstractNumId="21" w15:restartNumberingAfterBreak="0">
+  <w:abstractNum w:abstractNumId="22" w15:restartNumberingAfterBreak="0">
     <w:nsid w:val="75DB1EAD"/>
     <w:multiLevelType w:val="multilevel"/>
     <w:tmpl w:val="F2B0D608"/>
@@ -6616,7 +9211,7 @@
       </w:rPr>
     </w:lvl>
   </w:abstractNum>
-  <w:abstractNum w:abstractNumId="22" w15:restartNumberingAfterBreak="0">
+  <w:abstractNum w:abstractNumId="23" w15:restartNumberingAfterBreak="0">
     <w:nsid w:val="77694BC3"/>
     <w:multiLevelType w:val="hybridMultilevel"/>
     <w:tmpl w:val="8D0A3582"/>
@@ -6729,7 +9324,7 @@
       </w:rPr>
     </w:lvl>
   </w:abstractNum>
-  <w:abstractNum w:abstractNumId="23" w15:restartNumberingAfterBreak="0">
+  <w:abstractNum w:abstractNumId="24" w15:restartNumberingAfterBreak="0">
     <w:nsid w:val="79FE5F93"/>
     <w:multiLevelType w:val="hybridMultilevel"/>
     <w:tmpl w:val="A2A2B2DE"/>
@@ -6842,7 +9437,7 @@
       </w:rPr>
     </w:lvl>
   </w:abstractNum>
-  <w:abstractNum w:abstractNumId="24" w15:restartNumberingAfterBreak="0">
+  <w:abstractNum w:abstractNumId="25" w15:restartNumberingAfterBreak="0">
     <w:nsid w:val="7CE94054"/>
     <w:multiLevelType w:val="multilevel"/>
     <w:tmpl w:val="A4D4C1F2"/>
@@ -6957,79 +9552,82 @@
     </w:lvl>
   </w:abstractNum>
   <w:num w:numId="1" w16cid:durableId="1583446607">
+    <w:abstractNumId w:val="10"/>
+  </w:num>
+  <w:num w:numId="2" w16cid:durableId="1161702535">
+    <w:abstractNumId w:val="20"/>
+  </w:num>
+  <w:num w:numId="3" w16cid:durableId="278462607">
+    <w:abstractNumId w:val="19"/>
+  </w:num>
+  <w:num w:numId="4" w16cid:durableId="613749754">
+    <w:abstractNumId w:val="17"/>
+  </w:num>
+  <w:num w:numId="5" w16cid:durableId="1105156356">
+    <w:abstractNumId w:val="25"/>
+  </w:num>
+  <w:num w:numId="6" w16cid:durableId="634412190">
+    <w:abstractNumId w:val="14"/>
+  </w:num>
+  <w:num w:numId="7" w16cid:durableId="1977828569">
+    <w:abstractNumId w:val="18"/>
+  </w:num>
+  <w:num w:numId="8" w16cid:durableId="368337943">
+    <w:abstractNumId w:val="22"/>
+  </w:num>
+  <w:num w:numId="9" w16cid:durableId="962729499">
+    <w:abstractNumId w:val="23"/>
+  </w:num>
+  <w:num w:numId="10" w16cid:durableId="1927571658">
+    <w:abstractNumId w:val="2"/>
+  </w:num>
+  <w:num w:numId="11" w16cid:durableId="1692994704">
+    <w:abstractNumId w:val="5"/>
+  </w:num>
+  <w:num w:numId="12" w16cid:durableId="633755636">
+    <w:abstractNumId w:val="15"/>
+  </w:num>
+  <w:num w:numId="13" w16cid:durableId="978875567">
+    <w:abstractNumId w:val="7"/>
+  </w:num>
+  <w:num w:numId="14" w16cid:durableId="1002707692">
+    <w:abstractNumId w:val="12"/>
+  </w:num>
+  <w:num w:numId="15" w16cid:durableId="1257324613">
+    <w:abstractNumId w:val="1"/>
+  </w:num>
+  <w:num w:numId="16" w16cid:durableId="1878276933">
+    <w:abstractNumId w:val="21"/>
+  </w:num>
+  <w:num w:numId="17" w16cid:durableId="1925651546">
+    <w:abstractNumId w:val="16"/>
+  </w:num>
+  <w:num w:numId="18" w16cid:durableId="1629318432">
+    <w:abstractNumId w:val="3"/>
+  </w:num>
+  <w:num w:numId="19" w16cid:durableId="100034139">
+    <w:abstractNumId w:val="13"/>
+  </w:num>
+  <w:num w:numId="20" w16cid:durableId="1510371509">
+    <w:abstractNumId w:val="6"/>
+  </w:num>
+  <w:num w:numId="21" w16cid:durableId="1518696278">
+    <w:abstractNumId w:val="11"/>
+  </w:num>
+  <w:num w:numId="22" w16cid:durableId="1150554554">
     <w:abstractNumId w:val="9"/>
   </w:num>
-  <w:num w:numId="2" w16cid:durableId="1161702535">
-    <w:abstractNumId w:val="19"/>
-  </w:num>
-  <w:num w:numId="3" w16cid:durableId="278462607">
-    <w:abstractNumId w:val="18"/>
-  </w:num>
-  <w:num w:numId="4" w16cid:durableId="613749754">
-    <w:abstractNumId w:val="16"/>
-  </w:num>
-  <w:num w:numId="5" w16cid:durableId="1105156356">
+  <w:num w:numId="23" w16cid:durableId="260190137">
     <w:abstractNumId w:val="24"/>
   </w:num>
-  <w:num w:numId="6" w16cid:durableId="634412190">
-    <w:abstractNumId w:val="13"/>
+  <w:num w:numId="24" w16cid:durableId="174996968">
+    <w:abstractNumId w:val="8"/>
   </w:num>
-  <w:num w:numId="7" w16cid:durableId="1977828569">
-    <w:abstractNumId w:val="17"/>
-  </w:num>
-  <w:num w:numId="8" w16cid:durableId="368337943">
-    <w:abstractNumId w:val="21"/>
-  </w:num>
-  <w:num w:numId="9" w16cid:durableId="962729499">
-    <w:abstractNumId w:val="22"/>
-  </w:num>
-  <w:num w:numId="10" w16cid:durableId="1927571658">
-    <w:abstractNumId w:val="1"/>
-  </w:num>
-  <w:num w:numId="11" w16cid:durableId="1692994704">
+  <w:num w:numId="25" w16cid:durableId="490607554">
     <w:abstractNumId w:val="4"/>
   </w:num>
-  <w:num w:numId="12" w16cid:durableId="633755636">
-    <w:abstractNumId w:val="14"/>
-  </w:num>
-  <w:num w:numId="13" w16cid:durableId="978875567">
-    <w:abstractNumId w:val="6"/>
-  </w:num>
-  <w:num w:numId="14" w16cid:durableId="1002707692">
-    <w:abstractNumId w:val="11"/>
-  </w:num>
-  <w:num w:numId="15" w16cid:durableId="1257324613">
+  <w:num w:numId="26" w16cid:durableId="970669753">
     <w:abstractNumId w:val="0"/>
-  </w:num>
-  <w:num w:numId="16" w16cid:durableId="1878276933">
-    <w:abstractNumId w:val="20"/>
-  </w:num>
-  <w:num w:numId="17" w16cid:durableId="1925651546">
-    <w:abstractNumId w:val="15"/>
-  </w:num>
-  <w:num w:numId="18" w16cid:durableId="1629318432">
-    <w:abstractNumId w:val="2"/>
-  </w:num>
-  <w:num w:numId="19" w16cid:durableId="100034139">
-    <w:abstractNumId w:val="12"/>
-  </w:num>
-  <w:num w:numId="20" w16cid:durableId="1510371509">
-    <w:abstractNumId w:val="5"/>
-  </w:num>
-  <w:num w:numId="21" w16cid:durableId="1518696278">
-    <w:abstractNumId w:val="10"/>
-  </w:num>
-  <w:num w:numId="22" w16cid:durableId="1150554554">
-    <w:abstractNumId w:val="8"/>
-  </w:num>
-  <w:num w:numId="23" w16cid:durableId="260190137">
-    <w:abstractNumId w:val="23"/>
-  </w:num>
-  <w:num w:numId="24" w16cid:durableId="174996968">
-    <w:abstractNumId w:val="7"/>
-  </w:num>
-  <w:num w:numId="25" w16cid:durableId="490607554">
-    <w:abstractNumId w:val="3"/>
   </w:num>
 </w:numbering>
 </file>
@@ -8108,7 +10706,193 @@
       </w:tcPr>
     </w:tblStylePr>
   </w:style>
+  <w:style w:type="character" w:styleId="Mencinsinresolver">
+    <w:name w:val="Unresolved Mention"/>
+    <w:basedOn w:val="Fuentedeprrafopredeter"/>
+    <w:uiPriority w:val="99"/>
+    <w:semiHidden/>
+    <w:unhideWhenUsed/>
+    <w:rsid w:val="00E85D6B"/>
+    <w:rPr>
+      <w:color w:val="605E5C"/>
+      <w:shd w:val="clear" w:color="auto" w:fill="E1DFDD"/>
+    </w:rPr>
+  </w:style>
 </w:styles>
+</file>
+
+<file path=word/ink/ink1.xml><?xml version="1.0" encoding="utf-8"?>
+<inkml:ink xmlns:inkml="http://www.w3.org/2003/InkML">
+  <inkml:definitions>
+    <inkml:context xml:id="ctx0">
+      <inkml:inkSource xml:id="inkSrc0">
+        <inkml:traceFormat>
+          <inkml:channel name="X" type="integer" min="-2.14748E9" max="2.14748E9" units="cm"/>
+          <inkml:channel name="Y" type="integer" min="-2.14748E9" max="2.14748E9" units="cm"/>
+          <inkml:channel name="F" type="integer" max="32767" units="dev"/>
+        </inkml:traceFormat>
+        <inkml:channelProperties>
+          <inkml:channelProperty channel="X" name="resolution" value="1000" units="1/cm"/>
+          <inkml:channelProperty channel="Y" name="resolution" value="1000" units="1/cm"/>
+          <inkml:channelProperty channel="F" name="resolution" value="0" units="1/dev"/>
+        </inkml:channelProperties>
+      </inkml:inkSource>
+      <inkml:timestamp xml:id="ts0" timeString="2026-10-16T20:26:29.151"/>
+    </inkml:context>
+    <inkml:brush xml:id="br0">
+      <inkml:brushProperty name="width" value="0.35" units="cm"/>
+      <inkml:brushProperty name="height" value="0.35" units="cm"/>
+      <inkml:brushProperty name="color" value="#FF0066"/>
+    </inkml:brush>
+  </inkml:definitions>
+  <inkml:trace contextRef="#ctx0" brushRef="#br0">0 0 24575,'3'1'0,"0"0"0,0 0 0,-1 0 0,1 0 0,-1 1 0,1-1 0,0 1 0,-1-1 0,0 1 0,0 0 0,1 0 0,1 2 0,3 2 0,34 28 0,26 21 0,108 68 0,-51-45 0,-29-18 0,158 69 0,-199-104 0,-26-12 0,-8-4 0,31 18 0,58 32 0,-88-48 0,0 1 0,21 17 0,10 7 0,-34-25 0,-6-5 0,-1 1 0,-1 0 0,1 1 0,11 10 0,-6-6-1365</inkml:trace>
+  <inkml:trace contextRef="#ctx0" brushRef="#br0" timeOffset="2385.83">53 892 24575,'4'0'0,"0"-1"0,0 0 0,-1 0 0,1 0 0,-1 0 0,1-1 0,4-2 0,4-1 0,1-1 0,17-11 0,-19 11 0,-1 0 0,16-5 0,-16 6 0,1 0 0,-1-1 0,0 0 0,-1-1 0,17-14 0,18-12 0,-20 16 0,-1-1 0,28-28 0,13-10 0,5-3 0,-53 46 0,22-23 0,-19 17 0,-15 15 0,1 1 0,-1 0 0,1 1 0,0-1 0,-1 1 0,1 0 0,0 0 0,10-3 0,11-3 0,72-37 0,-63 25 0,-27 14 0,1 1 0,0 0 0,15-6 0,5 0 0,-2-2 0,37-21 0,5-3 0,-58 31 0,0-1 0,-1 0 0,1-1 0,13-13 0,-5 5 0,-16 13 0,73-64 0,-62 55 0,1 0 0,28-17 0,-24 20 0,-16 8 0,0 0 0,-1 0 0,1 0 0,0-1 0,-1 1 0,1-1 0,-1 0 0,1 1 0,1-4 0,3-2-1365</inkml:trace>
+</inkml:ink>
+</file>
+
+<file path=word/ink/ink2.xml><?xml version="1.0" encoding="utf-8"?>
+<inkml:ink xmlns:inkml="http://www.w3.org/2003/InkML">
+  <inkml:definitions>
+    <inkml:context xml:id="ctx0">
+      <inkml:inkSource xml:id="inkSrc0">
+        <inkml:traceFormat>
+          <inkml:channel name="X" type="integer" min="-2.14748E9" max="2.14748E9" units="cm"/>
+          <inkml:channel name="Y" type="integer" min="-2.14748E9" max="2.14748E9" units="cm"/>
+          <inkml:channel name="F" type="integer" max="32767" units="dev"/>
+        </inkml:traceFormat>
+        <inkml:channelProperties>
+          <inkml:channelProperty channel="X" name="resolution" value="1000" units="1/cm"/>
+          <inkml:channelProperty channel="Y" name="resolution" value="1000" units="1/cm"/>
+          <inkml:channelProperty channel="F" name="resolution" value="0" units="1/dev"/>
+        </inkml:channelProperties>
+      </inkml:inkSource>
+      <inkml:timestamp xml:id="ts0" timeString="2026-10-16T20:29:11.677"/>
+    </inkml:context>
+    <inkml:brush xml:id="br0">
+      <inkml:brushProperty name="width" value="0.35" units="cm"/>
+      <inkml:brushProperty name="height" value="0.35" units="cm"/>
+      <inkml:brushProperty name="color" value="#FF0066"/>
+    </inkml:brush>
+  </inkml:definitions>
+  <inkml:trace contextRef="#ctx0" brushRef="#br0">0 1 24575,'3'1'0,"1"1"0,-1 0 0,0 0 0,0 0 0,0 0 0,0 1 0,0 0 0,-1 0 0,1 0 0,0 1 0,-1-1 0,3 6 0,3 2 0,40 51 0,28 40 0,126 126 0,-60-84 0,-33-31 0,182 126 0,-229-192 0,-29-23 0,-11-9 0,37 35 0,67 60 0,-102-89 0,-1 2 0,25 31 0,13 12 0,-40-46 0,-8-9 0,-1 2 0,1 0 0,-1 1 0,13 21 0,-7-13-1365</inkml:trace>
+  <inkml:trace contextRef="#ctx0" brushRef="#br0" timeOffset="1">61 1656 24575,'5'-1'0,"-1"0"0,0-1 0,0 0 0,1 0 0,-1-1 0,0 1 0,5-6 0,5-2 0,0-1 0,21-20 0,-23 20 0,1 0 0,16-11 0,-17 13 0,0 0 0,0-2 0,-1 0 0,0-1 0,18-27 0,22-22 0,-23 29 0,-1-2 0,31-50 0,16-22 0,5-3 0,-61 85 0,25-42 0,-20 29 0,-19 31 0,1 0 0,1 1 0,-1 0 0,1 0 0,-1 1 0,1 0 0,0 1 0,11-5 0,12-8 0,83-67 0,-71 45 0,-31 28 0,0 0 0,0 1 0,18-11 0,4-1 0,0-2 0,42-41 0,5-5 0,-67 57 0,1 0 0,-1-1 0,0-1 0,16-25 0,-7 8 0,-17 27 0,83-121 0,-70 102 0,-1 2 0,34-33 0,-28 37 0,-19 15 0,1 0 0,-1 0 0,0 0 0,0-1 0,0 0 0,0 0 0,-1 0 0,1 0 0,3-5 0,2-6-1365</inkml:trace>
+</inkml:ink>
+</file>
+
+<file path=word/ink/ink3.xml><?xml version="1.0" encoding="utf-8"?>
+<inkml:ink xmlns:inkml="http://www.w3.org/2003/InkML">
+  <inkml:definitions>
+    <inkml:context xml:id="ctx0">
+      <inkml:inkSource xml:id="inkSrc0">
+        <inkml:traceFormat>
+          <inkml:channel name="X" type="integer" min="-2.14748E9" max="2.14748E9" units="cm"/>
+          <inkml:channel name="Y" type="integer" min="-2.14748E9" max="2.14748E9" units="cm"/>
+          <inkml:channel name="F" type="integer" max="32767" units="dev"/>
+        </inkml:traceFormat>
+        <inkml:channelProperties>
+          <inkml:channelProperty channel="X" name="resolution" value="1000" units="1/cm"/>
+          <inkml:channelProperty channel="Y" name="resolution" value="1000" units="1/cm"/>
+          <inkml:channelProperty channel="F" name="resolution" value="0" units="1/dev"/>
+        </inkml:channelProperties>
+      </inkml:inkSource>
+      <inkml:timestamp xml:id="ts0" timeString="2026-10-16T20:29:18.617"/>
+    </inkml:context>
+    <inkml:brush xml:id="br0">
+      <inkml:brushProperty name="width" value="0.35" units="cm"/>
+      <inkml:brushProperty name="height" value="0.35" units="cm"/>
+      <inkml:brushProperty name="color" value="#FF0066"/>
+    </inkml:brush>
+  </inkml:definitions>
+  <inkml:trace contextRef="#ctx0" brushRef="#br0">0 0 24575,'3'1'0,"0"0"0,0 0 0,-1 0 0,1 0 0,-1 1 0,1-1 0,0 1 0,-1-1 0,0 1 0,0 0 0,1 0 0,1 2 0,3 2 0,34 28 0,26 21 0,108 67 0,-51-44 0,-29-17 0,158 67 0,-199-103 0,-26-12 0,-8-4 0,31 18 0,58 32 0,-88-48 0,0 1 0,21 17 0,10 7 0,-34-26 0,-6-3 0,-1-1 0,-1 1 0,1 1 0,11 11 0,-6-7-1365</inkml:trace>
+  <inkml:trace contextRef="#ctx0" brushRef="#br0" timeOffset="1">53 891 24575,'4'-1'0,"0"0"0,0 1 0,-1-1 0,1-1 0,-1 1 0,1 0 0,4-4 0,4 0 0,1-1 0,17-10 0,-19 9 0,-1 2 0,16-7 0,-16 7 0,1 0 0,-1-1 0,0 0 0,-1 0 0,17-15 0,18-12 0,-20 16 0,-1-1 0,28-28 0,13-10 0,5-3 0,-53 46 0,22-23 0,-19 17 0,-15 15 0,1 1 0,-1 0 0,1 1 0,0-1 0,-1 1 0,1 0 0,0 0 0,10-2 0,11-5 0,72-36 0,-63 25 0,-27 14 0,1 1 0,0 0 0,15-5 0,5-2 0,-2 0 0,37-23 0,5-2 0,-58 31 0,0-1 0,-1 0 0,1 0 0,13-14 0,-5 5 0,-16 13 0,73-64 0,-62 55 0,1 0 0,28-17 0,-24 20 0,-16 8 0,0 0 0,-1 0 0,1 0 0,0-1 0,-1 1 0,1-1 0,-1 0 0,1 1 0,1-4 0,3-2-1365</inkml:trace>
+</inkml:ink>
+</file>
+
+<file path=word/ink/ink4.xml><?xml version="1.0" encoding="utf-8"?>
+<inkml:ink xmlns:inkml="http://www.w3.org/2003/InkML">
+  <inkml:definitions>
+    <inkml:context xml:id="ctx0">
+      <inkml:inkSource xml:id="inkSrc0">
+        <inkml:traceFormat>
+          <inkml:channel name="X" type="integer" min="-2.14748E9" max="2.14748E9" units="cm"/>
+          <inkml:channel name="Y" type="integer" min="-2.14748E9" max="2.14748E9" units="cm"/>
+          <inkml:channel name="F" type="integer" max="32767" units="dev"/>
+        </inkml:traceFormat>
+        <inkml:channelProperties>
+          <inkml:channelProperty channel="X" name="resolution" value="1000" units="1/cm"/>
+          <inkml:channelProperty channel="Y" name="resolution" value="1000" units="1/cm"/>
+          <inkml:channelProperty channel="F" name="resolution" value="0" units="1/dev"/>
+        </inkml:channelProperties>
+      </inkml:inkSource>
+      <inkml:timestamp xml:id="ts0" timeString="2026-10-16T20:29:20.946"/>
+    </inkml:context>
+    <inkml:brush xml:id="br0">
+      <inkml:brushProperty name="width" value="0.35" units="cm"/>
+      <inkml:brushProperty name="height" value="0.35" units="cm"/>
+      <inkml:brushProperty name="color" value="#FF0066"/>
+    </inkml:brush>
+  </inkml:definitions>
+  <inkml:trace contextRef="#ctx0" brushRef="#br0">0 0 24575,'3'1'0,"0"0"0,0 0 0,-1 0 0,1 0 0,-1 1 0,1-1 0,0 1 0,-1 0 0,0-1 0,0 1 0,1 0 0,1 3 0,3 1 0,34 28 0,26 22 0,108 70 0,-51-47 0,-29-16 0,158 68 0,-199-105 0,-26-13 0,-8-4 0,31 18 0,58 34 0,-88-50 0,0 2 0,21 16 0,10 8 0,-34-26 0,-6-5 0,-1 1 0,-1 0 0,1 1 0,11 11 0,-6-6-1365</inkml:trace>
+  <inkml:trace contextRef="#ctx0" brushRef="#br0" timeOffset="1">53 912 24575,'4'-1'0,"0"1"0,0-1 0,-1 0 0,1 0 0,-1-1 0,1 1 0,4-4 0,4 0 0,1-1 0,17-11 0,-19 11 0,-1 0 0,16-6 0,-16 7 0,1-1 0,-1 1 0,0-2 0,-1 1 0,17-16 0,18-11 0,-20 15 0,-1 0 0,28-29 0,13-11 0,5-2 0,-53 47 0,22-24 0,-19 17 0,-15 17 0,1 0 0,-1 0 0,1 0 0,0 0 0,-1 1 0,1 0 0,0 0 0,10-3 0,11-3 0,72-38 0,-63 25 0,-27 15 0,1 1 0,0 0 0,15-6 0,5-1 0,-2 0 0,37-24 0,5-1 0,-58 30 0,0 0 0,-1 0 0,1-1 0,13-13 0,-5 4 0,-16 15 0,73-67 0,-62 57 0,1 0 0,28-18 0,-24 21 0,-16 8 0,0 0 0,-1-1 0,1 1 0,0 0 0,-1-1 0,1 0 0,-1 1 0,1-1 0,1-3 0,3-2-1365</inkml:trace>
+</inkml:ink>
+</file>
+
+<file path=word/ink/ink5.xml><?xml version="1.0" encoding="utf-8"?>
+<inkml:ink xmlns:inkml="http://www.w3.org/2003/InkML">
+  <inkml:definitions>
+    <inkml:context xml:id="ctx0">
+      <inkml:inkSource xml:id="inkSrc0">
+        <inkml:traceFormat>
+          <inkml:channel name="X" type="integer" min="-2.14748E9" max="2.14748E9" units="cm"/>
+          <inkml:channel name="Y" type="integer" min="-2.14748E9" max="2.14748E9" units="cm"/>
+          <inkml:channel name="F" type="integer" max="32767" units="dev"/>
+        </inkml:traceFormat>
+        <inkml:channelProperties>
+          <inkml:channelProperty channel="X" name="resolution" value="1000" units="1/cm"/>
+          <inkml:channelProperty channel="Y" name="resolution" value="1000" units="1/cm"/>
+          <inkml:channelProperty channel="F" name="resolution" value="0" units="1/dev"/>
+        </inkml:channelProperties>
+      </inkml:inkSource>
+      <inkml:timestamp xml:id="ts0" timeString="2026-10-16T20:32:02.891"/>
+    </inkml:context>
+    <inkml:brush xml:id="br0">
+      <inkml:brushProperty name="width" value="0.35" units="cm"/>
+      <inkml:brushProperty name="height" value="0.35" units="cm"/>
+      <inkml:brushProperty name="color" value="#FF0066"/>
+    </inkml:brush>
+  </inkml:definitions>
+  <inkml:trace contextRef="#ctx0" brushRef="#br0">0 0 24575,'3'1'0,"0"0"0,0 0 0,-1 0 0,1 0 0,-1 1 0,1-1 0,0 1 0,-1-1 0,0 1 0,0 0 0,1 0 0,1 2 0,3 2 0,34 28 0,26 21 0,108 67 0,-51-44 0,-29-17 0,158 67 0,-199-103 0,-26-12 0,-8-4 0,31 18 0,58 32 0,-88-48 0,0 1 0,21 17 0,10 7 0,-34-26 0,-6-3 0,-1-1 0,-1 1 0,1 1 0,11 11 0,-6-7-1365</inkml:trace>
+  <inkml:trace contextRef="#ctx0" brushRef="#br0" timeOffset="1">53 891 24575,'4'-1'0,"0"0"0,0 1 0,-1-1 0,1-1 0,-1 1 0,1 0 0,4-4 0,4 0 0,1-1 0,17-10 0,-19 9 0,-1 2 0,16-7 0,-16 7 0,1 0 0,-1-1 0,0 0 0,-1 0 0,17-15 0,18-12 0,-20 16 0,-1-1 0,28-28 0,13-10 0,5-3 0,-53 46 0,22-23 0,-19 17 0,-15 15 0,1 1 0,-1 0 0,1 1 0,0-1 0,-1 1 0,1 0 0,0 0 0,10-2 0,11-5 0,72-36 0,-63 25 0,-27 14 0,1 1 0,0 0 0,15-5 0,5-2 0,-2 0 0,37-23 0,5-2 0,-58 31 0,0-1 0,-1 0 0,1 0 0,13-14 0,-5 5 0,-16 13 0,73-64 0,-62 55 0,1 0 0,28-17 0,-24 20 0,-16 8 0,0 0 0,-1 0 0,1 0 0,0-1 0,-1 1 0,1-1 0,-1 0 0,1 1 0,1-4 0,3-2-1365</inkml:trace>
+</inkml:ink>
+</file>
+
+<file path=word/ink/ink6.xml><?xml version="1.0" encoding="utf-8"?>
+<inkml:ink xmlns:inkml="http://www.w3.org/2003/InkML">
+  <inkml:definitions>
+    <inkml:context xml:id="ctx0">
+      <inkml:inkSource xml:id="inkSrc0">
+        <inkml:traceFormat>
+          <inkml:channel name="X" type="integer" min="-2.14748E9" max="2.14748E9" units="cm"/>
+          <inkml:channel name="Y" type="integer" min="-2.14748E9" max="2.14748E9" units="cm"/>
+          <inkml:channel name="F" type="integer" max="32767" units="dev"/>
+        </inkml:traceFormat>
+        <inkml:channelProperties>
+          <inkml:channelProperty channel="X" name="resolution" value="1000" units="1/cm"/>
+          <inkml:channelProperty channel="Y" name="resolution" value="1000" units="1/cm"/>
+          <inkml:channelProperty channel="F" name="resolution" value="0" units="1/dev"/>
+        </inkml:channelProperties>
+      </inkml:inkSource>
+      <inkml:timestamp xml:id="ts0" timeString="2026-10-16T20:31:57.996"/>
+    </inkml:context>
+    <inkml:brush xml:id="br0">
+      <inkml:brushProperty name="width" value="0.35" units="cm"/>
+      <inkml:brushProperty name="height" value="0.35" units="cm"/>
+      <inkml:brushProperty name="color" value="#FF0066"/>
+    </inkml:brush>
+  </inkml:definitions>
+  <inkml:trace contextRef="#ctx0" brushRef="#br0">0 0 24575,'3'1'0,"0"0"0,0 0 0,-1 0 0,1 0 0,-1 1 0,1-1 0,0 1 0,-1-1 0,0 1 0,0 0 0,1 0 0,1 2 0,3 2 0,34 28 0,26 21 0,108 67 0,-51-44 0,-29-17 0,158 67 0,-199-103 0,-26-12 0,-8-4 0,31 18 0,58 32 0,-88-48 0,0 1 0,21 17 0,10 7 0,-34-26 0,-6-3 0,-1-1 0,-1 1 0,1 1 0,11 11 0,-6-7-1365</inkml:trace>
+  <inkml:trace contextRef="#ctx0" brushRef="#br0" timeOffset="1">53 891 24575,'4'-1'0,"0"0"0,0 1 0,-1-1 0,1-1 0,-1 1 0,1 0 0,4-4 0,4 0 0,1-1 0,17-10 0,-19 9 0,-1 2 0,16-7 0,-16 7 0,1 0 0,-1-1 0,0 0 0,-1 0 0,17-15 0,18-12 0,-20 16 0,-1-1 0,28-28 0,13-10 0,5-3 0,-53 46 0,22-23 0,-19 17 0,-15 15 0,1 1 0,-1 0 0,1 1 0,0-1 0,-1 1 0,1 0 0,0 0 0,10-2 0,11-5 0,72-36 0,-63 25 0,-27 14 0,1 1 0,0 0 0,15-5 0,5-2 0,-2 0 0,37-23 0,5-2 0,-58 31 0,0-1 0,-1 0 0,1 0 0,13-14 0,-5 5 0,-16 13 0,73-64 0,-62 55 0,1 0 0,28-17 0,-24 20 0,-16 8 0,0 0 0,-1 0 0,1 0 0,0-1 0,-1 1 0,1-1 0,-1 0 0,1 1 0,1-4 0,3-2-1365</inkml:trace>
+</inkml:ink>
 </file>
 
 <file path=word/theme/theme1.xml><?xml version="1.0" encoding="utf-8"?>

</xml_diff>

<commit_message>
Se modifico el enlace del drive del los diagramas
</commit_message>
<xml_diff>
--- a/Actividad_1_Pilay_Tyrone.docx
+++ b/Actividad_1_Pilay_Tyrone.docx
@@ -663,7 +663,7 @@
             <w:noProof/>
             <w:lang w:val="es-ES_tradnl" w:eastAsia="es-EC"/>
           </w:rPr>
-          <w:t>https://drive.google.com/file/d/1e5I_FJ8YafKvK65TfSiShO_EMXvFAYyx/view?usp=sharing</w:t>
+          <w:t>https://drive.google.com/drive/folders/1__9rE8Ni4OaFT7t66o3H5UwzHL0lwFOe?usp=sharing</w:t>
         </w:r>
       </w:hyperlink>
     </w:p>
@@ -1195,27 +1195,7 @@
           <w:szCs w:val="20"/>
           <w:lang w:eastAsia="es-EC"/>
         </w:rPr>
-        <w:t xml:space="preserve">Utilice el flujo de trabajo </w:t>
-      </w:r>
-      <w:proofErr w:type="spellStart"/>
-      <w:r>
-        <w:rPr>
-          <w:rFonts w:ascii="Arial" w:hAnsi="Arial" w:cs="Arial"/>
-          <w:sz w:val="20"/>
-          <w:szCs w:val="20"/>
-          <w:lang w:eastAsia="es-EC"/>
-        </w:rPr>
-        <w:t>Gitflow</w:t>
-      </w:r>
-      <w:proofErr w:type="spellEnd"/>
-      <w:r>
-        <w:rPr>
-          <w:rFonts w:ascii="Arial" w:hAnsi="Arial" w:cs="Arial"/>
-          <w:sz w:val="20"/>
-          <w:szCs w:val="20"/>
-          <w:lang w:eastAsia="es-EC"/>
-        </w:rPr>
-        <w:t xml:space="preserve"> para el registro de avances del diseño en un repositorio de GitHub.</w:t>
+        <w:t>Utilice el flujo de trabajo Gitflow para el registro de avances del diseño en un repositorio de GitHub.</w:t>
       </w:r>
     </w:p>
     <w:p>
@@ -1385,23 +1365,7 @@
           <w:rFonts w:ascii="Arial" w:hAnsi="Arial" w:cs="Arial"/>
           <w:lang w:eastAsia="es-EC"/>
         </w:rPr>
-        <w:t xml:space="preserve">Ciudadano o </w:t>
-      </w:r>
-      <w:proofErr w:type="spellStart"/>
-      <w:r>
-        <w:rPr>
-          <w:rFonts w:ascii="Arial" w:hAnsi="Arial" w:cs="Arial"/>
-          <w:lang w:eastAsia="es-EC"/>
-        </w:rPr>
-        <w:t>reportante</w:t>
-      </w:r>
-      <w:proofErr w:type="spellEnd"/>
-      <w:r>
-        <w:rPr>
-          <w:rFonts w:ascii="Arial" w:hAnsi="Arial" w:cs="Arial"/>
-          <w:lang w:eastAsia="es-EC"/>
-        </w:rPr>
-        <w:t>: se encarga de registrar los casos de rescate y de brindar la información inicial del animal.</w:t>
+        <w:t>Ciudadano o reportante: se encarga de registrar los casos de rescate y de brindar la información inicial del animal.</w:t>
       </w:r>
     </w:p>
     <w:p>
@@ -1993,23 +1957,7 @@
           <w:rFonts w:ascii="Arial" w:hAnsi="Arial" w:cs="Arial"/>
           <w:lang w:eastAsia="es-EC"/>
         </w:rPr>
-        <w:t xml:space="preserve">El diagrama de casos de uso muestra las funciones principales del Sistema de Control de Rescate y Adopción Animal, así como la forma en que los distintos actores interactúan con él. En total, se identifican tres actores clave: el Ciudadano o </w:t>
-      </w:r>
-      <w:proofErr w:type="spellStart"/>
-      <w:r>
-        <w:rPr>
-          <w:rFonts w:ascii="Arial" w:hAnsi="Arial" w:cs="Arial"/>
-          <w:lang w:eastAsia="es-EC"/>
-        </w:rPr>
-        <w:t>Reportante</w:t>
-      </w:r>
-      <w:proofErr w:type="spellEnd"/>
-      <w:r>
-        <w:rPr>
-          <w:rFonts w:ascii="Arial" w:hAnsi="Arial" w:cs="Arial"/>
-          <w:lang w:eastAsia="es-EC"/>
-        </w:rPr>
-        <w:t xml:space="preserve">, el Voluntario o Veterinario y el Administrador del Refugio. Cada uno cumple un rol distinto dentro del proceso de rescate y seguimiento de los animales. </w:t>
+        <w:t xml:space="preserve">El diagrama de casos de uso muestra las funciones principales del Sistema de Control de Rescate y Adopción Animal, así como la forma en que los distintos actores interactúan con él. En total, se identifican tres actores clave: el Ciudadano o Reportante, el Voluntario o Veterinario y el Administrador del Refugio. Cada uno cumple un rol distinto dentro del proceso de rescate y seguimiento de los animales. </w:t>
       </w:r>
       <w:r>
         <w:rPr>
@@ -2128,11 +2076,9 @@
                 <w:lang w:eastAsia="es-EC"/>
               </w:rPr>
             </w:pPr>
-            <w:proofErr w:type="spellStart"/>
             <w:r>
               <w:t>CasoRescate</w:t>
             </w:r>
-            <w:proofErr w:type="spellEnd"/>
           </w:p>
         </w:tc>
         <w:tc>
@@ -2206,13 +2152,8 @@
               </w:rPr>
             </w:pPr>
             <w:r>
-              <w:t xml:space="preserve">Perro, Gato, </w:t>
+              <w:t>Perro, Gato, FaunaSilvestre</w:t>
             </w:r>
-            <w:proofErr w:type="spellStart"/>
-            <w:r>
-              <w:t>FaunaSilvestre</w:t>
-            </w:r>
-            <w:proofErr w:type="spellEnd"/>
           </w:p>
         </w:tc>
         <w:tc>
@@ -2425,11 +2366,9 @@
                 <w:lang w:eastAsia="es-EC"/>
               </w:rPr>
             </w:pPr>
-            <w:proofErr w:type="spellStart"/>
             <w:r>
               <w:t>GestorCasos</w:t>
             </w:r>
-            <w:proofErr w:type="spellEnd"/>
           </w:p>
         </w:tc>
         <w:tc>
@@ -2502,11 +2441,9 @@
                 <w:lang w:eastAsia="es-EC"/>
               </w:rPr>
             </w:pPr>
-            <w:proofErr w:type="spellStart"/>
             <w:r>
               <w:t>AnimalFactory</w:t>
             </w:r>
-            <w:proofErr w:type="spellEnd"/>
           </w:p>
         </w:tc>
         <w:tc>
@@ -2671,7 +2608,7 @@
           </mc:Choice>
           <mc:Fallback>
             <w:pict>
-              <v:shape w14:anchorId="5E6D5B65" id="Entrada de lápiz 25" o:spid="_x0000_s1026" type="#_x0000_t75" style="position:absolute;margin-left:239.95pt;margin-top:143.85pt;width:48.25pt;height:35.1pt;z-index:251697152;visibility:visible;mso-wrap-style:square;mso-width-percent:0;mso-height-percent:0;mso-wrap-distance-left:9pt;mso-wrap-distance-top:0;mso-wrap-distance-right:9pt;mso-wrap-distance-bottom:0;mso-position-horizontal:absolute;mso-position-horizontal-relative:text;mso-position-vertical:absolute;mso-position-vertical-relative:text;mso-width-percent:0;mso-height-percent:0;mso-width-relative:margin;mso-height-relative:margin" o:gfxdata="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">
+              <v:shape w14:anchorId="3E043548" id="Entrada de lápiz 25" o:spid="_x0000_s1026" type="#_x0000_t75" style="position:absolute;margin-left:239.95pt;margin-top:143.85pt;width:48.25pt;height:35.1pt;z-index:251697152;visibility:visible;mso-wrap-style:square;mso-width-percent:0;mso-height-percent:0;mso-wrap-distance-left:9pt;mso-wrap-distance-top:0;mso-wrap-distance-right:9pt;mso-wrap-distance-bottom:0;mso-position-horizontal:absolute;mso-position-horizontal-relative:text;mso-position-vertical:absolute;mso-position-vertical-relative:text;mso-width-percent:0;mso-height-percent:0;mso-width-relative:margin;mso-height-relative:margin" o:gfxdata="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">
                 <v:imagedata r:id="rId19" o:title=""/>
               </v:shape>
             </w:pict>
@@ -2733,48 +2670,21 @@
           </wp:anchor>
         </w:drawing>
       </w:r>
-      <w:proofErr w:type="spellStart"/>
-      <w:r>
-        <w:rPr>
-          <w:rFonts w:ascii="Arial" w:hAnsi="Arial" w:cs="Arial"/>
-          <w:b/>
-          <w:bCs/>
-          <w:lang w:eastAsia="es-EC"/>
-        </w:rPr>
-        <w:t>Singleton</w:t>
-      </w:r>
-      <w:proofErr w:type="spellEnd"/>
-      <w:r>
-        <w:rPr>
-          <w:rFonts w:ascii="Arial" w:hAnsi="Arial" w:cs="Arial"/>
-          <w:b/>
-          <w:bCs/>
-          <w:lang w:eastAsia="es-EC"/>
-        </w:rPr>
-        <w:t>:</w:t>
-      </w:r>
-      <w:r>
-        <w:rPr>
-          <w:rFonts w:ascii="Arial" w:hAnsi="Arial" w:cs="Arial"/>
-          <w:lang w:eastAsia="es-EC"/>
-        </w:rPr>
-        <w:t xml:space="preserve"> se aplica en la clase </w:t>
-      </w:r>
-      <w:proofErr w:type="spellStart"/>
-      <w:r>
-        <w:rPr>
-          <w:rFonts w:ascii="Arial" w:hAnsi="Arial" w:cs="Arial"/>
-          <w:lang w:eastAsia="es-EC"/>
-        </w:rPr>
-        <w:t>GestorCasos</w:t>
-      </w:r>
-      <w:proofErr w:type="spellEnd"/>
-      <w:r>
-        <w:rPr>
-          <w:rFonts w:ascii="Arial" w:hAnsi="Arial" w:cs="Arial"/>
-          <w:lang w:eastAsia="es-EC"/>
-        </w:rPr>
-        <w:t>, que centraliza la gestión de los casos de rescate y asegura que solo exista una instancia del gestor.</w:t>
+      <w:r>
+        <w:rPr>
+          <w:rFonts w:ascii="Arial" w:hAnsi="Arial" w:cs="Arial"/>
+          <w:b/>
+          <w:bCs/>
+          <w:lang w:eastAsia="es-EC"/>
+        </w:rPr>
+        <w:t>Singleton:</w:t>
+      </w:r>
+      <w:r>
+        <w:rPr>
+          <w:rFonts w:ascii="Arial" w:hAnsi="Arial" w:cs="Arial"/>
+          <w:lang w:eastAsia="es-EC"/>
+        </w:rPr>
+        <w:t xml:space="preserve"> se aplica en la clase GestorCasos, que centraliza la gestión de los casos de rescate y asegura que solo exista una instancia del gestor.</w:t>
       </w:r>
       <w:r>
         <w:rPr>
@@ -2837,7 +2747,7 @@
           </mc:Choice>
           <mc:Fallback>
             <w:pict>
-              <v:shape w14:anchorId="3E18B226" id="Entrada de lápiz 27" o:spid="_x0000_s1026" type="#_x0000_t75" style="position:absolute;margin-left:139.95pt;margin-top:326.65pt;width:54pt;height:55.1pt;z-index:251701248;visibility:visible;mso-wrap-style:square;mso-width-percent:0;mso-height-percent:0;mso-wrap-distance-left:9pt;mso-wrap-distance-top:0;mso-wrap-distance-right:9pt;mso-wrap-distance-bottom:0;mso-position-horizontal:absolute;mso-position-horizontal-relative:text;mso-position-vertical:absolute;mso-position-vertical-relative:text;mso-width-percent:0;mso-height-percent:0;mso-width-relative:margin;mso-height-relative:margin" o:gfxdata="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">
+              <v:shape w14:anchorId="2F322555" id="Entrada de lápiz 27" o:spid="_x0000_s1026" type="#_x0000_t75" style="position:absolute;margin-left:139.95pt;margin-top:326.65pt;width:54pt;height:55.1pt;z-index:251701248;visibility:visible;mso-wrap-style:square;mso-width-percent:0;mso-height-percent:0;mso-wrap-distance-left:9pt;mso-wrap-distance-top:0;mso-wrap-distance-right:9pt;mso-wrap-distance-bottom:0;mso-position-horizontal:absolute;mso-position-horizontal-relative:text;mso-position-vertical:absolute;mso-position-vertical-relative:text;mso-width-percent:0;mso-height-percent:0;mso-width-relative:margin;mso-height-relative:margin" o:gfxdata="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">
                 <v:imagedata r:id="rId22" o:title=""/>
               </v:shape>
             </w:pict>
@@ -2890,7 +2800,7 @@
           </mc:Choice>
           <mc:Fallback>
             <w:pict>
-              <v:shape w14:anchorId="0683163C" id="Entrada de lápiz 28" o:spid="_x0000_s1026" type="#_x0000_t75" style="position:absolute;margin-left:139.95pt;margin-top:436.55pt;width:48.25pt;height:35pt;z-index:251703296;visibility:visible;mso-wrap-style:square;mso-width-percent:0;mso-height-percent:0;mso-wrap-distance-left:9pt;mso-wrap-distance-top:0;mso-wrap-distance-right:9pt;mso-wrap-distance-bottom:0;mso-position-horizontal:absolute;mso-position-horizontal-relative:text;mso-position-vertical:absolute;mso-position-vertical-relative:text;mso-width-percent:0;mso-height-percent:0;mso-width-relative:margin;mso-height-relative:margin" o:gfxdata="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">
+              <v:shape w14:anchorId="17065D40" id="Entrada de lápiz 28" o:spid="_x0000_s1026" type="#_x0000_t75" style="position:absolute;margin-left:139.95pt;margin-top:436.55pt;width:48.25pt;height:35pt;z-index:251703296;visibility:visible;mso-wrap-style:square;mso-width-percent:0;mso-height-percent:0;mso-wrap-distance-left:9pt;mso-wrap-distance-top:0;mso-wrap-distance-right:9pt;mso-wrap-distance-bottom:0;mso-position-horizontal:absolute;mso-position-horizontal-relative:text;mso-position-vertical:absolute;mso-position-vertical-relative:text;mso-width-percent:0;mso-height-percent:0;mso-width-relative:margin;mso-height-relative:margin" o:gfxdata="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">
                 <v:imagedata r:id="rId24" o:title=""/>
               </v:shape>
             </w:pict>
@@ -2943,7 +2853,7 @@
           </mc:Choice>
           <mc:Fallback>
             <w:pict>
-              <v:shape w14:anchorId="110BA67C" id="Entrada de lápiz 29" o:spid="_x0000_s1026" type="#_x0000_t75" style="position:absolute;margin-left:139.95pt;margin-top:541.85pt;width:48.25pt;height:34.9pt;z-index:251705344;visibility:visible;mso-wrap-style:square;mso-width-percent:0;mso-height-percent:0;mso-wrap-distance-left:9pt;mso-wrap-distance-top:0;mso-wrap-distance-right:9pt;mso-wrap-distance-bottom:0;mso-position-horizontal:absolute;mso-position-horizontal-relative:text;mso-position-vertical:absolute;mso-position-vertical-relative:text;mso-width-percent:0;mso-height-percent:0;mso-width-relative:margin;mso-height-relative:margin" o:gfxdata="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">
+              <v:shape w14:anchorId="2B4AA5A8" id="Entrada de lápiz 29" o:spid="_x0000_s1026" type="#_x0000_t75" style="position:absolute;margin-left:139.95pt;margin-top:541.85pt;width:48.25pt;height:34.9pt;z-index:251705344;visibility:visible;mso-wrap-style:square;mso-width-percent:0;mso-height-percent:0;mso-wrap-distance-left:9pt;mso-wrap-distance-top:0;mso-wrap-distance-right:9pt;mso-wrap-distance-bottom:0;mso-position-horizontal:absolute;mso-position-horizontal-relative:text;mso-position-vertical:absolute;mso-position-vertical-relative:text;mso-width-percent:0;mso-height-percent:0;mso-width-relative:margin;mso-height-relative:margin" o:gfxdata="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">
                 <v:imagedata r:id="rId26" o:title=""/>
               </v:shape>
             </w:pict>
@@ -3005,25 +2915,14 @@
           </wp:anchor>
         </w:drawing>
       </w:r>
-      <w:proofErr w:type="spellStart"/>
-      <w:r>
-        <w:rPr>
-          <w:rFonts w:ascii="Arial" w:hAnsi="Arial" w:cs="Arial"/>
-          <w:b/>
-          <w:bCs/>
-          <w:lang w:eastAsia="es-EC"/>
-        </w:rPr>
-        <w:t>Observer</w:t>
-      </w:r>
-      <w:proofErr w:type="spellEnd"/>
-      <w:r>
-        <w:rPr>
-          <w:rFonts w:ascii="Arial" w:hAnsi="Arial" w:cs="Arial"/>
-          <w:b/>
-          <w:bCs/>
-          <w:lang w:eastAsia="es-EC"/>
-        </w:rPr>
-        <w:t>:</w:t>
+      <w:r>
+        <w:rPr>
+          <w:rFonts w:ascii="Arial" w:hAnsi="Arial" w:cs="Arial"/>
+          <w:b/>
+          <w:bCs/>
+          <w:lang w:eastAsia="es-EC"/>
+        </w:rPr>
+        <w:t>Observer:</w:t>
       </w:r>
       <w:r>
         <w:rPr>
@@ -3113,7 +3012,7 @@
           </mc:Choice>
           <mc:Fallback>
             <w:pict>
-              <v:shape w14:anchorId="2EAA04DB" id="Entrada de lápiz 32" o:spid="_x0000_s1026" type="#_x0000_t75" style="position:absolute;margin-left:296.8pt;margin-top:274.6pt;width:48.25pt;height:35pt;z-index:251711488;visibility:visible;mso-wrap-style:square;mso-width-percent:0;mso-height-percent:0;mso-wrap-distance-left:9pt;mso-wrap-distance-top:0;mso-wrap-distance-right:9pt;mso-wrap-distance-bottom:0;mso-position-horizontal:absolute;mso-position-horizontal-relative:text;mso-position-vertical:absolute;mso-position-vertical-relative:text;mso-width-percent:0;mso-height-percent:0;mso-width-relative:margin;mso-height-relative:margin" o:gfxdata="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">
+              <v:shape w14:anchorId="2E9238F4" id="Entrada de lápiz 32" o:spid="_x0000_s1026" type="#_x0000_t75" style="position:absolute;margin-left:296.8pt;margin-top:274.6pt;width:48.25pt;height:35pt;z-index:251711488;visibility:visible;mso-wrap-style:square;mso-width-percent:0;mso-height-percent:0;mso-wrap-distance-left:9pt;mso-wrap-distance-top:0;mso-wrap-distance-right:9pt;mso-wrap-distance-bottom:0;mso-position-horizontal:absolute;mso-position-horizontal-relative:text;mso-position-vertical:absolute;mso-position-vertical-relative:text;mso-width-percent:0;mso-height-percent:0;mso-width-relative:margin;mso-height-relative:margin" o:gfxdata="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">
                 <v:imagedata r:id="rId24" o:title=""/>
               </v:shape>
             </w:pict>
@@ -3166,7 +3065,7 @@
           </mc:Choice>
           <mc:Fallback>
             <w:pict>
-              <v:shape w14:anchorId="112022C8" id="Entrada de lápiz 31" o:spid="_x0000_s1026" type="#_x0000_t75" style="position:absolute;margin-left:296.85pt;margin-top:220.45pt;width:48.25pt;height:35pt;z-index:251709440;visibility:visible;mso-wrap-style:square;mso-width-percent:0;mso-height-percent:0;mso-wrap-distance-left:9pt;mso-wrap-distance-top:0;mso-wrap-distance-right:9pt;mso-wrap-distance-bottom:0;mso-position-horizontal:absolute;mso-position-horizontal-relative:text;mso-position-vertical:absolute;mso-position-vertical-relative:text;mso-width-percent:0;mso-height-percent:0;mso-width-relative:margin;mso-height-relative:margin" o:gfxdata="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">
+              <v:shape w14:anchorId="42DA0248" id="Entrada de lápiz 31" o:spid="_x0000_s1026" type="#_x0000_t75" style="position:absolute;margin-left:296.85pt;margin-top:220.45pt;width:48.25pt;height:35pt;z-index:251709440;visibility:visible;mso-wrap-style:square;mso-width-percent:0;mso-height-percent:0;mso-wrap-distance-left:9pt;mso-wrap-distance-top:0;mso-wrap-distance-right:9pt;mso-wrap-distance-bottom:0;mso-position-horizontal:absolute;mso-position-horizontal-relative:text;mso-position-vertical:absolute;mso-position-vertical-relative:text;mso-width-percent:0;mso-height-percent:0;mso-width-relative:margin;mso-height-relative:margin" o:gfxdata="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">
                 <v:imagedata r:id="rId24" o:title=""/>
               </v:shape>
             </w:pict>
@@ -3235,50 +3134,14 @@
           <w:bCs/>
           <w:lang w:eastAsia="es-EC"/>
         </w:rPr>
-        <w:t xml:space="preserve">Factory </w:t>
-      </w:r>
-      <w:proofErr w:type="spellStart"/>
-      <w:r>
-        <w:rPr>
-          <w:rFonts w:ascii="Arial" w:hAnsi="Arial" w:cs="Arial"/>
-          <w:b/>
-          <w:bCs/>
-          <w:lang w:eastAsia="es-EC"/>
-        </w:rPr>
-        <w:t>Method</w:t>
-      </w:r>
-      <w:proofErr w:type="spellEnd"/>
-      <w:r>
-        <w:rPr>
-          <w:rFonts w:ascii="Arial" w:hAnsi="Arial" w:cs="Arial"/>
-          <w:b/>
-          <w:bCs/>
-          <w:lang w:eastAsia="es-EC"/>
-        </w:rPr>
-        <w:t>:</w:t>
-      </w:r>
-      <w:r>
-        <w:rPr>
-          <w:rFonts w:ascii="Arial" w:hAnsi="Arial" w:cs="Arial"/>
-          <w:lang w:eastAsia="es-EC"/>
-        </w:rPr>
-        <w:t xml:space="preserve"> se implementa con </w:t>
-      </w:r>
-      <w:proofErr w:type="spellStart"/>
-      <w:r>
-        <w:rPr>
-          <w:rFonts w:ascii="Arial" w:hAnsi="Arial" w:cs="Arial"/>
-          <w:lang w:eastAsia="es-EC"/>
-        </w:rPr>
-        <w:t>AnimalFactory</w:t>
-      </w:r>
-      <w:proofErr w:type="spellEnd"/>
-      <w:r>
-        <w:rPr>
-          <w:rFonts w:ascii="Arial" w:hAnsi="Arial" w:cs="Arial"/>
-          <w:lang w:eastAsia="es-EC"/>
-        </w:rPr>
-        <w:t xml:space="preserve"> y sus fábricas específicas, que se encargan de crear objetos según la especie del animal, ya sea perro, gato o fauna silvestre.</w:t>
+        <w:t>Factory Method:</w:t>
+      </w:r>
+      <w:r>
+        <w:rPr>
+          <w:rFonts w:ascii="Arial" w:hAnsi="Arial" w:cs="Arial"/>
+          <w:lang w:eastAsia="es-EC"/>
+        </w:rPr>
+        <w:t xml:space="preserve"> se implementa con AnimalFactory y sus fábricas específicas, que se encargan de crear objetos según la especie del animal, ya sea perro, gato o fauna silvestre.</w:t>
       </w:r>
       <w:r>
         <w:rPr>
@@ -3508,39 +3371,7 @@
           <w:rFonts w:ascii="Arial" w:hAnsi="Arial" w:cs="Arial"/>
           <w:lang w:eastAsia="es-EC"/>
         </w:rPr>
-        <w:t xml:space="preserve">El diagrama de secuencia muestra cómo se lleva a cabo el registro de un nuevo caso de rescate, desde que se recibe la solicitud hasta que se notifica a los voluntarios. Durante este proceso, </w:t>
-      </w:r>
-      <w:proofErr w:type="spellStart"/>
-      <w:r>
-        <w:rPr>
-          <w:rFonts w:ascii="Arial" w:hAnsi="Arial" w:cs="Arial"/>
-          <w:lang w:eastAsia="es-EC"/>
-        </w:rPr>
-        <w:t>GestorCasos</w:t>
-      </w:r>
-      <w:proofErr w:type="spellEnd"/>
-      <w:r>
-        <w:rPr>
-          <w:rFonts w:ascii="Arial" w:hAnsi="Arial" w:cs="Arial"/>
-          <w:lang w:eastAsia="es-EC"/>
-        </w:rPr>
-        <w:t xml:space="preserve"> se encarga de coordinar el registro, </w:t>
-      </w:r>
-      <w:proofErr w:type="spellStart"/>
-      <w:r>
-        <w:rPr>
-          <w:rFonts w:ascii="Arial" w:hAnsi="Arial" w:cs="Arial"/>
-          <w:lang w:eastAsia="es-EC"/>
-        </w:rPr>
-        <w:t>AnimalFactory</w:t>
-      </w:r>
-      <w:proofErr w:type="spellEnd"/>
-      <w:r>
-        <w:rPr>
-          <w:rFonts w:ascii="Arial" w:hAnsi="Arial" w:cs="Arial"/>
-          <w:lang w:eastAsia="es-EC"/>
-        </w:rPr>
-        <w:t xml:space="preserve"> crea el objeto según la especie del animal y Notificador se ocupa de avisar a los voluntarios suscritos que hay un nuevo caso disponible.</w:t>
+        <w:t>El diagrama de secuencia muestra cómo se lleva a cabo el registro de un nuevo caso de rescate, desde que se recibe la solicitud hasta que se notifica a los voluntarios. Durante este proceso, GestorCasos se encarga de coordinar el registro, AnimalFactory crea el objeto según la especie del animal y Notificador se ocupa de avisar a los voluntarios suscritos que hay un nuevo caso disponible.</w:t>
       </w:r>
     </w:p>
     <w:p>
@@ -3635,19 +3466,8 @@
           <w:lang w:eastAsia="es-EC"/>
         </w:rPr>
         <w:lastRenderedPageBreak/>
-        <w:t xml:space="preserve">Arquitectura general y flujo de trabajo </w:t>
-      </w:r>
-      <w:proofErr w:type="spellStart"/>
-      <w:r>
-        <w:rPr>
-          <w:rFonts w:ascii="Arial" w:hAnsi="Arial" w:cs="Arial"/>
-          <w:b/>
-          <w:bCs/>
-          <w:lang w:eastAsia="es-EC"/>
-        </w:rPr>
-        <w:t>Gitflow</w:t>
-      </w:r>
-      <w:proofErr w:type="spellEnd"/>
+        <w:t>Arquitectura general y flujo de trabajo Gitflow</w:t>
+      </w:r>
     </w:p>
     <w:p>
       <w:pPr>
@@ -3676,23 +3496,7 @@
           <w:rFonts w:ascii="Arial" w:hAnsi="Arial" w:cs="Arial"/>
           <w:lang w:eastAsia="es-EC"/>
         </w:rPr>
-        <w:t xml:space="preserve">Para organizar el desarrollo y llevar un control de los cambios, se plantea usar Git y GitHub con el flujo de trabajo </w:t>
-      </w:r>
-      <w:proofErr w:type="spellStart"/>
-      <w:r>
-        <w:rPr>
-          <w:rFonts w:ascii="Arial" w:hAnsi="Arial" w:cs="Arial"/>
-          <w:lang w:eastAsia="es-EC"/>
-        </w:rPr>
-        <w:t>Gitflow</w:t>
-      </w:r>
-      <w:proofErr w:type="spellEnd"/>
-      <w:r>
-        <w:rPr>
-          <w:rFonts w:ascii="Arial" w:hAnsi="Arial" w:cs="Arial"/>
-          <w:lang w:eastAsia="es-EC"/>
-        </w:rPr>
-        <w:t>, apoyándose en las siguientes ramas:</w:t>
+        <w:t>Para organizar el desarrollo y llevar un control de los cambios, se plantea usar Git y GitHub con el flujo de trabajo Gitflow, apoyándose en las siguientes ramas:</w:t>
       </w:r>
     </w:p>
     <w:p>
@@ -3736,7 +3540,6 @@
           <w:lang w:eastAsia="es-EC"/>
         </w:rPr>
       </w:pPr>
-      <w:proofErr w:type="spellStart"/>
       <w:r>
         <w:rPr>
           <w:rFonts w:ascii="Arial" w:hAnsi="Arial" w:cs="Arial"/>
@@ -3746,7 +3549,6 @@
         </w:rPr>
         <w:t>develop</w:t>
       </w:r>
-      <w:proofErr w:type="spellEnd"/>
       <w:r>
         <w:rPr>
           <w:rFonts w:ascii="Arial" w:hAnsi="Arial" w:cs="Arial"/>
@@ -3767,25 +3569,14 @@
           <w:lang w:eastAsia="es-EC"/>
         </w:rPr>
       </w:pPr>
-      <w:proofErr w:type="spellStart"/>
-      <w:r>
-        <w:rPr>
-          <w:rFonts w:ascii="Arial" w:hAnsi="Arial" w:cs="Arial"/>
-          <w:b/>
-          <w:bCs/>
-          <w:lang w:eastAsia="es-EC"/>
-        </w:rPr>
-        <w:t>feature</w:t>
-      </w:r>
-      <w:proofErr w:type="spellEnd"/>
-      <w:r>
-        <w:rPr>
-          <w:rFonts w:ascii="Arial" w:hAnsi="Arial" w:cs="Arial"/>
-          <w:b/>
-          <w:bCs/>
-          <w:lang w:eastAsia="es-EC"/>
-        </w:rPr>
-        <w:t>/nombre-funcionalidad</w:t>
+      <w:r>
+        <w:rPr>
+          <w:rFonts w:ascii="Arial" w:hAnsi="Arial" w:cs="Arial"/>
+          <w:b/>
+          <w:bCs/>
+          <w:lang w:eastAsia="es-EC"/>
+        </w:rPr>
+        <w:t>feature/nombre-funcionalidad</w:t>
       </w:r>
       <w:r>
         <w:rPr>
@@ -3807,23 +3598,7 @@
           <w:rFonts w:ascii="Arial" w:hAnsi="Arial" w:cs="Arial"/>
           <w:lang w:eastAsia="es-EC"/>
         </w:rPr>
-        <w:t xml:space="preserve">Cuando una funcionalidad termina y se prueba, se integra en </w:t>
-      </w:r>
-      <w:proofErr w:type="spellStart"/>
-      <w:r>
-        <w:rPr>
-          <w:rFonts w:ascii="Arial" w:hAnsi="Arial" w:cs="Arial"/>
-          <w:lang w:eastAsia="es-EC"/>
-        </w:rPr>
-        <w:t>develop</w:t>
-      </w:r>
-      <w:proofErr w:type="spellEnd"/>
-      <w:r>
-        <w:rPr>
-          <w:rFonts w:ascii="Arial" w:hAnsi="Arial" w:cs="Arial"/>
-          <w:lang w:eastAsia="es-EC"/>
-        </w:rPr>
-        <w:t>. Y cuando el conjunto de cambios está listo para publicarse, se pasa a master mediante el proceso de integración correspondiente.</w:t>
+        <w:t>Cuando una funcionalidad termina y se prueba, se integra en develop. Y cuando el conjunto de cambios está listo para publicarse, se pasa a master mediante el proceso de integración correspondiente.</w:t>
       </w:r>
     </w:p>
     <w:p>
@@ -3847,65 +3622,22 @@
           <w:bCs/>
           <w:lang w:eastAsia="es-EC"/>
         </w:rPr>
-        <w:t xml:space="preserve">Diagrama del flujo </w:t>
-      </w:r>
-      <w:proofErr w:type="spellStart"/>
-      <w:r>
-        <w:rPr>
-          <w:rFonts w:ascii="Arial" w:hAnsi="Arial" w:cs="Arial"/>
-          <w:b/>
-          <w:bCs/>
-          <w:lang w:eastAsia="es-EC"/>
-        </w:rPr>
-        <w:t>Gitflow</w:t>
-      </w:r>
-      <w:proofErr w:type="spellEnd"/>
-    </w:p>
-    <w:p>
-      <w:pPr>
-        <w:rPr>
-          <w:rFonts w:ascii="Arial" w:hAnsi="Arial" w:cs="Arial"/>
-          <w:lang w:eastAsia="es-EC"/>
-        </w:rPr>
-      </w:pPr>
-      <w:r>
-        <w:rPr>
-          <w:rFonts w:ascii="Arial" w:hAnsi="Arial" w:cs="Arial"/>
-          <w:lang w:eastAsia="es-EC"/>
-        </w:rPr>
-        <w:t xml:space="preserve">El diagrama muestra el flujo de trabajo que se propone para el desarrollo del sistema. La rama master conserva las versiones estables, </w:t>
-      </w:r>
-      <w:proofErr w:type="spellStart"/>
-      <w:r>
-        <w:rPr>
-          <w:rFonts w:ascii="Arial" w:hAnsi="Arial" w:cs="Arial"/>
-          <w:lang w:eastAsia="es-EC"/>
-        </w:rPr>
-        <w:t>develop</w:t>
-      </w:r>
-      <w:proofErr w:type="spellEnd"/>
-      <w:r>
-        <w:rPr>
-          <w:rFonts w:ascii="Arial" w:hAnsi="Arial" w:cs="Arial"/>
-          <w:lang w:eastAsia="es-EC"/>
-        </w:rPr>
-        <w:t xml:space="preserve"> se encarga de integrar los cambios y las ramas </w:t>
-      </w:r>
-      <w:proofErr w:type="spellStart"/>
-      <w:r>
-        <w:rPr>
-          <w:rFonts w:ascii="Arial" w:hAnsi="Arial" w:cs="Arial"/>
-          <w:lang w:eastAsia="es-EC"/>
-        </w:rPr>
-        <w:t>feature</w:t>
-      </w:r>
-      <w:proofErr w:type="spellEnd"/>
-      <w:r>
-        <w:rPr>
-          <w:rFonts w:ascii="Arial" w:hAnsi="Arial" w:cs="Arial"/>
-          <w:lang w:eastAsia="es-EC"/>
-        </w:rPr>
-        <w:t>/ permiten trabajar en funcionalidades específicas antes de unirlas a la rama de desarrollo.</w:t>
+        <w:t>Diagrama del flujo Gitflow</w:t>
+      </w:r>
+    </w:p>
+    <w:p>
+      <w:pPr>
+        <w:rPr>
+          <w:rFonts w:ascii="Arial" w:hAnsi="Arial" w:cs="Arial"/>
+          <w:lang w:eastAsia="es-EC"/>
+        </w:rPr>
+      </w:pPr>
+      <w:r>
+        <w:rPr>
+          <w:rFonts w:ascii="Arial" w:hAnsi="Arial" w:cs="Arial"/>
+          <w:lang w:eastAsia="es-EC"/>
+        </w:rPr>
+        <w:t>El diagrama muestra el flujo de trabajo que se propone para el desarrollo del sistema. La rama master conserva las versiones estables, develop se encarga de integrar los cambios y las ramas feature/ permiten trabajar en funcionalidades específicas antes de unirlas a la rama de desarrollo.</w:t>
       </w:r>
       <w:r>
         <w:t xml:space="preserve"> </w:t>
@@ -3985,19 +3717,8 @@
           <w:lang w:eastAsia="es-EC"/>
         </w:rPr>
         <w:lastRenderedPageBreak/>
-        <w:t xml:space="preserve">Implementación del flujo de trabajo </w:t>
-      </w:r>
-      <w:proofErr w:type="spellStart"/>
-      <w:r>
-        <w:rPr>
-          <w:rFonts w:ascii="Arial" w:hAnsi="Arial" w:cs="Arial"/>
-          <w:b/>
-          <w:bCs/>
-          <w:lang w:eastAsia="es-EC"/>
-        </w:rPr>
-        <w:t>Gitflow</w:t>
-      </w:r>
-      <w:proofErr w:type="spellEnd"/>
+        <w:t>Implementación del flujo de trabajo Gitflow</w:t>
+      </w:r>
     </w:p>
     <w:p>
       <w:pPr>
@@ -4244,23 +3965,7 @@
           <w:rFonts w:ascii="Arial" w:hAnsi="Arial" w:cs="Arial"/>
           <w:lang w:eastAsia="es-EC"/>
         </w:rPr>
-        <w:t xml:space="preserve">Luego creé una carpeta local para iniciar el proyecto y la conecté con el repositorio. Dentro de esa carpeta abrí Git </w:t>
-      </w:r>
-      <w:proofErr w:type="spellStart"/>
-      <w:r>
-        <w:rPr>
-          <w:rFonts w:ascii="Arial" w:hAnsi="Arial" w:cs="Arial"/>
-          <w:lang w:eastAsia="es-EC"/>
-        </w:rPr>
-        <w:t>Bash</w:t>
-      </w:r>
-      <w:proofErr w:type="spellEnd"/>
-      <w:r>
-        <w:rPr>
-          <w:rFonts w:ascii="Arial" w:hAnsi="Arial" w:cs="Arial"/>
-          <w:lang w:eastAsia="es-EC"/>
-        </w:rPr>
-        <w:t xml:space="preserve"> y usé los siguientes comandos para inicializar el proyecto, crear la rama principal (master) y enlazarlo con el repositorio remoto:</w:t>
+        <w:t>Luego creé una carpeta local para iniciar el proyecto y la conecté con el repositorio. Dentro de esa carpeta abrí Git Bash y usé los siguientes comandos para inicializar el proyecto, crear la rama principal (master) y enlazarlo con el repositorio remoto:</w:t>
       </w:r>
       <w:r>
         <w:rPr>
@@ -4269,37 +3974,15 @@
         </w:rPr>
         <w:br/>
       </w:r>
-      <w:proofErr w:type="spellStart"/>
-      <w:r>
-        <w:rPr>
-          <w:rFonts w:ascii="Arial" w:hAnsi="Arial" w:cs="Arial"/>
-          <w:b/>
-          <w:bCs/>
-          <w:lang w:eastAsia="es-EC"/>
-        </w:rPr>
-        <w:t>git</w:t>
-      </w:r>
-      <w:proofErr w:type="spellEnd"/>
-      <w:r>
-        <w:rPr>
-          <w:rFonts w:ascii="Arial" w:hAnsi="Arial" w:cs="Arial"/>
-          <w:b/>
-          <w:bCs/>
-          <w:lang w:eastAsia="es-EC"/>
-        </w:rPr>
-        <w:t xml:space="preserve"> </w:t>
-      </w:r>
-      <w:proofErr w:type="spellStart"/>
-      <w:r>
-        <w:rPr>
-          <w:rFonts w:ascii="Arial" w:hAnsi="Arial" w:cs="Arial"/>
-          <w:b/>
-          <w:bCs/>
-          <w:lang w:eastAsia="es-EC"/>
-        </w:rPr>
-        <w:t>init</w:t>
-      </w:r>
-      <w:proofErr w:type="spellEnd"/>
+      <w:r>
+        <w:rPr>
+          <w:rFonts w:ascii="Arial" w:hAnsi="Arial" w:cs="Arial"/>
+          <w:b/>
+          <w:bCs/>
+          <w:lang w:eastAsia="es-EC"/>
+        </w:rPr>
+        <w:t>git init</w:t>
+      </w:r>
       <w:r>
         <w:rPr>
           <w:rFonts w:ascii="Arial" w:hAnsi="Arial" w:cs="Arial"/>
@@ -4308,46 +3991,16 @@
           <w:lang w:eastAsia="es-EC"/>
         </w:rPr>
         <w:br/>
-      </w:r>
-      <w:proofErr w:type="spellStart"/>
-      <w:r>
-        <w:rPr>
-          <w:rFonts w:ascii="Arial" w:hAnsi="Arial" w:cs="Arial"/>
-          <w:b/>
-          <w:bCs/>
-          <w:lang w:eastAsia="es-EC"/>
-        </w:rPr>
-        <w:t>git</w:t>
-      </w:r>
-      <w:proofErr w:type="spellEnd"/>
-      <w:r>
-        <w:rPr>
-          <w:rFonts w:ascii="Arial" w:hAnsi="Arial" w:cs="Arial"/>
-          <w:b/>
-          <w:bCs/>
-          <w:lang w:eastAsia="es-EC"/>
-        </w:rPr>
-        <w:t xml:space="preserve"> </w:t>
-      </w:r>
-      <w:proofErr w:type="spellStart"/>
-      <w:r>
-        <w:rPr>
-          <w:rFonts w:ascii="Arial" w:hAnsi="Arial" w:cs="Arial"/>
-          <w:b/>
-          <w:bCs/>
-          <w:lang w:eastAsia="es-EC"/>
-        </w:rPr>
-        <w:t>checkout</w:t>
-      </w:r>
-      <w:proofErr w:type="spellEnd"/>
-      <w:r>
-        <w:rPr>
-          <w:rFonts w:ascii="Arial" w:hAnsi="Arial" w:cs="Arial"/>
-          <w:b/>
-          <w:bCs/>
-          <w:lang w:eastAsia="es-EC"/>
-        </w:rPr>
-        <w:t xml:space="preserve"> -b</w:t>
+        <w:t xml:space="preserve">git </w:t>
+      </w:r>
+      <w:r>
+        <w:rPr>
+          <w:rFonts w:ascii="Arial" w:hAnsi="Arial" w:cs="Arial"/>
+          <w:b/>
+          <w:bCs/>
+          <w:lang w:eastAsia="es-EC"/>
+        </w:rPr>
+        <w:t>checkout -b</w:t>
       </w:r>
       <w:r>
         <w:rPr>
@@ -4527,7 +4180,6 @@
           <w:lang w:eastAsia="es-EC"/>
         </w:rPr>
       </w:pPr>
-      <w:proofErr w:type="spellStart"/>
       <w:r>
         <w:rPr>
           <w:rFonts w:ascii="Arial" w:hAnsi="Arial" w:cs="Arial"/>
@@ -4536,58 +4188,17 @@
           <w:lang w:eastAsia="es-EC"/>
         </w:rPr>
         <w:lastRenderedPageBreak/>
-        <w:t>Creacion</w:t>
-      </w:r>
-      <w:proofErr w:type="spellEnd"/>
-      <w:r>
-        <w:rPr>
-          <w:rFonts w:ascii="Arial" w:hAnsi="Arial" w:cs="Arial"/>
-          <w:b/>
-          <w:bCs/>
-          <w:lang w:eastAsia="es-EC"/>
-        </w:rPr>
-        <w:t xml:space="preserve"> de las ramas</w:t>
-      </w:r>
-      <w:r>
-        <w:rPr>
-          <w:rFonts w:ascii="Arial" w:hAnsi="Arial" w:cs="Arial"/>
-          <w:b/>
-          <w:bCs/>
-          <w:lang w:eastAsia="es-EC"/>
-        </w:rPr>
-        <w:t xml:space="preserve"> </w:t>
-      </w:r>
-      <w:proofErr w:type="spellStart"/>
-      <w:r>
-        <w:rPr>
-          <w:rFonts w:ascii="Arial" w:hAnsi="Arial" w:cs="Arial"/>
-          <w:b/>
-          <w:bCs/>
-          <w:lang w:eastAsia="es-EC"/>
-        </w:rPr>
-        <w:t>develop</w:t>
-      </w:r>
-      <w:proofErr w:type="spellEnd"/>
-      <w:r>
-        <w:rPr>
-          <w:rFonts w:ascii="Arial" w:hAnsi="Arial" w:cs="Arial"/>
-          <w:b/>
-          <w:bCs/>
-          <w:lang w:eastAsia="es-EC"/>
-        </w:rPr>
-        <w:t xml:space="preserve"> y </w:t>
-      </w:r>
-      <w:proofErr w:type="spellStart"/>
-      <w:r>
-        <w:rPr>
-          <w:rFonts w:ascii="Arial" w:hAnsi="Arial" w:cs="Arial"/>
-          <w:b/>
-          <w:bCs/>
-          <w:lang w:eastAsia="es-EC"/>
-        </w:rPr>
-        <w:t>feature</w:t>
-      </w:r>
-      <w:proofErr w:type="spellEnd"/>
+        <w:t>Creacion de las ramas</w:t>
+      </w:r>
+      <w:r>
+        <w:rPr>
+          <w:rFonts w:ascii="Arial" w:hAnsi="Arial" w:cs="Arial"/>
+          <w:b/>
+          <w:bCs/>
+          <w:lang w:eastAsia="es-EC"/>
+        </w:rPr>
+        <w:t xml:space="preserve"> develop y feature</w:t>
+      </w:r>
     </w:p>
     <w:p>
       <w:pPr>
@@ -4629,57 +4240,15 @@
           <w:lang w:eastAsia="es-EC"/>
         </w:rPr>
       </w:pPr>
-      <w:proofErr w:type="spellStart"/>
-      <w:r>
-        <w:rPr>
-          <w:rFonts w:ascii="Arial" w:hAnsi="Arial" w:cs="Arial"/>
-          <w:b/>
-          <w:bCs/>
-          <w:lang w:eastAsia="es-EC"/>
-        </w:rPr>
-        <w:t>git</w:t>
-      </w:r>
-      <w:proofErr w:type="spellEnd"/>
-      <w:r>
-        <w:rPr>
-          <w:rFonts w:ascii="Arial" w:hAnsi="Arial" w:cs="Arial"/>
-          <w:b/>
-          <w:bCs/>
-          <w:lang w:eastAsia="es-EC"/>
-        </w:rPr>
-        <w:t xml:space="preserve"> </w:t>
-      </w:r>
-      <w:proofErr w:type="spellStart"/>
-      <w:r>
-        <w:rPr>
-          <w:rFonts w:ascii="Arial" w:hAnsi="Arial" w:cs="Arial"/>
-          <w:b/>
-          <w:bCs/>
-          <w:lang w:eastAsia="es-EC"/>
-        </w:rPr>
-        <w:t>checkout</w:t>
-      </w:r>
-      <w:proofErr w:type="spellEnd"/>
-      <w:r>
-        <w:rPr>
-          <w:rFonts w:ascii="Arial" w:hAnsi="Arial" w:cs="Arial"/>
-          <w:b/>
-          <w:bCs/>
-          <w:lang w:eastAsia="es-EC"/>
-        </w:rPr>
-        <w:t xml:space="preserve"> -b </w:t>
-      </w:r>
-      <w:proofErr w:type="spellStart"/>
-      <w:r>
-        <w:rPr>
-          <w:rFonts w:ascii="Arial" w:hAnsi="Arial" w:cs="Arial"/>
-          <w:b/>
-          <w:bCs/>
-          <w:lang w:eastAsia="es-EC"/>
-        </w:rPr>
-        <w:t>develop</w:t>
-      </w:r>
-      <w:proofErr w:type="spellEnd"/>
+      <w:r>
+        <w:rPr>
+          <w:rFonts w:ascii="Arial" w:hAnsi="Arial" w:cs="Arial"/>
+          <w:b/>
+          <w:bCs/>
+          <w:lang w:eastAsia="es-EC"/>
+        </w:rPr>
+        <w:t>git checkout -b develop</w:t>
+      </w:r>
     </w:p>
     <w:p>
       <w:pPr>
@@ -4743,57 +4312,15 @@
           </wp:anchor>
         </w:drawing>
       </w:r>
-      <w:proofErr w:type="spellStart"/>
-      <w:r>
-        <w:rPr>
-          <w:rFonts w:ascii="Arial" w:hAnsi="Arial" w:cs="Arial"/>
-          <w:b/>
-          <w:bCs/>
-          <w:lang w:eastAsia="es-EC"/>
-        </w:rPr>
-        <w:t>git</w:t>
-      </w:r>
-      <w:proofErr w:type="spellEnd"/>
-      <w:r>
-        <w:rPr>
-          <w:rFonts w:ascii="Arial" w:hAnsi="Arial" w:cs="Arial"/>
-          <w:b/>
-          <w:bCs/>
-          <w:lang w:eastAsia="es-EC"/>
-        </w:rPr>
-        <w:t xml:space="preserve"> </w:t>
-      </w:r>
-      <w:proofErr w:type="spellStart"/>
-      <w:r>
-        <w:rPr>
-          <w:rFonts w:ascii="Arial" w:hAnsi="Arial" w:cs="Arial"/>
-          <w:b/>
-          <w:bCs/>
-          <w:lang w:eastAsia="es-EC"/>
-        </w:rPr>
-        <w:t>checkout</w:t>
-      </w:r>
-      <w:proofErr w:type="spellEnd"/>
-      <w:r>
-        <w:rPr>
-          <w:rFonts w:ascii="Arial" w:hAnsi="Arial" w:cs="Arial"/>
-          <w:b/>
-          <w:bCs/>
-          <w:lang w:eastAsia="es-EC"/>
-        </w:rPr>
-        <w:t xml:space="preserve"> -b </w:t>
-      </w:r>
-      <w:proofErr w:type="spellStart"/>
-      <w:r>
-        <w:rPr>
-          <w:rFonts w:ascii="Arial" w:hAnsi="Arial" w:cs="Arial"/>
-          <w:b/>
-          <w:bCs/>
-          <w:lang w:eastAsia="es-EC"/>
-        </w:rPr>
-        <w:t>feature</w:t>
-      </w:r>
-      <w:proofErr w:type="spellEnd"/>
+      <w:r>
+        <w:rPr>
+          <w:rFonts w:ascii="Arial" w:hAnsi="Arial" w:cs="Arial"/>
+          <w:b/>
+          <w:bCs/>
+          <w:lang w:eastAsia="es-EC"/>
+        </w:rPr>
+        <w:t>git checkout -b feature</w:t>
+      </w:r>
       <w:r>
         <w:rPr>
           <w:rFonts w:ascii="Arial" w:hAnsi="Arial" w:cs="Arial"/>
@@ -5069,47 +4596,16 @@
           <w:bCs/>
           <w:lang w:eastAsia="es-EC"/>
         </w:rPr>
-        <w:t xml:space="preserve">Registro de cambios mediante </w:t>
-      </w:r>
-      <w:proofErr w:type="spellStart"/>
-      <w:r>
-        <w:rPr>
-          <w:rFonts w:ascii="Arial" w:hAnsi="Arial" w:cs="Arial"/>
-          <w:b/>
-          <w:bCs/>
-          <w:lang w:eastAsia="es-EC"/>
-        </w:rPr>
-        <w:t>commits</w:t>
-      </w:r>
-      <w:proofErr w:type="spellEnd"/>
-      <w:r>
-        <w:rPr>
-          <w:rFonts w:ascii="Arial" w:hAnsi="Arial" w:cs="Arial"/>
-          <w:b/>
-          <w:bCs/>
-          <w:lang w:eastAsia="es-EC"/>
-        </w:rPr>
-        <w:t xml:space="preserve"> y </w:t>
-      </w:r>
-      <w:proofErr w:type="spellStart"/>
-      <w:r>
-        <w:rPr>
-          <w:rFonts w:ascii="Arial" w:hAnsi="Arial" w:cs="Arial"/>
-          <w:b/>
-          <w:bCs/>
-          <w:lang w:eastAsia="es-EC"/>
-        </w:rPr>
-        <w:t>push</w:t>
-      </w:r>
-      <w:proofErr w:type="spellEnd"/>
-      <w:r>
-        <w:rPr>
-          <w:rFonts w:ascii="Arial" w:hAnsi="Arial" w:cs="Arial"/>
-          <w:b/>
-          <w:bCs/>
-          <w:lang w:eastAsia="es-EC"/>
-        </w:rPr>
-        <w:t xml:space="preserve"> al repositorio</w:t>
+        <w:t>Registro de cambios mediante commits</w:t>
+      </w:r>
+      <w:r>
+        <w:rPr>
+          <w:rFonts w:ascii="Arial" w:hAnsi="Arial" w:cs="Arial"/>
+          <w:b/>
+          <w:bCs/>
+          <w:lang w:eastAsia="es-EC"/>
+        </w:rPr>
+        <w:t xml:space="preserve"> y push al repositorio</w:t>
       </w:r>
       <w:r>
         <w:rPr>
@@ -5191,33 +4687,11 @@
           <w:lang w:eastAsia="es-EC"/>
         </w:rPr>
       </w:pPr>
-      <w:proofErr w:type="spellStart"/>
-      <w:r>
-        <w:rPr>
-          <w:lang w:eastAsia="es-EC"/>
-        </w:rPr>
-        <w:t>Atlassian</w:t>
-      </w:r>
-      <w:proofErr w:type="spellEnd"/>
-      <w:r>
-        <w:rPr>
-          <w:lang w:eastAsia="es-EC"/>
-        </w:rPr>
-        <w:t xml:space="preserve">. (s. f.). Flujo de trabajo de </w:t>
-      </w:r>
-      <w:proofErr w:type="spellStart"/>
-      <w:r>
-        <w:rPr>
-          <w:lang w:eastAsia="es-EC"/>
-        </w:rPr>
-        <w:t>Gitflow</w:t>
-      </w:r>
-      <w:proofErr w:type="spellEnd"/>
-      <w:r>
-        <w:rPr>
-          <w:lang w:eastAsia="es-EC"/>
-        </w:rPr>
-        <w:t xml:space="preserve">. </w:t>
+      <w:r>
+        <w:rPr>
+          <w:lang w:eastAsia="es-EC"/>
+        </w:rPr>
+        <w:t xml:space="preserve">Atlassian. (s. f.). Flujo de trabajo de Gitflow. </w:t>
       </w:r>
       <w:hyperlink r:id="rId42" w:history="1">
         <w:r>
@@ -5262,33 +4736,11 @@
           <w:lang w:eastAsia="es-EC"/>
         </w:rPr>
       </w:pPr>
-      <w:proofErr w:type="spellStart"/>
-      <w:r>
-        <w:rPr>
-          <w:lang w:eastAsia="es-EC"/>
-        </w:rPr>
-        <w:t>freeCodeCamp</w:t>
-      </w:r>
-      <w:proofErr w:type="spellEnd"/>
-      <w:r>
-        <w:rPr>
-          <w:lang w:eastAsia="es-EC"/>
-        </w:rPr>
-        <w:t xml:space="preserve"> </w:t>
-      </w:r>
-      <w:proofErr w:type="gramStart"/>
-      <w:r>
-        <w:rPr>
-          <w:lang w:eastAsia="es-EC"/>
-        </w:rPr>
-        <w:t>Español</w:t>
-      </w:r>
-      <w:proofErr w:type="gramEnd"/>
-      <w:r>
-        <w:rPr>
-          <w:lang w:eastAsia="es-EC"/>
-        </w:rPr>
-        <w:t xml:space="preserve">. (s. f.). Guía para principiantes de Git y GitHub. </w:t>
+      <w:r>
+        <w:rPr>
+          <w:lang w:eastAsia="es-EC"/>
+        </w:rPr>
+        <w:t xml:space="preserve">freeCodeCamp Español. (s. f.). Guía para principiantes de Git y GitHub. </w:t>
       </w:r>
       <w:hyperlink r:id="rId43" w:history="1">
         <w:r>
@@ -5480,7 +4932,6 @@
           <w:lang w:eastAsia="es-EC"/>
         </w:rPr>
       </w:pPr>
-      <w:proofErr w:type="spellStart"/>
       <w:r>
         <w:rPr>
           <w:lang w:eastAsia="es-EC"/>
@@ -5493,7 +4944,6 @@
         </w:rPr>
         <w:t>oydalto</w:t>
       </w:r>
-      <w:proofErr w:type="spellEnd"/>
       <w:r>
         <w:rPr>
           <w:lang w:eastAsia="es-EC"/>
@@ -5561,7 +5011,6 @@
           <w:lang w:eastAsia="es-EC"/>
         </w:rPr>
       </w:pPr>
-      <w:proofErr w:type="spellStart"/>
       <w:r>
         <w:rPr>
           <w:lang w:eastAsia="es-EC"/>
@@ -5574,7 +5023,6 @@
         </w:rPr>
         <w:t>scuelaspring</w:t>
       </w:r>
-      <w:proofErr w:type="spellEnd"/>
       <w:r>
         <w:rPr>
           <w:lang w:eastAsia="es-EC"/>
@@ -5587,28 +5035,12 @@
         </w:rPr>
         <w:t xml:space="preserve">(s. f.). </w:t>
       </w:r>
-      <w:proofErr w:type="spellStart"/>
-      <w:r>
-        <w:rPr>
-          <w:lang w:eastAsia="es-EC"/>
-        </w:rPr>
-        <w:t>Gitflow</w:t>
-      </w:r>
-      <w:proofErr w:type="spellEnd"/>
-      <w:r>
-        <w:rPr>
-          <w:lang w:eastAsia="es-EC"/>
-        </w:rPr>
-        <w:t xml:space="preserve"> explicado paso a paso | Tutorial completo de </w:t>
-      </w:r>
-      <w:proofErr w:type="spellStart"/>
-      <w:r>
-        <w:rPr>
-          <w:lang w:eastAsia="es-EC"/>
-        </w:rPr>
-        <w:t>Gitflow</w:t>
-      </w:r>
-      <w:proofErr w:type="spellEnd"/>
+      <w:r>
+        <w:rPr>
+          <w:lang w:eastAsia="es-EC"/>
+        </w:rPr>
+        <w:t>Gitflow explicado paso a paso | Tutorial completo de Gitflow</w:t>
+      </w:r>
       <w:r>
         <w:rPr>
           <w:lang w:eastAsia="es-EC"/>
@@ -6530,7 +5962,7 @@
         <v:path o:extrusionok="f" gradientshapeok="t" o:connecttype="rect"/>
         <o:lock v:ext="edit" aspectratio="t"/>
       </v:shapetype>
-      <v:shape id="_x0000_i1107" type="#_x0000_t75" style="width:10.9pt;height:10.9pt" o:bullet="t">
+      <v:shape id="_x0000_i1109" type="#_x0000_t75" style="width:10.9pt;height:10.9pt" o:bullet="t">
         <v:imagedata r:id="rId1" o:title="mso3E28"/>
       </v:shape>
     </w:pict>

</xml_diff>